<commit_message>
v37: Link Finder: rows still waiting are tinted while a lookup runs, and the row being searched pulses. Brackets that only describe format or availability, such as "(Digital Download)", are ignored when matching titles; earlier misses are searched again once.
Co-Authored-By: Claude Opus 5.5 <noreply@anthropic.com>
</commit_message>
<xml_diff>
--- a/docs/Artist Feed User Guide.docx
+++ b/docs/Artist Feed User Guide.docx
@@ -33,7 +33,7 @@
     <w:p>
       <w:pPr/>
       <w:r>
-        <w:t xml:space="preserve">This guide describes Artist Feed version 36. The version number is shown in small grey text beside the title at the top of the app.</w:t>
+        <w:t xml:space="preserve">This guide describes Artist Feed version 37. The version number is shown in small grey text beside the title at the top of the app.</w:t>
       </w:r>
     </w:p>
     <w:p>
@@ -1646,7 +1646,7 @@
         <w:t xml:space="preserve">What was tried</w:t>
       </w:r>
       <w:r>
-        <w:t xml:space="preserve"> lists every step and what it found.</w:t>
+        <w:t xml:space="preserve"> lists every step and what it found. While a lookup runs, rows not yet answered have a soft blue tint, and the row being searched pulses and reads "Searching now…".</w:t>
       </w:r>
     </w:p>
     <w:p>
@@ -2178,7 +2178,7 @@
         </w:numPr>
       </w:pPr>
       <w:r>
-        <w:t xml:space="preserve">When the same track is on a release you own and on another, the one you own is returned. Numbers in a title must agree exactly, so "Hybrid Kit 6" does not match "Hybrid Kit 2". A WIP marker ("Title WIP", "Title (WIP)") is a status, not part of the title, and is ignored. A track page is swapped for the album it belongs to.</w:t>
+        <w:t xml:space="preserve">When the same track is on a release you own and on another, the one you own is returned. Numbers in a title must agree exactly, so "Hybrid Kit 6" does not match "Hybrid Kit 2". A WIP marker ("Title WIP", "Title (WIP)") is a status, not part of the title, and is ignored. So is a bracket that only says how a track is sold or presented, such as "(Digital Download)", "(Free DL)" or "(Out Now)". A track page is swapped for the album it belongs to.</w:t>
       </w:r>
     </w:p>
     <w:p>
@@ -4635,7 +4635,7 @@
     <w:p>
       <w:pPr/>
       <w:r>
-        <w:t xml:space="preserve">Versions 1 and 2 were delivered before the app showed a version number; the numbers are given here for reference. Versions 1 to 9 date from 9 October 2026, versions 10 to 33 from 10 October 2026, versions 34 to 36 from 11 October 2026.</w:t>
+        <w:t xml:space="preserve">Versions 1 and 2 were delivered before the app showed a version number; the numbers are given here for reference. Versions 1 to 9 date from 9 October 2026, versions 10 to 33 from 10 October 2026, versions 34 to 37 from 11 October 2026.</w:t>
       </w:r>
     </w:p>
     <w:tbl>
@@ -4674,6 +4674,30 @@
             <w:pPr/>
             <w:r>
               <w:t xml:space="preserve">What changed</w:t>
+            </w:r>
+          </w:p>
+        </w:tc>
+      </w:tr>
+      <w:tr>
+        <w:tc>
+          <w:tcPr>
+            <w:tcW w:w="4680" w:type="dxa"/>
+          </w:tcPr>
+          <w:p>
+            <w:pPr/>
+            <w:r>
+              <w:t xml:space="preserve">37</w:t>
+            </w:r>
+          </w:p>
+        </w:tc>
+        <w:tc>
+          <w:tcPr>
+            <w:tcW w:w="4680" w:type="dxa"/>
+          </w:tcPr>
+          <w:p>
+            <w:pPr/>
+            <w:r>
+              <w:t xml:space="preserve">Link Finder: rows still waiting are tinted while a lookup runs, and the row being searched pulses. Brackets that only describe format or availability, such as "(Digital Download)", are ignored when matching titles; earlier misses are searched again once.</w:t>
             </w:r>
           </w:p>
         </w:tc>

</xml_diff>

<commit_message>
v35: Tracked Artists table: resizable columns, and the Artist column always fits the full name. Back catalogues load faster: catch-up visits every 10 minutes, and unreadable release pages no longer block the rest.
Co-Authored-By: Claude Opus 5.5 <noreply@anthropic.com>
</commit_message>
<xml_diff>
--- a/docs/Artist Feed User Guide.docx
+++ b/docs/Artist Feed User Guide.docx
@@ -33,7 +33,7 @@
     <w:p>
       <w:pPr/>
       <w:r>
-        <w:t xml:space="preserve">This guide describes Artist Feed version 34. The version number is shown in small grey text beside the title at the top of the app.</w:t>
+        <w:t xml:space="preserve">This guide describes Artist Feed version 35. The version number is shown in small grey text beside the title at the top of the app.</w:t>
       </w:r>
     </w:p>
     <w:p>
@@ -1036,7 +1036,7 @@
         <w:t xml:space="preserve">Tracked Artists</w:t>
       </w:r>
       <w:r>
-        <w:t xml:space="preserve"> button opens a table with one row per artist or label and one column per site. This is the list the feed is built from.</w:t>
+        <w:t xml:space="preserve"> button opens a table with one row per artist or label and one column per site. This is the list the feed is built from. The Artist column is always wide enough to show the longest name in full, and the site columns share what is left; if the window is too narrow the table scrolls sideways. Drag the edge of the Artist, site or Status heading to set a width yourself, and double-click the edge to return it to automatic.</w:t>
       </w:r>
     </w:p>
     <w:p>
@@ -1844,7 +1844,7 @@
         <w:t xml:space="preserve">/music</w:t>
       </w:r>
       <w:r>
-        <w:t xml:space="preserve"> page, which lists the releases, then opens each release it has not read before to get the release date, posting date, label, track list, durations and the id its player needs. At most 6 new releases are opened per artist per refresh, so a long back catalogue fills in over several refreshes.</w:t>
+        <w:t xml:space="preserve"> page, which lists the releases, then opens each release it has not read before to get the release date, posting date, label, track list, durations and the id its player needs. At most 6 new releases are opened per artist per refresh, so a long back catalogue fills in over several visits. Between the hourly refreshes, pages that still have older releases to load are visited again every 10 minutes (CATCH_UP_MINUTES in docker-compose.yml), 6 releases at a time. A release page that cannot be read is retried after the unread ones, so it cannot hold up the rest.</w:t>
       </w:r>
     </w:p>
     <w:p>
@@ -4437,6 +4437,18 @@
       </w:r>
     </w:p>
     <w:p>
+      <w:pPr/>
+      <w:r>
+        <w:rPr>
+          <w:b/>
+        </w:rPr>
+        <w:t xml:space="preserve">The Status column keeps saying "N older release(s) still to load". Is it stuck?</w:t>
+      </w:r>
+      <w:r>
+        <w:t xml:space="preserve"> Usually not. A page's back catalogue loads 6 releases per visit, only while the app is running, and visits are skipped while a lookup or purchases read is running or Bandcamp has asked for a pause. The number should fall each time you look. Up to version 34 it could stall: release pages that failed to load were retried first on every visit and could use up all 6 places. Since version 35 those are retried last and reported separately as "could not be read", and backlog pages are visited every 10 minutes.</w:t>
+      </w:r>
+    </w:p>
+    <w:p>
       <w:pPr>
         <w:pStyle w:val="Heading3"/>
       </w:pPr>
@@ -4623,7 +4635,7 @@
     <w:p>
       <w:pPr/>
       <w:r>
-        <w:t xml:space="preserve">Versions 1 and 2 were delivered before the app showed a version number; the numbers are given here for reference. Versions 1 to 9 date from 9 October 2026, versions 10 to 33 from 10 October 2026, version 34 from 11 October 2026.</w:t>
+        <w:t xml:space="preserve">Versions 1 and 2 were delivered before the app showed a version number; the numbers are given here for reference. Versions 1 to 9 date from 9 October 2026, versions 10 to 33 from 10 October 2026, versions 34 and 35 from 11 October 2026.</w:t>
       </w:r>
     </w:p>
     <w:tbl>
@@ -4662,6 +4674,30 @@
             <w:pPr/>
             <w:r>
               <w:t xml:space="preserve">What changed</w:t>
+            </w:r>
+          </w:p>
+        </w:tc>
+      </w:tr>
+      <w:tr>
+        <w:tc>
+          <w:tcPr>
+            <w:tcW w:w="4680" w:type="dxa"/>
+          </w:tcPr>
+          <w:p>
+            <w:pPr/>
+            <w:r>
+              <w:t xml:space="preserve">35</w:t>
+            </w:r>
+          </w:p>
+        </w:tc>
+        <w:tc>
+          <w:tcPr>
+            <w:tcW w:w="4680" w:type="dxa"/>
+          </w:tcPr>
+          <w:p>
+            <w:pPr/>
+            <w:r>
+              <w:t xml:space="preserve">Tracked Artists table: resizable columns, and the Artist column always fits the full name. Back catalogues load faster: catch-up visits every 10 minutes, and unreadable release pages no longer block the rest.</w:t>
             </w:r>
           </w:p>
         </w:tc>

</xml_diff>

<commit_message>
v38: Link Finder remembers which SoundCloud profile belongs to a name, from a track of theirs found there or a link you set, and uses it wherever a profile would otherwise be picked by name alone. Saved name-only answers are corrected without a new search.
Co-Authored-By: Claude Opus 5.5 <noreply@anthropic.com>
</commit_message>
<xml_diff>
--- a/docs/Artist Feed User Guide.docx
+++ b/docs/Artist Feed User Guide.docx
@@ -33,7 +33,7 @@
     <w:p>
       <w:pPr/>
       <w:r>
-        <w:t xml:space="preserve">This guide describes Artist Feed version 37. The version number is shown in small grey text beside the title at the top of the app.</w:t>
+        <w:t xml:space="preserve">This guide describes Artist Feed version 38. The version number is shown in small grey text beside the title at the top of the app.</w:t>
       </w:r>
     </w:p>
     <w:p>
@@ -4091,7 +4091,7 @@
         <w:t xml:space="preserve">Common artist names.</w:t>
       </w:r>
       <w:r>
-        <w:t xml:space="preserve"> When a track is not on SoundCloud, a profile is picked by name alone and marked "matched by name only". For a name like River this can be the wrong person.</w:t>
+        <w:t xml:space="preserve"> When a track is not on SoundCloud, a profile is picked by name alone and marked "matched by name only". For a name like River this can be the wrong person. The app learns the right profile for a name when it finds one of their tracks on SoundCloud, or when you set a SoundCloud link with Edit, and uses it from then on, including for answers already saved.</w:t>
       </w:r>
     </w:p>
     <w:p>
@@ -4635,7 +4635,7 @@
     <w:p>
       <w:pPr/>
       <w:r>
-        <w:t xml:space="preserve">Versions 1 and 2 were delivered before the app showed a version number; the numbers are given here for reference. Versions 1 to 9 date from 9 October 2026, versions 10 to 33 from 10 October 2026, versions 34 to 37 from 11 October 2026.</w:t>
+        <w:t xml:space="preserve">Versions 1 and 2 were delivered before the app showed a version number; the numbers are given here for reference. Versions 1 to 9 date from 9 October 2026, versions 10 to 33 from 10 October 2026, versions 34 to 38 from 11 October 2026.</w:t>
       </w:r>
     </w:p>
     <w:tbl>
@@ -4674,6 +4674,30 @@
             <w:pPr/>
             <w:r>
               <w:t xml:space="preserve">What changed</w:t>
+            </w:r>
+          </w:p>
+        </w:tc>
+      </w:tr>
+      <w:tr>
+        <w:tc>
+          <w:tcPr>
+            <w:tcW w:w="4680" w:type="dxa"/>
+          </w:tcPr>
+          <w:p>
+            <w:pPr/>
+            <w:r>
+              <w:t xml:space="preserve">38</w:t>
+            </w:r>
+          </w:p>
+        </w:tc>
+        <w:tc>
+          <w:tcPr>
+            <w:tcW w:w="4680" w:type="dxa"/>
+          </w:tcPr>
+          <w:p>
+            <w:pPr/>
+            <w:r>
+              <w:t xml:space="preserve">Link Finder remembers which SoundCloud profile belongs to a name, from a track of theirs found there or a link you set, and uses it wherever a profile would otherwise be picked by name alone. Saved name-only answers are corrected without a new search.</w:t>
             </w:r>
           </w:p>
         </w:tc>

</xml_diff>

<commit_message>
v34: List columns can be dragged to reorder and shown or hidden from a Columns menu; new default order Artist, Track, Duration, Year, Released, Posted, Release, Label, Site. Date filter (last N days or a date range, by posted or release date). Show-first-N limit on results and export. WIP markers ignored when matching titles. Guide included in the zip under docs.
Co-Authored-By: Claude Opus 5.5 <noreply@anthropic.com>
</commit_message>
<xml_diff>
--- a/docs/Artist Feed User Guide.docx
+++ b/docs/Artist Feed User Guide.docx
@@ -13,7 +13,7 @@
     <w:p>
       <w:pPr/>
       <w:r>
-        <w:t xml:space="preserve">Oct 10, 2026</w:t>
+        <w:t xml:space="preserve">Oct 11, 2026</w:t>
       </w:r>
       <w:r>
         <w:t xml:space="preserve"/>
@@ -33,7 +33,7 @@
     <w:p>
       <w:pPr/>
       <w:r>
-        <w:t xml:space="preserve">This guide describes Artist Feed version 33. The version number is shown in small grey text beside the title at the top of the app.</w:t>
+        <w:t xml:space="preserve">This guide describes Artist Feed version 34. The version number is shown in small grey text beside the title at the top of the app.</w:t>
       </w:r>
     </w:p>
     <w:p>
@@ -517,7 +517,7 @@
         <w:t xml:space="preserve">List</w:t>
       </w:r>
       <w:r>
-        <w:t xml:space="preserve"> shows one row per track: artist, label, release, track, duration, year, release date, posted date and site.</w:t>
+        <w:t xml:space="preserve"> shows one row per track: artist, track, duration, year, release date, posted date, release, label and site. It opens sorted by Posted, newest first.</w:t>
       </w:r>
     </w:p>
     <w:p>
@@ -582,7 +582,7 @@
         </w:numPr>
       </w:pPr>
       <w:r>
-        <w:t xml:space="preserve">The headings stay in place while the list scrolls.</w:t>
+        <w:t xml:space="preserve">The headings stay in place while the list scrolls. Drag a heading onto another to move that column. The Columns button (List view only) opens a menu to tick columns on or off and reorder them with arrows; Reset to default restores the original order, visibility and widths. The layout is remembered in this browser.</w:t>
       </w:r>
     </w:p>
     <w:p>
@@ -874,7 +874,7 @@
     <w:p>
       <w:pPr/>
       <w:r>
-        <w:t xml:space="preserve">Filters apply to both views and to the export.</w:t>
+        <w:t xml:space="preserve">Filters apply to both views and to the export. Two more controls sit in the same row. The date menu keeps the last 7, 30, 90 days or 12 months, or a range you pick with two dates; a second menu chooses whether that goes by posted date (the release date is used where a post has none) or by release date. Show limits the page to the first 25 to 500 results in the current sort order, and the export is limited the same way.</w:t>
       </w:r>
     </w:p>
     <w:p>
@@ -2178,7 +2178,7 @@
         </w:numPr>
       </w:pPr>
       <w:r>
-        <w:t xml:space="preserve">When the same track is on a release you own and on another, the one you own is returned. Numbers in a title must agree exactly, so "Hybrid Kit 6" does not match "Hybrid Kit 2". A track page is swapped for the album it belongs to.</w:t>
+        <w:t xml:space="preserve">When the same track is on a release you own and on another, the one you own is returned. Numbers in a title must agree exactly, so "Hybrid Kit 6" does not match "Hybrid Kit 2". A WIP marker ("Title WIP", "Title (WIP)") is a status, not part of the title, and is ignored. A track page is swapped for the album it belongs to.</w:t>
       </w:r>
     </w:p>
     <w:p>
@@ -4623,7 +4623,7 @@
     <w:p>
       <w:pPr/>
       <w:r>
-        <w:t xml:space="preserve">Versions 1 and 2 were delivered before the app showed a version number; the numbers are given here for reference. Versions 1 to 9 date from 9 October 2026, versions 10 to 33 from 10 October 2026.</w:t>
+        <w:t xml:space="preserve">Versions 1 and 2 were delivered before the app showed a version number; the numbers are given here for reference. Versions 1 to 9 date from 9 October 2026, versions 10 to 33 from 10 October 2026, version 34 from 11 October 2026.</w:t>
       </w:r>
     </w:p>
     <w:tbl>
@@ -4662,6 +4662,30 @@
             <w:pPr/>
             <w:r>
               <w:t xml:space="preserve">What changed</w:t>
+            </w:r>
+          </w:p>
+        </w:tc>
+      </w:tr>
+      <w:tr>
+        <w:tc>
+          <w:tcPr>
+            <w:tcW w:w="4680" w:type="dxa"/>
+          </w:tcPr>
+          <w:p>
+            <w:pPr/>
+            <w:r>
+              <w:t xml:space="preserve">34</w:t>
+            </w:r>
+          </w:p>
+        </w:tc>
+        <w:tc>
+          <w:tcPr>
+            <w:tcW w:w="4680" w:type="dxa"/>
+          </w:tcPr>
+          <w:p>
+            <w:pPr/>
+            <w:r>
+              <w:t xml:space="preserve">List columns can be dragged to reorder and shown or hidden from a Columns menu; new default order Artist, Track, Duration, Year, Released, Posted, Release, Label, Site. Date filter (last N days or a date range, by posted or release date). Show-first-N limit on results and export. WIP markers ignored when matching titles. Guide included in the zip under docs.</w:t>
             </w:r>
           </w:p>
         </w:tc>

</xml_diff>

<commit_message>
v36: Default list order swaps Release and Released: Artist, Track, Duration, Year, Release, Posted, Released, Label, Site. Link Finder export puts year before the link.
Co-Authored-By: Claude Opus 5.5 <noreply@anthropic.com>
</commit_message>
<xml_diff>
--- a/docs/Artist Feed User Guide.docx
+++ b/docs/Artist Feed User Guide.docx
@@ -33,7 +33,7 @@
     <w:p>
       <w:pPr/>
       <w:r>
-        <w:t xml:space="preserve">This guide describes Artist Feed version 35. The version number is shown in small grey text beside the title at the top of the app.</w:t>
+        <w:t xml:space="preserve">This guide describes Artist Feed version 36. The version number is shown in small grey text beside the title at the top of the app.</w:t>
       </w:r>
     </w:p>
     <w:p>
@@ -517,7 +517,7 @@
         <w:t xml:space="preserve">List</w:t>
       </w:r>
       <w:r>
-        <w:t xml:space="preserve"> shows one row per track: artist, track, duration, year, release date, posted date, release, label and site. It opens sorted by Posted, newest first.</w:t>
+        <w:t xml:space="preserve"> shows one row per track: artist, track, duration, year, release, posted date, release date, label and site. It opens sorted by Posted, newest first.</w:t>
       </w:r>
     </w:p>
     <w:p>
@@ -1807,7 +1807,7 @@
         <w:t xml:space="preserve">Export results</w:t>
       </w:r>
       <w:r>
-        <w:t xml:space="preserve"> downloads the list in its original order with link, site, release, year, result, and the steps tried.</w:t>
+        <w:t xml:space="preserve"> downloads the list in its original order with year, link, site, release, result, and the steps tried.</w:t>
       </w:r>
     </w:p>
     <w:p>
@@ -4635,7 +4635,7 @@
     <w:p>
       <w:pPr/>
       <w:r>
-        <w:t xml:space="preserve">Versions 1 and 2 were delivered before the app showed a version number; the numbers are given here for reference. Versions 1 to 9 date from 9 October 2026, versions 10 to 33 from 10 October 2026, versions 34 and 35 from 11 October 2026.</w:t>
+        <w:t xml:space="preserve">Versions 1 and 2 were delivered before the app showed a version number; the numbers are given here for reference. Versions 1 to 9 date from 9 October 2026, versions 10 to 33 from 10 October 2026, versions 34 to 36 from 11 October 2026.</w:t>
       </w:r>
     </w:p>
     <w:tbl>
@@ -4674,6 +4674,30 @@
             <w:pPr/>
             <w:r>
               <w:t xml:space="preserve">What changed</w:t>
+            </w:r>
+          </w:p>
+        </w:tc>
+      </w:tr>
+      <w:tr>
+        <w:tc>
+          <w:tcPr>
+            <w:tcW w:w="4680" w:type="dxa"/>
+          </w:tcPr>
+          <w:p>
+            <w:pPr/>
+            <w:r>
+              <w:t xml:space="preserve">36</w:t>
+            </w:r>
+          </w:p>
+        </w:tc>
+        <w:tc>
+          <w:tcPr>
+            <w:tcW w:w="4680" w:type="dxa"/>
+          </w:tcPr>
+          <w:p>
+            <w:pPr/>
+            <w:r>
+              <w:t xml:space="preserve">Default list order swaps Release and Released: Artist, Track, Duration, Year, Release, Posted, Released, Label, Site. Link Finder export puts year before the link.</w:t>
             </w:r>
           </w:p>
         </w:tc>

</xml_diff>

<commit_message>
v39: Link Finder: uncertain links are marked Needs review with a red tint that stays until confirmed (Looks right) or corrected, and the export has a "needs review" column. Bandcamp search answers are saved for 7 days, so repeat searches after an update are nearly free. Search again button on each row, and a tick box to search again for not-found rows only. Hint text states that a row needs artist and track title.
Co-Authored-By: Claude Opus 5.5 <noreply@anthropic.com>
</commit_message>
<xml_diff>
--- a/docs/Artist Feed User Guide.docx
+++ b/docs/Artist Feed User Guide.docx
@@ -33,7 +33,7 @@
     <w:p>
       <w:pPr/>
       <w:r>
-        <w:t xml:space="preserve">This guide describes Artist Feed version 38. The version number is shown in small grey text beside the title at the top of the app.</w:t>
+        <w:t xml:space="preserve">This guide describes Artist Feed version 39. The version number is shown in small grey text beside the title at the top of the app.</w:t>
       </w:r>
     </w:p>
     <w:p>
@@ -1366,7 +1366,7 @@
         </w:numPr>
       </w:pPr>
       <w:r>
-        <w:t xml:space="preserve">No header row is needed. Artist then title, separated by a tab, is enough.</w:t>
+        <w:t xml:space="preserve">Each row needs two things: the artist and the track title. That is all a search uses. No header row is needed; artist then title, separated by a tab, is enough.</w:t>
       </w:r>
     </w:p>
     <w:p>
@@ -1646,7 +1646,7 @@
         <w:t xml:space="preserve">What was tried</w:t>
       </w:r>
       <w:r>
-        <w:t xml:space="preserve"> lists every step and what it found. While a lookup runs, rows not yet answered have a soft blue tint, and the row being searched pulses and reads "Searching now…".</w:t>
+        <w:t xml:space="preserve"> lists every step and what it found. While a lookup runs, rows not yet answered have a soft blue tint, and the row being searched pulses and reads "Searching now…". A row whose link is a guess (a SoundCloud profile picked by name alone, or a partial Bandcamp match) is marked Needs review and tinted red. It stays that way after the lookup finishes, until you press Looks right, which keeps the link as one you set, or correct it with Edit.</w:t>
       </w:r>
     </w:p>
     <w:p>
@@ -1708,7 +1708,7 @@
         <w:t xml:space="preserve">Search again for saved results.</w:t>
       </w:r>
       <w:r>
-        <w:t xml:space="preserve"> Normally a track looked up before is answered from the saved result. Tick this to run every step again, for example after a track has been released or bought.</w:t>
+        <w:t xml:space="preserve"> Normally a track looked up before is answered from the saved result. Tick this to run every step again, for example after a track has been released or bought. Search again for not-found rows only keeps the saved answers for tracks that were found and searches again just for the rows saved as not found. Each row of a finished lookup also has its own Search again button.</w:t>
       </w:r>
     </w:p>
     <w:p>
@@ -1807,7 +1807,7 @@
         <w:t xml:space="preserve">Export results</w:t>
       </w:r>
       <w:r>
-        <w:t xml:space="preserve"> downloads the list in its original order with year, link, site, release, result, and the steps tried.</w:t>
+        <w:t xml:space="preserve"> downloads the list in its original order with year, link, a "needs review" column, site, release, result, and the steps tried.</w:t>
       </w:r>
     </w:p>
     <w:p>
@@ -3948,7 +3948,7 @@
         <w:t xml:space="preserve">not</w:t>
       </w:r>
       <w:r>
-        <w:t xml:space="preserve"> a Bandcamp release are searched again once. Found releases and links you set are kept.</w:t>
+        <w:t xml:space="preserve"> a Bandcamp release are searched again once. Found releases and links you set are kept. Bandcamp's search answers are themselves kept for 7 days (LOOKUP_SEARCH_DAYS in docker-compose.yml), so a repeat search like this asks Bandcamp almost nothing. Pressing Search again, or ticking either search-again box, asks Bandcamp anew.</w:t>
       </w:r>
     </w:p>
     <w:p>
@@ -4635,7 +4635,7 @@
     <w:p>
       <w:pPr/>
       <w:r>
-        <w:t xml:space="preserve">Versions 1 and 2 were delivered before the app showed a version number; the numbers are given here for reference. Versions 1 to 9 date from 9 October 2026, versions 10 to 33 from 10 October 2026, versions 34 to 38 from 11 October 2026.</w:t>
+        <w:t xml:space="preserve">Versions 1 and 2 were delivered before the app showed a version number; the numbers are given here for reference. Versions 1 to 9 date from 9 October 2026, versions 10 to 33 from 10 October 2026, versions 34 to 39 from 11 October 2026.</w:t>
       </w:r>
     </w:p>
     <w:tbl>
@@ -4674,6 +4674,30 @@
             <w:pPr/>
             <w:r>
               <w:t xml:space="preserve">What changed</w:t>
+            </w:r>
+          </w:p>
+        </w:tc>
+      </w:tr>
+      <w:tr>
+        <w:tc>
+          <w:tcPr>
+            <w:tcW w:w="4680" w:type="dxa"/>
+          </w:tcPr>
+          <w:p>
+            <w:pPr/>
+            <w:r>
+              <w:t xml:space="preserve">39</w:t>
+            </w:r>
+          </w:p>
+        </w:tc>
+        <w:tc>
+          <w:tcPr>
+            <w:tcW w:w="4680" w:type="dxa"/>
+          </w:tcPr>
+          <w:p>
+            <w:pPr/>
+            <w:r>
+              <w:t xml:space="preserve">Link Finder: uncertain links are marked Needs review with a red tint that stays until confirmed (Looks right) or corrected, and the export has a "needs review" column. Bandcamp search answers are saved for 7 days, so repeat searches after an update are nearly free. Search again button on each row, and a tick box to search again for not-found rows only. Hint text states that a row needs artist and track title.</w:t>
             </w:r>
           </w:p>
         </w:tc>

</xml_diff>

<commit_message>
v40: Link Finder: Saved results tab listing every track looked up, with search, filters, row actions and export. Import your own list of artist and title spellings, with optional links and link notes; spellings appear as separate columns and list links are used when the lookup has nothing better. Each version of a title (a remix, a VIP) now has its own saved answer instead of sharing the plain title's.
Co-Authored-By: Claude Opus 5.5 <noreply@anthropic.com>
</commit_message>
<xml_diff>
--- a/docs/Artist Feed User Guide.docx
+++ b/docs/Artist Feed User Guide.docx
@@ -33,7 +33,7 @@
     <w:p>
       <w:pPr/>
       <w:r>
-        <w:t xml:space="preserve">This guide describes Artist Feed version 39. The version number is shown in small grey text beside the title at the top of the app.</w:t>
+        <w:t xml:space="preserve">This guide describes Artist Feed version 40. The version number is shown in small grey text beside the title at the top of the app.</w:t>
       </w:r>
     </w:p>
     <w:p>
@@ -1807,7 +1807,170 @@
         <w:t xml:space="preserve">Export results</w:t>
       </w:r>
       <w:r>
-        <w:t xml:space="preserve"> downloads the list in its original order with year, link, a "needs review" column, site, release, result, and the steps tried.</w:t>
+        <w:t xml:space="preserve"> downloads the list in its original order with year, link, a "needs review" column, your spelling of the artist and title and the link note (from your list, when you have imported one), site, release, result, and the steps tried.</w:t>
+      </w:r>
+    </w:p>
+    <w:p>
+      <w:pPr>
+        <w:pStyle w:val="Heading3"/>
+      </w:pPr>
+      <w:r>
+        <w:t xml:space="preserve">Saved results</w:t>
+      </w:r>
+    </w:p>
+    <w:p>
+      <w:pPr/>
+      <w:r>
+        <w:t xml:space="preserve">The </w:t>
+      </w:r>
+      <w:r>
+        <w:rPr>
+          <w:b/>
+        </w:rPr>
+        <w:t xml:space="preserve">Saved results</w:t>
+      </w:r>
+      <w:r>
+        <w:t xml:space="preserve"> tab in Link Finder lists every track looked up so far, newest first, with its link, year, result and the date it was saved. Search it, or filter to rows that need review, were not found, were found, have a link you set, are in your list, or have no spelling on file. Export downloads whatever the search and filter show.</w:t>
+      </w:r>
+    </w:p>
+    <w:p>
+      <w:pPr/>
+      <w:r>
+        <w:t xml:space="preserve">Each track is listed under the tidied form of its name: lower case, no accents or punctuation, and no describing tags. That is the form tracks are matched by. A version keeps its own entry, shown in square brackets, so "Temperature" and "Temperature (River Dub Edit)" are saved separately. What you typed is shown beneath when it differs; tracks saved before version 40 only have the tidied form.</w:t>
+      </w:r>
+    </w:p>
+    <w:p>
+      <w:pPr/>
+      <w:r>
+        <w:t xml:space="preserve">Each row has Edit, Search again and Forget, plus Looks right on rows marked for review. Forget removes the saved answer, so the track is searched for next time.</w:t>
+      </w:r>
+    </w:p>
+    <w:p>
+      <w:pPr>
+        <w:pStyle w:val="Heading3"/>
+      </w:pPr>
+      <w:r>
+        <w:t xml:space="preserve">Your list of spellings and links</w:t>
+      </w:r>
+    </w:p>
+    <w:p>
+      <w:pPr/>
+      <w:r>
+        <w:rPr>
+          <w:b/>
+        </w:rPr>
+        <w:t xml:space="preserve">Import your list</w:t>
+      </w:r>
+      <w:r>
+        <w:t xml:space="preserve"> takes a spreadsheet or CSV of how artists and titles should be written. It needs an Artist column and, for tracks, a Title column. A row with only an artist gives that artist's spelling for all their tracks.</w:t>
+      </w:r>
+    </w:p>
+    <w:p>
+      <w:pPr>
+        <w:pStyle w:val="ListParagraph"/>
+        <w:numPr>
+          <w:ilvl w:val="0"/>
+          <w:numId w:val="16"/>
+        </w:numPr>
+      </w:pPr>
+      <w:r>
+        <w:t xml:space="preserve">Your spelling is shown beside the tidied form here, under the names in lookup results, and as its own columns in both exports. The tidied form is kept.</w:t>
+      </w:r>
+    </w:p>
+    <w:p>
+      <w:pPr>
+        <w:pStyle w:val="ListParagraph"/>
+        <w:numPr>
+          <w:ilvl w:val="0"/>
+          <w:numId w:val="16"/>
+        </w:numPr>
+      </w:pPr>
+      <w:r>
+        <w:t xml:space="preserve">The list may include links, in columns named Link, URL, Bandcamp or SoundCloud, or anywhere a web address appears. Text written beside a link, such as "(limited time only)" or "(Patreon)", is kept separately as a note and shown and exported in its own column.</w:t>
+      </w:r>
+    </w:p>
+    <w:p>
+      <w:pPr>
+        <w:pStyle w:val="ListParagraph"/>
+        <w:numPr>
+          <w:ilvl w:val="0"/>
+          <w:numId w:val="16"/>
+        </w:numPr>
+      </w:pPr>
+      <w:r>
+        <w:t xml:space="preserve">When a name appears twice with different spellings, the first is kept and the import reports the others.</w:t>
+      </w:r>
+    </w:p>
+    <w:p>
+      <w:pPr>
+        <w:pStyle w:val="ListParagraph"/>
+        <w:numPr>
+          <w:ilvl w:val="0"/>
+          <w:numId w:val="16"/>
+        </w:numPr>
+      </w:pPr>
+      <w:r>
+        <w:t xml:space="preserve">Importing again updates the list. Remove my list deletes it; saved results and links you set are kept.</w:t>
+      </w:r>
+    </w:p>
+    <w:p>
+      <w:pPr/>
+      <w:r>
+        <w:t xml:space="preserve">A link from your list is used only when the lookup has nothing better:</w:t>
+      </w:r>
+    </w:p>
+    <w:p>
+      <w:pPr>
+        <w:pStyle w:val="ListParagraph"/>
+        <w:numPr>
+          <w:ilvl w:val="0"/>
+          <w:numId w:val="17"/>
+        </w:numPr>
+      </w:pPr>
+      <w:r>
+        <w:t xml:space="preserve">A link you set in the app with Edit or Looks right always comes first.</w:t>
+      </w:r>
+    </w:p>
+    <w:p>
+      <w:pPr>
+        <w:pStyle w:val="ListParagraph"/>
+        <w:numPr>
+          <w:ilvl w:val="0"/>
+          <w:numId w:val="17"/>
+        </w:numPr>
+      </w:pPr>
+      <w:r>
+        <w:t xml:space="preserve">Then a Bandcamp release or SoundCloud track the lookup found itself. Lists go out of date, for example when a track that only had a SoundCloud page has since been released.</w:t>
+      </w:r>
+    </w:p>
+    <w:p>
+      <w:pPr>
+        <w:pStyle w:val="ListParagraph"/>
+        <w:numPr>
+          <w:ilvl w:val="0"/>
+          <w:numId w:val="17"/>
+        </w:numPr>
+      </w:pPr>
+      <w:r>
+        <w:t xml:space="preserve">Then the link from your list. A Bandcamp release link answers the row without searching. Any other link is used only after a Bandcamp search finds nothing.</w:t>
+      </w:r>
+    </w:p>
+    <w:p>
+      <w:pPr>
+        <w:pStyle w:val="ListParagraph"/>
+        <w:numPr>
+          <w:ilvl w:val="0"/>
+          <w:numId w:val="17"/>
+        </w:numPr>
+      </w:pPr>
+      <w:r>
+        <w:t xml:space="preserve">Last, the lookup's own fallback: an artist page or a partial match.</w:t>
+      </w:r>
+    </w:p>
+    <w:p>
+      <w:pPr/>
+      <w:r>
+        <w:t xml:space="preserve">When your list's link is not the one shown, it still appears beneath as "your list had".</w:t>
       </w:r>
     </w:p>
     <w:p>
@@ -1880,7 +2043,7 @@
         <w:pStyle w:val="ListParagraph"/>
         <w:numPr>
           <w:ilvl w:val="0"/>
-          <w:numId w:val="16"/>
+          <w:numId w:val="18"/>
         </w:numPr>
       </w:pPr>
       <w:r>
@@ -1892,7 +2055,7 @@
         <w:pStyle w:val="ListParagraph"/>
         <w:numPr>
           <w:ilvl w:val="0"/>
-          <w:numId w:val="16"/>
+          <w:numId w:val="18"/>
         </w:numPr>
       </w:pPr>
       <w:r>
@@ -1918,7 +2081,7 @@
         <w:pStyle w:val="ListParagraph"/>
         <w:numPr>
           <w:ilvl w:val="0"/>
-          <w:numId w:val="17"/>
+          <w:numId w:val="19"/>
         </w:numPr>
       </w:pPr>
       <w:r>
@@ -1936,7 +2099,7 @@
         <w:pStyle w:val="ListParagraph"/>
         <w:numPr>
           <w:ilvl w:val="0"/>
-          <w:numId w:val="17"/>
+          <w:numId w:val="19"/>
         </w:numPr>
       </w:pPr>
       <w:r>
@@ -1974,7 +2137,7 @@
         <w:pStyle w:val="ListParagraph"/>
         <w:numPr>
           <w:ilvl w:val="0"/>
-          <w:numId w:val="18"/>
+          <w:numId w:val="20"/>
         </w:numPr>
       </w:pPr>
       <w:r>
@@ -1992,7 +2155,7 @@
         <w:pStyle w:val="ListParagraph"/>
         <w:numPr>
           <w:ilvl w:val="0"/>
-          <w:numId w:val="18"/>
+          <w:numId w:val="20"/>
         </w:numPr>
       </w:pPr>
       <w:r>
@@ -2010,7 +2173,7 @@
         <w:pStyle w:val="ListParagraph"/>
         <w:numPr>
           <w:ilvl w:val="0"/>
-          <w:numId w:val="18"/>
+          <w:numId w:val="20"/>
         </w:numPr>
       </w:pPr>
       <w:r>
@@ -2034,7 +2197,7 @@
         <w:pStyle w:val="ListParagraph"/>
         <w:numPr>
           <w:ilvl w:val="0"/>
-          <w:numId w:val="19"/>
+          <w:numId w:val="21"/>
         </w:numPr>
       </w:pPr>
       <w:r>
@@ -2046,7 +2209,7 @@
         <w:pStyle w:val="ListParagraph"/>
         <w:numPr>
           <w:ilvl w:val="0"/>
-          <w:numId w:val="19"/>
+          <w:numId w:val="21"/>
         </w:numPr>
       </w:pPr>
       <w:r>
@@ -2058,7 +2221,7 @@
         <w:pStyle w:val="ListParagraph"/>
         <w:numPr>
           <w:ilvl w:val="0"/>
-          <w:numId w:val="19"/>
+          <w:numId w:val="21"/>
         </w:numPr>
       </w:pPr>
       <w:r>
@@ -2070,7 +2233,7 @@
         <w:pStyle w:val="ListParagraph"/>
         <w:numPr>
           <w:ilvl w:val="0"/>
-          <w:numId w:val="19"/>
+          <w:numId w:val="21"/>
         </w:numPr>
       </w:pPr>
       <w:r>
@@ -2082,7 +2245,7 @@
         <w:pStyle w:val="ListParagraph"/>
         <w:numPr>
           <w:ilvl w:val="0"/>
-          <w:numId w:val="19"/>
+          <w:numId w:val="21"/>
         </w:numPr>
       </w:pPr>
       <w:r>
@@ -2094,7 +2257,7 @@
         <w:pStyle w:val="ListParagraph"/>
         <w:numPr>
           <w:ilvl w:val="0"/>
-          <w:numId w:val="19"/>
+          <w:numId w:val="21"/>
         </w:numPr>
       </w:pPr>
       <w:r>
@@ -2106,7 +2269,7 @@
         <w:pStyle w:val="ListParagraph"/>
         <w:numPr>
           <w:ilvl w:val="0"/>
-          <w:numId w:val="19"/>
+          <w:numId w:val="21"/>
         </w:numPr>
       </w:pPr>
       <w:r>
@@ -2126,7 +2289,7 @@
         <w:pStyle w:val="ListParagraph"/>
         <w:numPr>
           <w:ilvl w:val="0"/>
-          <w:numId w:val="20"/>
+          <w:numId w:val="22"/>
         </w:numPr>
       </w:pPr>
       <w:r>
@@ -2138,7 +2301,7 @@
         <w:pStyle w:val="ListParagraph"/>
         <w:numPr>
           <w:ilvl w:val="0"/>
-          <w:numId w:val="20"/>
+          <w:numId w:val="22"/>
         </w:numPr>
       </w:pPr>
       <w:r>
@@ -2150,7 +2313,7 @@
         <w:pStyle w:val="ListParagraph"/>
         <w:numPr>
           <w:ilvl w:val="0"/>
-          <w:numId w:val="20"/>
+          <w:numId w:val="22"/>
         </w:numPr>
       </w:pPr>
       <w:r>
@@ -2162,7 +2325,7 @@
         <w:pStyle w:val="ListParagraph"/>
         <w:numPr>
           <w:ilvl w:val="0"/>
-          <w:numId w:val="20"/>
+          <w:numId w:val="22"/>
         </w:numPr>
       </w:pPr>
       <w:r>
@@ -2174,7 +2337,7 @@
         <w:pStyle w:val="ListParagraph"/>
         <w:numPr>
           <w:ilvl w:val="0"/>
-          <w:numId w:val="20"/>
+          <w:numId w:val="22"/>
         </w:numPr>
       </w:pPr>
       <w:r>
@@ -3902,7 +4065,7 @@
         <w:pStyle w:val="ListParagraph"/>
         <w:numPr>
           <w:ilvl w:val="0"/>
-          <w:numId w:val="21"/>
+          <w:numId w:val="23"/>
         </w:numPr>
       </w:pPr>
       <w:r>
@@ -3923,7 +4086,7 @@
         <w:pStyle w:val="ListParagraph"/>
         <w:numPr>
           <w:ilvl w:val="0"/>
-          <w:numId w:val="21"/>
+          <w:numId w:val="23"/>
         </w:numPr>
       </w:pPr>
       <w:r>
@@ -3935,7 +4098,7 @@
         <w:pStyle w:val="ListParagraph"/>
         <w:numPr>
           <w:ilvl w:val="0"/>
-          <w:numId w:val="21"/>
+          <w:numId w:val="23"/>
         </w:numPr>
       </w:pPr>
       <w:r>
@@ -3956,7 +4119,7 @@
         <w:pStyle w:val="ListParagraph"/>
         <w:numPr>
           <w:ilvl w:val="0"/>
-          <w:numId w:val="21"/>
+          <w:numId w:val="23"/>
         </w:numPr>
       </w:pPr>
       <w:r>
@@ -3991,7 +4154,7 @@
         <w:pStyle w:val="ListParagraph"/>
         <w:numPr>
           <w:ilvl w:val="0"/>
-          <w:numId w:val="22"/>
+          <w:numId w:val="24"/>
         </w:numPr>
       </w:pPr>
       <w:r>
@@ -4009,7 +4172,7 @@
         <w:pStyle w:val="ListParagraph"/>
         <w:numPr>
           <w:ilvl w:val="0"/>
-          <w:numId w:val="22"/>
+          <w:numId w:val="24"/>
         </w:numPr>
       </w:pPr>
       <w:r>
@@ -4027,7 +4190,7 @@
         <w:pStyle w:val="ListParagraph"/>
         <w:numPr>
           <w:ilvl w:val="0"/>
-          <w:numId w:val="22"/>
+          <w:numId w:val="24"/>
         </w:numPr>
       </w:pPr>
       <w:r>
@@ -4045,7 +4208,7 @@
         <w:pStyle w:val="ListParagraph"/>
         <w:numPr>
           <w:ilvl w:val="0"/>
-          <w:numId w:val="22"/>
+          <w:numId w:val="24"/>
         </w:numPr>
       </w:pPr>
       <w:r>
@@ -4063,7 +4226,7 @@
         <w:pStyle w:val="ListParagraph"/>
         <w:numPr>
           <w:ilvl w:val="0"/>
-          <w:numId w:val="22"/>
+          <w:numId w:val="24"/>
         </w:numPr>
       </w:pPr>
       <w:r>
@@ -4081,7 +4244,7 @@
         <w:pStyle w:val="ListParagraph"/>
         <w:numPr>
           <w:ilvl w:val="0"/>
-          <w:numId w:val="22"/>
+          <w:numId w:val="24"/>
         </w:numPr>
       </w:pPr>
       <w:r>
@@ -4099,7 +4262,7 @@
         <w:pStyle w:val="ListParagraph"/>
         <w:numPr>
           <w:ilvl w:val="0"/>
-          <w:numId w:val="22"/>
+          <w:numId w:val="24"/>
         </w:numPr>
       </w:pPr>
       <w:r>
@@ -4117,7 +4280,7 @@
         <w:pStyle w:val="ListParagraph"/>
         <w:numPr>
           <w:ilvl w:val="0"/>
-          <w:numId w:val="22"/>
+          <w:numId w:val="24"/>
         </w:numPr>
       </w:pPr>
       <w:r>
@@ -4135,7 +4298,7 @@
         <w:pStyle w:val="ListParagraph"/>
         <w:numPr>
           <w:ilvl w:val="0"/>
-          <w:numId w:val="22"/>
+          <w:numId w:val="24"/>
         </w:numPr>
       </w:pPr>
       <w:r>
@@ -4153,7 +4316,7 @@
         <w:pStyle w:val="ListParagraph"/>
         <w:numPr>
           <w:ilvl w:val="0"/>
-          <w:numId w:val="22"/>
+          <w:numId w:val="24"/>
         </w:numPr>
       </w:pPr>
       <w:r>
@@ -4171,7 +4334,7 @@
         <w:pStyle w:val="ListParagraph"/>
         <w:numPr>
           <w:ilvl w:val="0"/>
-          <w:numId w:val="22"/>
+          <w:numId w:val="24"/>
         </w:numPr>
       </w:pPr>
       <w:r>
@@ -4635,7 +4798,7 @@
     <w:p>
       <w:pPr/>
       <w:r>
-        <w:t xml:space="preserve">Versions 1 and 2 were delivered before the app showed a version number; the numbers are given here for reference. Versions 1 to 9 date from 9 October 2026, versions 10 to 33 from 10 October 2026, versions 34 to 39 from 11 October 2026.</w:t>
+        <w:t xml:space="preserve">Versions 1 and 2 were delivered before the app showed a version number; the numbers are given here for reference. Versions 1 to 9 date from 9 October 2026, versions 10 to 33 from 10 October 2026, versions 34 to 40 from 11 October 2026.</w:t>
       </w:r>
     </w:p>
     <w:tbl>
@@ -4674,6 +4837,30 @@
             <w:pPr/>
             <w:r>
               <w:t xml:space="preserve">What changed</w:t>
+            </w:r>
+          </w:p>
+        </w:tc>
+      </w:tr>
+      <w:tr>
+        <w:tc>
+          <w:tcPr>
+            <w:tcW w:w="4680" w:type="dxa"/>
+          </w:tcPr>
+          <w:p>
+            <w:pPr/>
+            <w:r>
+              <w:t xml:space="preserve">40</w:t>
+            </w:r>
+          </w:p>
+        </w:tc>
+        <w:tc>
+          <w:tcPr>
+            <w:tcW w:w="4680" w:type="dxa"/>
+          </w:tcPr>
+          <w:p>
+            <w:pPr/>
+            <w:r>
+              <w:t xml:space="preserve">Link Finder: Saved results tab listing every track looked up, with search, filters, row actions and export. Import your own list of artist and title spellings, with optional links and link notes; spellings appear as separate columns and list links are used when the lookup has nothing better. Each version of a title (a remix, a VIP) now has its own saved answer instead of sharing the plain title's.</w:t>
             </w:r>
           </w:p>
         </w:tc>
@@ -5864,10 +6051,7 @@
     </w:lvlOverride>
   </w:num>
   <w:num w:numId="18">
-    <w:abstractNumId w:val="1"/>
-    <w:lvlOverride w:ilvl="0">
-      <w:startOverride w:val="1"/>
-    </w:lvlOverride>
+    <w:abstractNumId w:val="0"/>
   </w:num>
   <w:num w:numId="19">
     <w:abstractNumId w:val="1"/>
@@ -5876,12 +6060,24 @@
     </w:lvlOverride>
   </w:num>
   <w:num w:numId="20">
+    <w:abstractNumId w:val="1"/>
+    <w:lvlOverride w:ilvl="0">
+      <w:startOverride w:val="1"/>
+    </w:lvlOverride>
+  </w:num>
+  <w:num w:numId="21">
+    <w:abstractNumId w:val="1"/>
+    <w:lvlOverride w:ilvl="0">
+      <w:startOverride w:val="1"/>
+    </w:lvlOverride>
+  </w:num>
+  <w:num w:numId="22">
     <w:abstractNumId w:val="0"/>
   </w:num>
-  <w:num w:numId="21">
+  <w:num w:numId="23">
     <w:abstractNumId w:val="0"/>
   </w:num>
-  <w:num w:numId="22">
+  <w:num w:numId="24">
     <w:abstractNumId w:val="0"/>
   </w:num>
 </w:numbering>

</xml_diff>

<commit_message>
v46: Saved results: click a column heading to sort by it. The sort covers the whole table, not only the rows loaded, and the export follows it.
Co-Authored-By: Claude Opus 5.5 <noreply@anthropic.com>
</commit_message>
<xml_diff>
--- a/docs/Artist Feed User Guide.docx
+++ b/docs/Artist Feed User Guide.docx
@@ -1830,7 +1830,7 @@
         <w:t xml:space="preserve">Saved results</w:t>
       </w:r>
       <w:r>
-        <w:t xml:space="preserve"> tab in Link Finder lists every track looked up so far, newest first, with its link, year, result and the date it was saved. Search it, or filter to rows that need review, have no link to the track itself (only an artist page, a profile or a search), have the track found on Bandcamp or SoundCloud, have a link you set, are in your list, or have no spelling on file. Export downloads whatever the search and filter show.</w:t>
+        <w:t xml:space="preserve"> tab in Link Finder lists every track looked up so far, newest first, with its link, year, result and the date it was saved. Search it, or filter to rows that need review, have no link to the track itself (only an artist page, a profile or a search), have the track found on Bandcamp or SoundCloud, have a link you set, are in your list, or have no spelling on file. Click a column heading to sort the whole table by it, again to reverse the order, and a third time to return to newest first. Rows with nothing in that column go last. Export downloads whatever the search and filter show, in the order shown.</w:t>
       </w:r>
     </w:p>
     <w:p>
@@ -4837,6 +4837,30 @@
             <w:pPr/>
             <w:r>
               <w:t xml:space="preserve">What changed</w:t>
+            </w:r>
+          </w:p>
+        </w:tc>
+      </w:tr>
+      <w:tr>
+        <w:tc>
+          <w:tcPr>
+            <w:tcW w:w="4680" w:type="dxa"/>
+          </w:tcPr>
+          <w:p>
+            <w:pPr/>
+            <w:r>
+              <w:t xml:space="preserve">46</w:t>
+            </w:r>
+          </w:p>
+        </w:tc>
+        <w:tc>
+          <w:tcPr>
+            <w:tcW w:w="4680" w:type="dxa"/>
+          </w:tcPr>
+          <w:p>
+            <w:pPr/>
+            <w:r>
+              <w:t xml:space="preserve">Saved results: click a column heading to sort by it. The sort covers the whole table, not only the rows loaded, and the export follows it.</w:t>
             </w:r>
           </w:p>
         </w:tc>

</xml_diff>

<commit_message>
v45: Link Finder: a remix, edit, flip or bootleg typed without brackets is read as one when the title as typed finds no track, so it falls back to the remixer's SoundCloud profile and matches your list's bracketed spelling. For any remix with no link of its own, the remixer's SoundCloud profile is used even when Bandcamp is the preferred artist link.
Co-Authored-By: Claude Opus 5.5 <noreply@anthropic.com>
</commit_message>
<xml_diff>
--- a/docs/Artist Feed User Guide.docx
+++ b/docs/Artist Feed User Guide.docx
@@ -1775,7 +1775,7 @@
         </w:numPr>
       </w:pPr>
       <w:r>
-        <w:t xml:space="preserve">A request that names a remixer never returns the plain original.</w:t>
+        <w:t xml:space="preserve">A request that names a remixer never returns the plain original. When a remix, edit, flip or bootleg has no link of its own, the remixer's SoundCloud profile is given, whichever artist link you prefer otherwise. A remix typed without brackets, such as "Outside The Box IOWLA Flip", is first looked for as typed; if that finds no track, it is read as "Outside The Box (IOWLA Flip)" and looked for again. Brackets are still the reliable way to write one.</w:t>
       </w:r>
     </w:p>
     <w:p>
@@ -4837,6 +4837,30 @@
             <w:pPr/>
             <w:r>
               <w:t xml:space="preserve">What changed</w:t>
+            </w:r>
+          </w:p>
+        </w:tc>
+      </w:tr>
+      <w:tr>
+        <w:tc>
+          <w:tcPr>
+            <w:tcW w:w="4680" w:type="dxa"/>
+          </w:tcPr>
+          <w:p>
+            <w:pPr/>
+            <w:r>
+              <w:t xml:space="preserve">45</w:t>
+            </w:r>
+          </w:p>
+        </w:tc>
+        <w:tc>
+          <w:tcPr>
+            <w:tcW w:w="4680" w:type="dxa"/>
+          </w:tcPr>
+          <w:p>
+            <w:pPr/>
+            <w:r>
+              <w:t xml:space="preserve">Link Finder: a remix, edit, flip or bootleg typed without brackets is read as one when the title as typed finds no track, so it falls back to the remixer's SoundCloud profile and matches your list's bracketed spelling. For any remix with no link of its own, the remixer's SoundCloud profile is used even when Bandcamp is the preferred artist link.</w:t>
             </w:r>
           </w:p>
         </w:tc>

</xml_diff>

<commit_message>
v43: Saved results: fixed Edit and Looks right doing nothing on VIP and remix tracks saved before version 40; those answers are moved to their version's own entry at start-up, so they also pick up the title spelling from your list. Your spelling is now two columns, artist and title.
Co-Authored-By: Claude Opus 5.5 <noreply@anthropic.com>
</commit_message>
<xml_diff>
--- a/docs/Artist Feed User Guide.docx
+++ b/docs/Artist Feed User Guide.docx
@@ -1836,7 +1836,7 @@
     <w:p>
       <w:pPr/>
       <w:r>
-        <w:t xml:space="preserve">Each track is listed under the tidied form of its name: lower case, no accents or punctuation (ø is read as o; letters of other alphabets, such as Cyrillic or Chinese, are kept as they are), and no describing tags or status notes such as "(WIP)" or "(forth. Label)". That is the form tracks are matched by. A version keeps its own entry, shown in square brackets, so "Temperature" and "Temperature (River Dub Edit)" are saved separately. What you typed is shown beneath when it differs; tracks saved before version 40 only have the tidied form.</w:t>
+        <w:t xml:space="preserve">Each track is listed under the tidied form of its name: lower case, no accents or punctuation (ø is read as o; letters of other alphabets, such as Cyrillic or Chinese, are kept as they are), and no describing tags or status notes such as "(WIP)" or "(forth. Label)". That is the form tracks are matched by. A version keeps its own entry, shown in square brackets, so "Temperature" and "Temperature (River Dub Edit)" are saved separately. What you typed is shown beneath when it differs; tracks saved before version 40 only have the tidied form. Your spelling of the artist and of the title each have their own column.</w:t>
       </w:r>
     </w:p>
     <w:p>
@@ -4837,6 +4837,30 @@
             <w:pPr/>
             <w:r>
               <w:t xml:space="preserve">What changed</w:t>
+            </w:r>
+          </w:p>
+        </w:tc>
+      </w:tr>
+      <w:tr>
+        <w:tc>
+          <w:tcPr>
+            <w:tcW w:w="4680" w:type="dxa"/>
+          </w:tcPr>
+          <w:p>
+            <w:pPr/>
+            <w:r>
+              <w:t xml:space="preserve">43</w:t>
+            </w:r>
+          </w:p>
+        </w:tc>
+        <w:tc>
+          <w:tcPr>
+            <w:tcW w:w="4680" w:type="dxa"/>
+          </w:tcPr>
+          <w:p>
+            <w:pPr/>
+            <w:r>
+              <w:t xml:space="preserve">Saved results: fixed Edit and Looks right doing nothing on VIP and remix tracks saved before version 40; those answers are moved to their version's own entry at start-up, so they also pick up the title spelling from your list. Your spelling is now two columns, artist and title.</w:t>
             </w:r>
           </w:p>
         </w:tc>

</xml_diff>

<commit_message>
v41: Your list: a Year column is read and used when the lookup has no year. Repeated rows for a track are merged (commonest spelling; best link, then commonest). Versions that tidy to the same title are kept as separate entries. Columns without a heading are ignored. Names: ø, æ, ł and similar letters are now read as o, ae, l, so "Nocase" matches "Nøcase"; "(forth. Label)" and "(forthcoming)" are treated like WIP.
Co-Authored-By: Claude Opus 5.5 <noreply@anthropic.com>
</commit_message>
<xml_diff>
--- a/docs/Artist Feed User Guide.docx
+++ b/docs/Artist Feed User Guide.docx
@@ -1836,7 +1836,7 @@
     <w:p>
       <w:pPr/>
       <w:r>
-        <w:t xml:space="preserve">Each track is listed under the tidied form of its name: lower case, no accents or punctuation, and no describing tags. That is the form tracks are matched by. A version keeps its own entry, shown in square brackets, so "Temperature" and "Temperature (River Dub Edit)" are saved separately. What you typed is shown beneath when it differs; tracks saved before version 40 only have the tidied form.</w:t>
+        <w:t xml:space="preserve">Each track is listed under the tidied form of its name: lower case, no accents or punctuation (ø is read as o), and no describing tags or status notes such as "(WIP)" or "(forth. Label)". That is the form tracks are matched by. A version keeps its own entry, shown in square brackets, so "Temperature" and "Temperature (River Dub Edit)" are saved separately. What you typed is shown beneath when it differs; tracks saved before version 40 only have the tidied form.</w:t>
       </w:r>
     </w:p>
     <w:p>
@@ -1862,7 +1862,7 @@
         <w:t xml:space="preserve">Import your list</w:t>
       </w:r>
       <w:r>
-        <w:t xml:space="preserve"> takes a spreadsheet or CSV of how artists and titles should be written. It needs an Artist column and, for tracks, a Title column. A row with only an artist gives that artist's spelling for all their tracks.</w:t>
+        <w:t xml:space="preserve"> takes a spreadsheet or CSV of how artists and titles should be written. It needs an Artist column and, for tracks, a Title column. A row with only an artist gives that artist's spelling for all their tracks. Upload the .xlsx file itself, or save as "CSV UTF-8": a plain CSV saved from Excel loses letters outside Western European alphabets, which arrive as question marks.</w:t>
       </w:r>
     </w:p>
     <w:p>
@@ -1886,7 +1886,7 @@
         </w:numPr>
       </w:pPr>
       <w:r>
-        <w:t xml:space="preserve">The list may include links, in columns named Link, URL, Bandcamp or SoundCloud, or anywhere a web address appears. Text written beside a link, such as "(limited time only)" or "(Patreon)", is kept separately as a note and shown and exported in its own column.</w:t>
+        <w:t xml:space="preserve">The list may include links, in columns named Link, URL, Bandcamp or SoundCloud, or Buy. When the list has a header row, columns without a heading are ignored. Without a header row, links are read wherever a web address appears. Text written beside a link, such as "(limited time only)" or "(Patreon)", is kept separately as a note and shown and exported in its own column.</w:t>
       </w:r>
     </w:p>
     <w:p>
@@ -1898,7 +1898,7 @@
         </w:numPr>
       </w:pPr>
       <w:r>
-        <w:t xml:space="preserve">When a name appears twice with different spellings, the first is kept and the import reports the others.</w:t>
+        <w:t xml:space="preserve">A list may repeat tracks: rows for the same track are merged. The spelling used most often is kept. When rows give different links, a Bandcamp release or SoundCloud track link is preferred over a shop page, a label's front page or a profile, then the link given most often. The import reports how many tracks had either difference. Versions that tidy to the same title, such as "Eski" and "Eski [alternate version]", stay separate entries, each with its own spelling, link and note. A Year column is kept and used when the lookup has no year of its own. Rows whose title has no letters or digits, such as "???", are left out.</w:t>
       </w:r>
     </w:p>
     <w:p>
@@ -4837,6 +4837,30 @@
             <w:pPr/>
             <w:r>
               <w:t xml:space="preserve">What changed</w:t>
+            </w:r>
+          </w:p>
+        </w:tc>
+      </w:tr>
+      <w:tr>
+        <w:tc>
+          <w:tcPr>
+            <w:tcW w:w="4680" w:type="dxa"/>
+          </w:tcPr>
+          <w:p>
+            <w:pPr/>
+            <w:r>
+              <w:t xml:space="preserve">41</w:t>
+            </w:r>
+          </w:p>
+        </w:tc>
+        <w:tc>
+          <w:tcPr>
+            <w:tcW w:w="4680" w:type="dxa"/>
+          </w:tcPr>
+          <w:p>
+            <w:pPr/>
+            <w:r>
+              <w:t xml:space="preserve">Your list: a Year column is read and used when the lookup has no year. Repeated rows for a track are merged (commonest spelling; best link, then commonest). Versions that tidy to the same title are kept as separate entries. Columns without a heading are ignored. Names: ø, æ, ł and similar letters are now read as o, ae, l, so "Nocase" matches "Nøcase"; "(forth. Label)" and "(forthcoming)" are treated like WIP.</w:t>
             </w:r>
           </w:p>
         </w:tc>

</xml_diff>

<commit_message>
v44: Saved results: the "Not found" filter no longer includes tracks found on SoundCloud and is renamed "Track not found (artist page only)". Remix answers saved before version 40 whose SoundCloud title repeats the artist are also moved to the remix's own entry.
Co-Authored-By: Claude Opus 5.5 <noreply@anthropic.com>
</commit_message>
<xml_diff>
--- a/docs/Artist Feed User Guide.docx
+++ b/docs/Artist Feed User Guide.docx
@@ -1830,7 +1830,7 @@
         <w:t xml:space="preserve">Saved results</w:t>
       </w:r>
       <w:r>
-        <w:t xml:space="preserve"> tab in Link Finder lists every track looked up so far, newest first, with its link, year, result and the date it was saved. Search it, or filter to rows that need review, were not found, were found, have a link you set, are in your list, or have no spelling on file. Export downloads whatever the search and filter show.</w:t>
+        <w:t xml:space="preserve"> tab in Link Finder lists every track looked up so far, newest first, with its link, year, result and the date it was saved. Search it, or filter to rows that need review, have no link to the track itself (only an artist page, a profile or a search), have the track found on Bandcamp or SoundCloud, have a link you set, are in your list, or have no spelling on file. Export downloads whatever the search and filter show.</w:t>
       </w:r>
     </w:p>
     <w:p>
@@ -4837,6 +4837,30 @@
             <w:pPr/>
             <w:r>
               <w:t xml:space="preserve">What changed</w:t>
+            </w:r>
+          </w:p>
+        </w:tc>
+      </w:tr>
+      <w:tr>
+        <w:tc>
+          <w:tcPr>
+            <w:tcW w:w="4680" w:type="dxa"/>
+          </w:tcPr>
+          <w:p>
+            <w:pPr/>
+            <w:r>
+              <w:t xml:space="preserve">44</w:t>
+            </w:r>
+          </w:p>
+        </w:tc>
+        <w:tc>
+          <w:tcPr>
+            <w:tcW w:w="4680" w:type="dxa"/>
+          </w:tcPr>
+          <w:p>
+            <w:pPr/>
+            <w:r>
+              <w:t xml:space="preserve">Saved results: the "Not found" filter no longer includes tracks found on SoundCloud and is renamed "Track not found (artist page only)". Remix answers saved before version 40 whose SoundCloud title repeats the artist are also moved to the remix's own entry.</w:t>
             </w:r>
           </w:p>
         </w:tc>

</xml_diff>

<commit_message>
v42: Names: letters of other alphabets (Cyrillic, Chinese and so on) are kept when a name is tidied instead of being dropped, so titles written in them can be matched, saved and imported from your list.
Co-Authored-By: Claude Opus 5.5 <noreply@anthropic.com>
</commit_message>
<xml_diff>
--- a/docs/Artist Feed User Guide.docx
+++ b/docs/Artist Feed User Guide.docx
@@ -1836,7 +1836,7 @@
     <w:p>
       <w:pPr/>
       <w:r>
-        <w:t xml:space="preserve">Each track is listed under the tidied form of its name: lower case, no accents or punctuation (ø is read as o), and no describing tags or status notes such as "(WIP)" or "(forth. Label)". That is the form tracks are matched by. A version keeps its own entry, shown in square brackets, so "Temperature" and "Temperature (River Dub Edit)" are saved separately. What you typed is shown beneath when it differs; tracks saved before version 40 only have the tidied form.</w:t>
+        <w:t xml:space="preserve">Each track is listed under the tidied form of its name: lower case, no accents or punctuation (ø is read as o; letters of other alphabets, such as Cyrillic or Chinese, are kept as they are), and no describing tags or status notes such as "(WIP)" or "(forth. Label)". That is the form tracks are matched by. A version keeps its own entry, shown in square brackets, so "Temperature" and "Temperature (River Dub Edit)" are saved separately. What you typed is shown beneath when it differs; tracks saved before version 40 only have the tidied form.</w:t>
       </w:r>
     </w:p>
     <w:p>
@@ -4837,6 +4837,30 @@
             <w:pPr/>
             <w:r>
               <w:t xml:space="preserve">What changed</w:t>
+            </w:r>
+          </w:p>
+        </w:tc>
+      </w:tr>
+      <w:tr>
+        <w:tc>
+          <w:tcPr>
+            <w:tcW w:w="4680" w:type="dxa"/>
+          </w:tcPr>
+          <w:p>
+            <w:pPr/>
+            <w:r>
+              <w:t xml:space="preserve">42</w:t>
+            </w:r>
+          </w:p>
+        </w:tc>
+        <w:tc>
+          <w:tcPr>
+            <w:tcW w:w="4680" w:type="dxa"/>
+          </w:tcPr>
+          <w:p>
+            <w:pPr/>
+            <w:r>
+              <w:t xml:space="preserve">Names: letters of other alphabets (Cyrillic, Chinese and so on) are kept when a name is tidied instead of being dropped, so titles written in them can be matched, saved and imported from your list.</w:t>
             </w:r>
           </w:p>
         </w:tc>

</xml_diff>

<commit_message>
v52: Forget is now on every row in Saved results, including tracks that are only in your imported list, and it can take a track out of your list.
Co-Authored-By: Claude Opus 5.5 <noreply@anthropic.com>
</commit_message>
<xml_diff>
--- a/docs/Artist Feed User Guide.docx
+++ b/docs/Artist Feed User Guide.docx
@@ -13,7 +13,7 @@
     <w:p>
       <w:pPr/>
       <w:r>
-        <w:t xml:space="preserve">Oct 11, 2026</w:t>
+        <w:t xml:space="preserve">Oct 12, 2026</w:t>
       </w:r>
       <w:r>
         <w:t xml:space="preserve"/>
@@ -1842,7 +1842,7 @@
     <w:p>
       <w:pPr/>
       <w:r>
-        <w:t xml:space="preserve">Each row has Edit, Search again and Forget, plus Looks right on rows marked for review. Forget removes the saved answer, so the track is searched for next time.</w:t>
+        <w:t xml:space="preserve">Each row has Edit, Search again and Forget, plus Looks right on rows marked for review. Forget removes the saved answer, so the track is searched for next time. On a track from your imported list, Forget also asks whether to take it out of the list; a track that is only in your list (never searched) is simply removed from it.</w:t>
       </w:r>
     </w:p>
     <w:p>
@@ -4837,6 +4837,30 @@
             <w:pPr/>
             <w:r>
               <w:t xml:space="preserve">What changed</w:t>
+            </w:r>
+          </w:p>
+        </w:tc>
+      </w:tr>
+      <w:tr>
+        <w:tc>
+          <w:tcPr>
+            <w:tcW w:w="4680" w:type="dxa"/>
+          </w:tcPr>
+          <w:p>
+            <w:pPr/>
+            <w:r>
+              <w:t xml:space="preserve">52</w:t>
+            </w:r>
+          </w:p>
+        </w:tc>
+        <w:tc>
+          <w:tcPr>
+            <w:tcW w:w="4680" w:type="dxa"/>
+          </w:tcPr>
+          <w:p>
+            <w:pPr/>
+            <w:r>
+              <w:t xml:space="preserve">Forget is now on every row in Saved results, including tracks that are only in your imported list, and it can take a track out of your list.</w:t>
             </w:r>
           </w:p>
         </w:tc>

</xml_diff>

<commit_message>
v51: Saved results: tracks whose saved name doesn't match your list exactly show the closest list entry, marked as such. Edit spelling / Add spelling sets a track's artist and title spelling in place.
Co-Authored-By: Claude Opus 5.5 <noreply@anthropic.com>
</commit_message>
<xml_diff>
--- a/docs/Artist Feed User Guide.docx
+++ b/docs/Artist Feed User Guide.docx
@@ -1836,7 +1836,7 @@
     <w:p>
       <w:pPr/>
       <w:r>
-        <w:t xml:space="preserve">Each track is listed under the tidied form of its name: lower case, no accents or punctuation (ø is read as o; letters of other alphabets, such as Cyrillic or Chinese, are kept as they are, and so is a symbol written into a word, as in "∑1", "Myca$h" or "Mor£"), and no describing tags or status notes such as "(WIP)" or "(forth. Label)". That is the form tracks are matched by. A version keeps its own entry, shown in square brackets, so "Temperature" and "Temperature (River Dub Edit)" are saved separately. What you typed is shown beneath when it differs; tracks saved before version 40 only have the tidied form. Your spelling of the artist and of the title each have their own column.</w:t>
+        <w:t xml:space="preserve">Each track is listed under the tidied form of its name: lower case, no accents or punctuation (ø is read as o; letters of other alphabets, such as Cyrillic or Chinese, are kept as they are, and so is a symbol written into a word, as in "∑1", "Myca$h" or "Mor£"), and no describing tags or status notes such as "(WIP)" or "(forth. Label)". That is the form tracks are matched by. A version keeps its own entry, shown in square brackets, so "Temperature" and "Temperature (River Dub Edit)" are saved separately. What you typed is shown beneath when it differs; tracks saved before version 40 only have the tidied form. Your spelling of the artist and of the title each have their own column. A track saved under a name that doesn't match your list exactly (saved before versions had entries of their own, or typed without brackets) shows the closest entry, marked "closest in your list": the one with the same words, or the only version of that title. **Edit spelling** (or Add spelling) under the title lets you type how the artist and title should be written; it is saved to your list for that track, and Remove takes the track out of your list.</w:t>
       </w:r>
     </w:p>
     <w:p>
@@ -4837,6 +4837,30 @@
             <w:pPr/>
             <w:r>
               <w:t xml:space="preserve">What changed</w:t>
+            </w:r>
+          </w:p>
+        </w:tc>
+      </w:tr>
+      <w:tr>
+        <w:tc>
+          <w:tcPr>
+            <w:tcW w:w="4680" w:type="dxa"/>
+          </w:tcPr>
+          <w:p>
+            <w:pPr/>
+            <w:r>
+              <w:t xml:space="preserve">51</w:t>
+            </w:r>
+          </w:p>
+        </w:tc>
+        <w:tc>
+          <w:tcPr>
+            <w:tcW w:w="4680" w:type="dxa"/>
+          </w:tcPr>
+          <w:p>
+            <w:pPr/>
+            <w:r>
+              <w:t xml:space="preserve">Saved results: tracks whose saved name doesn't match your list exactly show the closest list entry, marked as such. Edit spelling / Add spelling sets a track's artist and title spelling in place.</w:t>
             </w:r>
           </w:p>
         </w:tc>

</xml_diff>

<commit_message>
v50: Link Finder: Skip and Add link on rows still waiting during a lookup, including the one being searched. Skip stops that track's search and moves on; Add link sets the link you know and the track is not searched.
Co-Authored-By: Claude Opus 5.5 <noreply@anthropic.com>
</commit_message>
<xml_diff>
--- a/docs/Artist Feed User Guide.docx
+++ b/docs/Artist Feed User Guide.docx
@@ -1646,7 +1646,7 @@
         <w:t xml:space="preserve">What was tried</w:t>
       </w:r>
       <w:r>
-        <w:t xml:space="preserve"> lists every step and what it found. While a lookup runs, rows not yet answered have a soft blue tint, and the row being searched pulses and reads "Searching now…". A row whose link is a guess (a SoundCloud profile picked by name alone, or a partial Bandcamp match) is marked Needs review and tinted red. It stays that way after the lookup finishes, until you press Looks right, which keeps the link as one you set, or correct it with Edit.</w:t>
+        <w:t xml:space="preserve"> lists every step and what it found. While a lookup runs, rows not yet answered have a soft blue tint, and the row being searched pulses and reads "Searching now…". Each of those rows has **Skip** and **Add link**. Skip stops the search for that track at once (or before it starts) and moves on; it is marked Skipped and nothing is saved for it, so it is searched for next time unless you add a link. Add link sets the link you already know, and that track is not searched. A row whose link is a guess (a SoundCloud profile picked by name alone, or a partial Bandcamp match) is marked Needs review and tinted red. It stays that way after the lookup finishes, until you press Looks right, which keeps the link as one you set, or correct it with Edit.</w:t>
       </w:r>
     </w:p>
     <w:p>
@@ -4676,7 +4676,7 @@
         <w:t xml:space="preserve">Why does a lookup take so long, or seem stuck?</w:t>
       </w:r>
       <w:r>
-        <w:t xml:space="preserve"> Bandcamp limits how fast it can be read, so requests go two seconds apart and pause when Bandcamp asks. A track that is not in your purchases can need several searches and dozens of page reads. The status line names the track being searched and shows any pause. Tracks already known are filled in first.</w:t>
+        <w:t xml:space="preserve"> Bandcamp limits how fast it can be read, so requests go two seconds apart and pause when Bandcamp asks. A track that is not in your purchases can need several searches and dozens of page reads. The status line names the track being searched and shows any pause. Tracks already known are filled in first. If you know a track can't be found (an unreleased tune, say) or already have its link, press Skip or Add link on its row.</w:t>
       </w:r>
     </w:p>
     <w:p>
@@ -4837,6 +4837,30 @@
             <w:pPr/>
             <w:r>
               <w:t xml:space="preserve">What changed</w:t>
+            </w:r>
+          </w:p>
+        </w:tc>
+      </w:tr>
+      <w:tr>
+        <w:tc>
+          <w:tcPr>
+            <w:tcW w:w="4680" w:type="dxa"/>
+          </w:tcPr>
+          <w:p>
+            <w:pPr/>
+            <w:r>
+              <w:t xml:space="preserve">50</w:t>
+            </w:r>
+          </w:p>
+        </w:tc>
+        <w:tc>
+          <w:tcPr>
+            <w:tcW w:w="4680" w:type="dxa"/>
+          </w:tcPr>
+          <w:p>
+            <w:pPr/>
+            <w:r>
+              <w:t xml:space="preserve">Link Finder: Skip and Add link on rows still waiting during a lookup, including the one being searched. Skip stops that track's search and moves on; Add link sets the link you know and the track is not searched.</w:t>
             </w:r>
           </w:p>
         </w:tc>

</xml_diff>

<commit_message>
v48: Tracked Artists: an artist can have other names, typed after the first and separated by commas; Link Finder matches any of them and falls back to that artist's tracked Bandcamp page or SoundCloud profile. Find missing links shows the same glow and row highlighting as a Link Finder lookup.
Co-Authored-By: Claude Opus 5.5 <noreply@anthropic.com>
</commit_message>
<xml_diff>
--- a/docs/Artist Feed User Guide.docx
+++ b/docs/Artist Feed User Guide.docx
@@ -1081,7 +1081,7 @@
         </w:numPr>
       </w:pPr>
       <w:r>
-        <w:t xml:space="preserve">Leave the artist name empty and it is filled in from the page.</w:t>
+        <w:t xml:space="preserve">Leave the artist name empty and it is filled in from the page. If an artist goes by other names, add them after the first, separated by commas: "Night Ferry, NF, Nightferry". The first name is the one shown in the feed. Link Finder treats all of them as the same artist, so a track listed under any of the names matches their releases and falls back to their pages. Put a name that contains a comma in double quotes. Type other names in the table itself; in the paste box, commas separate the name from the links.</w:t>
       </w:r>
     </w:p>
     <w:p>
@@ -1220,7 +1220,7 @@
         <w:t xml:space="preserve">Find missing links</w:t>
       </w:r>
       <w:r>
-        <w:t xml:space="preserve"> goes through every row that has an empty cell and looks for what is missing: the Bandcamp page, the SoundCloud profile, or the name when only a link was given. It works one row at a time at Bandcamp's pace, and the button reads Stop while it runs.</w:t>
+        <w:t xml:space="preserve"> goes through every row that has an empty cell and looks for what is missing: the Bandcamp page, the SoundCloud profile, or the name when only a link was given. It works one row at a time at Bandcamp's pace, and the button reads Stop while it runs. As in a Link Finder lookup, the panel glows while it works, rows still to be searched have a blue tint, and the row being searched pulses.</w:t>
       </w:r>
     </w:p>
     <w:p>
@@ -4837,6 +4837,30 @@
             <w:pPr/>
             <w:r>
               <w:t xml:space="preserve">What changed</w:t>
+            </w:r>
+          </w:p>
+        </w:tc>
+      </w:tr>
+      <w:tr>
+        <w:tc>
+          <w:tcPr>
+            <w:tcW w:w="4680" w:type="dxa"/>
+          </w:tcPr>
+          <w:p>
+            <w:pPr/>
+            <w:r>
+              <w:t xml:space="preserve">48</w:t>
+            </w:r>
+          </w:p>
+        </w:tc>
+        <w:tc>
+          <w:tcPr>
+            <w:tcW w:w="4680" w:type="dxa"/>
+          </w:tcPr>
+          <w:p>
+            <w:pPr/>
+            <w:r>
+              <w:t xml:space="preserve">Tracked Artists: an artist can have other names, typed after the first and separated by commas; Link Finder matches any of them and falls back to that artist's tracked Bandcamp page or SoundCloud profile. Find missing links shows the same glow and row highlighting as a Link Finder lookup.</w:t>
             </w:r>
           </w:p>
         </w:tc>

</xml_diff>

<commit_message>
v47: Names: a symbol written into a word is kept when a name is tidied ("∑1" was becoming "1", and "Myca$h" "myca h"). Punctuation and symbols standing alone are still dropped. An imported list is re-filed under the new tidied names at start-up, so it does not need importing again.
Co-Authored-By: Claude Opus 5.5 <noreply@anthropic.com>
</commit_message>
<xml_diff>
--- a/docs/Artist Feed User Guide.docx
+++ b/docs/Artist Feed User Guide.docx
@@ -1836,7 +1836,7 @@
     <w:p>
       <w:pPr/>
       <w:r>
-        <w:t xml:space="preserve">Each track is listed under the tidied form of its name: lower case, no accents or punctuation (ø is read as o; letters of other alphabets, such as Cyrillic or Chinese, are kept as they are), and no describing tags or status notes such as "(WIP)" or "(forth. Label)". That is the form tracks are matched by. A version keeps its own entry, shown in square brackets, so "Temperature" and "Temperature (River Dub Edit)" are saved separately. What you typed is shown beneath when it differs; tracks saved before version 40 only have the tidied form. Your spelling of the artist and of the title each have their own column.</w:t>
+        <w:t xml:space="preserve">Each track is listed under the tidied form of its name: lower case, no accents or punctuation (ø is read as o; letters of other alphabets, such as Cyrillic or Chinese, are kept as they are, and so is a symbol written into a word, as in "∑1", "Myca$h" or "Mor£"), and no describing tags or status notes such as "(WIP)" or "(forth. Label)". That is the form tracks are matched by. A version keeps its own entry, shown in square brackets, so "Temperature" and "Temperature (River Dub Edit)" are saved separately. What you typed is shown beneath when it differs; tracks saved before version 40 only have the tidied form. Your spelling of the artist and of the title each have their own column.</w:t>
       </w:r>
     </w:p>
     <w:p>
@@ -4837,6 +4837,30 @@
             <w:pPr/>
             <w:r>
               <w:t xml:space="preserve">What changed</w:t>
+            </w:r>
+          </w:p>
+        </w:tc>
+      </w:tr>
+      <w:tr>
+        <w:tc>
+          <w:tcPr>
+            <w:tcW w:w="4680" w:type="dxa"/>
+          </w:tcPr>
+          <w:p>
+            <w:pPr/>
+            <w:r>
+              <w:t xml:space="preserve">47</w:t>
+            </w:r>
+          </w:p>
+        </w:tc>
+        <w:tc>
+          <w:tcPr>
+            <w:tcW w:w="4680" w:type="dxa"/>
+          </w:tcPr>
+          <w:p>
+            <w:pPr/>
+            <w:r>
+              <w:t xml:space="preserve">Names: a symbol written into a word is kept when a name is tidied ("∑1" was becoming "1", and "Myca$h" "myca h"). Punctuation and symbols standing alone are still dropped. An imported list is re-filed under the new tidied names at start-up, so it does not need importing again.</w:t>
             </w:r>
           </w:p>
         </w:tc>

</xml_diff>

<commit_message>
v53: Forget in Saved results opens a choice: Saved answer, List entry (including the closest list entry), or Both.
Co-Authored-By: Claude Opus 5.5 <noreply@anthropic.com>
</commit_message>
<xml_diff>
--- a/docs/Artist Feed User Guide.docx
+++ b/docs/Artist Feed User Guide.docx
@@ -1842,7 +1842,7 @@
     <w:p>
       <w:pPr/>
       <w:r>
-        <w:t xml:space="preserve">Each row has Edit, Search again and Forget, plus Looks right on rows marked for review. Forget removes the saved answer, so the track is searched for next time. On a track from your imported list, Forget also asks whether to take it out of the list; a track that is only in your list (never searched) is simply removed from it.</w:t>
+        <w:t xml:space="preserve">Each row has Edit, Search again and Forget, plus Looks right on rows marked for review. Forget opens a choice of what to forget: Saved answer (the track is searched for next time), List entry (takes that track out of your imported list; on a row marked "closest in your list" it is called Closest list entry), or Both. Only the choices that apply to the row are shown.</w:t>
       </w:r>
     </w:p>
     <w:p>
@@ -4837,6 +4837,30 @@
             <w:pPr/>
             <w:r>
               <w:t xml:space="preserve">What changed</w:t>
+            </w:r>
+          </w:p>
+        </w:tc>
+      </w:tr>
+      <w:tr>
+        <w:tc>
+          <w:tcPr>
+            <w:tcW w:w="4680" w:type="dxa"/>
+          </w:tcPr>
+          <w:p>
+            <w:pPr/>
+            <w:r>
+              <w:t xml:space="preserve">53</w:t>
+            </w:r>
+          </w:p>
+        </w:tc>
+        <w:tc>
+          <w:tcPr>
+            <w:tcW w:w="4680" w:type="dxa"/>
+          </w:tcPr>
+          <w:p>
+            <w:pPr/>
+            <w:r>
+              <w:t xml:space="preserve">Forget in Saved results opens a choice: Saved answer, List entry (including the closest list entry), or Both.</w:t>
             </w:r>
           </w:p>
         </w:tc>

</xml_diff>

<commit_message>
v49: Refresh Feed: no longer ignored while a smaller refresh is running (a full one is queued behind it). After a refresh, the status line reports new posts, Bandcamp pages skipped during a lookup, and pages that couldn't be read; each refresh is also summarised in the app's log.
Co-Authored-By: Claude Opus 5.5 <noreply@anthropic.com>
</commit_message>
<xml_diff>
--- a/docs/Artist Feed User Guide.docx
+++ b/docs/Artist Feed User Guide.docx
@@ -473,7 +473,7 @@
         <w:t xml:space="preserve">Refresh Feed</w:t>
       </w:r>
       <w:r>
-        <w:t xml:space="preserve"> checks immediately.</w:t>
+        <w:t xml:space="preserve"> checks immediately. If a refresh is already under way (for example for pages just added), a full one follows as soon as it ends. When it finishes, the line beside the buttons says what it found: how many new posts, how many Bandcamp pages were skipped because a Link Finder lookup was running (they are checked on the next refresh), and how many pages couldn't be read. The reasons for those are in the Status column of Tracked Artists and in the app's log (docker compose logs).</w:t>
       </w:r>
     </w:p>
     <w:p>
@@ -4837,6 +4837,30 @@
             <w:pPr/>
             <w:r>
               <w:t xml:space="preserve">What changed</w:t>
+            </w:r>
+          </w:p>
+        </w:tc>
+      </w:tr>
+      <w:tr>
+        <w:tc>
+          <w:tcPr>
+            <w:tcW w:w="4680" w:type="dxa"/>
+          </w:tcPr>
+          <w:p>
+            <w:pPr/>
+            <w:r>
+              <w:t xml:space="preserve">49</w:t>
+            </w:r>
+          </w:p>
+        </w:tc>
+        <w:tc>
+          <w:tcPr>
+            <w:tcW w:w="4680" w:type="dxa"/>
+          </w:tcPr>
+          <w:p>
+            <w:pPr/>
+            <w:r>
+              <w:t xml:space="preserve">Refresh Feed: no longer ignored while a smaller refresh is running (a full one is queued behind it). After a refresh, the status line reports new posts, Bandcamp pages skipped during a lookup, and pages that couldn't be read; each refresh is also summarised in the app's log.</w:t>
             </w:r>
           </w:p>
         </w:tc>

</xml_diff>

<commit_message>
v56: Tracked Artists: Filter rows box, a menu of row types (Needs attention, Still being checked, No posts yet, New, Ticked for YouTube search) with counts, and sortable columns.
Co-Authored-By: Claude Opus 5.5 <noreply@anthropic.com>
</commit_message>
<xml_diff>
--- a/docs/Artist Feed User Guide.docx
+++ b/docs/Artist Feed User Guide.docx
@@ -1165,13 +1165,37 @@
         </w:numPr>
       </w:pPr>
       <w:r>
-        <w:t xml:space="preserve">After a save, rows are sorted by artist name.</w:t>
+        <w:t xml:space="preserve">After a save, rows are sorted by artist name, or by the column you sorted on.</w:t>
       </w:r>
     </w:p>
     <w:p>
       <w:pPr/>
       <w:r>
         <w:t xml:space="preserve">The Status column shows how many posts each artist has, and any problem reading one of their pages.</w:t>
+      </w:r>
+    </w:p>
+    <w:p>
+      <w:pPr/>
+      <w:r>
+        <w:t xml:space="preserve">To find rows quickly, type in </w:t>
+      </w:r>
+      <w:r>
+        <w:rPr>
+          <w:b/>
+        </w:rPr>
+        <w:t xml:space="preserve">Filter rows</w:t>
+      </w:r>
+      <w:r>
+        <w:t xml:space="preserve"> (it matches names, pages and status messages) or pick from the menu beside it: </w:t>
+      </w:r>
+      <w:r>
+        <w:rPr>
+          <w:b/>
+        </w:rPr>
+        <w:t xml:space="preserve">Needs attention</w:t>
+      </w:r>
+      <w:r>
+        <w:t xml:space="preserve"> shows rows with a problem (a page that couldn't be read, or a save error), and there are also Still being checked, No posts yet, New, not saved yet, and Ticked for YouTube search. Each option shows how many rows it holds. Click a column heading to sort by it, again to reverse, and a third time to go back to the usual order; sorting by Status puts rows with problems first, then those with the fewest posts. Filtering and sorting only change what is shown: saving still saves every row, and pasting a block of cells fills the rows on screen, leaving filtered-out rows alone.</w:t>
       </w:r>
     </w:p>
     <w:p>
@@ -5038,6 +5062,30 @@
             <w:pPr/>
             <w:r>
               <w:t xml:space="preserve">What changed</w:t>
+            </w:r>
+          </w:p>
+        </w:tc>
+      </w:tr>
+      <w:tr>
+        <w:tc>
+          <w:tcPr>
+            <w:tcW w:w="4680" w:type="dxa"/>
+          </w:tcPr>
+          <w:p>
+            <w:pPr/>
+            <w:r>
+              <w:t xml:space="preserve">56</w:t>
+            </w:r>
+          </w:p>
+        </w:tc>
+        <w:tc>
+          <w:tcPr>
+            <w:tcW w:w="4680" w:type="dxa"/>
+          </w:tcPr>
+          <w:p>
+            <w:pPr/>
+            <w:r>
+              <w:t xml:space="preserve">Tracked Artists: Filter rows box, a menu of row types (Needs attention, Still being checked, No posts yet, New, Ticked for YouTube search) with counts, and sortable columns.</w:t>
             </w:r>
           </w:p>
         </w:tc>

</xml_diff>

<commit_message>
v58: Tracked Artists: two rows sharing a name are refused on Save, like two rows with the same page, unless you mark them as different artists with "Different artists, keep both".
Co-Authored-By: Claude Opus 5.5 <noreply@anthropic.com>
</commit_message>
<xml_diff>
--- a/docs/Artist Feed User Guide.docx
+++ b/docs/Artist Feed User Guide.docx
@@ -1196,6 +1196,30 @@
       </w:r>
       <w:r>
         <w:t xml:space="preserve"> shows rows with a problem (a page that couldn't be read, or a save error), and there are also Still being checked, No posts yet, New, not saved yet, and Ticked for YouTube search. Each option shows how many rows it holds. Click a column heading to sort by it, again to reverse, and a third time to go back to the usual order; sorting by Status puts rows with problems first, then those with the fewest posts. Filtering and sorting only change what is shown: saving still saves every row, and pasting a block of cells fills the rows on screen, leaving filtered-out rows alone.</w:t>
+      </w:r>
+    </w:p>
+    <w:p>
+      <w:pPr/>
+      <w:r>
+        <w:t xml:space="preserve">Each artist belongs on one row. Save is refused, with a message on every row involved, when two rows have the same page, or share a name (any of the names in their Artist cells). Both usually happen after </w:t>
+      </w:r>
+      <w:r>
+        <w:rPr>
+          <w:b/>
+        </w:rPr>
+        <w:t xml:space="preserve">Import CSV</w:t>
+      </w:r>
+      <w:r>
+        <w:t xml:space="preserve">, which adds the file's rows as new rows rather than updating the ones you have: move the new pages into the existing row and delete the extra one. Two rows for one artist would leave Link Finder using whichever it finds first. If two rows really are different artists who share a name (in different genres, say), press </w:t>
+      </w:r>
+      <w:r>
+        <w:rPr>
+          <w:b/>
+        </w:rPr>
+        <w:t xml:space="preserve">Different artists, keep both</w:t>
+      </w:r>
+      <w:r>
+        <w:t xml:space="preserve"> on one of them and save. That is remembered, and both rows then say "Shares its name with another row". Link Finder still can't tell them apart by name, so give the right link with Edit when it picks the wrong one. Renaming one of them ends it.</w:t>
       </w:r>
     </w:p>
     <w:p>
@@ -5062,6 +5086,30 @@
             <w:pPr/>
             <w:r>
               <w:t xml:space="preserve">What changed</w:t>
+            </w:r>
+          </w:p>
+        </w:tc>
+      </w:tr>
+      <w:tr>
+        <w:tc>
+          <w:tcPr>
+            <w:tcW w:w="4680" w:type="dxa"/>
+          </w:tcPr>
+          <w:p>
+            <w:pPr/>
+            <w:r>
+              <w:t xml:space="preserve">58</w:t>
+            </w:r>
+          </w:p>
+        </w:tc>
+        <w:tc>
+          <w:tcPr>
+            <w:tcW w:w="4680" w:type="dxa"/>
+          </w:tcPr>
+          <w:p>
+            <w:pPr/>
+            <w:r>
+              <w:t xml:space="preserve">Tracked Artists: two rows sharing a name are refused on Save, like two rows with the same page, unless you mark them as different artists with "Different artists, keep both".</w:t>
             </w:r>
           </w:p>
         </w:tc>

</xml_diff>

<commit_message>
v54: Feed search: only the newest search is shown when answers arrive out of order, Enter searches at once, and a failed load is reported instead of silently leaving the old list.
Co-Authored-By: Claude Opus 5.5 <noreply@anthropic.com>
</commit_message>
<xml_diff>
--- a/docs/Artist Feed User Guide.docx
+++ b/docs/Artist Feed User Guide.docx
@@ -745,7 +745,7 @@
           <w:p>
             <w:pPr/>
             <w:r>
-              <w:t xml:space="preserve">Matches artist, label, release and track names</w:t>
+              <w:t xml:space="preserve">Matches artist, label, release and track names, a moment after you stop typing (Enter searches at once). If the feed can't be loaded, a red message beside the status line says so.</w:t>
             </w:r>
           </w:p>
         </w:tc>
@@ -4837,6 +4837,30 @@
             <w:pPr/>
             <w:r>
               <w:t xml:space="preserve">What changed</w:t>
+            </w:r>
+          </w:p>
+        </w:tc>
+      </w:tr>
+      <w:tr>
+        <w:tc>
+          <w:tcPr>
+            <w:tcW w:w="4680" w:type="dxa"/>
+          </w:tcPr>
+          <w:p>
+            <w:pPr/>
+            <w:r>
+              <w:t xml:space="preserve">54</w:t>
+            </w:r>
+          </w:p>
+        </w:tc>
+        <w:tc>
+          <w:tcPr>
+            <w:tcW w:w="4680" w:type="dxa"/>
+          </w:tcPr>
+          <w:p>
+            <w:pPr/>
+            <w:r>
+              <w:t xml:space="preserve">Feed search: only the newest search is shown when answers arrive out of order, Enter searches at once, and a failed load is reported instead of silently leaving the old list.</w:t>
             </w:r>
           </w:p>
         </w:tc>

</xml_diff>

<commit_message>
v55: YouTube as a third site: channels in the feed and player, a YouTube button at the top, a YouTube column and a YouTube search column in Tracked Artists. A new Settings button switches sites off completely and chooses which sites Link Finder searches (Bandcamp, then SoundCloud, then YouTube; YouTube off by default). Saved results has a "Searched in the last lookup" filter.
Co-Authored-By: Claude Opus 5.5 <noreply@anthropic.com>
</commit_message>
<xml_diff>
--- a/docs/Artist Feed User Guide.docx
+++ b/docs/Artist Feed User Guide.docx
@@ -13,7 +13,7 @@
     <w:p>
       <w:pPr/>
       <w:r>
-        <w:t xml:space="preserve">Oct 12, 2026</w:t>
+        <w:t xml:space="preserve">Oct 13, 2026</w:t>
       </w:r>
       <w:r>
         <w:t xml:space="preserve"/>
@@ -60,7 +60,7 @@
     <w:p>
       <w:pPr/>
       <w:r>
-        <w:t xml:space="preserve">One thing applies throughout: the app was built without access to the real Bandcamp and SoundCloud sites. Its logic is tested against stand-in copies of their pages, and corrected from reports of how it behaves on the real ones. Parts that have only been tested that way are noted under Known limits.</w:t>
+        <w:t xml:space="preserve">One thing applies throughout: the app was built without access to the real Bandcamp, SoundCloud and YouTube sites. Its logic is tested against stand-in copies of their pages, and corrected from reports of how it behaves on the real ones. Parts that have only been tested that way are noted under Known limits.</w:t>
       </w:r>
     </w:p>
     <w:p>
@@ -92,7 +92,7 @@
         <w:t xml:space="preserve">The feed.</w:t>
       </w:r>
       <w:r>
-        <w:t xml:space="preserve"> It checks the Bandcamp and SoundCloud pages of the artists and labels you track and shows their newest releases and uploads on one page, newest first. You can browse as a grid of covers or as a sortable list of tracks, filter and search, listen without leaving the page, and export the list.</w:t>
+        <w:t xml:space="preserve"> It checks the Bandcamp, SoundCloud and YouTube pages of the artists and labels you track and shows their newest releases and uploads on one page, newest first. You can browse as a grid of covers or as a sortable list of tracks, filter and search, listen without leaving the page, and export the list.</w:t>
       </w:r>
     </w:p>
     <w:p>
@@ -1319,6 +1319,118 @@
         <w:pStyle w:val="Heading2"/>
       </w:pPr>
       <w:r>
+        <w:t xml:space="preserve">Settings</w:t>
+      </w:r>
+    </w:p>
+    <w:p>
+      <w:pPr/>
+      <w:r>
+        <w:t xml:space="preserve">The </w:t>
+      </w:r>
+      <w:r>
+        <w:rPr>
+          <w:b/>
+        </w:rPr>
+        <w:t xml:space="preserve">Settings</w:t>
+      </w:r>
+      <w:r>
+        <w:t xml:space="preserve"> button at the top opens two lists of checkboxes.</w:t>
+      </w:r>
+    </w:p>
+    <w:p>
+      <w:pPr/>
+      <w:r>
+        <w:rPr>
+          <w:b/>
+        </w:rPr>
+        <w:t xml:space="preserve">Sites.</w:t>
+      </w:r>
+      <w:r>
+        <w:t xml:space="preserve"> Switch a site off and it is gone from the app: no button for it at the top, no column in Tracked Artists, no checks for new posts, its posts left out of the feed, and Link Finder doesn't use it. This goes further than the site buttons at the top, which only narrow what the feed shows. The pages you track there are kept (saving Tracked Artists leaves them alone), so switching the site back on brings everything back. At least one site has to stay on.</w:t>
+      </w:r>
+    </w:p>
+    <w:p>
+      <w:pPr/>
+      <w:r>
+        <w:rPr>
+          <w:b/>
+        </w:rPr>
+        <w:t xml:space="preserve">Link Finder searches.</w:t>
+      </w:r>
+      <w:r>
+        <w:t xml:space="preserve"> Tick the sites Link Finder looks on. A track found on a site higher in the list is preferred: Bandcamp first, then SoundCloud, then YouTube. YouTube starts unticked. Saved answers stay as they were, except that a link on a site you have unticked gives way to the next best one. When you tick a site, rows saved as not found are searched again the next time they are looked up; when the newly ticked site is YouTube, only YouTube is looked at for them, and only for the artists ticked for it.</w:t>
+      </w:r>
+    </w:p>
+    <w:p>
+      <w:pPr>
+        <w:pStyle w:val="Heading3"/>
+      </w:pPr>
+      <w:r>
+        <w:t xml:space="preserve">YouTube</w:t>
+      </w:r>
+    </w:p>
+    <w:p>
+      <w:pPr/>
+      <w:r>
+        <w:t xml:space="preserve">Put a channel in the YouTube column of Tracked Artists as its @handle or its address (youtube.com/@name, /channel/UC…, or an old /c/ or /user/ address). Its newest uploads appear in the feed like any other post and play in the player at the bottom.</w:t>
+      </w:r>
+    </w:p>
+    <w:p>
+      <w:pPr/>
+      <w:r>
+        <w:t xml:space="preserve">Link Finder only looks on YouTube for the rows ticked in the </w:t>
+      </w:r>
+      <w:r>
+        <w:rPr>
+          <w:b/>
+        </w:rPr>
+        <w:t xml:space="preserve">YouTube search</w:t>
+      </w:r>
+      <w:r>
+        <w:t xml:space="preserve"> column of Tracked Artists, so it doesn't search YouTube for every artist just because their other links aren't set:</w:t>
+      </w:r>
+    </w:p>
+    <w:p>
+      <w:pPr>
+        <w:pStyle w:val="ListParagraph"/>
+        <w:numPr>
+          <w:ilvl w:val="0"/>
+          <w:numId w:val="13"/>
+        </w:numPr>
+      </w:pPr>
+      <w:r>
+        <w:t xml:space="preserve">For a ticked artist, it first looks through the uploads of the YouTube channels you track for ticked rows, then runs a YouTube search for the artist and title.</w:t>
+      </w:r>
+    </w:p>
+    <w:p>
+      <w:pPr>
+        <w:pStyle w:val="ListParagraph"/>
+        <w:numPr>
+          <w:ilvl w:val="0"/>
+          <w:numId w:val="13"/>
+        </w:numPr>
+      </w:pPr>
+      <w:r>
+        <w:t xml:space="preserve">For a ticked label, it looks through the uploads of the label's channel, which needs to be in the label's YouTube cell. Labels aren't searched by name, because a tracklist doesn't say which label a track is on.</w:t>
+      </w:r>
+    </w:p>
+    <w:p>
+      <w:pPr>
+        <w:pStyle w:val="ListParagraph"/>
+        <w:numPr>
+          <w:ilvl w:val="0"/>
+          <w:numId w:val="13"/>
+        </w:numPr>
+      </w:pPr>
+      <w:r>
+        <w:t xml:space="preserve">YouTube comes third: it is only looked at when the track wasn't found on Bandcamp or SoundCloud.</w:t>
+      </w:r>
+    </w:p>
+    <w:p>
+      <w:pPr>
+        <w:pStyle w:val="Heading2"/>
+      </w:pPr>
+      <w:r>
         <w:t xml:space="preserve">Link Finder</w:t>
       </w:r>
     </w:p>
@@ -1350,7 +1462,7 @@
         <w:pStyle w:val="ListParagraph"/>
         <w:numPr>
           <w:ilvl w:val="0"/>
-          <w:numId w:val="13"/>
+          <w:numId w:val="14"/>
         </w:numPr>
       </w:pPr>
       <w:r>
@@ -1362,7 +1474,7 @@
         <w:pStyle w:val="ListParagraph"/>
         <w:numPr>
           <w:ilvl w:val="0"/>
-          <w:numId w:val="13"/>
+          <w:numId w:val="14"/>
         </w:numPr>
       </w:pPr>
       <w:r>
@@ -1374,7 +1486,7 @@
         <w:pStyle w:val="ListParagraph"/>
         <w:numPr>
           <w:ilvl w:val="0"/>
-          <w:numId w:val="13"/>
+          <w:numId w:val="14"/>
         </w:numPr>
       </w:pPr>
       <w:r>
@@ -1386,7 +1498,7 @@
         <w:pStyle w:val="ListParagraph"/>
         <w:numPr>
           <w:ilvl w:val="0"/>
-          <w:numId w:val="13"/>
+          <w:numId w:val="14"/>
         </w:numPr>
       </w:pPr>
       <w:r>
@@ -1521,6 +1633,30 @@
           <w:p>
             <w:pPr/>
             <w:r>
+              <w:t xml:space="preserve">YouTube video</w:t>
+            </w:r>
+          </w:p>
+        </w:tc>
+        <w:tc>
+          <w:tcPr>
+            <w:tcW w:w="4680" w:type="dxa"/>
+          </w:tcPr>
+          <w:p>
+            <w:pPr/>
+            <w:r>
+              <w:t xml:space="preserve">Not found on Bandcamp or SoundCloud, but on YouTube: among the uploads of a channel you track, or by a YouTube search for an artist ticked for it. Only when YouTube is ticked for Link Finder in Settings.</w:t>
+            </w:r>
+          </w:p>
+        </w:tc>
+      </w:tr>
+      <w:tr>
+        <w:tc>
+          <w:tcPr>
+            <w:tcW w:w="4680" w:type="dxa"/>
+          </w:tcPr>
+          <w:p>
+            <w:pPr/>
+            <w:r>
               <w:t xml:space="preserve">SoundCloud artist page</w:t>
             </w:r>
           </w:p>
@@ -1593,6 +1729,30 @@
           <w:p>
             <w:pPr/>
             <w:r>
+              <w:t xml:space="preserve">YouTube channel</w:t>
+            </w:r>
+          </w:p>
+        </w:tc>
+        <w:tc>
+          <w:tcPr>
+            <w:tcW w:w="4680" w:type="dxa"/>
+          </w:tcPr>
+          <w:p>
+            <w:pPr/>
+            <w:r>
+              <w:t xml:space="preserve">The track was not found, and the artist has neither a Bandcamp page nor a SoundCloud profile to link. This is the YouTube channel you track for them.</w:t>
+            </w:r>
+          </w:p>
+        </w:tc>
+      </w:tr>
+      <w:tr>
+        <w:tc>
+          <w:tcPr>
+            <w:tcW w:w="4680" w:type="dxa"/>
+          </w:tcPr>
+          <w:p>
+            <w:pPr/>
+            <w:r>
               <w:t xml:space="preserve">Link you set</w:t>
             </w:r>
           </w:p>
@@ -1662,7 +1822,7 @@
         <w:pStyle w:val="ListParagraph"/>
         <w:numPr>
           <w:ilvl w:val="0"/>
-          <w:numId w:val="14"/>
+          <w:numId w:val="15"/>
         </w:numPr>
       </w:pPr>
       <w:r>
@@ -1680,7 +1840,7 @@
         <w:pStyle w:val="ListParagraph"/>
         <w:numPr>
           <w:ilvl w:val="0"/>
-          <w:numId w:val="14"/>
+          <w:numId w:val="15"/>
         </w:numPr>
       </w:pPr>
       <w:r>
@@ -1698,7 +1858,7 @@
         <w:pStyle w:val="ListParagraph"/>
         <w:numPr>
           <w:ilvl w:val="0"/>
-          <w:numId w:val="14"/>
+          <w:numId w:val="15"/>
         </w:numPr>
       </w:pPr>
       <w:r>
@@ -1759,7 +1919,7 @@
         <w:pStyle w:val="ListParagraph"/>
         <w:numPr>
           <w:ilvl w:val="0"/>
-          <w:numId w:val="15"/>
+          <w:numId w:val="16"/>
         </w:numPr>
       </w:pPr>
       <w:r>
@@ -1771,7 +1931,7 @@
         <w:pStyle w:val="ListParagraph"/>
         <w:numPr>
           <w:ilvl w:val="0"/>
-          <w:numId w:val="15"/>
+          <w:numId w:val="16"/>
         </w:numPr>
       </w:pPr>
       <w:r>
@@ -1783,7 +1943,7 @@
         <w:pStyle w:val="ListParagraph"/>
         <w:numPr>
           <w:ilvl w:val="0"/>
-          <w:numId w:val="15"/>
+          <w:numId w:val="16"/>
         </w:numPr>
       </w:pPr>
       <w:r>
@@ -1836,6 +1996,21 @@
     <w:p>
       <w:pPr/>
       <w:r>
+        <w:t xml:space="preserve">The filter </w:t>
+      </w:r>
+      <w:r>
+        <w:rPr>
+          <w:b/>
+        </w:rPr>
+        <w:t xml:space="preserve">Searched in the last lookup</w:t>
+      </w:r>
+      <w:r>
+        <w:t xml:space="preserve"> shows only the tracks the latest lookup had to search for (not the ones answered from what was already saved), and keeps showing them after the lookup finishes, so you have one list of new links to review. It starts again each time you press a Look up button; Search again on a row adds that row to it.</w:t>
+      </w:r>
+    </w:p>
+    <w:p>
+      <w:pPr/>
+      <w:r>
         <w:t xml:space="preserve">Each track is listed under the tidied form of its name: lower case, no accents or punctuation (ø is read as o; letters of other alphabets, such as Cyrillic or Chinese, are kept as they are, and so is a symbol written into a word, as in "∑1", "Myca$h" or "Mor£"), and no describing tags or status notes such as "(WIP)" or "(forth. Label)". That is the form tracks are matched by. A version keeps its own entry, shown in square brackets, so "Temperature" and "Temperature (River Dub Edit)" are saved separately. What you typed is shown beneath when it differs; tracks saved before version 40 only have the tidied form. Your spelling of the artist and of the title each have their own column. A track saved under a name that doesn't match your list exactly (saved before versions had entries of their own, or typed without brackets) shows the closest entry, marked "closest in your list": the one with the same words, or the only version of that title. **Edit spelling** (or Add spelling) under the title lets you type how the artist and title should be written; it is saved to your list for that track, and Remove takes the track out of your list.</w:t>
       </w:r>
     </w:p>
@@ -1870,7 +2045,7 @@
         <w:pStyle w:val="ListParagraph"/>
         <w:numPr>
           <w:ilvl w:val="0"/>
-          <w:numId w:val="16"/>
+          <w:numId w:val="17"/>
         </w:numPr>
       </w:pPr>
       <w:r>
@@ -1882,7 +2057,7 @@
         <w:pStyle w:val="ListParagraph"/>
         <w:numPr>
           <w:ilvl w:val="0"/>
-          <w:numId w:val="16"/>
+          <w:numId w:val="17"/>
         </w:numPr>
       </w:pPr>
       <w:r>
@@ -1894,7 +2069,7 @@
         <w:pStyle w:val="ListParagraph"/>
         <w:numPr>
           <w:ilvl w:val="0"/>
-          <w:numId w:val="16"/>
+          <w:numId w:val="17"/>
         </w:numPr>
       </w:pPr>
       <w:r>
@@ -1906,7 +2081,7 @@
         <w:pStyle w:val="ListParagraph"/>
         <w:numPr>
           <w:ilvl w:val="0"/>
-          <w:numId w:val="16"/>
+          <w:numId w:val="17"/>
         </w:numPr>
       </w:pPr>
       <w:r>
@@ -1924,7 +2099,7 @@
         <w:pStyle w:val="ListParagraph"/>
         <w:numPr>
           <w:ilvl w:val="0"/>
-          <w:numId w:val="17"/>
+          <w:numId w:val="18"/>
         </w:numPr>
       </w:pPr>
       <w:r>
@@ -1936,7 +2111,7 @@
         <w:pStyle w:val="ListParagraph"/>
         <w:numPr>
           <w:ilvl w:val="0"/>
-          <w:numId w:val="17"/>
+          <w:numId w:val="18"/>
         </w:numPr>
       </w:pPr>
       <w:r>
@@ -1948,7 +2123,7 @@
         <w:pStyle w:val="ListParagraph"/>
         <w:numPr>
           <w:ilvl w:val="0"/>
-          <w:numId w:val="17"/>
+          <w:numId w:val="18"/>
         </w:numPr>
       </w:pPr>
       <w:r>
@@ -1960,7 +2135,7 @@
         <w:pStyle w:val="ListParagraph"/>
         <w:numPr>
           <w:ilvl w:val="0"/>
-          <w:numId w:val="17"/>
+          <w:numId w:val="18"/>
         </w:numPr>
       </w:pPr>
       <w:r>
@@ -2029,6 +2204,20 @@
         <w:pStyle w:val="Heading3"/>
       </w:pPr>
       <w:r>
+        <w:t xml:space="preserve">Reading YouTube</w:t>
+      </w:r>
+    </w:p>
+    <w:p>
+      <w:pPr/>
+      <w:r>
+        <w:t xml:space="preserve">YouTube publishes a feed of every channel's 15 newest videos, which needs no key. A channel given by its @handle (or an old address) is opened once to read its id, which is then remembered. The feed gives no running times, so YouTube posts have no duration, and it does not mark Shorts apart from other videos. Link Finder's YouTube search reads YouTube's own results page, and keeps each answer for a week.</w:t>
+      </w:r>
+    </w:p>
+    <w:p>
+      <w:pPr>
+        <w:pStyle w:val="Heading3"/>
+      </w:pPr>
+      <w:r>
         <w:t xml:space="preserve">Pacing</w:t>
       </w:r>
     </w:p>
@@ -2043,7 +2232,7 @@
         <w:pStyle w:val="ListParagraph"/>
         <w:numPr>
           <w:ilvl w:val="0"/>
-          <w:numId w:val="18"/>
+          <w:numId w:val="19"/>
         </w:numPr>
       </w:pPr>
       <w:r>
@@ -2055,7 +2244,7 @@
         <w:pStyle w:val="ListParagraph"/>
         <w:numPr>
           <w:ilvl w:val="0"/>
-          <w:numId w:val="18"/>
+          <w:numId w:val="19"/>
         </w:numPr>
       </w:pPr>
       <w:r>
@@ -2081,7 +2270,7 @@
         <w:pStyle w:val="ListParagraph"/>
         <w:numPr>
           <w:ilvl w:val="0"/>
-          <w:numId w:val="19"/>
+          <w:numId w:val="20"/>
         </w:numPr>
       </w:pPr>
       <w:r>
@@ -2099,7 +2288,7 @@
         <w:pStyle w:val="ListParagraph"/>
         <w:numPr>
           <w:ilvl w:val="0"/>
-          <w:numId w:val="19"/>
+          <w:numId w:val="20"/>
         </w:numPr>
       </w:pPr>
       <w:r>
@@ -2137,7 +2326,7 @@
         <w:pStyle w:val="ListParagraph"/>
         <w:numPr>
           <w:ilvl w:val="0"/>
-          <w:numId w:val="20"/>
+          <w:numId w:val="21"/>
         </w:numPr>
       </w:pPr>
       <w:r>
@@ -2155,7 +2344,7 @@
         <w:pStyle w:val="ListParagraph"/>
         <w:numPr>
           <w:ilvl w:val="0"/>
-          <w:numId w:val="20"/>
+          <w:numId w:val="21"/>
         </w:numPr>
       </w:pPr>
       <w:r>
@@ -2173,7 +2362,7 @@
         <w:pStyle w:val="ListParagraph"/>
         <w:numPr>
           <w:ilvl w:val="0"/>
-          <w:numId w:val="20"/>
+          <w:numId w:val="21"/>
         </w:numPr>
       </w:pPr>
       <w:r>
@@ -2197,7 +2386,7 @@
         <w:pStyle w:val="ListParagraph"/>
         <w:numPr>
           <w:ilvl w:val="0"/>
-          <w:numId w:val="21"/>
+          <w:numId w:val="22"/>
         </w:numPr>
       </w:pPr>
       <w:r>
@@ -2209,7 +2398,7 @@
         <w:pStyle w:val="ListParagraph"/>
         <w:numPr>
           <w:ilvl w:val="0"/>
-          <w:numId w:val="21"/>
+          <w:numId w:val="22"/>
         </w:numPr>
       </w:pPr>
       <w:r>
@@ -2221,7 +2410,7 @@
         <w:pStyle w:val="ListParagraph"/>
         <w:numPr>
           <w:ilvl w:val="0"/>
-          <w:numId w:val="21"/>
+          <w:numId w:val="22"/>
         </w:numPr>
       </w:pPr>
       <w:r>
@@ -2233,7 +2422,7 @@
         <w:pStyle w:val="ListParagraph"/>
         <w:numPr>
           <w:ilvl w:val="0"/>
-          <w:numId w:val="21"/>
+          <w:numId w:val="22"/>
         </w:numPr>
       </w:pPr>
       <w:r>
@@ -2245,7 +2434,7 @@
         <w:pStyle w:val="ListParagraph"/>
         <w:numPr>
           <w:ilvl w:val="0"/>
-          <w:numId w:val="21"/>
+          <w:numId w:val="22"/>
         </w:numPr>
       </w:pPr>
       <w:r>
@@ -2257,7 +2446,7 @@
         <w:pStyle w:val="ListParagraph"/>
         <w:numPr>
           <w:ilvl w:val="0"/>
-          <w:numId w:val="21"/>
+          <w:numId w:val="22"/>
         </w:numPr>
       </w:pPr>
       <w:r>
@@ -2269,7 +2458,7 @@
         <w:pStyle w:val="ListParagraph"/>
         <w:numPr>
           <w:ilvl w:val="0"/>
-          <w:numId w:val="21"/>
+          <w:numId w:val="22"/>
         </w:numPr>
       </w:pPr>
       <w:r>
@@ -2289,7 +2478,7 @@
         <w:pStyle w:val="ListParagraph"/>
         <w:numPr>
           <w:ilvl w:val="0"/>
-          <w:numId w:val="22"/>
+          <w:numId w:val="23"/>
         </w:numPr>
       </w:pPr>
       <w:r>
@@ -2301,7 +2490,7 @@
         <w:pStyle w:val="ListParagraph"/>
         <w:numPr>
           <w:ilvl w:val="0"/>
-          <w:numId w:val="22"/>
+          <w:numId w:val="23"/>
         </w:numPr>
       </w:pPr>
       <w:r>
@@ -2313,7 +2502,7 @@
         <w:pStyle w:val="ListParagraph"/>
         <w:numPr>
           <w:ilvl w:val="0"/>
-          <w:numId w:val="22"/>
+          <w:numId w:val="23"/>
         </w:numPr>
       </w:pPr>
       <w:r>
@@ -2325,7 +2514,7 @@
         <w:pStyle w:val="ListParagraph"/>
         <w:numPr>
           <w:ilvl w:val="0"/>
-          <w:numId w:val="22"/>
+          <w:numId w:val="23"/>
         </w:numPr>
       </w:pPr>
       <w:r>
@@ -2337,7 +2526,7 @@
         <w:pStyle w:val="ListParagraph"/>
         <w:numPr>
           <w:ilvl w:val="0"/>
-          <w:numId w:val="22"/>
+          <w:numId w:val="23"/>
         </w:numPr>
       </w:pPr>
       <w:r>
@@ -4065,7 +4254,7 @@
         <w:pStyle w:val="ListParagraph"/>
         <w:numPr>
           <w:ilvl w:val="0"/>
-          <w:numId w:val="23"/>
+          <w:numId w:val="24"/>
         </w:numPr>
       </w:pPr>
       <w:r>
@@ -4086,7 +4275,7 @@
         <w:pStyle w:val="ListParagraph"/>
         <w:numPr>
           <w:ilvl w:val="0"/>
-          <w:numId w:val="23"/>
+          <w:numId w:val="24"/>
         </w:numPr>
       </w:pPr>
       <w:r>
@@ -4098,7 +4287,7 @@
         <w:pStyle w:val="ListParagraph"/>
         <w:numPr>
           <w:ilvl w:val="0"/>
-          <w:numId w:val="23"/>
+          <w:numId w:val="24"/>
         </w:numPr>
       </w:pPr>
       <w:r>
@@ -4119,7 +4308,7 @@
         <w:pStyle w:val="ListParagraph"/>
         <w:numPr>
           <w:ilvl w:val="0"/>
-          <w:numId w:val="23"/>
+          <w:numId w:val="24"/>
         </w:numPr>
       </w:pPr>
       <w:r>
@@ -4154,7 +4343,7 @@
         <w:pStyle w:val="ListParagraph"/>
         <w:numPr>
           <w:ilvl w:val="0"/>
-          <w:numId w:val="24"/>
+          <w:numId w:val="25"/>
         </w:numPr>
       </w:pPr>
       <w:r>
@@ -4172,7 +4361,7 @@
         <w:pStyle w:val="ListParagraph"/>
         <w:numPr>
           <w:ilvl w:val="0"/>
-          <w:numId w:val="24"/>
+          <w:numId w:val="25"/>
         </w:numPr>
       </w:pPr>
       <w:r>
@@ -4190,7 +4379,7 @@
         <w:pStyle w:val="ListParagraph"/>
         <w:numPr>
           <w:ilvl w:val="0"/>
-          <w:numId w:val="24"/>
+          <w:numId w:val="25"/>
         </w:numPr>
       </w:pPr>
       <w:r>
@@ -4208,7 +4397,7 @@
         <w:pStyle w:val="ListParagraph"/>
         <w:numPr>
           <w:ilvl w:val="0"/>
-          <w:numId w:val="24"/>
+          <w:numId w:val="25"/>
         </w:numPr>
       </w:pPr>
       <w:r>
@@ -4226,7 +4415,7 @@
         <w:pStyle w:val="ListParagraph"/>
         <w:numPr>
           <w:ilvl w:val="0"/>
-          <w:numId w:val="24"/>
+          <w:numId w:val="25"/>
         </w:numPr>
       </w:pPr>
       <w:r>
@@ -4244,7 +4433,7 @@
         <w:pStyle w:val="ListParagraph"/>
         <w:numPr>
           <w:ilvl w:val="0"/>
-          <w:numId w:val="24"/>
+          <w:numId w:val="25"/>
         </w:numPr>
       </w:pPr>
       <w:r>
@@ -4262,7 +4451,7 @@
         <w:pStyle w:val="ListParagraph"/>
         <w:numPr>
           <w:ilvl w:val="0"/>
-          <w:numId w:val="24"/>
+          <w:numId w:val="25"/>
         </w:numPr>
       </w:pPr>
       <w:r>
@@ -4280,7 +4469,7 @@
         <w:pStyle w:val="ListParagraph"/>
         <w:numPr>
           <w:ilvl w:val="0"/>
-          <w:numId w:val="24"/>
+          <w:numId w:val="25"/>
         </w:numPr>
       </w:pPr>
       <w:r>
@@ -4298,7 +4487,7 @@
         <w:pStyle w:val="ListParagraph"/>
         <w:numPr>
           <w:ilvl w:val="0"/>
-          <w:numId w:val="24"/>
+          <w:numId w:val="25"/>
         </w:numPr>
       </w:pPr>
       <w:r>
@@ -4316,7 +4505,7 @@
         <w:pStyle w:val="ListParagraph"/>
         <w:numPr>
           <w:ilvl w:val="0"/>
-          <w:numId w:val="24"/>
+          <w:numId w:val="25"/>
         </w:numPr>
       </w:pPr>
       <w:r>
@@ -4334,7 +4523,7 @@
         <w:pStyle w:val="ListParagraph"/>
         <w:numPr>
           <w:ilvl w:val="0"/>
-          <w:numId w:val="24"/>
+          <w:numId w:val="25"/>
         </w:numPr>
       </w:pPr>
       <w:r>
@@ -4342,6 +4531,18 @@
           <w:b/>
         </w:rPr>
         <w:t xml:space="preserve">No Instagram, no login, no "mark as unheard".</w:t>
+      </w:r>
+    </w:p>
+    <w:p>
+      <w:pPr>
+        <w:pStyle w:val="ListParagraph"/>
+        <w:numPr>
+          <w:ilvl w:val="0"/>
+          <w:numId w:val="25"/>
+        </w:numPr>
+      </w:pPr>
+      <w:r>
+        <w:t xml:space="preserve">YouTube has only been tested against stand-in copies of its pages. Its channel feed holds the 15 newest videos, has no running times and includes Shorts. Its search page is not an official interface and may change, or ask for a sign-in or a cookie choice in some countries; if it stops answering, YouTube search steps say so and the rest of the lookup carries on.</w:t>
       </w:r>
     </w:p>
     <w:p>
@@ -4837,6 +5038,30 @@
             <w:pPr/>
             <w:r>
               <w:t xml:space="preserve">What changed</w:t>
+            </w:r>
+          </w:p>
+        </w:tc>
+      </w:tr>
+      <w:tr>
+        <w:tc>
+          <w:tcPr>
+            <w:tcW w:w="4680" w:type="dxa"/>
+          </w:tcPr>
+          <w:p>
+            <w:pPr/>
+            <w:r>
+              <w:t xml:space="preserve">55</w:t>
+            </w:r>
+          </w:p>
+        </w:tc>
+        <w:tc>
+          <w:tcPr>
+            <w:tcW w:w="4680" w:type="dxa"/>
+          </w:tcPr>
+          <w:p>
+            <w:pPr/>
+            <w:r>
+              <w:t xml:space="preserve">YouTube as a third site: channels in the feed and player, a YouTube button at the top, a YouTube column and a YouTube search column in Tracked Artists. A new Settings button switches sites off completely and chooses which sites Link Finder searches (Bandcamp, then SoundCloud, then YouTube; YouTube off by default). Saved results has a "Searched in the last lookup" filter.</w:t>
             </w:r>
           </w:p>
         </w:tc>
@@ -6381,19 +6606,16 @@
     <w:abstractNumId w:val="0"/>
   </w:num>
   <w:num w:numId="17">
+    <w:abstractNumId w:val="0"/>
+  </w:num>
+  <w:num w:numId="18">
     <w:abstractNumId w:val="1"/>
     <w:lvlOverride w:ilvl="0">
       <w:startOverride w:val="1"/>
     </w:lvlOverride>
   </w:num>
-  <w:num w:numId="18">
+  <w:num w:numId="19">
     <w:abstractNumId w:val="0"/>
-  </w:num>
-  <w:num w:numId="19">
-    <w:abstractNumId w:val="1"/>
-    <w:lvlOverride w:ilvl="0">
-      <w:startOverride w:val="1"/>
-    </w:lvlOverride>
   </w:num>
   <w:num w:numId="20">
     <w:abstractNumId w:val="1"/>
@@ -6408,12 +6630,18 @@
     </w:lvlOverride>
   </w:num>
   <w:num w:numId="22">
-    <w:abstractNumId w:val="0"/>
+    <w:abstractNumId w:val="1"/>
+    <w:lvlOverride w:ilvl="0">
+      <w:startOverride w:val="1"/>
+    </w:lvlOverride>
   </w:num>
   <w:num w:numId="23">
     <w:abstractNumId w:val="0"/>
   </w:num>
   <w:num w:numId="24">
+    <w:abstractNumId w:val="0"/>
+  </w:num>
+  <w:num w:numId="25">
     <w:abstractNumId w:val="0"/>
   </w:num>
 </w:numbering>

</xml_diff>

<commit_message>
v57: List view: the hide column is titled Hide, and its ✕ hides only that track instead of the whole release. Cards still hide whole releases.
Co-Authored-By: Claude Opus 5.5 <noreply@anthropic.com>
</commit_message>
<xml_diff>
--- a/docs/Artist Feed User Guide.docx
+++ b/docs/Artist Feed User Guide.docx
@@ -968,7 +968,7 @@
         </w:numPr>
       </w:pPr>
       <w:r>
-        <w:t xml:space="preserve">The ✕ on a card (shown when you point at it) or at the end of a list row hides that release. Hiding a row hides the whole release it belongs to.</w:t>
+        <w:t xml:space="preserve">The ✕ on a card (shown when you point at it) hides that whole release. The ✕ in the list's Hide column hides just that track; the rest of the release stays, in the list and as a card. A release of a single track is hidden whole either way.</w:t>
       </w:r>
     </w:p>
     <w:p>
@@ -980,7 +980,7 @@
         </w:numPr>
       </w:pPr>
       <w:r>
-        <w:t xml:space="preserve">Hidden releases stay hidden through refreshes. Tick </w:t>
+        <w:t xml:space="preserve">Hidden releases and tracks stay hidden through refreshes. Tick </w:t>
       </w:r>
       <w:r>
         <w:rPr>
@@ -989,7 +989,7 @@
         <w:t xml:space="preserve">Show hidden</w:t>
       </w:r>
       <w:r>
-        <w:t xml:space="preserve"> and use ↺ to bring one back.</w:t>
+        <w:t xml:space="preserve"> and use ↺ to bring one back. In the list, ↺ on a track of a release hidden from the grid brings back the whole release.</w:t>
       </w:r>
     </w:p>
     <w:p>
@@ -5062,6 +5062,30 @@
             <w:pPr/>
             <w:r>
               <w:t xml:space="preserve">What changed</w:t>
+            </w:r>
+          </w:p>
+        </w:tc>
+      </w:tr>
+      <w:tr>
+        <w:tc>
+          <w:tcPr>
+            <w:tcW w:w="4680" w:type="dxa"/>
+          </w:tcPr>
+          <w:p>
+            <w:pPr/>
+            <w:r>
+              <w:t xml:space="preserve">57</w:t>
+            </w:r>
+          </w:p>
+        </w:tc>
+        <w:tc>
+          <w:tcPr>
+            <w:tcW w:w="4680" w:type="dxa"/>
+          </w:tcPr>
+          <w:p>
+            <w:pPr/>
+            <w:r>
+              <w:t xml:space="preserve">List view: the hide column is titled Hide, and its ✕ hides only that track instead of the whole release. Cards still hide whole releases.</w:t>
             </w:r>
           </w:p>
         </w:tc>

</xml_diff>

<commit_message>
Guide: add Keeping it in Git (setup, everyday commands, installing updates)
Co-Authored-By: Claude Opus 5.5 <noreply@anthropic.com>
</commit_message>
<xml_diff>
--- a/docs/Artist Feed User Guide.docx
+++ b/docs/Artist Feed User Guide.docx
@@ -13,7 +13,7 @@
     <w:p>
       <w:pPr/>
       <w:r>
-        <w:t xml:space="preserve">Oct 13, 2026</w:t>
+        <w:t xml:space="preserve">Oct 14, 2026</w:t>
       </w:r>
       <w:r>
         <w:t xml:space="preserve"/>
@@ -260,7 +260,7 @@
         </w:numPr>
       </w:pPr>
       <w:r>
-        <w:t xml:space="preserve">Unzip the new version to a </w:t>
+        <w:t xml:space="preserve">(Without Git; with Git, see Keeping it in Git below.) Unzip the new version to a </w:t>
       </w:r>
       <w:r>
         <w:rPr>
@@ -369,6 +369,400 @@
       </w:r>
       <w:r>
         <w:t xml:space="preserve">.</w:t>
+      </w:r>
+    </w:p>
+    <w:p>
+      <w:pPr>
+        <w:pStyle w:val="Heading3"/>
+      </w:pPr>
+      <w:r>
+        <w:t xml:space="preserve">Keeping it in Git</w:t>
+      </w:r>
+    </w:p>
+    <w:p>
+      <w:pPr/>
+      <w:r>
+        <w:t xml:space="preserve">The app's folder is a Git repository: every version since 3 is saved as a commit, tagged with its number (</w:t>
+      </w:r>
+      <w:r>
+        <w:rPr>
+          <w:rStyle w:val="CodeChar"/>
+        </w:rPr>
+        <w:t xml:space="preserve">v3</w:t>
+      </w:r>
+      <w:r>
+        <w:t xml:space="preserve"> … </w:t>
+      </w:r>
+      <w:r>
+        <w:rPr>
+          <w:rStyle w:val="CodeChar"/>
+        </w:rPr>
+        <w:t xml:space="preserve">v58</w:t>
+      </w:r>
+      <w:r>
+        <w:t xml:space="preserve">), with that version's Version log entry as its description. Git keeps a history of the code only. The </w:t>
+      </w:r>
+      <w:r>
+        <w:rPr>
+          <w:rStyle w:val="CodeChar"/>
+        </w:rPr>
+        <w:t xml:space="preserve">data</w:t>
+      </w:r>
+      <w:r>
+        <w:t xml:space="preserve"> folder is left out on purpose, so your artists, feed and saved lookups are never committed and never overwritten by an update.</w:t>
+      </w:r>
+    </w:p>
+    <w:p>
+      <w:pPr/>
+      <w:r>
+        <w:rPr>
+          <w:b/>
+        </w:rPr>
+        <w:t xml:space="preserve">Setting it up (once).</w:t>
+      </w:r>
+      <w:r>
+        <w:t xml:space="preserve"> Install Git for Windows from git-scm.com (the default options are fine). Stop the app, unzip </w:t>
+      </w:r>
+      <w:r>
+        <w:rPr>
+          <w:rStyle w:val="CodeChar"/>
+        </w:rPr>
+        <w:t xml:space="preserve">artist-feed-git.zip</w:t>
+      </w:r>
+      <w:r>
+        <w:t xml:space="preserve"> to a new folder, move your </w:t>
+      </w:r>
+      <w:r>
+        <w:rPr>
+          <w:rStyle w:val="CodeChar"/>
+        </w:rPr>
+        <w:t xml:space="preserve">data</w:t>
+      </w:r>
+      <w:r>
+        <w:t xml:space="preserve"> folder into it, and start the app from there with </w:t>
+      </w:r>
+      <w:r>
+        <w:rPr>
+          <w:rStyle w:val="CodeChar"/>
+        </w:rPr>
+        <w:t xml:space="preserve">docker compose up -d --build</w:t>
+      </w:r>
+      <w:r>
+        <w:t xml:space="preserve">. After that, updates no longer need a new folder each time.</w:t>
+      </w:r>
+    </w:p>
+    <w:p>
+      <w:pPr/>
+      <w:r>
+        <w:rPr>
+          <w:b/>
+        </w:rPr>
+        <w:t xml:space="preserve">Everyday commands</w:t>
+      </w:r>
+      <w:r>
+        <w:t xml:space="preserve">, typed in PowerShell inside the app's folder:</w:t>
+      </w:r>
+    </w:p>
+    <w:tbl>
+      <w:tblPr>
+        <w:tblStyle w:val="TableGrid"/>
+        <w:tblW w:w="0" w:type="auto"/>
+        <w:tblLayout w:type="fixed"/>
+        <w:tblLook w:val="04A0" w:firstRow="1" w:lastRow="0" w:firstColumn="0" w:lastColumn="0" w:noHBand="0" w:noVBand="1"/>
+      </w:tblPr>
+      <w:tblGrid>
+        <w:gridCol w:w="4680"/>
+        <w:gridCol w:w="4680"/>
+      </w:tblGrid>
+      <w:tr>
+        <w:trPr>
+          <w:tblHeader/>
+        </w:trPr>
+        <w:tc>
+          <w:tcPr>
+            <w:tcW w:w="4680" w:type="dxa"/>
+            <w:shd w:val="clear" w:color="auto" w:fill="F2F2F2"/>
+          </w:tcPr>
+          <w:p>
+            <w:pPr/>
+            <w:r>
+              <w:t xml:space="preserve">Command</w:t>
+            </w:r>
+          </w:p>
+        </w:tc>
+        <w:tc>
+          <w:tcPr>
+            <w:tcW w:w="4680" w:type="dxa"/>
+            <w:shd w:val="clear" w:color="auto" w:fill="F2F2F2"/>
+          </w:tcPr>
+          <w:p>
+            <w:pPr/>
+            <w:r>
+              <w:t xml:space="preserve">What it does</w:t>
+            </w:r>
+          </w:p>
+        </w:tc>
+      </w:tr>
+      <w:tr>
+        <w:tc>
+          <w:tcPr>
+            <w:tcW w:w="4680" w:type="dxa"/>
+          </w:tcPr>
+          <w:p>
+            <w:pPr/>
+            <w:r>
+              <w:rPr>
+                <w:rStyle w:val="CodeChar"/>
+              </w:rPr>
+              <w:t xml:space="preserve">git log --oneline</w:t>
+            </w:r>
+          </w:p>
+        </w:tc>
+        <w:tc>
+          <w:tcPr>
+            <w:tcW w:w="4680" w:type="dxa"/>
+          </w:tcPr>
+          <w:p>
+            <w:pPr/>
+            <w:r>
+              <w:t xml:space="preserve">Lists every version and what changed in it.</w:t>
+            </w:r>
+          </w:p>
+        </w:tc>
+      </w:tr>
+      <w:tr>
+        <w:tc>
+          <w:tcPr>
+            <w:tcW w:w="4680" w:type="dxa"/>
+          </w:tcPr>
+          <w:p>
+            <w:pPr/>
+            <w:r>
+              <w:rPr>
+                <w:rStyle w:val="CodeChar"/>
+              </w:rPr>
+              <w:t xml:space="preserve">git status</w:t>
+            </w:r>
+          </w:p>
+        </w:tc>
+        <w:tc>
+          <w:tcPr>
+            <w:tcW w:w="4680" w:type="dxa"/>
+          </w:tcPr>
+          <w:p>
+            <w:pPr/>
+            <w:r>
+              <w:t xml:space="preserve">Shows the files you have edited since the last commit.</w:t>
+            </w:r>
+          </w:p>
+        </w:tc>
+      </w:tr>
+      <w:tr>
+        <w:tc>
+          <w:tcPr>
+            <w:tcW w:w="4680" w:type="dxa"/>
+          </w:tcPr>
+          <w:p>
+            <w:pPr/>
+            <w:r>
+              <w:rPr>
+                <w:rStyle w:val="CodeChar"/>
+              </w:rPr>
+              <w:t xml:space="preserve">git diff</w:t>
+            </w:r>
+          </w:p>
+        </w:tc>
+        <w:tc>
+          <w:tcPr>
+            <w:tcW w:w="4680" w:type="dxa"/>
+          </w:tcPr>
+          <w:p>
+            <w:pPr/>
+            <w:r>
+              <w:t xml:space="preserve">Shows exactly what you changed.</w:t>
+            </w:r>
+          </w:p>
+        </w:tc>
+      </w:tr>
+      <w:tr>
+        <w:tc>
+          <w:tcPr>
+            <w:tcW w:w="4680" w:type="dxa"/>
+          </w:tcPr>
+          <w:p>
+            <w:pPr/>
+            <w:r>
+              <w:rPr>
+                <w:rStyle w:val="CodeChar"/>
+              </w:rPr>
+              <w:t xml:space="preserve">git add -A</w:t>
+            </w:r>
+            <w:r>
+              <w:t xml:space="preserve"> then </w:t>
+            </w:r>
+            <w:r>
+              <w:rPr>
+                <w:rStyle w:val="CodeChar"/>
+              </w:rPr>
+              <w:t xml:space="preserve">git commit -m "what I changed"</w:t>
+            </w:r>
+          </w:p>
+        </w:tc>
+        <w:tc>
+          <w:tcPr>
+            <w:tcW w:w="4680" w:type="dxa"/>
+          </w:tcPr>
+          <w:p>
+            <w:pPr/>
+            <w:r>
+              <w:t xml:space="preserve">Saves your own edits (a colour, some wording) as a commit. Do this before installing an update.</w:t>
+            </w:r>
+          </w:p>
+        </w:tc>
+      </w:tr>
+      <w:tr>
+        <w:tc>
+          <w:tcPr>
+            <w:tcW w:w="4680" w:type="dxa"/>
+          </w:tcPr>
+          <w:p>
+            <w:pPr/>
+            <w:r>
+              <w:rPr>
+                <w:rStyle w:val="CodeChar"/>
+              </w:rPr>
+              <w:t xml:space="preserve">git checkout v55</w:t>
+            </w:r>
+          </w:p>
+        </w:tc>
+        <w:tc>
+          <w:tcPr>
+            <w:tcW w:w="4680" w:type="dxa"/>
+          </w:tcPr>
+          <w:p>
+            <w:pPr/>
+            <w:r>
+              <w:t xml:space="preserve">Switches to an older version, to compare or go back. </w:t>
+            </w:r>
+            <w:r>
+              <w:rPr>
+                <w:rStyle w:val="CodeChar"/>
+              </w:rPr>
+              <w:t xml:space="preserve">git checkout main</w:t>
+            </w:r>
+            <w:r>
+              <w:t xml:space="preserve"> returns to the newest. Rebuild with </w:t>
+            </w:r>
+            <w:r>
+              <w:rPr>
+                <w:rStyle w:val="CodeChar"/>
+              </w:rPr>
+              <w:t xml:space="preserve">docker compose up -d --build</w:t>
+            </w:r>
+            <w:r>
+              <w:t xml:space="preserve"> after switching.</w:t>
+            </w:r>
+          </w:p>
+        </w:tc>
+      </w:tr>
+    </w:tbl>
+    <w:p>
+      <w:pPr/>
+      <w:r>
+        <w:rPr>
+          <w:b/>
+        </w:rPr>
+        <w:t xml:space="preserve">Installing an update.</w:t>
+      </w:r>
+      <w:r>
+        <w:t xml:space="preserve"> Commit any edits of your own first. If the repository is on GitHub, run </w:t>
+      </w:r>
+      <w:r>
+        <w:rPr>
+          <w:rStyle w:val="CodeChar"/>
+        </w:rPr>
+        <w:t xml:space="preserve">git pull</w:t>
+      </w:r>
+      <w:r>
+        <w:t xml:space="preserve">; if the update came as a file such as </w:t>
+      </w:r>
+      <w:r>
+        <w:rPr>
+          <w:rStyle w:val="CodeChar"/>
+        </w:rPr>
+        <w:t xml:space="preserve">artist-feed-v59.bundle</w:t>
+      </w:r>
+      <w:r>
+        <w:t xml:space="preserve">, run </w:t>
+      </w:r>
+      <w:r>
+        <w:rPr>
+          <w:rStyle w:val="CodeChar"/>
+        </w:rPr>
+        <w:t xml:space="preserve">git pull artist-feed-v59.bundle main</w:t>
+      </w:r>
+      <w:r>
+        <w:t xml:space="preserve">. Then run </w:t>
+      </w:r>
+      <w:r>
+        <w:rPr>
+          <w:rStyle w:val="CodeChar"/>
+        </w:rPr>
+        <w:t xml:space="preserve">docker compose up -d --build</w:t>
+      </w:r>
+      <w:r>
+        <w:t xml:space="preserve"> and check the version number. Git merges your edits with the update. Where both changed the same lines, it says there is a conflict and marks those lines in the file with </w:t>
+      </w:r>
+      <w:r>
+        <w:rPr>
+          <w:rStyle w:val="CodeChar"/>
+        </w:rPr>
+        <w:t xml:space="preserve">&lt;&lt;&lt;&lt;&lt;&lt;&lt;</w:t>
+      </w:r>
+      <w:r>
+        <w:t xml:space="preserve"> and </w:t>
+      </w:r>
+      <w:r>
+        <w:rPr>
+          <w:rStyle w:val="CodeChar"/>
+        </w:rPr>
+        <w:t xml:space="preserve">&gt;&gt;&gt;&gt;&gt;&gt;&gt;</w:t>
+      </w:r>
+      <w:r>
+        <w:t xml:space="preserve">: keep the version you want, delete the markers, then </w:t>
+      </w:r>
+      <w:r>
+        <w:rPr>
+          <w:rStyle w:val="CodeChar"/>
+        </w:rPr>
+        <w:t xml:space="preserve">git add -A</w:t>
+      </w:r>
+      <w:r>
+        <w:t xml:space="preserve"> and </w:t>
+      </w:r>
+      <w:r>
+        <w:rPr>
+          <w:rStyle w:val="CodeChar"/>
+        </w:rPr>
+        <w:t xml:space="preserve">git commit</w:t>
+      </w:r>
+      <w:r>
+        <w:t xml:space="preserve">.</w:t>
+      </w:r>
+    </w:p>
+    <w:p>
+      <w:pPr/>
+      <w:r>
+        <w:t xml:space="preserve">The file </w:t>
+      </w:r>
+      <w:r>
+        <w:rPr>
+          <w:rStyle w:val="CodeChar"/>
+        </w:rPr>
+        <w:t xml:space="preserve">.gitattributes</w:t>
+      </w:r>
+      <w:r>
+        <w:t xml:space="preserve"> keeps line endings as Linux expects them, so files edited on Windows still work inside Docker. Leave it in place.</w:t>
       </w:r>
     </w:p>
     <w:p>

</xml_diff>

<commit_message>
v59: Tracked Artists, Link Finder and Settings sit beside Grid | List; Export list beside Refresh Feed; Columns button renamed Edit Columns. README and guide rewritten for newcomers to Docker, with a way to run without Docker.
Co-Authored-By: Claude Opus 5.5 <noreply@anthropic.com>
</commit_message>
<xml_diff>
--- a/docs/Artist Feed User Guide.docx
+++ b/docs/Artist Feed User Guide.docx
@@ -166,7 +166,40 @@
     <w:p>
       <w:pPr/>
       <w:r>
-        <w:t xml:space="preserve">The app runs in Docker, so the only thing to install is Docker Desktop (free for personal use). On Windows, accept the default WSL 2 option during setup.</w:t>
+        <w:t xml:space="preserve">There are two ways to run the app. </w:t>
+      </w:r>
+      <w:r>
+        <w:rPr>
+          <w:b/>
+        </w:rPr>
+        <w:t xml:space="preserve">Docker</w:t>
+      </w:r>
+      <w:r>
+        <w:t xml:space="preserve"> is the recommended one: Docker Desktop is a free program that runs the app in its own sealed-off space, with everything it needs included, and starts it again whenever the computer starts. You don't need to learn Docker to use it; the few commands below are all there is. If you would rather not install Docker, see </w:t>
+      </w:r>
+      <w:r>
+        <w:rPr>
+          <w:b/>
+        </w:rPr>
+        <w:t xml:space="preserve">Running without Docker</w:t>
+      </w:r>
+      <w:r>
+        <w:t xml:space="preserve"> further down.</w:t>
+      </w:r>
+    </w:p>
+    <w:p>
+      <w:pPr/>
+      <w:r>
+        <w:t xml:space="preserve">Whichever way you choose, the app runs on your own computer, and you use it in your web browser at http://localhost:8080. Other devices on your home network can open it at </w:t>
+      </w:r>
+      <w:r>
+        <w:rPr>
+          <w:rStyle w:val="CodeChar"/>
+        </w:rPr>
+        <w:t xml:space="preserve">http://&lt;your computer's address&gt;:8080</w:t>
+      </w:r>
+      <w:r>
+        <w:t xml:space="preserve">.</w:t>
       </w:r>
     </w:p>
     <w:p>
@@ -174,6 +207,74 @@
         <w:pStyle w:val="Heading3"/>
       </w:pPr>
       <w:r>
+        <w:t xml:space="preserve">Installing Docker Desktop (once)</w:t>
+      </w:r>
+    </w:p>
+    <w:p>
+      <w:pPr>
+        <w:pStyle w:val="ListParagraph"/>
+        <w:numPr>
+          <w:ilvl w:val="0"/>
+          <w:numId w:val="4"/>
+        </w:numPr>
+      </w:pPr>
+      <w:r>
+        <w:t xml:space="preserve">Download Docker Desktop from docker.com/products/docker-desktop and run the installer. On Windows, keep the default option </w:t>
+      </w:r>
+      <w:r>
+        <w:rPr>
+          <w:b/>
+        </w:rPr>
+        <w:t xml:space="preserve">Use WSL 2</w:t>
+      </w:r>
+      <w:r>
+        <w:t xml:space="preserve"> ticked. If the installer says WSL needs updating, let it, or run </w:t>
+      </w:r>
+      <w:r>
+        <w:rPr>
+          <w:rStyle w:val="CodeChar"/>
+        </w:rPr>
+        <w:t xml:space="preserve">wsl --update</w:t>
+      </w:r>
+      <w:r>
+        <w:t xml:space="preserve"> in PowerShell.</w:t>
+      </w:r>
+    </w:p>
+    <w:p>
+      <w:pPr>
+        <w:pStyle w:val="ListParagraph"/>
+        <w:numPr>
+          <w:ilvl w:val="0"/>
+          <w:numId w:val="4"/>
+        </w:numPr>
+      </w:pPr>
+      <w:r>
+        <w:t xml:space="preserve">Restart the computer if asked, then open Docker Desktop. Accept the terms; you can skip signing in.</w:t>
+      </w:r>
+    </w:p>
+    <w:p>
+      <w:pPr>
+        <w:pStyle w:val="ListParagraph"/>
+        <w:numPr>
+          <w:ilvl w:val="0"/>
+          <w:numId w:val="4"/>
+        </w:numPr>
+      </w:pPr>
+      <w:r>
+        <w:t xml:space="preserve">Wait until the bottom-left corner of Docker Desktop says the engine is running (a green indicator).</w:t>
+      </w:r>
+    </w:p>
+    <w:p>
+      <w:pPr/>
+      <w:r>
+        <w:t xml:space="preserve">Docker Desktop is free for personal use. It needs a 64-bit Windows 10 or 11, or a recent Mac, and about 4 GB of memory to spare.</w:t>
+      </w:r>
+    </w:p>
+    <w:p>
+      <w:pPr>
+        <w:pStyle w:val="Heading3"/>
+      </w:pPr>
+      <w:r>
         <w:t xml:space="preserve">First run</w:t>
       </w:r>
     </w:p>
@@ -182,156 +283,297 @@
         <w:pStyle w:val="ListParagraph"/>
         <w:numPr>
           <w:ilvl w:val="0"/>
-          <w:numId w:val="4"/>
-        </w:numPr>
-      </w:pPr>
-      <w:r>
-        <w:t xml:space="preserve">Start Docker Desktop and wait until it says the engine is running.</w:t>
-      </w:r>
-    </w:p>
-    <w:p>
-      <w:pPr>
-        <w:pStyle w:val="ListParagraph"/>
-        <w:numPr>
-          <w:ilvl w:val="0"/>
-          <w:numId w:val="4"/>
-        </w:numPr>
-      </w:pPr>
-      <w:r>
-        <w:t xml:space="preserve">Unzip the app, and open the folder that directly contains </w:t>
+          <w:numId w:val="5"/>
+        </w:numPr>
+      </w:pPr>
+      <w:r>
+        <w:t xml:space="preserve">Get the app's files. Either download them from GitHub with Git (</w:t>
       </w:r>
       <w:r>
         <w:rPr>
           <w:rStyle w:val="CodeChar"/>
         </w:rPr>
+        <w:t xml:space="preserve">git clone https://github.com/divided-eye/artist-feed.git</w:t>
+      </w:r>
+      <w:r>
+        <w:t xml:space="preserve">, see Keeping it in Git), or unzip the zip you were given. Put the folder somewhere permanent, such as </w:t>
+      </w:r>
+      <w:r>
+        <w:rPr>
+          <w:rStyle w:val="CodeChar"/>
+        </w:rPr>
+        <w:t xml:space="preserve">Documents\artist-feed</w:t>
+      </w:r>
+      <w:r>
+        <w:t xml:space="preserve">.</w:t>
+      </w:r>
+    </w:p>
+    <w:p>
+      <w:pPr>
+        <w:pStyle w:val="ListParagraph"/>
+        <w:numPr>
+          <w:ilvl w:val="0"/>
+          <w:numId w:val="5"/>
+        </w:numPr>
+      </w:pPr>
+      <w:r>
+        <w:t xml:space="preserve">Open that folder in File Explorer and check it directly contains </w:t>
+      </w:r>
+      <w:r>
+        <w:rPr>
+          <w:rStyle w:val="CodeChar"/>
+        </w:rPr>
         <w:t xml:space="preserve">docker-compose.yml</w:t>
       </w:r>
       <w:r>
+        <w:t xml:space="preserve">. ("Extract all" on Windows often adds an extra outer folder; if so, go one level in.)</w:t>
+      </w:r>
+    </w:p>
+    <w:p>
+      <w:pPr>
+        <w:pStyle w:val="ListParagraph"/>
+        <w:numPr>
+          <w:ilvl w:val="0"/>
+          <w:numId w:val="5"/>
+        </w:numPr>
+      </w:pPr>
+      <w:r>
+        <w:t xml:space="preserve">Open a terminal in that folder: in File Explorer, click the address bar, type </w:t>
+      </w:r>
+      <w:r>
+        <w:rPr>
+          <w:rStyle w:val="CodeChar"/>
+        </w:rPr>
+        <w:t xml:space="preserve">powershell</w:t>
+      </w:r>
+      <w:r>
+        <w:t xml:space="preserve"> and press Enter. On a Mac, open Terminal and type </w:t>
+      </w:r>
+      <w:r>
+        <w:rPr>
+          <w:rStyle w:val="CodeChar"/>
+        </w:rPr>
+        <w:t xml:space="preserve">cd </w:t>
+      </w:r>
+      <w:r>
+        <w:t xml:space="preserve"> followed by the folder's path.</w:t>
+      </w:r>
+    </w:p>
+    <w:p>
+      <w:pPr>
+        <w:pStyle w:val="ListParagraph"/>
+        <w:numPr>
+          <w:ilvl w:val="0"/>
+          <w:numId w:val="5"/>
+        </w:numPr>
+      </w:pPr>
+      <w:r>
+        <w:t xml:space="preserve">Make sure Docker Desktop is running, then type </w:t>
+      </w:r>
+      <w:r>
+        <w:rPr>
+          <w:rStyle w:val="CodeChar"/>
+        </w:rPr>
+        <w:t xml:space="preserve">docker compose up -d --build</w:t>
+      </w:r>
+      <w:r>
+        <w:t xml:space="preserve"> and press Enter. The first time takes a few minutes while it downloads and builds; later starts take seconds. When it finishes, it prints that the container is started.</w:t>
+      </w:r>
+    </w:p>
+    <w:p>
+      <w:pPr>
+        <w:pStyle w:val="ListParagraph"/>
+        <w:numPr>
+          <w:ilvl w:val="0"/>
+          <w:numId w:val="5"/>
+        </w:numPr>
+      </w:pPr>
+      <w:r>
+        <w:t xml:space="preserve">Open http://localhost:8080 in your browser. Click </w:t>
+      </w:r>
+      <w:r>
+        <w:rPr>
+          <w:b/>
+        </w:rPr>
+        <w:t xml:space="preserve">Tracked Artists</w:t>
+      </w:r>
+      <w:r>
+        <w:t xml:space="preserve">, add a few artists, and press </w:t>
+      </w:r>
+      <w:r>
+        <w:rPr>
+          <w:b/>
+        </w:rPr>
+        <w:t xml:space="preserve">Save changes</w:t>
+      </w:r>
+      <w:r>
         <w:t xml:space="preserve">.</w:t>
       </w:r>
     </w:p>
     <w:p>
-      <w:pPr>
-        <w:pStyle w:val="ListParagraph"/>
-        <w:numPr>
-          <w:ilvl w:val="0"/>
-          <w:numId w:val="4"/>
-        </w:numPr>
-      </w:pPr>
-      <w:r>
-        <w:t xml:space="preserve">Open a terminal in that folder and run </w:t>
+      <w:pPr/>
+      <w:r>
+        <w:t xml:space="preserve">From then on the app starts by itself whenever Docker Desktop starts. To make Docker Desktop start with the computer, tick </w:t>
+      </w:r>
+      <w:r>
+        <w:rPr>
+          <w:b/>
+        </w:rPr>
+        <w:t xml:space="preserve">Start Docker Desktop when you sign in</w:t>
+      </w:r>
+      <w:r>
+        <w:t xml:space="preserve"> in its Settings.</w:t>
+      </w:r>
+    </w:p>
+    <w:p>
+      <w:pPr/>
+      <w:r>
+        <w:t xml:space="preserve">If the page doesn't open: check Docker Desktop is running and the app is listed under </w:t>
+      </w:r>
+      <w:r>
+        <w:rPr>
+          <w:b/>
+        </w:rPr>
+        <w:t xml:space="preserve">Containers</w:t>
+      </w:r>
+      <w:r>
+        <w:t xml:space="preserve"> with a green dot. </w:t>
       </w:r>
       <w:r>
         <w:rPr>
           <w:rStyle w:val="CodeChar"/>
         </w:rPr>
+        <w:t xml:space="preserve">docker compose logs --tail 50</w:t>
+      </w:r>
+      <w:r>
+        <w:t xml:space="preserve">, run in the app's folder, shows its latest messages. If another program already uses port 8080, change </w:t>
+      </w:r>
+      <w:r>
+        <w:rPr>
+          <w:rStyle w:val="CodeChar"/>
+        </w:rPr>
+        <w:t xml:space="preserve">8080:8000</w:t>
+      </w:r>
+      <w:r>
+        <w:t xml:space="preserve"> in </w:t>
+      </w:r>
+      <w:r>
+        <w:rPr>
+          <w:rStyle w:val="CodeChar"/>
+        </w:rPr>
+        <w:t xml:space="preserve">docker-compose.yml</w:t>
+      </w:r>
+      <w:r>
+        <w:t xml:space="preserve"> to, say, </w:t>
+      </w:r>
+      <w:r>
+        <w:rPr>
+          <w:rStyle w:val="CodeChar"/>
+        </w:rPr>
+        <w:t xml:space="preserve">8090:8000</w:t>
+      </w:r>
+      <w:r>
+        <w:t xml:space="preserve">, run </w:t>
+      </w:r>
+      <w:r>
+        <w:rPr>
+          <w:rStyle w:val="CodeChar"/>
+        </w:rPr>
+        <w:t xml:space="preserve">docker compose up -d</w:t>
+      </w:r>
+      <w:r>
+        <w:t xml:space="preserve"> again and open http://localhost:8090.</w:t>
+      </w:r>
+    </w:p>
+    <w:p>
+      <w:pPr>
+        <w:pStyle w:val="Heading3"/>
+      </w:pPr>
+      <w:r>
+        <w:t xml:space="preserve">Updating to a new version</w:t>
+      </w:r>
+    </w:p>
+    <w:p>
+      <w:pPr>
+        <w:pStyle w:val="ListParagraph"/>
+        <w:numPr>
+          <w:ilvl w:val="0"/>
+          <w:numId w:val="6"/>
+        </w:numPr>
+      </w:pPr>
+      <w:r>
+        <w:t xml:space="preserve">(Without Git; with Git, see Keeping it in Git below.) Unzip the new version to a </w:t>
+      </w:r>
+      <w:r>
+        <w:rPr>
+          <w:b/>
+        </w:rPr>
+        <w:t xml:space="preserve">new</w:t>
+      </w:r>
+      <w:r>
+        <w:t xml:space="preserve"> folder. Do not unzip over the old one.</w:t>
+      </w:r>
+    </w:p>
+    <w:p>
+      <w:pPr>
+        <w:pStyle w:val="ListParagraph"/>
+        <w:numPr>
+          <w:ilvl w:val="0"/>
+          <w:numId w:val="6"/>
+        </w:numPr>
+      </w:pPr>
+      <w:r>
+        <w:t xml:space="preserve">Check that the folder you are in directly contains </w:t>
+      </w:r>
+      <w:r>
+        <w:rPr>
+          <w:rStyle w:val="CodeChar"/>
+        </w:rPr>
+        <w:t xml:space="preserve">docker-compose.yml</w:t>
+      </w:r>
+      <w:r>
+        <w:t xml:space="preserve">. "Extract all" on Windows often adds an extra outer folder.</w:t>
+      </w:r>
+    </w:p>
+    <w:p>
+      <w:pPr>
+        <w:pStyle w:val="ListParagraph"/>
+        <w:numPr>
+          <w:ilvl w:val="0"/>
+          <w:numId w:val="6"/>
+        </w:numPr>
+      </w:pPr>
+      <w:r>
+        <w:t xml:space="preserve">Copy the </w:t>
+      </w:r>
+      <w:r>
+        <w:rPr>
+          <w:rStyle w:val="CodeChar"/>
+        </w:rPr>
+        <w:t xml:space="preserve">data</w:t>
+      </w:r>
+      <w:r>
+        <w:t xml:space="preserve"> folder from the old version's folder into the new one. This carries over your artists, feed, purchases and saved lookups.</w:t>
+      </w:r>
+    </w:p>
+    <w:p>
+      <w:pPr>
+        <w:pStyle w:val="ListParagraph"/>
+        <w:numPr>
+          <w:ilvl w:val="0"/>
+          <w:numId w:val="6"/>
+        </w:numPr>
+      </w:pPr>
+      <w:r>
+        <w:t xml:space="preserve">Run </w:t>
+      </w:r>
+      <w:r>
+        <w:rPr>
+          <w:rStyle w:val="CodeChar"/>
+        </w:rPr>
         <w:t xml:space="preserve">docker compose up -d --build</w:t>
       </w:r>
       <w:r>
-        <w:t xml:space="preserve">.</w:t>
-      </w:r>
-    </w:p>
-    <w:p>
-      <w:pPr>
-        <w:pStyle w:val="ListParagraph"/>
-        <w:numPr>
-          <w:ilvl w:val="0"/>
-          <w:numId w:val="4"/>
-        </w:numPr>
-      </w:pPr>
-      <w:r>
-        <w:t xml:space="preserve">Open http://localhost:8080 in a browser.</w:t>
-      </w:r>
-    </w:p>
-    <w:p>
-      <w:pPr>
-        <w:pStyle w:val="Heading3"/>
-      </w:pPr>
-      <w:r>
-        <w:t xml:space="preserve">Updating to a new version</w:t>
-      </w:r>
-    </w:p>
-    <w:p>
-      <w:pPr>
-        <w:pStyle w:val="ListParagraph"/>
-        <w:numPr>
-          <w:ilvl w:val="0"/>
-          <w:numId w:val="5"/>
-        </w:numPr>
-      </w:pPr>
-      <w:r>
-        <w:t xml:space="preserve">(Without Git; with Git, see Keeping it in Git below.) Unzip the new version to a </w:t>
-      </w:r>
-      <w:r>
-        <w:rPr>
-          <w:b/>
-        </w:rPr>
-        <w:t xml:space="preserve">new</w:t>
-      </w:r>
-      <w:r>
-        <w:t xml:space="preserve"> folder. Do not unzip over the old one.</w:t>
-      </w:r>
-    </w:p>
-    <w:p>
-      <w:pPr>
-        <w:pStyle w:val="ListParagraph"/>
-        <w:numPr>
-          <w:ilvl w:val="0"/>
-          <w:numId w:val="5"/>
-        </w:numPr>
-      </w:pPr>
-      <w:r>
-        <w:t xml:space="preserve">Check that the folder you are in directly contains </w:t>
-      </w:r>
-      <w:r>
-        <w:rPr>
-          <w:rStyle w:val="CodeChar"/>
-        </w:rPr>
-        <w:t xml:space="preserve">docker-compose.yml</w:t>
-      </w:r>
-      <w:r>
-        <w:t xml:space="preserve">. "Extract all" on Windows often adds an extra outer folder.</w:t>
-      </w:r>
-    </w:p>
-    <w:p>
-      <w:pPr>
-        <w:pStyle w:val="ListParagraph"/>
-        <w:numPr>
-          <w:ilvl w:val="0"/>
-          <w:numId w:val="5"/>
-        </w:numPr>
-      </w:pPr>
-      <w:r>
-        <w:t xml:space="preserve">Copy the </w:t>
-      </w:r>
-      <w:r>
-        <w:rPr>
-          <w:rStyle w:val="CodeChar"/>
-        </w:rPr>
-        <w:t xml:space="preserve">data</w:t>
-      </w:r>
-      <w:r>
-        <w:t xml:space="preserve"> folder from the old version's folder into the new one. This carries over your artists, feed, purchases and saved lookups.</w:t>
-      </w:r>
-    </w:p>
-    <w:p>
-      <w:pPr>
-        <w:pStyle w:val="ListParagraph"/>
-        <w:numPr>
-          <w:ilvl w:val="0"/>
-          <w:numId w:val="5"/>
-        </w:numPr>
-      </w:pPr>
-      <w:r>
-        <w:t xml:space="preserve">Run </w:t>
-      </w:r>
-      <w:r>
-        <w:rPr>
-          <w:rStyle w:val="CodeChar"/>
-        </w:rPr>
-        <w:t xml:space="preserve">docker compose up -d --build</w:t>
-      </w:r>
-      <w:r>
         <w:t xml:space="preserve"> in the new folder.</w:t>
       </w:r>
     </w:p>
@@ -340,7 +582,7 @@
         <w:pStyle w:val="ListParagraph"/>
         <w:numPr>
           <w:ilvl w:val="0"/>
-          <w:numId w:val="5"/>
+          <w:numId w:val="6"/>
         </w:numPr>
       </w:pPr>
       <w:r>
@@ -778,7 +1020,7 @@
         <w:pStyle w:val="ListParagraph"/>
         <w:numPr>
           <w:ilvl w:val="0"/>
-          <w:numId w:val="6"/>
+          <w:numId w:val="7"/>
         </w:numPr>
       </w:pPr>
       <w:r>
@@ -805,7 +1047,7 @@
         <w:pStyle w:val="ListParagraph"/>
         <w:numPr>
           <w:ilvl w:val="0"/>
-          <w:numId w:val="6"/>
+          <w:numId w:val="7"/>
         </w:numPr>
       </w:pPr>
       <w:r>
@@ -817,7 +1059,7 @@
         <w:pStyle w:val="ListParagraph"/>
         <w:numPr>
           <w:ilvl w:val="0"/>
-          <w:numId w:val="6"/>
+          <w:numId w:val="7"/>
         </w:numPr>
       </w:pPr>
       <w:r>
@@ -849,6 +1091,264 @@
     </w:p>
     <w:p>
       <w:pPr>
+        <w:pStyle w:val="Heading3"/>
+      </w:pPr>
+      <w:r>
+        <w:t xml:space="preserve">Running without Docker</w:t>
+      </w:r>
+    </w:p>
+    <w:p>
+      <w:pPr/>
+      <w:r>
+        <w:t xml:space="preserve">The app is an ordinary Python program, so it can run without Docker. The trade-off: it only runs while its window is open, it doesn't start by itself when the computer starts, and you install Python and the app's libraries yourself.</w:t>
+      </w:r>
+    </w:p>
+    <w:p>
+      <w:pPr/>
+      <w:r>
+        <w:rPr>
+          <w:b/>
+        </w:rPr>
+        <w:t xml:space="preserve">Installing (once), on Windows:</w:t>
+      </w:r>
+    </w:p>
+    <w:p>
+      <w:pPr>
+        <w:pStyle w:val="ListParagraph"/>
+        <w:numPr>
+          <w:ilvl w:val="0"/>
+          <w:numId w:val="8"/>
+        </w:numPr>
+      </w:pPr>
+      <w:r>
+        <w:t xml:space="preserve">Install Python 3.12 from python.org/downloads. On the installer's first screen, tick </w:t>
+      </w:r>
+      <w:r>
+        <w:rPr>
+          <w:b/>
+        </w:rPr>
+        <w:t xml:space="preserve">Add python.exe to PATH</w:t>
+      </w:r>
+      <w:r>
+        <w:t xml:space="preserve">.</w:t>
+      </w:r>
+    </w:p>
+    <w:p>
+      <w:pPr>
+        <w:pStyle w:val="ListParagraph"/>
+        <w:numPr>
+          <w:ilvl w:val="0"/>
+          <w:numId w:val="8"/>
+        </w:numPr>
+      </w:pPr>
+      <w:r>
+        <w:t xml:space="preserve">Open PowerShell in the app's folder (the one containing </w:t>
+      </w:r>
+      <w:r>
+        <w:rPr>
+          <w:rStyle w:val="CodeChar"/>
+        </w:rPr>
+        <w:t xml:space="preserve">requirements.txt</w:t>
+      </w:r>
+      <w:r>
+        <w:t xml:space="preserve">) and run these three lines one at a time:</w:t>
+      </w:r>
+    </w:p>
+    <w:p>
+      <w:pPr>
+        <w:pStyle w:val="Code"/>
+      </w:pPr>
+      <w:r>
+        <w:t xml:space="preserve">py -3.12 -m venv .venv</w:t>
+        <w:br/>
+        <w:t xml:space="preserve">.venv\Scripts\Activate.ps1</w:t>
+        <w:br/>
+        <w:t xml:space="preserve">pip install -r requirements.txt</w:t>
+      </w:r>
+    </w:p>
+    <w:p>
+      <w:pPr/>
+      <w:r>
+        <w:t xml:space="preserve">The first line makes a private Python environment for the app in a </w:t>
+      </w:r>
+      <w:r>
+        <w:rPr>
+          <w:rStyle w:val="CodeChar"/>
+        </w:rPr>
+        <w:t xml:space="preserve">.venv</w:t>
+      </w:r>
+      <w:r>
+        <w:t xml:space="preserve"> folder, the second switches to it, and the third installs the libraries the app needs. If PowerShell refuses the second line because running scripts is disabled, run </w:t>
+      </w:r>
+      <w:r>
+        <w:rPr>
+          <w:rStyle w:val="CodeChar"/>
+        </w:rPr>
+        <w:t xml:space="preserve">Set-ExecutionPolicy -Scope CurrentUser RemoteSigned</w:t>
+      </w:r>
+      <w:r>
+        <w:t xml:space="preserve"> once, answer Y, and try again.</w:t>
+      </w:r>
+    </w:p>
+    <w:p>
+      <w:pPr/>
+      <w:r>
+        <w:t xml:space="preserve">On a Mac the same steps are </w:t>
+      </w:r>
+      <w:r>
+        <w:rPr>
+          <w:rStyle w:val="CodeChar"/>
+        </w:rPr>
+        <w:t xml:space="preserve">python3 -m venv .venv</w:t>
+      </w:r>
+      <w:r>
+        <w:t xml:space="preserve">, </w:t>
+      </w:r>
+      <w:r>
+        <w:rPr>
+          <w:rStyle w:val="CodeChar"/>
+        </w:rPr>
+        <w:t xml:space="preserve">source .venv/bin/activate</w:t>
+      </w:r>
+      <w:r>
+        <w:t xml:space="preserve"> and </w:t>
+      </w:r>
+      <w:r>
+        <w:rPr>
+          <w:rStyle w:val="CodeChar"/>
+        </w:rPr>
+        <w:t xml:space="preserve">pip install -r requirements.txt</w:t>
+      </w:r>
+      <w:r>
+        <w:t xml:space="preserve">.</w:t>
+      </w:r>
+    </w:p>
+    <w:p>
+      <w:pPr/>
+      <w:r>
+        <w:rPr>
+          <w:b/>
+        </w:rPr>
+        <w:t xml:space="preserve">Starting it</w:t>
+      </w:r>
+      <w:r>
+        <w:t xml:space="preserve">, each time, in PowerShell in the app's folder:</w:t>
+      </w:r>
+    </w:p>
+    <w:p>
+      <w:pPr>
+        <w:pStyle w:val="Code"/>
+      </w:pPr>
+      <w:r>
+        <w:t xml:space="preserve">.venv\Scripts\Activate.ps1</w:t>
+        <w:br/>
+        <w:t xml:space="preserve">python -m uvicorn app.main:app --host 0.0.0.0 --port 8080</w:t>
+      </w:r>
+    </w:p>
+    <w:p>
+      <w:pPr/>
+      <w:r>
+        <w:t xml:space="preserve">Then open http://localhost:8080. Leave the window open while you use the app; closing it, or pressing Ctrl+C in it, stops the app. Use </w:t>
+      </w:r>
+      <w:r>
+        <w:rPr>
+          <w:rStyle w:val="CodeChar"/>
+        </w:rPr>
+        <w:t xml:space="preserve">--host 127.0.0.1</w:t>
+      </w:r>
+      <w:r>
+        <w:t xml:space="preserve"> instead of </w:t>
+      </w:r>
+      <w:r>
+        <w:rPr>
+          <w:rStyle w:val="CodeChar"/>
+        </w:rPr>
+        <w:t xml:space="preserve">0.0.0.0</w:t>
+      </w:r>
+      <w:r>
+        <w:t xml:space="preserve"> to keep it to this computer only.</w:t>
+      </w:r>
+    </w:p>
+    <w:p>
+      <w:pPr/>
+      <w:r>
+        <w:rPr>
+          <w:b/>
+        </w:rPr>
+        <w:t xml:space="preserve">Where things are.</w:t>
+      </w:r>
+      <w:r>
+        <w:t xml:space="preserve"> Your data is saved in the </w:t>
+      </w:r>
+      <w:r>
+        <w:rPr>
+          <w:rStyle w:val="CodeChar"/>
+        </w:rPr>
+        <w:t xml:space="preserve">data</w:t>
+      </w:r>
+      <w:r>
+        <w:t xml:space="preserve"> folder inside the app's folder, the same as with Docker, so you can switch between the two ways and keep everything. The settings in </w:t>
+      </w:r>
+      <w:r>
+        <w:rPr>
+          <w:rStyle w:val="CodeChar"/>
+        </w:rPr>
+        <w:t xml:space="preserve">docker-compose.yml</w:t>
+      </w:r>
+      <w:r>
+        <w:t xml:space="preserve"> don't apply; set them in PowerShell before starting instead, for example </w:t>
+      </w:r>
+      <w:r>
+        <w:rPr>
+          <w:rStyle w:val="CodeChar"/>
+        </w:rPr>
+        <w:t xml:space="preserve">$env:REFRESH_MINUTES = "30"</w:t>
+      </w:r>
+      <w:r>
+        <w:t xml:space="preserve">.</w:t>
+      </w:r>
+    </w:p>
+    <w:p>
+      <w:pPr/>
+      <w:r>
+        <w:rPr>
+          <w:b/>
+        </w:rPr>
+        <w:t xml:space="preserve">Updating</w:t>
+      </w:r>
+      <w:r>
+        <w:t xml:space="preserve"> works as with Docker (</w:t>
+      </w:r>
+      <w:r>
+        <w:rPr>
+          <w:rStyle w:val="CodeChar"/>
+        </w:rPr>
+        <w:t xml:space="preserve">git pull</w:t>
+      </w:r>
+      <w:r>
+        <w:t xml:space="preserve">, or a new folder with your </w:t>
+      </w:r>
+      <w:r>
+        <w:rPr>
+          <w:rStyle w:val="CodeChar"/>
+        </w:rPr>
+        <w:t xml:space="preserve">data</w:t>
+      </w:r>
+      <w:r>
+        <w:t xml:space="preserve"> folder copied in), then run </w:t>
+      </w:r>
+      <w:r>
+        <w:rPr>
+          <w:rStyle w:val="CodeChar"/>
+        </w:rPr>
+        <w:t xml:space="preserve">pip install -r requirements.txt</w:t>
+      </w:r>
+      <w:r>
+        <w:t xml:space="preserve"> again in case the libraries changed, and start the app as above.</w:t>
+      </w:r>
+    </w:p>
+    <w:p>
+      <w:pPr>
         <w:pStyle w:val="Heading2"/>
       </w:pPr>
       <w:r>
@@ -883,7 +1383,7 @@
         <w:pStyle w:val="ListParagraph"/>
         <w:numPr>
           <w:ilvl w:val="0"/>
-          <w:numId w:val="7"/>
+          <w:numId w:val="9"/>
         </w:numPr>
       </w:pPr>
       <w:r>
@@ -901,7 +1401,7 @@
         <w:pStyle w:val="ListParagraph"/>
         <w:numPr>
           <w:ilvl w:val="0"/>
-          <w:numId w:val="7"/>
+          <w:numId w:val="9"/>
         </w:numPr>
       </w:pPr>
       <w:r>
@@ -919,7 +1419,7 @@
         <w:pStyle w:val="ListParagraph"/>
         <w:numPr>
           <w:ilvl w:val="0"/>
-          <w:numId w:val="7"/>
+          <w:numId w:val="9"/>
         </w:numPr>
       </w:pPr>
       <w:r>
@@ -939,7 +1439,7 @@
         <w:pStyle w:val="ListParagraph"/>
         <w:numPr>
           <w:ilvl w:val="0"/>
-          <w:numId w:val="8"/>
+          <w:numId w:val="10"/>
         </w:numPr>
       </w:pPr>
       <w:r>
@@ -951,7 +1451,7 @@
         <w:pStyle w:val="ListParagraph"/>
         <w:numPr>
           <w:ilvl w:val="0"/>
-          <w:numId w:val="8"/>
+          <w:numId w:val="10"/>
         </w:numPr>
       </w:pPr>
       <w:r>
@@ -972,19 +1472,19 @@
         <w:pStyle w:val="ListParagraph"/>
         <w:numPr>
           <w:ilvl w:val="0"/>
-          <w:numId w:val="8"/>
-        </w:numPr>
-      </w:pPr>
-      <w:r>
-        <w:t xml:space="preserve">The headings stay in place while the list scrolls. Drag a heading onto another to move that column. The Columns button (List view only) opens a menu to tick columns on or off and reorder them with arrows; Reset to default restores the original order, visibility and widths. The layout is remembered in this browser.</w:t>
-      </w:r>
-    </w:p>
-    <w:p>
-      <w:pPr>
-        <w:pStyle w:val="ListParagraph"/>
-        <w:numPr>
-          <w:ilvl w:val="0"/>
-          <w:numId w:val="8"/>
+          <w:numId w:val="10"/>
+        </w:numPr>
+      </w:pPr>
+      <w:r>
+        <w:t xml:space="preserve">The headings stay in place while the list scrolls. Drag a heading onto another to move that column. The Edit Columns button (List view only) opens a menu to tick columns on or off and reorder them with arrows; Reset to default restores the original order, visibility and widths. The layout is remembered in this browser.</w:t>
+      </w:r>
+    </w:p>
+    <w:p>
+      <w:pPr>
+        <w:pStyle w:val="ListParagraph"/>
+        <w:numPr>
+          <w:ilvl w:val="0"/>
+          <w:numId w:val="10"/>
         </w:numPr>
       </w:pPr>
       <w:r>
@@ -994,15 +1494,15 @@
         <w:t xml:space="preserve">Export list</w:t>
       </w:r>
       <w:r>
-        <w:t xml:space="preserve"> downloads a CSV of every row that matches the current filters, in the current sort order, not just the rows on screen.</w:t>
-      </w:r>
-    </w:p>
-    <w:p>
-      <w:pPr>
-        <w:pStyle w:val="ListParagraph"/>
-        <w:numPr>
-          <w:ilvl w:val="0"/>
-          <w:numId w:val="8"/>
+        <w:t xml:space="preserve"> (List view only, beside Refresh Feed) downloads a CSV of every row that matches the current filters, in the current sort order, not just the rows on screen.</w:t>
+      </w:r>
+    </w:p>
+    <w:p>
+      <w:pPr>
+        <w:pStyle w:val="ListParagraph"/>
+        <w:numPr>
+          <w:ilvl w:val="0"/>
+          <w:numId w:val="10"/>
         </w:numPr>
       </w:pPr>
       <w:r>
@@ -1290,7 +1790,7 @@
         <w:pStyle w:val="ListParagraph"/>
         <w:numPr>
           <w:ilvl w:val="0"/>
-          <w:numId w:val="9"/>
+          <w:numId w:val="11"/>
         </w:numPr>
       </w:pPr>
       <w:r>
@@ -1302,7 +1802,7 @@
         <w:pStyle w:val="ListParagraph"/>
         <w:numPr>
           <w:ilvl w:val="0"/>
-          <w:numId w:val="9"/>
+          <w:numId w:val="11"/>
         </w:numPr>
       </w:pPr>
       <w:r>
@@ -1314,7 +1814,7 @@
         <w:pStyle w:val="ListParagraph"/>
         <w:numPr>
           <w:ilvl w:val="0"/>
-          <w:numId w:val="9"/>
+          <w:numId w:val="11"/>
         </w:numPr>
       </w:pPr>
       <w:r>
@@ -1326,7 +1826,7 @@
         <w:pStyle w:val="ListParagraph"/>
         <w:numPr>
           <w:ilvl w:val="0"/>
-          <w:numId w:val="9"/>
+          <w:numId w:val="11"/>
         </w:numPr>
       </w:pPr>
       <w:r>
@@ -1338,7 +1838,7 @@
         <w:pStyle w:val="ListParagraph"/>
         <w:numPr>
           <w:ilvl w:val="0"/>
-          <w:numId w:val="9"/>
+          <w:numId w:val="11"/>
         </w:numPr>
       </w:pPr>
       <w:r>
@@ -1358,7 +1858,7 @@
         <w:pStyle w:val="ListParagraph"/>
         <w:numPr>
           <w:ilvl w:val="0"/>
-          <w:numId w:val="10"/>
+          <w:numId w:val="12"/>
         </w:numPr>
       </w:pPr>
       <w:r>
@@ -1370,7 +1870,7 @@
         <w:pStyle w:val="ListParagraph"/>
         <w:numPr>
           <w:ilvl w:val="0"/>
-          <w:numId w:val="10"/>
+          <w:numId w:val="12"/>
         </w:numPr>
       </w:pPr>
       <w:r>
@@ -1391,7 +1891,7 @@
         <w:pStyle w:val="ListParagraph"/>
         <w:numPr>
           <w:ilvl w:val="0"/>
-          <w:numId w:val="10"/>
+          <w:numId w:val="12"/>
         </w:numPr>
       </w:pPr>
       <w:r>
@@ -1403,7 +1903,7 @@
         <w:pStyle w:val="ListParagraph"/>
         <w:numPr>
           <w:ilvl w:val="0"/>
-          <w:numId w:val="10"/>
+          <w:numId w:val="12"/>
         </w:numPr>
       </w:pPr>
       <w:r>
@@ -1438,7 +1938,7 @@
         <w:pStyle w:val="ListParagraph"/>
         <w:numPr>
           <w:ilvl w:val="0"/>
-          <w:numId w:val="11"/>
+          <w:numId w:val="13"/>
         </w:numPr>
       </w:pPr>
       <w:r>
@@ -1459,7 +1959,7 @@
         <w:pStyle w:val="ListParagraph"/>
         <w:numPr>
           <w:ilvl w:val="0"/>
-          <w:numId w:val="11"/>
+          <w:numId w:val="13"/>
         </w:numPr>
       </w:pPr>
       <w:r>
@@ -1471,7 +1971,7 @@
         <w:pStyle w:val="ListParagraph"/>
         <w:numPr>
           <w:ilvl w:val="0"/>
-          <w:numId w:val="11"/>
+          <w:numId w:val="13"/>
         </w:numPr>
       </w:pPr>
       <w:r>
@@ -1483,7 +1983,7 @@
         <w:pStyle w:val="ListParagraph"/>
         <w:numPr>
           <w:ilvl w:val="0"/>
-          <w:numId w:val="11"/>
+          <w:numId w:val="13"/>
         </w:numPr>
       </w:pPr>
       <w:r>
@@ -1495,7 +1995,7 @@
         <w:pStyle w:val="ListParagraph"/>
         <w:numPr>
           <w:ilvl w:val="0"/>
-          <w:numId w:val="11"/>
+          <w:numId w:val="13"/>
         </w:numPr>
       </w:pPr>
       <w:r>
@@ -1516,7 +2016,7 @@
         <w:pStyle w:val="ListParagraph"/>
         <w:numPr>
           <w:ilvl w:val="0"/>
-          <w:numId w:val="11"/>
+          <w:numId w:val="13"/>
         </w:numPr>
       </w:pPr>
       <w:r>
@@ -1528,7 +2028,7 @@
         <w:pStyle w:val="ListParagraph"/>
         <w:numPr>
           <w:ilvl w:val="0"/>
-          <w:numId w:val="11"/>
+          <w:numId w:val="13"/>
         </w:numPr>
       </w:pPr>
       <w:r>
@@ -1555,7 +2055,7 @@
         <w:pStyle w:val="ListParagraph"/>
         <w:numPr>
           <w:ilvl w:val="0"/>
-          <w:numId w:val="11"/>
+          <w:numId w:val="13"/>
         </w:numPr>
       </w:pPr>
       <w:r>
@@ -1670,7 +2170,7 @@
         <w:pStyle w:val="ListParagraph"/>
         <w:numPr>
           <w:ilvl w:val="0"/>
-          <w:numId w:val="12"/>
+          <w:numId w:val="14"/>
         </w:numPr>
       </w:pPr>
       <w:r>
@@ -1682,7 +2182,7 @@
         <w:pStyle w:val="ListParagraph"/>
         <w:numPr>
           <w:ilvl w:val="0"/>
-          <w:numId w:val="12"/>
+          <w:numId w:val="14"/>
         </w:numPr>
       </w:pPr>
       <w:r>
@@ -1694,7 +2194,7 @@
         <w:pStyle w:val="ListParagraph"/>
         <w:numPr>
           <w:ilvl w:val="0"/>
-          <w:numId w:val="12"/>
+          <w:numId w:val="14"/>
         </w:numPr>
       </w:pPr>
       <w:r>
@@ -1706,7 +2206,7 @@
         <w:pStyle w:val="ListParagraph"/>
         <w:numPr>
           <w:ilvl w:val="0"/>
-          <w:numId w:val="12"/>
+          <w:numId w:val="14"/>
         </w:numPr>
       </w:pPr>
       <w:r>
@@ -1837,7 +2337,7 @@
         <w:pStyle w:val="ListParagraph"/>
         <w:numPr>
           <w:ilvl w:val="0"/>
-          <w:numId w:val="13"/>
+          <w:numId w:val="15"/>
         </w:numPr>
       </w:pPr>
       <w:r>
@@ -1849,7 +2349,7 @@
         <w:pStyle w:val="ListParagraph"/>
         <w:numPr>
           <w:ilvl w:val="0"/>
-          <w:numId w:val="13"/>
+          <w:numId w:val="15"/>
         </w:numPr>
       </w:pPr>
       <w:r>
@@ -1861,7 +2361,7 @@
         <w:pStyle w:val="ListParagraph"/>
         <w:numPr>
           <w:ilvl w:val="0"/>
-          <w:numId w:val="13"/>
+          <w:numId w:val="15"/>
         </w:numPr>
       </w:pPr>
       <w:r>
@@ -1904,7 +2404,7 @@
         <w:pStyle w:val="ListParagraph"/>
         <w:numPr>
           <w:ilvl w:val="0"/>
-          <w:numId w:val="14"/>
+          <w:numId w:val="16"/>
         </w:numPr>
       </w:pPr>
       <w:r>
@@ -1916,7 +2416,7 @@
         <w:pStyle w:val="ListParagraph"/>
         <w:numPr>
           <w:ilvl w:val="0"/>
-          <w:numId w:val="14"/>
+          <w:numId w:val="16"/>
         </w:numPr>
       </w:pPr>
       <w:r>
@@ -1928,7 +2428,7 @@
         <w:pStyle w:val="ListParagraph"/>
         <w:numPr>
           <w:ilvl w:val="0"/>
-          <w:numId w:val="14"/>
+          <w:numId w:val="16"/>
         </w:numPr>
       </w:pPr>
       <w:r>
@@ -1940,7 +2440,7 @@
         <w:pStyle w:val="ListParagraph"/>
         <w:numPr>
           <w:ilvl w:val="0"/>
-          <w:numId w:val="14"/>
+          <w:numId w:val="16"/>
         </w:numPr>
       </w:pPr>
       <w:r>
@@ -2264,7 +2764,7 @@
         <w:pStyle w:val="ListParagraph"/>
         <w:numPr>
           <w:ilvl w:val="0"/>
-          <w:numId w:val="15"/>
+          <w:numId w:val="17"/>
         </w:numPr>
       </w:pPr>
       <w:r>
@@ -2282,7 +2782,7 @@
         <w:pStyle w:val="ListParagraph"/>
         <w:numPr>
           <w:ilvl w:val="0"/>
-          <w:numId w:val="15"/>
+          <w:numId w:val="17"/>
         </w:numPr>
       </w:pPr>
       <w:r>
@@ -2300,7 +2800,7 @@
         <w:pStyle w:val="ListParagraph"/>
         <w:numPr>
           <w:ilvl w:val="0"/>
-          <w:numId w:val="15"/>
+          <w:numId w:val="17"/>
         </w:numPr>
       </w:pPr>
       <w:r>
@@ -2361,7 +2861,7 @@
         <w:pStyle w:val="ListParagraph"/>
         <w:numPr>
           <w:ilvl w:val="0"/>
-          <w:numId w:val="16"/>
+          <w:numId w:val="18"/>
         </w:numPr>
       </w:pPr>
       <w:r>
@@ -2373,7 +2873,7 @@
         <w:pStyle w:val="ListParagraph"/>
         <w:numPr>
           <w:ilvl w:val="0"/>
-          <w:numId w:val="16"/>
+          <w:numId w:val="18"/>
         </w:numPr>
       </w:pPr>
       <w:r>
@@ -2385,7 +2885,7 @@
         <w:pStyle w:val="ListParagraph"/>
         <w:numPr>
           <w:ilvl w:val="0"/>
-          <w:numId w:val="16"/>
+          <w:numId w:val="18"/>
         </w:numPr>
       </w:pPr>
       <w:r>
@@ -2487,7 +2987,7 @@
         <w:pStyle w:val="ListParagraph"/>
         <w:numPr>
           <w:ilvl w:val="0"/>
-          <w:numId w:val="17"/>
+          <w:numId w:val="19"/>
         </w:numPr>
       </w:pPr>
       <w:r>
@@ -2499,7 +2999,7 @@
         <w:pStyle w:val="ListParagraph"/>
         <w:numPr>
           <w:ilvl w:val="0"/>
-          <w:numId w:val="17"/>
+          <w:numId w:val="19"/>
         </w:numPr>
       </w:pPr>
       <w:r>
@@ -2511,7 +3011,7 @@
         <w:pStyle w:val="ListParagraph"/>
         <w:numPr>
           <w:ilvl w:val="0"/>
-          <w:numId w:val="17"/>
+          <w:numId w:val="19"/>
         </w:numPr>
       </w:pPr>
       <w:r>
@@ -2523,7 +3023,7 @@
         <w:pStyle w:val="ListParagraph"/>
         <w:numPr>
           <w:ilvl w:val="0"/>
-          <w:numId w:val="17"/>
+          <w:numId w:val="19"/>
         </w:numPr>
       </w:pPr>
       <w:r>
@@ -2541,7 +3041,7 @@
         <w:pStyle w:val="ListParagraph"/>
         <w:numPr>
           <w:ilvl w:val="0"/>
-          <w:numId w:val="18"/>
+          <w:numId w:val="20"/>
         </w:numPr>
       </w:pPr>
       <w:r>
@@ -2553,7 +3053,7 @@
         <w:pStyle w:val="ListParagraph"/>
         <w:numPr>
           <w:ilvl w:val="0"/>
-          <w:numId w:val="18"/>
+          <w:numId w:val="20"/>
         </w:numPr>
       </w:pPr>
       <w:r>
@@ -2565,7 +3065,7 @@
         <w:pStyle w:val="ListParagraph"/>
         <w:numPr>
           <w:ilvl w:val="0"/>
-          <w:numId w:val="18"/>
+          <w:numId w:val="20"/>
         </w:numPr>
       </w:pPr>
       <w:r>
@@ -2577,7 +3077,7 @@
         <w:pStyle w:val="ListParagraph"/>
         <w:numPr>
           <w:ilvl w:val="0"/>
-          <w:numId w:val="18"/>
+          <w:numId w:val="20"/>
         </w:numPr>
       </w:pPr>
       <w:r>
@@ -2674,7 +3174,7 @@
         <w:pStyle w:val="ListParagraph"/>
         <w:numPr>
           <w:ilvl w:val="0"/>
-          <w:numId w:val="19"/>
+          <w:numId w:val="21"/>
         </w:numPr>
       </w:pPr>
       <w:r>
@@ -2686,7 +3186,7 @@
         <w:pStyle w:val="ListParagraph"/>
         <w:numPr>
           <w:ilvl w:val="0"/>
-          <w:numId w:val="19"/>
+          <w:numId w:val="21"/>
         </w:numPr>
       </w:pPr>
       <w:r>
@@ -2712,7 +3212,7 @@
         <w:pStyle w:val="ListParagraph"/>
         <w:numPr>
           <w:ilvl w:val="0"/>
-          <w:numId w:val="20"/>
+          <w:numId w:val="22"/>
         </w:numPr>
       </w:pPr>
       <w:r>
@@ -2730,7 +3230,7 @@
         <w:pStyle w:val="ListParagraph"/>
         <w:numPr>
           <w:ilvl w:val="0"/>
-          <w:numId w:val="20"/>
+          <w:numId w:val="22"/>
         </w:numPr>
       </w:pPr>
       <w:r>
@@ -2768,7 +3268,7 @@
         <w:pStyle w:val="ListParagraph"/>
         <w:numPr>
           <w:ilvl w:val="0"/>
-          <w:numId w:val="21"/>
+          <w:numId w:val="23"/>
         </w:numPr>
       </w:pPr>
       <w:r>
@@ -2786,7 +3286,7 @@
         <w:pStyle w:val="ListParagraph"/>
         <w:numPr>
           <w:ilvl w:val="0"/>
-          <w:numId w:val="21"/>
+          <w:numId w:val="23"/>
         </w:numPr>
       </w:pPr>
       <w:r>
@@ -2804,7 +3304,7 @@
         <w:pStyle w:val="ListParagraph"/>
         <w:numPr>
           <w:ilvl w:val="0"/>
-          <w:numId w:val="21"/>
+          <w:numId w:val="23"/>
         </w:numPr>
       </w:pPr>
       <w:r>
@@ -2828,7 +3328,7 @@
         <w:pStyle w:val="ListParagraph"/>
         <w:numPr>
           <w:ilvl w:val="0"/>
-          <w:numId w:val="22"/>
+          <w:numId w:val="24"/>
         </w:numPr>
       </w:pPr>
       <w:r>
@@ -2840,7 +3340,7 @@
         <w:pStyle w:val="ListParagraph"/>
         <w:numPr>
           <w:ilvl w:val="0"/>
-          <w:numId w:val="22"/>
+          <w:numId w:val="24"/>
         </w:numPr>
       </w:pPr>
       <w:r>
@@ -2852,7 +3352,7 @@
         <w:pStyle w:val="ListParagraph"/>
         <w:numPr>
           <w:ilvl w:val="0"/>
-          <w:numId w:val="22"/>
+          <w:numId w:val="24"/>
         </w:numPr>
       </w:pPr>
       <w:r>
@@ -2864,7 +3364,7 @@
         <w:pStyle w:val="ListParagraph"/>
         <w:numPr>
           <w:ilvl w:val="0"/>
-          <w:numId w:val="22"/>
+          <w:numId w:val="24"/>
         </w:numPr>
       </w:pPr>
       <w:r>
@@ -2876,7 +3376,7 @@
         <w:pStyle w:val="ListParagraph"/>
         <w:numPr>
           <w:ilvl w:val="0"/>
-          <w:numId w:val="22"/>
+          <w:numId w:val="24"/>
         </w:numPr>
       </w:pPr>
       <w:r>
@@ -2888,7 +3388,7 @@
         <w:pStyle w:val="ListParagraph"/>
         <w:numPr>
           <w:ilvl w:val="0"/>
-          <w:numId w:val="22"/>
+          <w:numId w:val="24"/>
         </w:numPr>
       </w:pPr>
       <w:r>
@@ -2900,7 +3400,7 @@
         <w:pStyle w:val="ListParagraph"/>
         <w:numPr>
           <w:ilvl w:val="0"/>
-          <w:numId w:val="22"/>
+          <w:numId w:val="24"/>
         </w:numPr>
       </w:pPr>
       <w:r>
@@ -2920,7 +3420,7 @@
         <w:pStyle w:val="ListParagraph"/>
         <w:numPr>
           <w:ilvl w:val="0"/>
-          <w:numId w:val="23"/>
+          <w:numId w:val="25"/>
         </w:numPr>
       </w:pPr>
       <w:r>
@@ -2932,7 +3432,7 @@
         <w:pStyle w:val="ListParagraph"/>
         <w:numPr>
           <w:ilvl w:val="0"/>
-          <w:numId w:val="23"/>
+          <w:numId w:val="25"/>
         </w:numPr>
       </w:pPr>
       <w:r>
@@ -2944,7 +3444,7 @@
         <w:pStyle w:val="ListParagraph"/>
         <w:numPr>
           <w:ilvl w:val="0"/>
-          <w:numId w:val="23"/>
+          <w:numId w:val="25"/>
         </w:numPr>
       </w:pPr>
       <w:r>
@@ -2956,7 +3456,7 @@
         <w:pStyle w:val="ListParagraph"/>
         <w:numPr>
           <w:ilvl w:val="0"/>
-          <w:numId w:val="23"/>
+          <w:numId w:val="25"/>
         </w:numPr>
       </w:pPr>
       <w:r>
@@ -2968,7 +3468,7 @@
         <w:pStyle w:val="ListParagraph"/>
         <w:numPr>
           <w:ilvl w:val="0"/>
-          <w:numId w:val="23"/>
+          <w:numId w:val="25"/>
         </w:numPr>
       </w:pPr>
       <w:r>
@@ -4696,7 +5196,7 @@
         <w:pStyle w:val="ListParagraph"/>
         <w:numPr>
           <w:ilvl w:val="0"/>
-          <w:numId w:val="24"/>
+          <w:numId w:val="26"/>
         </w:numPr>
       </w:pPr>
       <w:r>
@@ -4717,7 +5217,7 @@
         <w:pStyle w:val="ListParagraph"/>
         <w:numPr>
           <w:ilvl w:val="0"/>
-          <w:numId w:val="24"/>
+          <w:numId w:val="26"/>
         </w:numPr>
       </w:pPr>
       <w:r>
@@ -4729,7 +5229,7 @@
         <w:pStyle w:val="ListParagraph"/>
         <w:numPr>
           <w:ilvl w:val="0"/>
-          <w:numId w:val="24"/>
+          <w:numId w:val="26"/>
         </w:numPr>
       </w:pPr>
       <w:r>
@@ -4750,7 +5250,7 @@
         <w:pStyle w:val="ListParagraph"/>
         <w:numPr>
           <w:ilvl w:val="0"/>
-          <w:numId w:val="24"/>
+          <w:numId w:val="26"/>
         </w:numPr>
       </w:pPr>
       <w:r>
@@ -4785,7 +5285,7 @@
         <w:pStyle w:val="ListParagraph"/>
         <w:numPr>
           <w:ilvl w:val="0"/>
-          <w:numId w:val="25"/>
+          <w:numId w:val="27"/>
         </w:numPr>
       </w:pPr>
       <w:r>
@@ -4803,7 +5303,7 @@
         <w:pStyle w:val="ListParagraph"/>
         <w:numPr>
           <w:ilvl w:val="0"/>
-          <w:numId w:val="25"/>
+          <w:numId w:val="27"/>
         </w:numPr>
       </w:pPr>
       <w:r>
@@ -4821,7 +5321,7 @@
         <w:pStyle w:val="ListParagraph"/>
         <w:numPr>
           <w:ilvl w:val="0"/>
-          <w:numId w:val="25"/>
+          <w:numId w:val="27"/>
         </w:numPr>
       </w:pPr>
       <w:r>
@@ -4839,7 +5339,7 @@
         <w:pStyle w:val="ListParagraph"/>
         <w:numPr>
           <w:ilvl w:val="0"/>
-          <w:numId w:val="25"/>
+          <w:numId w:val="27"/>
         </w:numPr>
       </w:pPr>
       <w:r>
@@ -4857,7 +5357,7 @@
         <w:pStyle w:val="ListParagraph"/>
         <w:numPr>
           <w:ilvl w:val="0"/>
-          <w:numId w:val="25"/>
+          <w:numId w:val="27"/>
         </w:numPr>
       </w:pPr>
       <w:r>
@@ -4875,7 +5375,7 @@
         <w:pStyle w:val="ListParagraph"/>
         <w:numPr>
           <w:ilvl w:val="0"/>
-          <w:numId w:val="25"/>
+          <w:numId w:val="27"/>
         </w:numPr>
       </w:pPr>
       <w:r>
@@ -4893,7 +5393,7 @@
         <w:pStyle w:val="ListParagraph"/>
         <w:numPr>
           <w:ilvl w:val="0"/>
-          <w:numId w:val="25"/>
+          <w:numId w:val="27"/>
         </w:numPr>
       </w:pPr>
       <w:r>
@@ -4911,7 +5411,7 @@
         <w:pStyle w:val="ListParagraph"/>
         <w:numPr>
           <w:ilvl w:val="0"/>
-          <w:numId w:val="25"/>
+          <w:numId w:val="27"/>
         </w:numPr>
       </w:pPr>
       <w:r>
@@ -4929,7 +5429,7 @@
         <w:pStyle w:val="ListParagraph"/>
         <w:numPr>
           <w:ilvl w:val="0"/>
-          <w:numId w:val="25"/>
+          <w:numId w:val="27"/>
         </w:numPr>
       </w:pPr>
       <w:r>
@@ -4947,7 +5447,7 @@
         <w:pStyle w:val="ListParagraph"/>
         <w:numPr>
           <w:ilvl w:val="0"/>
-          <w:numId w:val="25"/>
+          <w:numId w:val="27"/>
         </w:numPr>
       </w:pPr>
       <w:r>
@@ -4965,7 +5465,7 @@
         <w:pStyle w:val="ListParagraph"/>
         <w:numPr>
           <w:ilvl w:val="0"/>
-          <w:numId w:val="25"/>
+          <w:numId w:val="27"/>
         </w:numPr>
       </w:pPr>
       <w:r>
@@ -4980,7 +5480,7 @@
         <w:pStyle w:val="ListParagraph"/>
         <w:numPr>
           <w:ilvl w:val="0"/>
-          <w:numId w:val="25"/>
+          <w:numId w:val="27"/>
         </w:numPr>
       </w:pPr>
       <w:r>
@@ -5480,6 +5980,30 @@
             <w:pPr/>
             <w:r>
               <w:t xml:space="preserve">What changed</w:t>
+            </w:r>
+          </w:p>
+        </w:tc>
+      </w:tr>
+      <w:tr>
+        <w:tc>
+          <w:tcPr>
+            <w:tcW w:w="4680" w:type="dxa"/>
+          </w:tcPr>
+          <w:p>
+            <w:pPr/>
+            <w:r>
+              <w:t xml:space="preserve">59</w:t>
+            </w:r>
+          </w:p>
+        </w:tc>
+        <w:tc>
+          <w:tcPr>
+            <w:tcW w:w="4680" w:type="dxa"/>
+          </w:tcPr>
+          <w:p>
+            <w:pPr/>
+            <w:r>
+              <w:t xml:space="preserve">Title bar: Tracked Artists, Link Finder and Settings sit beside Grid | List; Export list sits beside Refresh Feed. The Columns button is now Edit Columns. Setup instructions rewritten for newcomers to Docker, with a way to run the app without Docker.</w:t>
             </w:r>
           </w:p>
         </w:tc>
@@ -7087,13 +7611,19 @@
     </w:lvlOverride>
   </w:num>
   <w:num w:numId="6">
-    <w:abstractNumId w:val="0"/>
+    <w:abstractNumId w:val="1"/>
+    <w:lvlOverride w:ilvl="0">
+      <w:startOverride w:val="1"/>
+    </w:lvlOverride>
   </w:num>
   <w:num w:numId="7">
     <w:abstractNumId w:val="0"/>
   </w:num>
   <w:num w:numId="8">
-    <w:abstractNumId w:val="0"/>
+    <w:abstractNumId w:val="1"/>
+    <w:lvlOverride w:ilvl="0">
+      <w:startOverride w:val="1"/>
+    </w:lvlOverride>
   </w:num>
   <w:num w:numId="9">
     <w:abstractNumId w:val="0"/>
@@ -7123,10 +7653,7 @@
     <w:abstractNumId w:val="0"/>
   </w:num>
   <w:num w:numId="18">
-    <w:abstractNumId w:val="1"/>
-    <w:lvlOverride w:ilvl="0">
-      <w:startOverride w:val="1"/>
-    </w:lvlOverride>
+    <w:abstractNumId w:val="0"/>
   </w:num>
   <w:num w:numId="19">
     <w:abstractNumId w:val="0"/>
@@ -7138,10 +7665,7 @@
     </w:lvlOverride>
   </w:num>
   <w:num w:numId="21">
-    <w:abstractNumId w:val="1"/>
-    <w:lvlOverride w:ilvl="0">
-      <w:startOverride w:val="1"/>
-    </w:lvlOverride>
+    <w:abstractNumId w:val="0"/>
   </w:num>
   <w:num w:numId="22">
     <w:abstractNumId w:val="1"/>
@@ -7150,12 +7674,24 @@
     </w:lvlOverride>
   </w:num>
   <w:num w:numId="23">
+    <w:abstractNumId w:val="1"/>
+    <w:lvlOverride w:ilvl="0">
+      <w:startOverride w:val="1"/>
+    </w:lvlOverride>
+  </w:num>
+  <w:num w:numId="24">
+    <w:abstractNumId w:val="1"/>
+    <w:lvlOverride w:ilvl="0">
+      <w:startOverride w:val="1"/>
+    </w:lvlOverride>
+  </w:num>
+  <w:num w:numId="25">
     <w:abstractNumId w:val="0"/>
   </w:num>
-  <w:num w:numId="24">
+  <w:num w:numId="26">
     <w:abstractNumId w:val="0"/>
   </w:num>
-  <w:num w:numId="25">
+  <w:num w:numId="27">
     <w:abstractNumId w:val="0"/>
   </w:num>
 </w:numbering>

</xml_diff>

<commit_message>
v60: Tracked Artists, Link Finder and Settings on the right of the second line; Refresh Feed and Export list at the start of the filter row.
Co-Authored-By: Claude Opus 5.5 <noreply@anthropic.com>
</commit_message>
<xml_diff>
--- a/docs/Artist Feed User Guide.docx
+++ b/docs/Artist Feed User Guide.docx
@@ -1494,7 +1494,7 @@
         <w:t xml:space="preserve">Export list</w:t>
       </w:r>
       <w:r>
-        <w:t xml:space="preserve"> (List view only, beside Refresh Feed) downloads a CSV of every row that matches the current filters, in the current sort order, not just the rows on screen.</w:t>
+        <w:t xml:space="preserve"> (List view only, beside Refresh Feed at the start of the filter row) downloads a CSV of every row that matches the current filters, in the current sort order, not just the rows on screen.</w:t>
       </w:r>
     </w:p>
     <w:p>
@@ -2276,7 +2276,7 @@
         <w:t xml:space="preserve">Settings</w:t>
       </w:r>
       <w:r>
-        <w:t xml:space="preserve"> button at the top opens two lists of checkboxes.</w:t>
+        <w:t xml:space="preserve"> button (top right, beside Tracked Artists and Link Finder) opens two lists of checkboxes.</w:t>
       </w:r>
     </w:p>
     <w:p>
@@ -5980,6 +5980,30 @@
             <w:pPr/>
             <w:r>
               <w:t xml:space="preserve">What changed</w:t>
+            </w:r>
+          </w:p>
+        </w:tc>
+      </w:tr>
+      <w:tr>
+        <w:tc>
+          <w:tcPr>
+            <w:tcW w:w="4680" w:type="dxa"/>
+          </w:tcPr>
+          <w:p>
+            <w:pPr/>
+            <w:r>
+              <w:t xml:space="preserve">60</w:t>
+            </w:r>
+          </w:p>
+        </w:tc>
+        <w:tc>
+          <w:tcPr>
+            <w:tcW w:w="4680" w:type="dxa"/>
+          </w:tcPr>
+          <w:p>
+            <w:pPr/>
+            <w:r>
+              <w:t xml:space="preserve">Title bar: Tracked Artists, Link Finder and Settings on the right of the second line; Refresh Feed and Export list at the start of the filter row.</w:t>
             </w:r>
           </w:p>
         </w:tc>

</xml_diff>

<commit_message>
v61: date menu next to the length menu; Show on the line below the filters, left of Page width and the column buttons.
Co-Authored-By: Claude Opus 5.5 <noreply@anthropic.com>
Claude-Session: https://claude.ai/code/session_01Xj1HuHJX1zYNh76RWBnCyx
</commit_message>
<xml_diff>
--- a/docs/Artist Feed User Guide.docx
+++ b/docs/Artist Feed User Guide.docx
@@ -1768,7 +1768,7 @@
     <w:p>
       <w:pPr/>
       <w:r>
-        <w:t xml:space="preserve">Filters apply to both views and to the export. Two more controls sit in the same row. The date menu keeps the last 7, 30, 90 days or 12 months, or a range you pick with two dates; a second menu chooses whether that goes by posted date (the release date is used where a post has none) or by release date. Show limits the page to the first 25 to 500 results in the current sort order, and the export is limited the same way.</w:t>
+        <w:t xml:space="preserve">Filters apply to both views and to the export. The date menu sits next to the length menu. It keeps the last 7, 30, 90 days or 12 months, or a range you pick with two dates; a second menu chooses whether that goes by posted date (the release date is used where a post has none) or by release date. Show, at the left of the line below the filters (with Page width, Reset column widths and Edit Columns on the right), limits the page to the first 25 to 500 results in the current sort order, and the export is limited the same way.</w:t>
       </w:r>
     </w:p>
     <w:p>
@@ -3863,7 +3863,7 @@
           <w:p>
             <w:pPr/>
             <w:r>
-              <w:t xml:space="preserve">Filter row</w:t>
+              <w:t xml:space="preserve">Line below the filters</w:t>
             </w:r>
           </w:p>
         </w:tc>
@@ -5980,6 +5980,30 @@
             <w:pPr/>
             <w:r>
               <w:t xml:space="preserve">What changed</w:t>
+            </w:r>
+          </w:p>
+        </w:tc>
+      </w:tr>
+      <w:tr>
+        <w:tc>
+          <w:tcPr>
+            <w:tcW w:w="4680" w:type="dxa"/>
+          </w:tcPr>
+          <w:p>
+            <w:pPr/>
+            <w:r>
+              <w:t xml:space="preserve">61</w:t>
+            </w:r>
+          </w:p>
+        </w:tc>
+        <w:tc>
+          <w:tcPr>
+            <w:tcW w:w="4680" w:type="dxa"/>
+          </w:tcPr>
+          <w:p>
+            <w:pPr/>
+            <w:r>
+              <w:t xml:space="preserve">Filter row: the date menu sits next to the length menu. Show and its results menu moved to the left of the line below the filters, beside Page width, Reset column widths and Edit Columns.</w:t>
             </w:r>
           </w:p>
         </w:tc>

</xml_diff>

<commit_message>
v62: app icon (headphones emoji), replaceable by saving favicon.png, .ico or .svg in app/static.
Co-Authored-By: Claude Opus 5.5 <noreply@anthropic.com>
Claude-Session: https://claude.ai/code/session_01Xj1HuHJX1zYNh76RWBnCyx
</commit_message>
<xml_diff>
--- a/docs/Artist Feed User Guide.docx
+++ b/docs/Artist Feed User Guide.docx
@@ -4946,6 +4946,98 @@
     </w:p>
     <w:p>
       <w:pPr>
+        <w:pStyle w:val="Heading3"/>
+      </w:pPr>
+      <w:r>
+        <w:t xml:space="preserve">App icon</w:t>
+      </w:r>
+    </w:p>
+    <w:p>
+      <w:pPr/>
+      <w:r>
+        <w:t xml:space="preserve">The icon in the browser tab is a file in </w:t>
+      </w:r>
+      <w:r>
+        <w:rPr>
+          <w:rStyle w:val="CodeChar"/>
+        </w:rPr>
+        <w:t xml:space="preserve">app/static</w:t>
+      </w:r>
+      <w:r>
+        <w:t xml:space="preserve">. The app uses the first of these it finds: </w:t>
+      </w:r>
+      <w:r>
+        <w:rPr>
+          <w:rStyle w:val="CodeChar"/>
+        </w:rPr>
+        <w:t xml:space="preserve">favicon.png</w:t>
+      </w:r>
+      <w:r>
+        <w:t xml:space="preserve">, </w:t>
+      </w:r>
+      <w:r>
+        <w:rPr>
+          <w:rStyle w:val="CodeChar"/>
+        </w:rPr>
+        <w:t xml:space="preserve">favicon.ico</w:t>
+      </w:r>
+      <w:r>
+        <w:t xml:space="preserve">, </w:t>
+      </w:r>
+      <w:r>
+        <w:rPr>
+          <w:rStyle w:val="CodeChar"/>
+        </w:rPr>
+        <w:t xml:space="preserve">favicon.svg</w:t>
+      </w:r>
+      <w:r>
+        <w:t xml:space="preserve">. It comes with </w:t>
+      </w:r>
+      <w:r>
+        <w:rPr>
+          <w:rStyle w:val="CodeChar"/>
+        </w:rPr>
+        <w:t xml:space="preserve">favicon.svg</w:t>
+      </w:r>
+      <w:r>
+        <w:t xml:space="preserve">, a headphones emoji.</w:t>
+      </w:r>
+    </w:p>
+    <w:p>
+      <w:pPr/>
+      <w:r>
+        <w:t xml:space="preserve">To use your own, save a square image (64×64 pixels or larger) as </w:t>
+      </w:r>
+      <w:r>
+        <w:rPr>
+          <w:rStyle w:val="CodeChar"/>
+        </w:rPr>
+        <w:t xml:space="preserve">app/static/favicon.png</w:t>
+      </w:r>
+      <w:r>
+        <w:t xml:space="preserve">. Then run </w:t>
+      </w:r>
+      <w:r>
+        <w:rPr>
+          <w:rStyle w:val="CodeChar"/>
+        </w:rPr>
+        <w:t xml:space="preserve">docker compose up -d --build</w:t>
+      </w:r>
+      <w:r>
+        <w:t xml:space="preserve">. Browsers hold on to old icons, so close the tab and open the page again if the old one still shows. Delete </w:t>
+      </w:r>
+      <w:r>
+        <w:rPr>
+          <w:rStyle w:val="CodeChar"/>
+        </w:rPr>
+        <w:t xml:space="preserve">favicon.png</w:t>
+      </w:r>
+      <w:r>
+        <w:t xml:space="preserve"> to go back to the emoji.</w:t>
+      </w:r>
+    </w:p>
+    <w:p>
+      <w:pPr>
         <w:pStyle w:val="Heading2"/>
       </w:pPr>
       <w:r>
@@ -5980,6 +6072,30 @@
             <w:pPr/>
             <w:r>
               <w:t xml:space="preserve">What changed</w:t>
+            </w:r>
+          </w:p>
+        </w:tc>
+      </w:tr>
+      <w:tr>
+        <w:tc>
+          <w:tcPr>
+            <w:tcW w:w="4680" w:type="dxa"/>
+          </w:tcPr>
+          <w:p>
+            <w:pPr/>
+            <w:r>
+              <w:t xml:space="preserve">62</w:t>
+            </w:r>
+          </w:p>
+        </w:tc>
+        <w:tc>
+          <w:tcPr>
+            <w:tcW w:w="4680" w:type="dxa"/>
+          </w:tcPr>
+          <w:p>
+            <w:pPr/>
+            <w:r>
+              <w:t xml:space="preserve">App icon: a headphones emoji in the browser tab, replaceable by saving favicon.png (or .ico or .svg) in app/static.</w:t>
             </w:r>
           </w:p>
         </w:tc>

</xml_diff>

<commit_message>
Guide: describes version 62; Export Feed button name.
Co-Authored-By: Claude Opus 5.5 <noreply@anthropic.com>
Claude-Session: https://claude.ai/code/session_01Xj1HuHJX1zYNh76RWBnCyx
</commit_message>
<xml_diff>
--- a/docs/Artist Feed User Guide.docx
+++ b/docs/Artist Feed User Guide.docx
@@ -33,7 +33,7 @@
     <w:p>
       <w:pPr/>
       <w:r>
-        <w:t xml:space="preserve">This guide describes Artist Feed version 40. The version number is shown in small grey text beside the title at the top of the app.</w:t>
+        <w:t xml:space="preserve">This guide describes Artist Feed version 62. The version number is shown in small grey text beside the title at the top of the app.</w:t>
       </w:r>
     </w:p>
     <w:p>
@@ -1491,7 +1491,7 @@
         <w:rPr>
           <w:b/>
         </w:rPr>
-        <w:t xml:space="preserve">Export list</w:t>
+        <w:t xml:space="preserve">Export Feed</w:t>
       </w:r>
       <w:r>
         <w:t xml:space="preserve"> (List view only, beside Refresh Feed at the start of the filter row) downloads a CSV of every row that matches the current filters, in the current sort order, not just the rows on screen.</w:t>

</xml_diff>

<commit_message>
v63: your SoundCloud username in Settings; profiles it follows are preferred when Find missing links or Link Finder picks a SoundCloud profile by name.
Co-Authored-By: Claude Opus 5.5 <noreply@anthropic.com>
Claude-Session: https://claude.ai/code/session_01Xj1HuHJX1zYNh76RWBnCyx
</commit_message>
<xml_diff>
--- a/docs/Artist Feed User Guide.docx
+++ b/docs/Artist Feed User Guide.docx
@@ -33,7 +33,7 @@
     <w:p>
       <w:pPr/>
       <w:r>
-        <w:t xml:space="preserve">This guide describes Artist Feed version 62. The version number is shown in small grey text beside the title at the top of the app.</w:t>
+        <w:t xml:space="preserve">This guide describes Artist Feed version 63. The version number is shown in small grey text beside the title at the top of the app.</w:t>
       </w:r>
     </w:p>
     <w:p>
@@ -2213,6 +2213,18 @@
         </w:numPr>
       </w:pPr>
       <w:r>
+        <w:t xml:space="preserve">When your SoundCloud username is set in Settings, a profile you follow is preferred over others with the same name.</w:t>
+      </w:r>
+    </w:p>
+    <w:p>
+      <w:pPr>
+        <w:pStyle w:val="ListParagraph"/>
+        <w:numPr>
+          <w:ilvl w:val="0"/>
+          <w:numId w:val="14"/>
+        </w:numPr>
+      </w:pPr>
+      <w:r>
         <w:t xml:space="preserve">Editing a highlighted cell removes its highlight. Save changes saves whatever is in the table at that moment and clears all highlights.</w:t>
       </w:r>
     </w:p>
@@ -2291,7 +2303,7 @@
         <w:t xml:space="preserve">Settings</w:t>
       </w:r>
       <w:r>
-        <w:t xml:space="preserve"> button (top right, beside Tracked Artists and Link Finder) opens two lists of checkboxes.</w:t>
+        <w:t xml:space="preserve"> button (top right, beside Tracked Artists and Link Finder) opens two lists of checkboxes and a box for your SoundCloud username.</w:t>
       </w:r>
     </w:p>
     <w:p>
@@ -2316,6 +2328,27 @@
       </w:r>
       <w:r>
         <w:t xml:space="preserve"> Tick the sites Link Finder looks on. A track found on a site higher in the list is preferred: Bandcamp first, then SoundCloud, then YouTube. YouTube starts unticked. Saved answers stay as they were, except that a link on a site you have unticked gives way to the next best one. When you tick a site, rows saved as not found are searched again the next time they are looked up; when the newly ticked site is YouTube, only YouTube is looked at for them, and only for the artists ticked for it.</w:t>
+      </w:r>
+    </w:p>
+    <w:p>
+      <w:pPr/>
+      <w:r>
+        <w:rPr>
+          <w:b/>
+        </w:rPr>
+        <w:t xml:space="preserve">Your SoundCloud account.</w:t>
+      </w:r>
+      <w:r>
+        <w:t xml:space="preserve"> Many SoundCloud profiles share a name. Enter your SoundCloud username and press </w:t>
+      </w:r>
+      <w:r>
+        <w:rPr>
+          <w:b/>
+        </w:rPr>
+        <w:t xml:space="preserve">Save and read follows</w:t>
+      </w:r>
+      <w:r>
+        <w:t xml:space="preserve">: the profiles your account follows are then preferred whenever a profile has to be picked by its name, by Find missing links in Tracked Artists and by Link Finder when a track isn't on SoundCloud. A followed profile is found even when SoundCloud's search doesn't list it. The line beside the button says how many profiles were read and when. The list is read again every 12 hours, so a profile you follow later is picked up within half a day (press the button to read it now). Your follows must be public. Clear the box and press the button to stop using it.</w:t>
       </w:r>
     </w:p>
     <w:p>
@@ -3667,6 +3700,56 @@
           <w:p>
             <w:pPr/>
             <w:r>
+              <w:t xml:space="preserve">Your SoundCloud username</w:t>
+            </w:r>
+          </w:p>
+        </w:tc>
+        <w:tc>
+          <w:tcPr>
+            <w:tcW w:w="3120" w:type="dxa"/>
+          </w:tcPr>
+          <w:p>
+            <w:pPr/>
+            <w:r>
+              <w:t xml:space="preserve">Settings, or </w:t>
+            </w:r>
+            <w:r>
+              <w:rPr>
+                <w:rStyle w:val="CodeChar"/>
+              </w:rPr>
+              <w:t xml:space="preserve">SOUNDCLOUD_USER</w:t>
+            </w:r>
+            <w:r>
+              <w:t xml:space="preserve"> in </w:t>
+            </w:r>
+            <w:r>
+              <w:rPr>
+                <w:rStyle w:val="CodeChar"/>
+              </w:rPr>
+              <w:t xml:space="preserve">docker-compose.yml</w:t>
+            </w:r>
+          </w:p>
+        </w:tc>
+        <w:tc>
+          <w:tcPr>
+            <w:tcW w:w="3120" w:type="dxa"/>
+          </w:tcPr>
+          <w:p>
+            <w:pPr/>
+            <w:r>
+              <w:t xml:space="preserve">Find missing links and Link Finder prefer the SoundCloud profiles you follow when several share a name. Your follows must be public.</w:t>
+            </w:r>
+          </w:p>
+        </w:tc>
+      </w:tr>
+      <w:tr>
+        <w:tc>
+          <w:tcPr>
+            <w:tcW w:w="3120" w:type="dxa"/>
+          </w:tcPr>
+          <w:p>
+            <w:pPr/>
+            <w:r>
               <w:t xml:space="preserve">Who can reach the app</w:t>
             </w:r>
           </w:p>
@@ -4573,6 +4656,44 @@
               <w:rPr>
                 <w:rStyle w:val="CodeChar"/>
               </w:rPr>
+              <w:t xml:space="preserve">SOUNDCLOUD_USER</w:t>
+            </w:r>
+          </w:p>
+        </w:tc>
+        <w:tc>
+          <w:tcPr>
+            <w:tcW w:w="3120" w:type="dxa"/>
+          </w:tcPr>
+          <w:p>
+            <w:pPr/>
+            <w:r>
+              <w:t xml:space="preserve">unset</w:t>
+            </w:r>
+          </w:p>
+        </w:tc>
+        <w:tc>
+          <w:tcPr>
+            <w:tcW w:w="3120" w:type="dxa"/>
+          </w:tcPr>
+          <w:p>
+            <w:pPr/>
+            <w:r>
+              <w:t xml:space="preserve">Your SoundCloud username, whose followed profiles are preferred (also set in Settings, which wins)</w:t>
+            </w:r>
+          </w:p>
+        </w:tc>
+      </w:tr>
+      <w:tr>
+        <w:tc>
+          <w:tcPr>
+            <w:tcW w:w="3120" w:type="dxa"/>
+          </w:tcPr>
+          <w:p>
+            <w:pPr/>
+            <w:r>
+              <w:rPr>
+                <w:rStyle w:val="CodeChar"/>
+              </w:rPr>
               <w:t xml:space="preserve">SOUNDCLOUD_CLIENT_ID</w:t>
             </w:r>
           </w:p>
@@ -5492,7 +5613,7 @@
         <w:t xml:space="preserve">Common artist names.</w:t>
       </w:r>
       <w:r>
-        <w:t xml:space="preserve"> When a track is not on SoundCloud, a profile is picked by name alone and marked "matched by name only". For a name like River this can be the wrong person. The app learns the right profile for a name when it finds one of their tracks on SoundCloud, or when you set a SoundCloud link with Edit, and uses it from then on, including for answers already saved.</w:t>
+        <w:t xml:space="preserve"> When a track is not on SoundCloud, a profile is picked by name alone and marked "matched by name only". For a name like River this can be the wrong person. The app learns the right profile for a name when it finds one of their tracks on SoundCloud, or when you set a SoundCloud link with Edit, and uses it from then on, including for answers already saved. Setting your SoundCloud username in Settings also helps: a profile you follow is picked before one matched by name alone, and its note reads "A profile you follow".</w:t>
       </w:r>
     </w:p>
     <w:p>
@@ -6087,6 +6208,30 @@
             <w:pPr/>
             <w:r>
               <w:t xml:space="preserve">What changed</w:t>
+            </w:r>
+          </w:p>
+        </w:tc>
+      </w:tr>
+      <w:tr>
+        <w:tc>
+          <w:tcPr>
+            <w:tcW w:w="4680" w:type="dxa"/>
+          </w:tcPr>
+          <w:p>
+            <w:pPr/>
+            <w:r>
+              <w:t xml:space="preserve">63</w:t>
+            </w:r>
+          </w:p>
+        </w:tc>
+        <w:tc>
+          <w:tcPr>
+            <w:tcW w:w="4680" w:type="dxa"/>
+          </w:tcPr>
+          <w:p>
+            <w:pPr/>
+            <w:r>
+              <w:t xml:space="preserve">Your SoundCloud username in Settings: the profiles it follows are preferred when Find missing links or Link Finder picks a SoundCloud profile by name. SOUNDCLOUD_USER setting.</w:t>
             </w:r>
           </w:p>
         </w:tc>

</xml_diff>

<commit_message>
v64: Downloads button counts new Bandcamp purchases and pre-orders that have come out; clicking it opens your Bandcamp collection and clears the count.
Co-Authored-By: Claude Opus 5.5 <noreply@anthropic.com>
Claude-Session: https://claude.ai/code/session_01Xj1HuHJX1zYNh76RWBnCyx
</commit_message>
<xml_diff>
--- a/docs/Artist Feed User Guide.docx
+++ b/docs/Artist Feed User Guide.docx
@@ -13,7 +13,7 @@
     <w:p>
       <w:pPr/>
       <w:r>
-        <w:t xml:space="preserve">Oct 14, 2026</w:t>
+        <w:t xml:space="preserve">Oct 15, 2026</w:t>
       </w:r>
       <w:r>
         <w:t xml:space="preserve"/>
@@ -33,7 +33,7 @@
     <w:p>
       <w:pPr/>
       <w:r>
-        <w:t xml:space="preserve">This guide describes Artist Feed version 63. The version number is shown in small grey text beside the title at the top of the app.</w:t>
+        <w:t xml:space="preserve">This guide describes Artist Feed version 64. The version number is shown in small grey text beside the title at the top of the app.</w:t>
       </w:r>
     </w:p>
     <w:p>
@@ -1927,6 +1927,89 @@
     </w:p>
     <w:p>
       <w:pPr>
+        <w:pStyle w:val="Heading3"/>
+      </w:pPr>
+      <w:r>
+        <w:t xml:space="preserve">Downloads</w:t>
+      </w:r>
+    </w:p>
+    <w:p>
+      <w:pPr/>
+      <w:r>
+        <w:t xml:space="preserve">The </w:t>
+      </w:r>
+      <w:r>
+        <w:rPr>
+          <w:b/>
+        </w:rPr>
+        <w:t xml:space="preserve">Downloads</w:t>
+      </w:r>
+      <w:r>
+        <w:t xml:space="preserve"> button (top right, beside Tracked Artists) shows how many of your Bandcamp purchases are ready to download that you haven't been shown yet. It appears once your Bandcamp username is set in the Link Finder panel.</w:t>
+      </w:r>
+    </w:p>
+    <w:p>
+      <w:pPr>
+        <w:pStyle w:val="ListParagraph"/>
+        <w:numPr>
+          <w:ilvl w:val="0"/>
+          <w:numId w:val="13"/>
+        </w:numPr>
+      </w:pPr>
+      <w:r>
+        <w:t xml:space="preserve">Two things are counted: a purchase made since the app first read your collection, and a pre-order whose release date has come. A pre-order is not counted when you buy it, only when it comes out.</w:t>
+      </w:r>
+    </w:p>
+    <w:p>
+      <w:pPr>
+        <w:pStyle w:val="ListParagraph"/>
+        <w:numPr>
+          <w:ilvl w:val="0"/>
+          <w:numId w:val="13"/>
+        </w:numPr>
+      </w:pPr>
+      <w:r>
+        <w:t xml:space="preserve">Point at the button to see the list of releases. Click it to open your Bandcamp collection in a new tab, where the download links are; the count goes back to zero.</w:t>
+      </w:r>
+    </w:p>
+    <w:p>
+      <w:pPr>
+        <w:pStyle w:val="ListParagraph"/>
+        <w:numPr>
+          <w:ilvl w:val="0"/>
+          <w:numId w:val="13"/>
+        </w:numPr>
+      </w:pPr>
+      <w:r>
+        <w:t xml:space="preserve">Your purchases are checked as often as the feed refreshes (every hour unless you changed it), and whenever Link Finder starts a lookup.</w:t>
+      </w:r>
+    </w:p>
+    <w:p>
+      <w:pPr>
+        <w:pStyle w:val="ListParagraph"/>
+        <w:numPr>
+          <w:ilvl w:val="0"/>
+          <w:numId w:val="13"/>
+        </w:numPr>
+      </w:pPr>
+      <w:r>
+        <w:t xml:space="preserve">The app can't download the files itself. Bandcamp's download links need you to be signed in to your account, and the app only reads your public collection page.</w:t>
+      </w:r>
+    </w:p>
+    <w:p>
+      <w:pPr>
+        <w:pStyle w:val="ListParagraph"/>
+        <w:numPr>
+          <w:ilvl w:val="0"/>
+          <w:numId w:val="13"/>
+        </w:numPr>
+      </w:pPr>
+      <w:r>
+        <w:t xml:space="preserve">Purchases you made before setting your username are not counted, and a collection set to private can't be read.</w:t>
+      </w:r>
+    </w:p>
+    <w:p>
+      <w:pPr>
         <w:pStyle w:val="Heading2"/>
       </w:pPr>
       <w:r>
@@ -1953,7 +2036,7 @@
         <w:pStyle w:val="ListParagraph"/>
         <w:numPr>
           <w:ilvl w:val="0"/>
-          <w:numId w:val="13"/>
+          <w:numId w:val="14"/>
         </w:numPr>
       </w:pPr>
       <w:r>
@@ -1974,7 +2057,7 @@
         <w:pStyle w:val="ListParagraph"/>
         <w:numPr>
           <w:ilvl w:val="0"/>
-          <w:numId w:val="13"/>
+          <w:numId w:val="14"/>
         </w:numPr>
       </w:pPr>
       <w:r>
@@ -1986,7 +2069,7 @@
         <w:pStyle w:val="ListParagraph"/>
         <w:numPr>
           <w:ilvl w:val="0"/>
-          <w:numId w:val="13"/>
+          <w:numId w:val="14"/>
         </w:numPr>
       </w:pPr>
       <w:r>
@@ -1998,7 +2081,7 @@
         <w:pStyle w:val="ListParagraph"/>
         <w:numPr>
           <w:ilvl w:val="0"/>
-          <w:numId w:val="13"/>
+          <w:numId w:val="14"/>
         </w:numPr>
       </w:pPr>
       <w:r>
@@ -2010,7 +2093,7 @@
         <w:pStyle w:val="ListParagraph"/>
         <w:numPr>
           <w:ilvl w:val="0"/>
-          <w:numId w:val="13"/>
+          <w:numId w:val="14"/>
         </w:numPr>
       </w:pPr>
       <w:r>
@@ -2031,7 +2114,7 @@
         <w:pStyle w:val="ListParagraph"/>
         <w:numPr>
           <w:ilvl w:val="0"/>
-          <w:numId w:val="13"/>
+          <w:numId w:val="14"/>
         </w:numPr>
       </w:pPr>
       <w:r>
@@ -2043,7 +2126,7 @@
         <w:pStyle w:val="ListParagraph"/>
         <w:numPr>
           <w:ilvl w:val="0"/>
-          <w:numId w:val="13"/>
+          <w:numId w:val="14"/>
         </w:numPr>
       </w:pPr>
       <w:r>
@@ -2070,7 +2153,7 @@
         <w:pStyle w:val="ListParagraph"/>
         <w:numPr>
           <w:ilvl w:val="0"/>
-          <w:numId w:val="13"/>
+          <w:numId w:val="14"/>
         </w:numPr>
       </w:pPr>
       <w:r>
@@ -2185,7 +2268,7 @@
         <w:pStyle w:val="ListParagraph"/>
         <w:numPr>
           <w:ilvl w:val="0"/>
-          <w:numId w:val="14"/>
+          <w:numId w:val="15"/>
         </w:numPr>
       </w:pPr>
       <w:r>
@@ -2197,7 +2280,7 @@
         <w:pStyle w:val="ListParagraph"/>
         <w:numPr>
           <w:ilvl w:val="0"/>
-          <w:numId w:val="14"/>
+          <w:numId w:val="15"/>
         </w:numPr>
       </w:pPr>
       <w:r>
@@ -2209,7 +2292,7 @@
         <w:pStyle w:val="ListParagraph"/>
         <w:numPr>
           <w:ilvl w:val="0"/>
-          <w:numId w:val="14"/>
+          <w:numId w:val="15"/>
         </w:numPr>
       </w:pPr>
       <w:r>
@@ -2221,7 +2304,7 @@
         <w:pStyle w:val="ListParagraph"/>
         <w:numPr>
           <w:ilvl w:val="0"/>
-          <w:numId w:val="14"/>
+          <w:numId w:val="15"/>
         </w:numPr>
       </w:pPr>
       <w:r>
@@ -2233,7 +2316,7 @@
         <w:pStyle w:val="ListParagraph"/>
         <w:numPr>
           <w:ilvl w:val="0"/>
-          <w:numId w:val="14"/>
+          <w:numId w:val="15"/>
         </w:numPr>
       </w:pPr>
       <w:r>
@@ -2385,7 +2468,7 @@
         <w:pStyle w:val="ListParagraph"/>
         <w:numPr>
           <w:ilvl w:val="0"/>
-          <w:numId w:val="15"/>
+          <w:numId w:val="16"/>
         </w:numPr>
       </w:pPr>
       <w:r>
@@ -2397,7 +2480,7 @@
         <w:pStyle w:val="ListParagraph"/>
         <w:numPr>
           <w:ilvl w:val="0"/>
-          <w:numId w:val="15"/>
+          <w:numId w:val="16"/>
         </w:numPr>
       </w:pPr>
       <w:r>
@@ -2409,7 +2492,7 @@
         <w:pStyle w:val="ListParagraph"/>
         <w:numPr>
           <w:ilvl w:val="0"/>
-          <w:numId w:val="15"/>
+          <w:numId w:val="16"/>
         </w:numPr>
       </w:pPr>
       <w:r>
@@ -2452,7 +2535,7 @@
         <w:pStyle w:val="ListParagraph"/>
         <w:numPr>
           <w:ilvl w:val="0"/>
-          <w:numId w:val="16"/>
+          <w:numId w:val="17"/>
         </w:numPr>
       </w:pPr>
       <w:r>
@@ -2464,7 +2547,7 @@
         <w:pStyle w:val="ListParagraph"/>
         <w:numPr>
           <w:ilvl w:val="0"/>
-          <w:numId w:val="16"/>
+          <w:numId w:val="17"/>
         </w:numPr>
       </w:pPr>
       <w:r>
@@ -2476,7 +2559,7 @@
         <w:pStyle w:val="ListParagraph"/>
         <w:numPr>
           <w:ilvl w:val="0"/>
-          <w:numId w:val="16"/>
+          <w:numId w:val="17"/>
         </w:numPr>
       </w:pPr>
       <w:r>
@@ -2488,7 +2571,7 @@
         <w:pStyle w:val="ListParagraph"/>
         <w:numPr>
           <w:ilvl w:val="0"/>
-          <w:numId w:val="16"/>
+          <w:numId w:val="17"/>
         </w:numPr>
       </w:pPr>
       <w:r>
@@ -2812,7 +2895,7 @@
         <w:pStyle w:val="ListParagraph"/>
         <w:numPr>
           <w:ilvl w:val="0"/>
-          <w:numId w:val="17"/>
+          <w:numId w:val="18"/>
         </w:numPr>
       </w:pPr>
       <w:r>
@@ -2830,7 +2913,7 @@
         <w:pStyle w:val="ListParagraph"/>
         <w:numPr>
           <w:ilvl w:val="0"/>
-          <w:numId w:val="17"/>
+          <w:numId w:val="18"/>
         </w:numPr>
       </w:pPr>
       <w:r>
@@ -2848,7 +2931,7 @@
         <w:pStyle w:val="ListParagraph"/>
         <w:numPr>
           <w:ilvl w:val="0"/>
-          <w:numId w:val="17"/>
+          <w:numId w:val="18"/>
         </w:numPr>
       </w:pPr>
       <w:r>
@@ -2909,7 +2992,7 @@
         <w:pStyle w:val="ListParagraph"/>
         <w:numPr>
           <w:ilvl w:val="0"/>
-          <w:numId w:val="18"/>
+          <w:numId w:val="19"/>
         </w:numPr>
       </w:pPr>
       <w:r>
@@ -2921,7 +3004,7 @@
         <w:pStyle w:val="ListParagraph"/>
         <w:numPr>
           <w:ilvl w:val="0"/>
-          <w:numId w:val="18"/>
+          <w:numId w:val="19"/>
         </w:numPr>
       </w:pPr>
       <w:r>
@@ -2933,7 +3016,7 @@
         <w:pStyle w:val="ListParagraph"/>
         <w:numPr>
           <w:ilvl w:val="0"/>
-          <w:numId w:val="18"/>
+          <w:numId w:val="19"/>
         </w:numPr>
       </w:pPr>
       <w:r>
@@ -3035,7 +3118,7 @@
         <w:pStyle w:val="ListParagraph"/>
         <w:numPr>
           <w:ilvl w:val="0"/>
-          <w:numId w:val="19"/>
+          <w:numId w:val="20"/>
         </w:numPr>
       </w:pPr>
       <w:r>
@@ -3047,7 +3130,7 @@
         <w:pStyle w:val="ListParagraph"/>
         <w:numPr>
           <w:ilvl w:val="0"/>
-          <w:numId w:val="19"/>
+          <w:numId w:val="20"/>
         </w:numPr>
       </w:pPr>
       <w:r>
@@ -3059,7 +3142,7 @@
         <w:pStyle w:val="ListParagraph"/>
         <w:numPr>
           <w:ilvl w:val="0"/>
-          <w:numId w:val="19"/>
+          <w:numId w:val="20"/>
         </w:numPr>
       </w:pPr>
       <w:r>
@@ -3071,7 +3154,7 @@
         <w:pStyle w:val="ListParagraph"/>
         <w:numPr>
           <w:ilvl w:val="0"/>
-          <w:numId w:val="19"/>
+          <w:numId w:val="20"/>
         </w:numPr>
       </w:pPr>
       <w:r>
@@ -3089,7 +3172,7 @@
         <w:pStyle w:val="ListParagraph"/>
         <w:numPr>
           <w:ilvl w:val="0"/>
-          <w:numId w:val="20"/>
+          <w:numId w:val="21"/>
         </w:numPr>
       </w:pPr>
       <w:r>
@@ -3101,7 +3184,7 @@
         <w:pStyle w:val="ListParagraph"/>
         <w:numPr>
           <w:ilvl w:val="0"/>
-          <w:numId w:val="20"/>
+          <w:numId w:val="21"/>
         </w:numPr>
       </w:pPr>
       <w:r>
@@ -3113,7 +3196,7 @@
         <w:pStyle w:val="ListParagraph"/>
         <w:numPr>
           <w:ilvl w:val="0"/>
-          <w:numId w:val="20"/>
+          <w:numId w:val="21"/>
         </w:numPr>
       </w:pPr>
       <w:r>
@@ -3125,7 +3208,7 @@
         <w:pStyle w:val="ListParagraph"/>
         <w:numPr>
           <w:ilvl w:val="0"/>
-          <w:numId w:val="20"/>
+          <w:numId w:val="21"/>
         </w:numPr>
       </w:pPr>
       <w:r>
@@ -3222,7 +3305,7 @@
         <w:pStyle w:val="ListParagraph"/>
         <w:numPr>
           <w:ilvl w:val="0"/>
-          <w:numId w:val="21"/>
+          <w:numId w:val="22"/>
         </w:numPr>
       </w:pPr>
       <w:r>
@@ -3234,7 +3317,7 @@
         <w:pStyle w:val="ListParagraph"/>
         <w:numPr>
           <w:ilvl w:val="0"/>
-          <w:numId w:val="21"/>
+          <w:numId w:val="22"/>
         </w:numPr>
       </w:pPr>
       <w:r>
@@ -3260,7 +3343,7 @@
         <w:pStyle w:val="ListParagraph"/>
         <w:numPr>
           <w:ilvl w:val="0"/>
-          <w:numId w:val="22"/>
+          <w:numId w:val="23"/>
         </w:numPr>
       </w:pPr>
       <w:r>
@@ -3278,7 +3361,7 @@
         <w:pStyle w:val="ListParagraph"/>
         <w:numPr>
           <w:ilvl w:val="0"/>
-          <w:numId w:val="22"/>
+          <w:numId w:val="23"/>
         </w:numPr>
       </w:pPr>
       <w:r>
@@ -3316,7 +3399,7 @@
         <w:pStyle w:val="ListParagraph"/>
         <w:numPr>
           <w:ilvl w:val="0"/>
-          <w:numId w:val="23"/>
+          <w:numId w:val="24"/>
         </w:numPr>
       </w:pPr>
       <w:r>
@@ -3334,7 +3417,7 @@
         <w:pStyle w:val="ListParagraph"/>
         <w:numPr>
           <w:ilvl w:val="0"/>
-          <w:numId w:val="23"/>
+          <w:numId w:val="24"/>
         </w:numPr>
       </w:pPr>
       <w:r>
@@ -3352,7 +3435,7 @@
         <w:pStyle w:val="ListParagraph"/>
         <w:numPr>
           <w:ilvl w:val="0"/>
-          <w:numId w:val="23"/>
+          <w:numId w:val="24"/>
         </w:numPr>
       </w:pPr>
       <w:r>
@@ -3376,7 +3459,7 @@
         <w:pStyle w:val="ListParagraph"/>
         <w:numPr>
           <w:ilvl w:val="0"/>
-          <w:numId w:val="24"/>
+          <w:numId w:val="25"/>
         </w:numPr>
       </w:pPr>
       <w:r>
@@ -3388,7 +3471,7 @@
         <w:pStyle w:val="ListParagraph"/>
         <w:numPr>
           <w:ilvl w:val="0"/>
-          <w:numId w:val="24"/>
+          <w:numId w:val="25"/>
         </w:numPr>
       </w:pPr>
       <w:r>
@@ -3400,7 +3483,7 @@
         <w:pStyle w:val="ListParagraph"/>
         <w:numPr>
           <w:ilvl w:val="0"/>
-          <w:numId w:val="24"/>
+          <w:numId w:val="25"/>
         </w:numPr>
       </w:pPr>
       <w:r>
@@ -3412,7 +3495,7 @@
         <w:pStyle w:val="ListParagraph"/>
         <w:numPr>
           <w:ilvl w:val="0"/>
-          <w:numId w:val="24"/>
+          <w:numId w:val="25"/>
         </w:numPr>
       </w:pPr>
       <w:r>
@@ -3424,7 +3507,7 @@
         <w:pStyle w:val="ListParagraph"/>
         <w:numPr>
           <w:ilvl w:val="0"/>
-          <w:numId w:val="24"/>
+          <w:numId w:val="25"/>
         </w:numPr>
       </w:pPr>
       <w:r>
@@ -3436,7 +3519,7 @@
         <w:pStyle w:val="ListParagraph"/>
         <w:numPr>
           <w:ilvl w:val="0"/>
-          <w:numId w:val="24"/>
+          <w:numId w:val="25"/>
         </w:numPr>
       </w:pPr>
       <w:r>
@@ -3448,7 +3531,7 @@
         <w:pStyle w:val="ListParagraph"/>
         <w:numPr>
           <w:ilvl w:val="0"/>
-          <w:numId w:val="24"/>
+          <w:numId w:val="25"/>
         </w:numPr>
       </w:pPr>
       <w:r>
@@ -3468,7 +3551,7 @@
         <w:pStyle w:val="ListParagraph"/>
         <w:numPr>
           <w:ilvl w:val="0"/>
-          <w:numId w:val="25"/>
+          <w:numId w:val="26"/>
         </w:numPr>
       </w:pPr>
       <w:r>
@@ -3480,7 +3563,7 @@
         <w:pStyle w:val="ListParagraph"/>
         <w:numPr>
           <w:ilvl w:val="0"/>
-          <w:numId w:val="25"/>
+          <w:numId w:val="26"/>
         </w:numPr>
       </w:pPr>
       <w:r>
@@ -3492,7 +3575,7 @@
         <w:pStyle w:val="ListParagraph"/>
         <w:numPr>
           <w:ilvl w:val="0"/>
-          <w:numId w:val="25"/>
+          <w:numId w:val="26"/>
         </w:numPr>
       </w:pPr>
       <w:r>
@@ -3504,7 +3587,7 @@
         <w:pStyle w:val="ListParagraph"/>
         <w:numPr>
           <w:ilvl w:val="0"/>
-          <w:numId w:val="25"/>
+          <w:numId w:val="26"/>
         </w:numPr>
       </w:pPr>
       <w:r>
@@ -3516,7 +3599,7 @@
         <w:pStyle w:val="ListParagraph"/>
         <w:numPr>
           <w:ilvl w:val="0"/>
-          <w:numId w:val="25"/>
+          <w:numId w:val="26"/>
         </w:numPr>
       </w:pPr>
       <w:r>
@@ -3687,7 +3770,7 @@
           <w:p>
             <w:pPr/>
             <w:r>
-              <w:t xml:space="preserve">Lets Link Finder check your purchases first. Your collection must be public. Enter your own username in the Link Finder panel, or set it in the file.</w:t>
+              <w:t xml:space="preserve">Lets Link Finder check your purchases first, and the Downloads button count what you have to download. Your collection must be public. Enter your own username in the Link Finder panel, or set it in the file.</w:t>
             </w:r>
           </w:p>
         </w:tc>
@@ -5424,7 +5507,7 @@
         <w:pStyle w:val="ListParagraph"/>
         <w:numPr>
           <w:ilvl w:val="0"/>
-          <w:numId w:val="26"/>
+          <w:numId w:val="27"/>
         </w:numPr>
       </w:pPr>
       <w:r>
@@ -5445,7 +5528,7 @@
         <w:pStyle w:val="ListParagraph"/>
         <w:numPr>
           <w:ilvl w:val="0"/>
-          <w:numId w:val="26"/>
+          <w:numId w:val="27"/>
         </w:numPr>
       </w:pPr>
       <w:r>
@@ -5457,7 +5540,7 @@
         <w:pStyle w:val="ListParagraph"/>
         <w:numPr>
           <w:ilvl w:val="0"/>
-          <w:numId w:val="26"/>
+          <w:numId w:val="27"/>
         </w:numPr>
       </w:pPr>
       <w:r>
@@ -5478,7 +5561,7 @@
         <w:pStyle w:val="ListParagraph"/>
         <w:numPr>
           <w:ilvl w:val="0"/>
-          <w:numId w:val="26"/>
+          <w:numId w:val="27"/>
         </w:numPr>
       </w:pPr>
       <w:r>
@@ -5513,7 +5596,7 @@
         <w:pStyle w:val="ListParagraph"/>
         <w:numPr>
           <w:ilvl w:val="0"/>
-          <w:numId w:val="27"/>
+          <w:numId w:val="28"/>
         </w:numPr>
       </w:pPr>
       <w:r>
@@ -5531,7 +5614,7 @@
         <w:pStyle w:val="ListParagraph"/>
         <w:numPr>
           <w:ilvl w:val="0"/>
-          <w:numId w:val="27"/>
+          <w:numId w:val="28"/>
         </w:numPr>
       </w:pPr>
       <w:r>
@@ -5549,7 +5632,7 @@
         <w:pStyle w:val="ListParagraph"/>
         <w:numPr>
           <w:ilvl w:val="0"/>
-          <w:numId w:val="27"/>
+          <w:numId w:val="28"/>
         </w:numPr>
       </w:pPr>
       <w:r>
@@ -5567,7 +5650,7 @@
         <w:pStyle w:val="ListParagraph"/>
         <w:numPr>
           <w:ilvl w:val="0"/>
-          <w:numId w:val="27"/>
+          <w:numId w:val="28"/>
         </w:numPr>
       </w:pPr>
       <w:r>
@@ -5585,7 +5668,7 @@
         <w:pStyle w:val="ListParagraph"/>
         <w:numPr>
           <w:ilvl w:val="0"/>
-          <w:numId w:val="27"/>
+          <w:numId w:val="28"/>
         </w:numPr>
       </w:pPr>
       <w:r>
@@ -5603,7 +5686,7 @@
         <w:pStyle w:val="ListParagraph"/>
         <w:numPr>
           <w:ilvl w:val="0"/>
-          <w:numId w:val="27"/>
+          <w:numId w:val="28"/>
         </w:numPr>
       </w:pPr>
       <w:r>
@@ -5621,7 +5704,7 @@
         <w:pStyle w:val="ListParagraph"/>
         <w:numPr>
           <w:ilvl w:val="0"/>
-          <w:numId w:val="27"/>
+          <w:numId w:val="28"/>
         </w:numPr>
       </w:pPr>
       <w:r>
@@ -5639,7 +5722,7 @@
         <w:pStyle w:val="ListParagraph"/>
         <w:numPr>
           <w:ilvl w:val="0"/>
-          <w:numId w:val="27"/>
+          <w:numId w:val="28"/>
         </w:numPr>
       </w:pPr>
       <w:r>
@@ -5657,7 +5740,7 @@
         <w:pStyle w:val="ListParagraph"/>
         <w:numPr>
           <w:ilvl w:val="0"/>
-          <w:numId w:val="27"/>
+          <w:numId w:val="28"/>
         </w:numPr>
       </w:pPr>
       <w:r>
@@ -5675,7 +5758,7 @@
         <w:pStyle w:val="ListParagraph"/>
         <w:numPr>
           <w:ilvl w:val="0"/>
-          <w:numId w:val="27"/>
+          <w:numId w:val="28"/>
         </w:numPr>
       </w:pPr>
       <w:r>
@@ -5693,7 +5776,7 @@
         <w:pStyle w:val="ListParagraph"/>
         <w:numPr>
           <w:ilvl w:val="0"/>
-          <w:numId w:val="27"/>
+          <w:numId w:val="28"/>
         </w:numPr>
       </w:pPr>
       <w:r>
@@ -5708,7 +5791,7 @@
         <w:pStyle w:val="ListParagraph"/>
         <w:numPr>
           <w:ilvl w:val="0"/>
-          <w:numId w:val="27"/>
+          <w:numId w:val="28"/>
         </w:numPr>
       </w:pPr>
       <w:r>
@@ -6208,6 +6291,30 @@
             <w:pPr/>
             <w:r>
               <w:t xml:space="preserve">What changed</w:t>
+            </w:r>
+          </w:p>
+        </w:tc>
+      </w:tr>
+      <w:tr>
+        <w:tc>
+          <w:tcPr>
+            <w:tcW w:w="4680" w:type="dxa"/>
+          </w:tcPr>
+          <w:p>
+            <w:pPr/>
+            <w:r>
+              <w:t xml:space="preserve">64</w:t>
+            </w:r>
+          </w:p>
+        </w:tc>
+        <w:tc>
+          <w:tcPr>
+            <w:tcW w:w="4680" w:type="dxa"/>
+          </w:tcPr>
+          <w:p>
+            <w:pPr/>
+            <w:r>
+              <w:t xml:space="preserve">Downloads button: counts new Bandcamp purchases and pre-orders that have come out; clicking it opens your Bandcamp collection and clears the count.</w:t>
             </w:r>
           </w:p>
         </w:tc>
@@ -7983,19 +8090,16 @@
     <w:abstractNumId w:val="0"/>
   </w:num>
   <w:num w:numId="20">
+    <w:abstractNumId w:val="0"/>
+  </w:num>
+  <w:num w:numId="21">
     <w:abstractNumId w:val="1"/>
     <w:lvlOverride w:ilvl="0">
       <w:startOverride w:val="1"/>
     </w:lvlOverride>
   </w:num>
-  <w:num w:numId="21">
+  <w:num w:numId="22">
     <w:abstractNumId w:val="0"/>
-  </w:num>
-  <w:num w:numId="22">
-    <w:abstractNumId w:val="1"/>
-    <w:lvlOverride w:ilvl="0">
-      <w:startOverride w:val="1"/>
-    </w:lvlOverride>
   </w:num>
   <w:num w:numId="23">
     <w:abstractNumId w:val="1"/>
@@ -8010,12 +8114,18 @@
     </w:lvlOverride>
   </w:num>
   <w:num w:numId="25">
-    <w:abstractNumId w:val="0"/>
+    <w:abstractNumId w:val="1"/>
+    <w:lvlOverride w:ilvl="0">
+      <w:startOverride w:val="1"/>
+    </w:lvlOverride>
   </w:num>
   <w:num w:numId="26">
     <w:abstractNumId w:val="0"/>
   </w:num>
   <w:num w:numId="27">
+    <w:abstractNumId w:val="0"/>
+  </w:num>
+  <w:num w:numId="28">
     <w:abstractNumId w:val="0"/>
   </w:num>
 </w:numbering>

</xml_diff>

<commit_message>
v65: refresh progress in the status line, with a rough estimate of the time left.
Co-Authored-By: Claude Opus 5.5 <noreply@anthropic.com>
Claude-Session: https://claude.ai/code/session_01Xj1HuHJX1zYNh76RWBnCyx
</commit_message>
<xml_diff>
--- a/docs/Artist Feed User Guide.docx
+++ b/docs/Artist Feed User Guide.docx
@@ -13,7 +13,7 @@
     <w:p>
       <w:pPr/>
       <w:r>
-        <w:t xml:space="preserve">Oct 15, 2026</w:t>
+        <w:t xml:space="preserve">Oct 16, 2026</w:t>
       </w:r>
       <w:r>
         <w:t xml:space="preserve"/>
@@ -33,7 +33,7 @@
     <w:p>
       <w:pPr/>
       <w:r>
-        <w:t xml:space="preserve">This guide describes Artist Feed version 64. The version number is shown in small grey text beside the title at the top of the app.</w:t>
+        <w:t xml:space="preserve">This guide describes Artist Feed version 65. The version number is shown in small grey text beside the title at the top of the app.</w:t>
       </w:r>
     </w:p>
     <w:p>
@@ -3322,6 +3322,12 @@
       </w:pPr>
       <w:r>
         <w:t xml:space="preserve">While a lookup or a purchases read is running, the feed's own Bandcamp checks stand aside and resume on the next refresh.</w:t>
+      </w:r>
+    </w:p>
+    <w:p>
+      <w:pPr/>
+      <w:r>
+        <w:t xml:space="preserve">While the feed refreshes, the status line counts the pages checked and estimates the time left, for example "Checking for new posts… 118 of 452 pages · about 49 min left". The estimate starts from the pace of the last full refresh and switches to this refresh's own pace after ten pages. Bandcamp's two-second gap and any pauses it asks for make it a rough guide: SoundCloud and YouTube pages are quick, Bandcamp pages slow.</w:t>
       </w:r>
     </w:p>
     <w:p>
@@ -6291,6 +6297,30 @@
             <w:pPr/>
             <w:r>
               <w:t xml:space="preserve">What changed</w:t>
+            </w:r>
+          </w:p>
+        </w:tc>
+      </w:tr>
+      <w:tr>
+        <w:tc>
+          <w:tcPr>
+            <w:tcW w:w="4680" w:type="dxa"/>
+          </w:tcPr>
+          <w:p>
+            <w:pPr/>
+            <w:r>
+              <w:t xml:space="preserve">65</w:t>
+            </w:r>
+          </w:p>
+        </w:tc>
+        <w:tc>
+          <w:tcPr>
+            <w:tcW w:w="4680" w:type="dxa"/>
+          </w:tcPr>
+          <w:p>
+            <w:pPr/>
+            <w:r>
+              <w:t xml:space="preserve">Refresh progress: the status line shows pages checked so far and a rough estimate of the time left.</w:t>
             </w:r>
           </w:p>
         </w:tc>

</xml_diff>

<commit_message>
v66: refresh estimate timed per site; clear (x) buttons in search and filter boxes; Tracked Artists hover description.
Co-Authored-By: Claude Opus 5.5 <noreply@anthropic.com>
Claude-Session: https://claude.ai/code/session_01Xj1HuHJX1zYNh76RWBnCyx
</commit_message>
<xml_diff>
--- a/docs/Artist Feed User Guide.docx
+++ b/docs/Artist Feed User Guide.docx
@@ -33,7 +33,7 @@
     <w:p>
       <w:pPr/>
       <w:r>
-        <w:t xml:space="preserve">This guide describes Artist Feed version 65. The version number is shown in small grey text beside the title at the top of the app.</w:t>
+        <w:t xml:space="preserve">This guide describes Artist Feed version 66. The version number is shown in small grey text beside the title at the top of the app.</w:t>
       </w:r>
     </w:p>
     <w:p>
@@ -1654,7 +1654,7 @@
           <w:p>
             <w:pPr/>
             <w:r>
-              <w:t xml:space="preserve">Matches artist, label, release and track names, a moment after you stop typing (Enter searches at once). If the feed can't be loaded, a red message beside the status line says so.</w:t>
+              <w:t xml:space="preserve">Matches artist, label, release and track names, a moment after you stop typing (Enter searches at once). The ✕ at its right end empties it; the filter box in Tracked Artists and the search box for saved results have one too. If the feed can't be loaded, a red message beside the status line says so.</w:t>
             </w:r>
           </w:p>
         </w:tc>
@@ -3327,7 +3327,7 @@
     <w:p>
       <w:pPr/>
       <w:r>
-        <w:t xml:space="preserve">While the feed refreshes, the status line counts the pages checked and estimates the time left, for example "Checking for new posts… 118 of 452 pages · about 49 min left". The estimate starts from the pace of the last full refresh and switches to this refresh's own pace after ten pages. Bandcamp's two-second gap and any pauses it asks for make it a rough guide: SoundCloud and YouTube pages are quick, Bandcamp pages slow.</w:t>
+        <w:t xml:space="preserve">While the feed refreshes, the status line counts the pages checked and estimates the time left, for example "Checking for new posts… 118 of 452 pages · about 49 min left". Each site is timed separately, since the refresh ends when its slowest site does: a site's pace comes from the last full refresh at first, then from this refresh once five of its pages are done. Bandcamp's two-second gap and any pauses it asks for make it a rough guide: SoundCloud and YouTube pages are quick, Bandcamp pages slow.</w:t>
       </w:r>
     </w:p>
     <w:p>
@@ -6297,6 +6297,30 @@
             <w:pPr/>
             <w:r>
               <w:t xml:space="preserve">What changed</w:t>
+            </w:r>
+          </w:p>
+        </w:tc>
+      </w:tr>
+      <w:tr>
+        <w:tc>
+          <w:tcPr>
+            <w:tcW w:w="4680" w:type="dxa"/>
+          </w:tcPr>
+          <w:p>
+            <w:pPr/>
+            <w:r>
+              <w:t xml:space="preserve">66</w:t>
+            </w:r>
+          </w:p>
+        </w:tc>
+        <w:tc>
+          <w:tcPr>
+            <w:tcW w:w="4680" w:type="dxa"/>
+          </w:tcPr>
+          <w:p>
+            <w:pPr/>
+            <w:r>
+              <w:t xml:space="preserve">Refresh estimate timed per site, so it no longer climbs as the quick SoundCloud and YouTube pages finish. A ✕ in the search and filter boxes empties them. Tracked Artists button has a hover description.</w:t>
             </w:r>
           </w:p>
         </w:tc>

</xml_diff>

<commit_message>
v67: Focus column in Tracked Artists and Focus Feed button; removing a row marks it (with Undo) until Save.
Co-Authored-By: Claude Opus 5.5 <noreply@anthropic.com>
Claude-Session: https://claude.ai/code/session_01Xj1HuHJX1zYNh76RWBnCyx
</commit_message>
<xml_diff>
--- a/docs/Artist Feed User Guide.docx
+++ b/docs/Artist Feed User Guide.docx
@@ -33,7 +33,7 @@
     <w:p>
       <w:pPr/>
       <w:r>
-        <w:t xml:space="preserve">This guide describes Artist Feed version 66. The version number is shown in small grey text beside the title at the top of the app.</w:t>
+        <w:t xml:space="preserve">This guide describes Artist Feed version 67. The version number is shown in small grey text beside the title at the top of the app.</w:t>
       </w:r>
     </w:p>
     <w:p>
@@ -1446,6 +1446,38 @@
         <w:pStyle w:val="Heading3"/>
       </w:pPr>
       <w:r>
+        <w:t xml:space="preserve">Focus Feed</w:t>
+      </w:r>
+    </w:p>
+    <w:p>
+      <w:pPr/>
+      <w:r>
+        <w:t xml:space="preserve">The </w:t>
+      </w:r>
+      <w:r>
+        <w:rPr>
+          <w:b/>
+        </w:rPr>
+        <w:t xml:space="preserve">Focus Feed</w:t>
+      </w:r>
+      <w:r>
+        <w:t xml:space="preserve"> button, beside Grid | List, shows only the artists ticked in the </w:t>
+      </w:r>
+      <w:r>
+        <w:rPr>
+          <w:b/>
+        </w:rPr>
+        <w:t xml:space="preserve">Focus</w:t>
+      </w:r>
+      <w:r>
+        <w:t xml:space="preserve"> column of Tracked Artists: a short list of the ones you want to follow most closely, out of everyone you track. Click it again (or Clear filters) to show everyone. The other filters still apply on top of it. Tick or untick Focus in Tracked Artists, then Save changes.</w:t>
+      </w:r>
+    </w:p>
+    <w:p>
+      <w:pPr>
+        <w:pStyle w:val="Heading3"/>
+      </w:pPr>
+      <w:r>
         <w:t xml:space="preserve">List view</w:t>
       </w:r>
     </w:p>
@@ -2118,7 +2150,7 @@
         </w:numPr>
       </w:pPr>
       <w:r>
-        <w:t xml:space="preserve">Deleting a row and saving stops tracking that artist and removes their posts. It asks you to confirm.</w:t>
+        <w:t xml:space="preserve">The ✕ at the end of a row marks it for removal: the row turns a dark red-grey, its text is struck through, and an Undo button takes the ✕'s place. Nothing is removed until you Save, which stops tracking those artists and removes their posts after asking you to confirm. A new row that was never saved goes at once. The Focus column, left of the artist's name, picks the artists shown by the Focus Feed button.</w:t>
       </w:r>
     </w:p>
     <w:p>
@@ -2187,7 +2219,7 @@
         <w:t xml:space="preserve">Needs attention</w:t>
       </w:r>
       <w:r>
-        <w:t xml:space="preserve"> shows rows with a problem (a page that couldn't be read, or a save error), and there are also Still being checked, No posts yet, New, not saved yet, and Ticked for YouTube search. Each option shows how many rows it holds. Click a column heading to sort by it, again to reverse, and a third time to go back to the usual order; sorting by Status puts rows with problems first, then those with the fewest posts. Filtering and sorting only change what is shown: saving still saves every row, and pasting a block of cells fills the rows on screen, leaving filtered-out rows alone.</w:t>
+        <w:t xml:space="preserve"> shows rows with a problem (a page that couldn't be read, or a save error), and there are also Still being checked, No posts yet, New, not saved yet, Ticked for YouTube search, Ticked for Focus, and Marked for removal. Each option shows how many rows it holds. Click a column heading to sort by it, again to reverse, and a third time to go back to the usual order; sorting by Status puts rows with problems first, then those with the fewest posts. Filtering and sorting only change what is shown: saving still saves every row, and pasting a block of cells fills the rows on screen, leaving filtered-out rows alone.</w:t>
       </w:r>
     </w:p>
     <w:p>
@@ -6297,6 +6329,30 @@
             <w:pPr/>
             <w:r>
               <w:t xml:space="preserve">What changed</w:t>
+            </w:r>
+          </w:p>
+        </w:tc>
+      </w:tr>
+      <w:tr>
+        <w:tc>
+          <w:tcPr>
+            <w:tcW w:w="4680" w:type="dxa"/>
+          </w:tcPr>
+          <w:p>
+            <w:pPr/>
+            <w:r>
+              <w:t xml:space="preserve">67</w:t>
+            </w:r>
+          </w:p>
+        </w:tc>
+        <w:tc>
+          <w:tcPr>
+            <w:tcW w:w="4680" w:type="dxa"/>
+          </w:tcPr>
+          <w:p>
+            <w:pPr/>
+            <w:r>
+              <w:t xml:space="preserve">Focus column in Tracked Artists and a Focus Feed button showing only those artists. Removing a row now marks it (dark red-grey, with Undo) until you Save.</w:t>
             </w:r>
           </w:p>
         </w:tc>

</xml_diff>

<commit_message>
v68: SoundCloud profiles with an empty track list are read from their All tab; Status flags profiles SoundCloud lists no tracks for; app.check shows each request's result.
Co-Authored-By: Claude Opus 5.5 <noreply@anthropic.com>
Claude-Session: https://claude.ai/code/session_01Xj1HuHJX1zYNh76RWBnCyx
</commit_message>
<xml_diff>
--- a/docs/Artist Feed User Guide.docx
+++ b/docs/Artist Feed User Guide.docx
@@ -33,7 +33,7 @@
     <w:p>
       <w:pPr/>
       <w:r>
-        <w:t xml:space="preserve">This guide describes Artist Feed version 67. The version number is shown in small grey text beside the title at the top of the app.</w:t>
+        <w:t xml:space="preserve">This guide describes Artist Feed version 68. The version number is shown in small grey text beside the title at the top of the app.</w:t>
       </w:r>
     </w:p>
     <w:p>
@@ -728,8 +728,8 @@
         <w:tblLook w:val="04A0" w:firstRow="1" w:lastRow="0" w:firstColumn="0" w:lastColumn="0" w:noHBand="0" w:noVBand="1"/>
       </w:tblPr>
       <w:tblGrid>
-        <w:gridCol w:w="4680"/>
-        <w:gridCol w:w="4680"/>
+        <w:gridCol w:w="4440"/>
+        <w:gridCol w:w="4920"/>
       </w:tblGrid>
       <w:tr>
         <w:trPr>
@@ -737,7 +737,7 @@
         </w:trPr>
         <w:tc>
           <w:tcPr>
-            <w:tcW w:w="4680" w:type="dxa"/>
+            <w:tcW w:w="4440" w:type="dxa"/>
             <w:shd w:val="clear" w:color="auto" w:fill="F2F2F2"/>
           </w:tcPr>
           <w:p>
@@ -749,7 +749,7 @@
         </w:tc>
         <w:tc>
           <w:tcPr>
-            <w:tcW w:w="4680" w:type="dxa"/>
+            <w:tcW w:w="4920" w:type="dxa"/>
             <w:shd w:val="clear" w:color="auto" w:fill="F2F2F2"/>
           </w:tcPr>
           <w:p>
@@ -763,7 +763,7 @@
       <w:tr>
         <w:tc>
           <w:tcPr>
-            <w:tcW w:w="4680" w:type="dxa"/>
+            <w:tcW w:w="4440" w:type="dxa"/>
           </w:tcPr>
           <w:p>
             <w:pPr/>
@@ -777,7 +777,7 @@
         </w:tc>
         <w:tc>
           <w:tcPr>
-            <w:tcW w:w="4680" w:type="dxa"/>
+            <w:tcW w:w="4920" w:type="dxa"/>
           </w:tcPr>
           <w:p>
             <w:pPr/>
@@ -790,7 +790,7 @@
       <w:tr>
         <w:tc>
           <w:tcPr>
-            <w:tcW w:w="4680" w:type="dxa"/>
+            <w:tcW w:w="4440" w:type="dxa"/>
           </w:tcPr>
           <w:p>
             <w:pPr/>
@@ -804,7 +804,7 @@
         </w:tc>
         <w:tc>
           <w:tcPr>
-            <w:tcW w:w="4680" w:type="dxa"/>
+            <w:tcW w:w="4920" w:type="dxa"/>
           </w:tcPr>
           <w:p>
             <w:pPr/>
@@ -817,7 +817,7 @@
       <w:tr>
         <w:tc>
           <w:tcPr>
-            <w:tcW w:w="4680" w:type="dxa"/>
+            <w:tcW w:w="4440" w:type="dxa"/>
           </w:tcPr>
           <w:p>
             <w:pPr/>
@@ -831,7 +831,7 @@
         </w:tc>
         <w:tc>
           <w:tcPr>
-            <w:tcW w:w="4680" w:type="dxa"/>
+            <w:tcW w:w="4920" w:type="dxa"/>
           </w:tcPr>
           <w:p>
             <w:pPr/>
@@ -844,7 +844,7 @@
       <w:tr>
         <w:tc>
           <w:tcPr>
-            <w:tcW w:w="4680" w:type="dxa"/>
+            <w:tcW w:w="4440" w:type="dxa"/>
           </w:tcPr>
           <w:p>
             <w:pPr/>
@@ -867,7 +867,7 @@
         </w:tc>
         <w:tc>
           <w:tcPr>
-            <w:tcW w:w="4680" w:type="dxa"/>
+            <w:tcW w:w="4920" w:type="dxa"/>
           </w:tcPr>
           <w:p>
             <w:pPr/>
@@ -880,7 +880,7 @@
       <w:tr>
         <w:tc>
           <w:tcPr>
-            <w:tcW w:w="4680" w:type="dxa"/>
+            <w:tcW w:w="4440" w:type="dxa"/>
           </w:tcPr>
           <w:p>
             <w:pPr/>
@@ -894,7 +894,7 @@
         </w:tc>
         <w:tc>
           <w:tcPr>
-            <w:tcW w:w="4680" w:type="dxa"/>
+            <w:tcW w:w="4920" w:type="dxa"/>
           </w:tcPr>
           <w:p>
             <w:pPr/>
@@ -1587,8 +1587,8 @@
         <w:tblLook w:val="04A0" w:firstRow="1" w:lastRow="0" w:firstColumn="0" w:lastColumn="0" w:noHBand="0" w:noVBand="1"/>
       </w:tblPr>
       <w:tblGrid>
-        <w:gridCol w:w="4680"/>
-        <w:gridCol w:w="4680"/>
+        <w:gridCol w:w="3829"/>
+        <w:gridCol w:w="5530"/>
       </w:tblGrid>
       <w:tr>
         <w:trPr>
@@ -1596,7 +1596,7 @@
         </w:trPr>
         <w:tc>
           <w:tcPr>
-            <w:tcW w:w="4680" w:type="dxa"/>
+            <w:tcW w:w="3829" w:type="dxa"/>
             <w:shd w:val="clear" w:color="auto" w:fill="F2F2F2"/>
           </w:tcPr>
           <w:p>
@@ -1608,7 +1608,7 @@
         </w:tc>
         <w:tc>
           <w:tcPr>
-            <w:tcW w:w="4680" w:type="dxa"/>
+            <w:tcW w:w="5530" w:type="dxa"/>
             <w:shd w:val="clear" w:color="auto" w:fill="F2F2F2"/>
           </w:tcPr>
           <w:p>
@@ -1622,7 +1622,7 @@
       <w:tr>
         <w:tc>
           <w:tcPr>
-            <w:tcW w:w="4680" w:type="dxa"/>
+            <w:tcW w:w="3829" w:type="dxa"/>
           </w:tcPr>
           <w:p>
             <w:pPr/>
@@ -1633,7 +1633,7 @@
         </w:tc>
         <w:tc>
           <w:tcPr>
-            <w:tcW w:w="4680" w:type="dxa"/>
+            <w:tcW w:w="5530" w:type="dxa"/>
           </w:tcPr>
           <w:p>
             <w:pPr/>
@@ -1646,7 +1646,7 @@
       <w:tr>
         <w:tc>
           <w:tcPr>
-            <w:tcW w:w="4680" w:type="dxa"/>
+            <w:tcW w:w="3829" w:type="dxa"/>
           </w:tcPr>
           <w:p>
             <w:pPr/>
@@ -1657,7 +1657,7 @@
         </w:tc>
         <w:tc>
           <w:tcPr>
-            <w:tcW w:w="4680" w:type="dxa"/>
+            <w:tcW w:w="5530" w:type="dxa"/>
           </w:tcPr>
           <w:p>
             <w:pPr/>
@@ -1670,7 +1670,7 @@
       <w:tr>
         <w:tc>
           <w:tcPr>
-            <w:tcW w:w="4680" w:type="dxa"/>
+            <w:tcW w:w="3829" w:type="dxa"/>
           </w:tcPr>
           <w:p>
             <w:pPr/>
@@ -1681,7 +1681,7 @@
         </w:tc>
         <w:tc>
           <w:tcPr>
-            <w:tcW w:w="4680" w:type="dxa"/>
+            <w:tcW w:w="5530" w:type="dxa"/>
           </w:tcPr>
           <w:p>
             <w:pPr/>
@@ -1694,7 +1694,7 @@
       <w:tr>
         <w:tc>
           <w:tcPr>
-            <w:tcW w:w="4680" w:type="dxa"/>
+            <w:tcW w:w="3829" w:type="dxa"/>
           </w:tcPr>
           <w:p>
             <w:pPr/>
@@ -1705,7 +1705,7 @@
         </w:tc>
         <w:tc>
           <w:tcPr>
-            <w:tcW w:w="4680" w:type="dxa"/>
+            <w:tcW w:w="5530" w:type="dxa"/>
           </w:tcPr>
           <w:p>
             <w:pPr/>
@@ -1718,7 +1718,7 @@
       <w:tr>
         <w:tc>
           <w:tcPr>
-            <w:tcW w:w="4680" w:type="dxa"/>
+            <w:tcW w:w="3829" w:type="dxa"/>
           </w:tcPr>
           <w:p>
             <w:pPr/>
@@ -1729,7 +1729,7 @@
         </w:tc>
         <w:tc>
           <w:tcPr>
-            <w:tcW w:w="4680" w:type="dxa"/>
+            <w:tcW w:w="5530" w:type="dxa"/>
           </w:tcPr>
           <w:p>
             <w:pPr/>
@@ -1742,7 +1742,7 @@
       <w:tr>
         <w:tc>
           <w:tcPr>
-            <w:tcW w:w="4680" w:type="dxa"/>
+            <w:tcW w:w="3829" w:type="dxa"/>
           </w:tcPr>
           <w:p>
             <w:pPr/>
@@ -1753,7 +1753,7 @@
         </w:tc>
         <w:tc>
           <w:tcPr>
-            <w:tcW w:w="4680" w:type="dxa"/>
+            <w:tcW w:w="5530" w:type="dxa"/>
           </w:tcPr>
           <w:p>
             <w:pPr/>
@@ -1766,7 +1766,7 @@
       <w:tr>
         <w:tc>
           <w:tcPr>
-            <w:tcW w:w="4680" w:type="dxa"/>
+            <w:tcW w:w="3829" w:type="dxa"/>
           </w:tcPr>
           <w:p>
             <w:pPr/>
@@ -1777,7 +1777,7 @@
         </w:tc>
         <w:tc>
           <w:tcPr>
-            <w:tcW w:w="4680" w:type="dxa"/>
+            <w:tcW w:w="5530" w:type="dxa"/>
           </w:tcPr>
           <w:p>
             <w:pPr/>
@@ -1790,7 +1790,7 @@
       <w:tr>
         <w:tc>
           <w:tcPr>
-            <w:tcW w:w="4680" w:type="dxa"/>
+            <w:tcW w:w="3829" w:type="dxa"/>
           </w:tcPr>
           <w:p>
             <w:pPr/>
@@ -1801,7 +1801,7 @@
         </w:tc>
         <w:tc>
           <w:tcPr>
-            <w:tcW w:w="4680" w:type="dxa"/>
+            <w:tcW w:w="5530" w:type="dxa"/>
           </w:tcPr>
           <w:p>
             <w:pPr/>
@@ -2626,8 +2626,8 @@
         <w:tblLook w:val="04A0" w:firstRow="1" w:lastRow="0" w:firstColumn="0" w:lastColumn="0" w:noHBand="0" w:noVBand="1"/>
       </w:tblPr>
       <w:tblGrid>
-        <w:gridCol w:w="4680"/>
-        <w:gridCol w:w="4680"/>
+        <w:gridCol w:w="3547"/>
+        <w:gridCol w:w="5812"/>
       </w:tblGrid>
       <w:tr>
         <w:trPr>
@@ -2635,7 +2635,7 @@
         </w:trPr>
         <w:tc>
           <w:tcPr>
-            <w:tcW w:w="4680" w:type="dxa"/>
+            <w:tcW w:w="3547" w:type="dxa"/>
             <w:shd w:val="clear" w:color="auto" w:fill="F2F2F2"/>
           </w:tcPr>
           <w:p>
@@ -2647,7 +2647,7 @@
         </w:tc>
         <w:tc>
           <w:tcPr>
-            <w:tcW w:w="4680" w:type="dxa"/>
+            <w:tcW w:w="5812" w:type="dxa"/>
             <w:shd w:val="clear" w:color="auto" w:fill="F2F2F2"/>
           </w:tcPr>
           <w:p>
@@ -2661,7 +2661,7 @@
       <w:tr>
         <w:tc>
           <w:tcPr>
-            <w:tcW w:w="4680" w:type="dxa"/>
+            <w:tcW w:w="3547" w:type="dxa"/>
           </w:tcPr>
           <w:p>
             <w:pPr/>
@@ -2672,7 +2672,7 @@
         </w:tc>
         <w:tc>
           <w:tcPr>
-            <w:tcW w:w="4680" w:type="dxa"/>
+            <w:tcW w:w="5812" w:type="dxa"/>
           </w:tcPr>
           <w:p>
             <w:pPr/>
@@ -2685,7 +2685,7 @@
       <w:tr>
         <w:tc>
           <w:tcPr>
-            <w:tcW w:w="4680" w:type="dxa"/>
+            <w:tcW w:w="3547" w:type="dxa"/>
           </w:tcPr>
           <w:p>
             <w:pPr/>
@@ -2696,7 +2696,7 @@
         </w:tc>
         <w:tc>
           <w:tcPr>
-            <w:tcW w:w="4680" w:type="dxa"/>
+            <w:tcW w:w="5812" w:type="dxa"/>
           </w:tcPr>
           <w:p>
             <w:pPr/>
@@ -2709,7 +2709,7 @@
       <w:tr>
         <w:tc>
           <w:tcPr>
-            <w:tcW w:w="4680" w:type="dxa"/>
+            <w:tcW w:w="3547" w:type="dxa"/>
           </w:tcPr>
           <w:p>
             <w:pPr/>
@@ -2720,7 +2720,7 @@
         </w:tc>
         <w:tc>
           <w:tcPr>
-            <w:tcW w:w="4680" w:type="dxa"/>
+            <w:tcW w:w="5812" w:type="dxa"/>
           </w:tcPr>
           <w:p>
             <w:pPr/>
@@ -2733,7 +2733,7 @@
       <w:tr>
         <w:tc>
           <w:tcPr>
-            <w:tcW w:w="4680" w:type="dxa"/>
+            <w:tcW w:w="3547" w:type="dxa"/>
           </w:tcPr>
           <w:p>
             <w:pPr/>
@@ -2744,7 +2744,7 @@
         </w:tc>
         <w:tc>
           <w:tcPr>
-            <w:tcW w:w="4680" w:type="dxa"/>
+            <w:tcW w:w="5812" w:type="dxa"/>
           </w:tcPr>
           <w:p>
             <w:pPr/>
@@ -2757,7 +2757,7 @@
       <w:tr>
         <w:tc>
           <w:tcPr>
-            <w:tcW w:w="4680" w:type="dxa"/>
+            <w:tcW w:w="3547" w:type="dxa"/>
           </w:tcPr>
           <w:p>
             <w:pPr/>
@@ -2768,7 +2768,7 @@
         </w:tc>
         <w:tc>
           <w:tcPr>
-            <w:tcW w:w="4680" w:type="dxa"/>
+            <w:tcW w:w="5812" w:type="dxa"/>
           </w:tcPr>
           <w:p>
             <w:pPr/>
@@ -2781,7 +2781,7 @@
       <w:tr>
         <w:tc>
           <w:tcPr>
-            <w:tcW w:w="4680" w:type="dxa"/>
+            <w:tcW w:w="3547" w:type="dxa"/>
           </w:tcPr>
           <w:p>
             <w:pPr/>
@@ -2792,7 +2792,7 @@
         </w:tc>
         <w:tc>
           <w:tcPr>
-            <w:tcW w:w="4680" w:type="dxa"/>
+            <w:tcW w:w="5812" w:type="dxa"/>
           </w:tcPr>
           <w:p>
             <w:pPr/>
@@ -2805,7 +2805,7 @@
       <w:tr>
         <w:tc>
           <w:tcPr>
-            <w:tcW w:w="4680" w:type="dxa"/>
+            <w:tcW w:w="3547" w:type="dxa"/>
           </w:tcPr>
           <w:p>
             <w:pPr/>
@@ -2816,7 +2816,7 @@
         </w:tc>
         <w:tc>
           <w:tcPr>
-            <w:tcW w:w="4680" w:type="dxa"/>
+            <w:tcW w:w="5812" w:type="dxa"/>
           </w:tcPr>
           <w:p>
             <w:pPr/>
@@ -2829,7 +2829,7 @@
       <w:tr>
         <w:tc>
           <w:tcPr>
-            <w:tcW w:w="4680" w:type="dxa"/>
+            <w:tcW w:w="3547" w:type="dxa"/>
           </w:tcPr>
           <w:p>
             <w:pPr/>
@@ -2840,7 +2840,7 @@
         </w:tc>
         <w:tc>
           <w:tcPr>
-            <w:tcW w:w="4680" w:type="dxa"/>
+            <w:tcW w:w="5812" w:type="dxa"/>
           </w:tcPr>
           <w:p>
             <w:pPr/>
@@ -2853,7 +2853,7 @@
       <w:tr>
         <w:tc>
           <w:tcPr>
-            <w:tcW w:w="4680" w:type="dxa"/>
+            <w:tcW w:w="3547" w:type="dxa"/>
           </w:tcPr>
           <w:p>
             <w:pPr/>
@@ -2864,7 +2864,7 @@
         </w:tc>
         <w:tc>
           <w:tcPr>
-            <w:tcW w:w="4680" w:type="dxa"/>
+            <w:tcW w:w="5812" w:type="dxa"/>
           </w:tcPr>
           <w:p>
             <w:pPr/>
@@ -2877,7 +2877,7 @@
       <w:tr>
         <w:tc>
           <w:tcPr>
-            <w:tcW w:w="4680" w:type="dxa"/>
+            <w:tcW w:w="3547" w:type="dxa"/>
           </w:tcPr>
           <w:p>
             <w:pPr/>
@@ -2888,7 +2888,7 @@
         </w:tc>
         <w:tc>
           <w:tcPr>
-            <w:tcW w:w="4680" w:type="dxa"/>
+            <w:tcW w:w="5812" w:type="dxa"/>
           </w:tcPr>
           <w:p>
             <w:pPr/>
@@ -3301,7 +3301,7 @@
     <w:p>
       <w:pPr/>
       <w:r>
-        <w:t xml:space="preserve">SoundCloud's RSS feeds are empty for most musicians, so the app uses the same data endpoints the soundcloud.com website calls. They need a public key that is embedded in the site's own code. The app finds that key itself and replaces it when it expires. Only an artist's own uploads are read, not reposts.</w:t>
+        <w:t xml:space="preserve">SoundCloud's RSS feeds are empty for most musicians, so the app uses the same data endpoints the soundcloud.com website calls. They need a public key that is embedded in the site's own code. The app finds that key itself and replaces it when it expires. Only an artist's own uploads are read, not reposts. SoundCloud sometimes sends back an empty track list for a profile that has tracks. When that happens the app also reads the profile's All tab, keeping only the artist's own uploads. If that comes back empty too while SoundCloud says the profile has tracks, the row's Status says so, and the app tries again on the next refresh. To see what SoundCloud returns for one profile, run docker compose exec artist-feed python -m app.check soundcloud username: it lists the tracks found and what each request returned.</w:t>
       </w:r>
     </w:p>
     <w:p>
@@ -3683,9 +3683,9 @@
         <w:tblLook w:val="04A0" w:firstRow="1" w:lastRow="0" w:firstColumn="0" w:lastColumn="0" w:noHBand="0" w:noVBand="1"/>
       </w:tblPr>
       <w:tblGrid>
-        <w:gridCol w:w="3120"/>
-        <w:gridCol w:w="3120"/>
-        <w:gridCol w:w="3120"/>
+        <w:gridCol w:w="1795"/>
+        <w:gridCol w:w="2645"/>
+        <w:gridCol w:w="4920"/>
       </w:tblGrid>
       <w:tr>
         <w:trPr>
@@ -3693,7 +3693,7 @@
         </w:trPr>
         <w:tc>
           <w:tcPr>
-            <w:tcW w:w="3120" w:type="dxa"/>
+            <w:tcW w:w="1795" w:type="dxa"/>
             <w:shd w:val="clear" w:color="auto" w:fill="F2F2F2"/>
           </w:tcPr>
           <w:p>
@@ -3705,7 +3705,7 @@
         </w:tc>
         <w:tc>
           <w:tcPr>
-            <w:tcW w:w="3120" w:type="dxa"/>
+            <w:tcW w:w="2645" w:type="dxa"/>
             <w:shd w:val="clear" w:color="auto" w:fill="F2F2F2"/>
           </w:tcPr>
           <w:p>
@@ -3717,7 +3717,7 @@
         </w:tc>
         <w:tc>
           <w:tcPr>
-            <w:tcW w:w="3120" w:type="dxa"/>
+            <w:tcW w:w="4920" w:type="dxa"/>
             <w:shd w:val="clear" w:color="auto" w:fill="F2F2F2"/>
           </w:tcPr>
           <w:p>
@@ -3731,7 +3731,7 @@
       <w:tr>
         <w:tc>
           <w:tcPr>
-            <w:tcW w:w="3120" w:type="dxa"/>
+            <w:tcW w:w="1795" w:type="dxa"/>
           </w:tcPr>
           <w:p>
             <w:pPr/>
@@ -3742,7 +3742,7 @@
         </w:tc>
         <w:tc>
           <w:tcPr>
-            <w:tcW w:w="3120" w:type="dxa"/>
+            <w:tcW w:w="2645" w:type="dxa"/>
           </w:tcPr>
           <w:p>
             <w:pPr/>
@@ -3753,7 +3753,7 @@
         </w:tc>
         <w:tc>
           <w:tcPr>
-            <w:tcW w:w="3120" w:type="dxa"/>
+            <w:tcW w:w="4920" w:type="dxa"/>
           </w:tcPr>
           <w:p>
             <w:pPr/>
@@ -3766,7 +3766,7 @@
       <w:tr>
         <w:tc>
           <w:tcPr>
-            <w:tcW w:w="3120" w:type="dxa"/>
+            <w:tcW w:w="1795" w:type="dxa"/>
           </w:tcPr>
           <w:p>
             <w:pPr/>
@@ -3777,7 +3777,7 @@
         </w:tc>
         <w:tc>
           <w:tcPr>
-            <w:tcW w:w="3120" w:type="dxa"/>
+            <w:tcW w:w="2645" w:type="dxa"/>
           </w:tcPr>
           <w:p>
             <w:pPr/>
@@ -3803,7 +3803,7 @@
         </w:tc>
         <w:tc>
           <w:tcPr>
-            <w:tcW w:w="3120" w:type="dxa"/>
+            <w:tcW w:w="4920" w:type="dxa"/>
           </w:tcPr>
           <w:p>
             <w:pPr/>
@@ -3816,7 +3816,7 @@
       <w:tr>
         <w:tc>
           <w:tcPr>
-            <w:tcW w:w="3120" w:type="dxa"/>
+            <w:tcW w:w="1795" w:type="dxa"/>
           </w:tcPr>
           <w:p>
             <w:pPr/>
@@ -3827,7 +3827,7 @@
         </w:tc>
         <w:tc>
           <w:tcPr>
-            <w:tcW w:w="3120" w:type="dxa"/>
+            <w:tcW w:w="2645" w:type="dxa"/>
           </w:tcPr>
           <w:p>
             <w:pPr/>
@@ -3853,7 +3853,7 @@
         </w:tc>
         <w:tc>
           <w:tcPr>
-            <w:tcW w:w="3120" w:type="dxa"/>
+            <w:tcW w:w="4920" w:type="dxa"/>
           </w:tcPr>
           <w:p>
             <w:pPr/>
@@ -3866,7 +3866,7 @@
       <w:tr>
         <w:tc>
           <w:tcPr>
-            <w:tcW w:w="3120" w:type="dxa"/>
+            <w:tcW w:w="1795" w:type="dxa"/>
           </w:tcPr>
           <w:p>
             <w:pPr/>
@@ -3877,7 +3877,7 @@
         </w:tc>
         <w:tc>
           <w:tcPr>
-            <w:tcW w:w="3120" w:type="dxa"/>
+            <w:tcW w:w="2645" w:type="dxa"/>
           </w:tcPr>
           <w:p>
             <w:pPr/>
@@ -3900,7 +3900,7 @@
         </w:tc>
         <w:tc>
           <w:tcPr>
-            <w:tcW w:w="3120" w:type="dxa"/>
+            <w:tcW w:w="4920" w:type="dxa"/>
           </w:tcPr>
           <w:p>
             <w:pPr/>
@@ -3948,9 +3948,9 @@
         <w:tblLook w:val="04A0" w:firstRow="1" w:lastRow="0" w:firstColumn="0" w:lastColumn="0" w:noHBand="0" w:noVBand="1"/>
       </w:tblPr>
       <w:tblGrid>
-        <w:gridCol w:w="3120"/>
-        <w:gridCol w:w="3120"/>
-        <w:gridCol w:w="3120"/>
+        <w:gridCol w:w="4637"/>
+        <w:gridCol w:w="2775"/>
+        <w:gridCol w:w="1946"/>
       </w:tblGrid>
       <w:tr>
         <w:trPr>
@@ -3958,7 +3958,7 @@
         </w:trPr>
         <w:tc>
           <w:tcPr>
-            <w:tcW w:w="3120" w:type="dxa"/>
+            <w:tcW w:w="4637" w:type="dxa"/>
             <w:shd w:val="clear" w:color="auto" w:fill="F2F2F2"/>
           </w:tcPr>
           <w:p>
@@ -3970,7 +3970,7 @@
         </w:tc>
         <w:tc>
           <w:tcPr>
-            <w:tcW w:w="3120" w:type="dxa"/>
+            <w:tcW w:w="2775" w:type="dxa"/>
             <w:shd w:val="clear" w:color="auto" w:fill="F2F2F2"/>
           </w:tcPr>
           <w:p>
@@ -3982,7 +3982,7 @@
         </w:tc>
         <w:tc>
           <w:tcPr>
-            <w:tcW w:w="3120" w:type="dxa"/>
+            <w:tcW w:w="1946" w:type="dxa"/>
             <w:shd w:val="clear" w:color="auto" w:fill="F2F2F2"/>
           </w:tcPr>
           <w:p>
@@ -3996,7 +3996,7 @@
       <w:tr>
         <w:tc>
           <w:tcPr>
-            <w:tcW w:w="3120" w:type="dxa"/>
+            <w:tcW w:w="4637" w:type="dxa"/>
           </w:tcPr>
           <w:p>
             <w:pPr/>
@@ -4007,7 +4007,7 @@
         </w:tc>
         <w:tc>
           <w:tcPr>
-            <w:tcW w:w="3120" w:type="dxa"/>
+            <w:tcW w:w="2775" w:type="dxa"/>
           </w:tcPr>
           <w:p>
             <w:pPr/>
@@ -4018,7 +4018,7 @@
         </w:tc>
         <w:tc>
           <w:tcPr>
-            <w:tcW w:w="3120" w:type="dxa"/>
+            <w:tcW w:w="1946" w:type="dxa"/>
           </w:tcPr>
           <w:p>
             <w:pPr/>
@@ -4031,7 +4031,7 @@
       <w:tr>
         <w:tc>
           <w:tcPr>
-            <w:tcW w:w="3120" w:type="dxa"/>
+            <w:tcW w:w="4637" w:type="dxa"/>
           </w:tcPr>
           <w:p>
             <w:pPr/>
@@ -4042,7 +4042,7 @@
         </w:tc>
         <w:tc>
           <w:tcPr>
-            <w:tcW w:w="3120" w:type="dxa"/>
+            <w:tcW w:w="2775" w:type="dxa"/>
           </w:tcPr>
           <w:p>
             <w:pPr/>
@@ -4053,7 +4053,7 @@
         </w:tc>
         <w:tc>
           <w:tcPr>
-            <w:tcW w:w="3120" w:type="dxa"/>
+            <w:tcW w:w="1946" w:type="dxa"/>
           </w:tcPr>
           <w:p>
             <w:pPr/>
@@ -4066,7 +4066,7 @@
       <w:tr>
         <w:tc>
           <w:tcPr>
-            <w:tcW w:w="3120" w:type="dxa"/>
+            <w:tcW w:w="4637" w:type="dxa"/>
           </w:tcPr>
           <w:p>
             <w:pPr/>
@@ -4077,7 +4077,7 @@
         </w:tc>
         <w:tc>
           <w:tcPr>
-            <w:tcW w:w="3120" w:type="dxa"/>
+            <w:tcW w:w="2775" w:type="dxa"/>
           </w:tcPr>
           <w:p>
             <w:pPr/>
@@ -4088,7 +4088,7 @@
         </w:tc>
         <w:tc>
           <w:tcPr>
-            <w:tcW w:w="3120" w:type="dxa"/>
+            <w:tcW w:w="1946" w:type="dxa"/>
           </w:tcPr>
           <w:p>
             <w:pPr/>
@@ -4101,7 +4101,7 @@
       <w:tr>
         <w:tc>
           <w:tcPr>
-            <w:tcW w:w="3120" w:type="dxa"/>
+            <w:tcW w:w="4637" w:type="dxa"/>
           </w:tcPr>
           <w:p>
             <w:pPr/>
@@ -4112,7 +4112,7 @@
         </w:tc>
         <w:tc>
           <w:tcPr>
-            <w:tcW w:w="3120" w:type="dxa"/>
+            <w:tcW w:w="2775" w:type="dxa"/>
           </w:tcPr>
           <w:p>
             <w:pPr/>
@@ -4123,7 +4123,7 @@
         </w:tc>
         <w:tc>
           <w:tcPr>
-            <w:tcW w:w="3120" w:type="dxa"/>
+            <w:tcW w:w="1946" w:type="dxa"/>
           </w:tcPr>
           <w:p>
             <w:pPr/>
@@ -4136,7 +4136,7 @@
       <w:tr>
         <w:tc>
           <w:tcPr>
-            <w:tcW w:w="3120" w:type="dxa"/>
+            <w:tcW w:w="4637" w:type="dxa"/>
           </w:tcPr>
           <w:p>
             <w:pPr/>
@@ -4147,7 +4147,7 @@
         </w:tc>
         <w:tc>
           <w:tcPr>
-            <w:tcW w:w="3120" w:type="dxa"/>
+            <w:tcW w:w="2775" w:type="dxa"/>
           </w:tcPr>
           <w:p>
             <w:pPr/>
@@ -4158,7 +4158,7 @@
         </w:tc>
         <w:tc>
           <w:tcPr>
-            <w:tcW w:w="3120" w:type="dxa"/>
+            <w:tcW w:w="1946" w:type="dxa"/>
           </w:tcPr>
           <w:p>
             <w:pPr/>
@@ -4171,7 +4171,7 @@
       <w:tr>
         <w:tc>
           <w:tcPr>
-            <w:tcW w:w="3120" w:type="dxa"/>
+            <w:tcW w:w="4637" w:type="dxa"/>
           </w:tcPr>
           <w:p>
             <w:pPr/>
@@ -4182,7 +4182,7 @@
         </w:tc>
         <w:tc>
           <w:tcPr>
-            <w:tcW w:w="3120" w:type="dxa"/>
+            <w:tcW w:w="2775" w:type="dxa"/>
           </w:tcPr>
           <w:p>
             <w:pPr/>
@@ -4193,7 +4193,7 @@
         </w:tc>
         <w:tc>
           <w:tcPr>
-            <w:tcW w:w="3120" w:type="dxa"/>
+            <w:tcW w:w="1946" w:type="dxa"/>
           </w:tcPr>
           <w:p>
             <w:pPr/>
@@ -4206,7 +4206,7 @@
       <w:tr>
         <w:tc>
           <w:tcPr>
-            <w:tcW w:w="3120" w:type="dxa"/>
+            <w:tcW w:w="4637" w:type="dxa"/>
           </w:tcPr>
           <w:p>
             <w:pPr/>
@@ -4217,7 +4217,7 @@
         </w:tc>
         <w:tc>
           <w:tcPr>
-            <w:tcW w:w="3120" w:type="dxa"/>
+            <w:tcW w:w="2775" w:type="dxa"/>
           </w:tcPr>
           <w:p>
             <w:pPr/>
@@ -4228,7 +4228,7 @@
         </w:tc>
         <w:tc>
           <w:tcPr>
-            <w:tcW w:w="3120" w:type="dxa"/>
+            <w:tcW w:w="1946" w:type="dxa"/>
           </w:tcPr>
           <w:p>
             <w:pPr/>
@@ -4285,9 +4285,9 @@
         <w:tblLook w:val="04A0" w:firstRow="1" w:lastRow="0" w:firstColumn="0" w:lastColumn="0" w:noHBand="0" w:noVBand="1"/>
       </w:tblPr>
       <w:tblGrid>
-        <w:gridCol w:w="3120"/>
-        <w:gridCol w:w="3120"/>
-        <w:gridCol w:w="3120"/>
+        <w:gridCol w:w="3116"/>
+        <w:gridCol w:w="1385"/>
+        <w:gridCol w:w="4859"/>
       </w:tblGrid>
       <w:tr>
         <w:trPr>
@@ -4295,7 +4295,7 @@
         </w:trPr>
         <w:tc>
           <w:tcPr>
-            <w:tcW w:w="3120" w:type="dxa"/>
+            <w:tcW w:w="3116" w:type="dxa"/>
             <w:shd w:val="clear" w:color="auto" w:fill="F2F2F2"/>
           </w:tcPr>
           <w:p>
@@ -4307,7 +4307,7 @@
         </w:tc>
         <w:tc>
           <w:tcPr>
-            <w:tcW w:w="3120" w:type="dxa"/>
+            <w:tcW w:w="1385" w:type="dxa"/>
             <w:shd w:val="clear" w:color="auto" w:fill="F2F2F2"/>
           </w:tcPr>
           <w:p>
@@ -4319,7 +4319,7 @@
         </w:tc>
         <w:tc>
           <w:tcPr>
-            <w:tcW w:w="3120" w:type="dxa"/>
+            <w:tcW w:w="4859" w:type="dxa"/>
             <w:shd w:val="clear" w:color="auto" w:fill="F2F2F2"/>
           </w:tcPr>
           <w:p>
@@ -4333,7 +4333,7 @@
       <w:tr>
         <w:tc>
           <w:tcPr>
-            <w:tcW w:w="3120" w:type="dxa"/>
+            <w:tcW w:w="3116" w:type="dxa"/>
           </w:tcPr>
           <w:p>
             <w:pPr/>
@@ -4347,7 +4347,7 @@
         </w:tc>
         <w:tc>
           <w:tcPr>
-            <w:tcW w:w="3120" w:type="dxa"/>
+            <w:tcW w:w="1385" w:type="dxa"/>
           </w:tcPr>
           <w:p>
             <w:pPr/>
@@ -4358,7 +4358,7 @@
         </w:tc>
         <w:tc>
           <w:tcPr>
-            <w:tcW w:w="3120" w:type="dxa"/>
+            <w:tcW w:w="4859" w:type="dxa"/>
           </w:tcPr>
           <w:p>
             <w:pPr/>
@@ -4371,7 +4371,7 @@
       <w:tr>
         <w:tc>
           <w:tcPr>
-            <w:tcW w:w="3120" w:type="dxa"/>
+            <w:tcW w:w="3116" w:type="dxa"/>
           </w:tcPr>
           <w:p>
             <w:pPr/>
@@ -4385,7 +4385,7 @@
         </w:tc>
         <w:tc>
           <w:tcPr>
-            <w:tcW w:w="3120" w:type="dxa"/>
+            <w:tcW w:w="1385" w:type="dxa"/>
           </w:tcPr>
           <w:p>
             <w:pPr/>
@@ -4396,7 +4396,7 @@
         </w:tc>
         <w:tc>
           <w:tcPr>
-            <w:tcW w:w="3120" w:type="dxa"/>
+            <w:tcW w:w="4859" w:type="dxa"/>
           </w:tcPr>
           <w:p>
             <w:pPr/>
@@ -4409,7 +4409,7 @@
       <w:tr>
         <w:tc>
           <w:tcPr>
-            <w:tcW w:w="3120" w:type="dxa"/>
+            <w:tcW w:w="3116" w:type="dxa"/>
           </w:tcPr>
           <w:p>
             <w:pPr/>
@@ -4423,7 +4423,7 @@
         </w:tc>
         <w:tc>
           <w:tcPr>
-            <w:tcW w:w="3120" w:type="dxa"/>
+            <w:tcW w:w="1385" w:type="dxa"/>
           </w:tcPr>
           <w:p>
             <w:pPr/>
@@ -4434,7 +4434,7 @@
         </w:tc>
         <w:tc>
           <w:tcPr>
-            <w:tcW w:w="3120" w:type="dxa"/>
+            <w:tcW w:w="4859" w:type="dxa"/>
           </w:tcPr>
           <w:p>
             <w:pPr/>
@@ -4465,7 +4465,7 @@
       <w:tr>
         <w:tc>
           <w:tcPr>
-            <w:tcW w:w="3120" w:type="dxa"/>
+            <w:tcW w:w="3116" w:type="dxa"/>
           </w:tcPr>
           <w:p>
             <w:pPr/>
@@ -4479,7 +4479,7 @@
         </w:tc>
         <w:tc>
           <w:tcPr>
-            <w:tcW w:w="3120" w:type="dxa"/>
+            <w:tcW w:w="1385" w:type="dxa"/>
           </w:tcPr>
           <w:p>
             <w:pPr/>
@@ -4490,7 +4490,7 @@
         </w:tc>
         <w:tc>
           <w:tcPr>
-            <w:tcW w:w="3120" w:type="dxa"/>
+            <w:tcW w:w="4859" w:type="dxa"/>
           </w:tcPr>
           <w:p>
             <w:pPr/>
@@ -4503,7 +4503,7 @@
       <w:tr>
         <w:tc>
           <w:tcPr>
-            <w:tcW w:w="3120" w:type="dxa"/>
+            <w:tcW w:w="3116" w:type="dxa"/>
           </w:tcPr>
           <w:p>
             <w:pPr/>
@@ -4517,7 +4517,7 @@
         </w:tc>
         <w:tc>
           <w:tcPr>
-            <w:tcW w:w="3120" w:type="dxa"/>
+            <w:tcW w:w="1385" w:type="dxa"/>
           </w:tcPr>
           <w:p>
             <w:pPr/>
@@ -4528,7 +4528,7 @@
         </w:tc>
         <w:tc>
           <w:tcPr>
-            <w:tcW w:w="3120" w:type="dxa"/>
+            <w:tcW w:w="4859" w:type="dxa"/>
           </w:tcPr>
           <w:p>
             <w:pPr/>
@@ -4541,7 +4541,7 @@
       <w:tr>
         <w:tc>
           <w:tcPr>
-            <w:tcW w:w="3120" w:type="dxa"/>
+            <w:tcW w:w="3116" w:type="dxa"/>
           </w:tcPr>
           <w:p>
             <w:pPr/>
@@ -4555,7 +4555,7 @@
         </w:tc>
         <w:tc>
           <w:tcPr>
-            <w:tcW w:w="3120" w:type="dxa"/>
+            <w:tcW w:w="1385" w:type="dxa"/>
           </w:tcPr>
           <w:p>
             <w:pPr/>
@@ -4566,7 +4566,7 @@
         </w:tc>
         <w:tc>
           <w:tcPr>
-            <w:tcW w:w="3120" w:type="dxa"/>
+            <w:tcW w:w="4859" w:type="dxa"/>
           </w:tcPr>
           <w:p>
             <w:pPr/>
@@ -4579,7 +4579,7 @@
       <w:tr>
         <w:tc>
           <w:tcPr>
-            <w:tcW w:w="3120" w:type="dxa"/>
+            <w:tcW w:w="3116" w:type="dxa"/>
           </w:tcPr>
           <w:p>
             <w:pPr/>
@@ -4593,7 +4593,7 @@
         </w:tc>
         <w:tc>
           <w:tcPr>
-            <w:tcW w:w="3120" w:type="dxa"/>
+            <w:tcW w:w="1385" w:type="dxa"/>
           </w:tcPr>
           <w:p>
             <w:pPr/>
@@ -4604,7 +4604,7 @@
         </w:tc>
         <w:tc>
           <w:tcPr>
-            <w:tcW w:w="3120" w:type="dxa"/>
+            <w:tcW w:w="4859" w:type="dxa"/>
           </w:tcPr>
           <w:p>
             <w:pPr/>
@@ -4617,7 +4617,7 @@
       <w:tr>
         <w:tc>
           <w:tcPr>
-            <w:tcW w:w="3120" w:type="dxa"/>
+            <w:tcW w:w="3116" w:type="dxa"/>
           </w:tcPr>
           <w:p>
             <w:pPr/>
@@ -4631,7 +4631,7 @@
         </w:tc>
         <w:tc>
           <w:tcPr>
-            <w:tcW w:w="3120" w:type="dxa"/>
+            <w:tcW w:w="1385" w:type="dxa"/>
           </w:tcPr>
           <w:p>
             <w:pPr/>
@@ -4642,7 +4642,7 @@
         </w:tc>
         <w:tc>
           <w:tcPr>
-            <w:tcW w:w="3120" w:type="dxa"/>
+            <w:tcW w:w="4859" w:type="dxa"/>
           </w:tcPr>
           <w:p>
             <w:pPr/>
@@ -4655,7 +4655,7 @@
       <w:tr>
         <w:tc>
           <w:tcPr>
-            <w:tcW w:w="3120" w:type="dxa"/>
+            <w:tcW w:w="3116" w:type="dxa"/>
           </w:tcPr>
           <w:p>
             <w:pPr/>
@@ -4669,7 +4669,7 @@
         </w:tc>
         <w:tc>
           <w:tcPr>
-            <w:tcW w:w="3120" w:type="dxa"/>
+            <w:tcW w:w="1385" w:type="dxa"/>
           </w:tcPr>
           <w:p>
             <w:pPr/>
@@ -4680,7 +4680,7 @@
         </w:tc>
         <w:tc>
           <w:tcPr>
-            <w:tcW w:w="3120" w:type="dxa"/>
+            <w:tcW w:w="4859" w:type="dxa"/>
           </w:tcPr>
           <w:p>
             <w:pPr/>
@@ -4693,7 +4693,7 @@
       <w:tr>
         <w:tc>
           <w:tcPr>
-            <w:tcW w:w="3120" w:type="dxa"/>
+            <w:tcW w:w="3116" w:type="dxa"/>
           </w:tcPr>
           <w:p>
             <w:pPr/>
@@ -4707,7 +4707,7 @@
         </w:tc>
         <w:tc>
           <w:tcPr>
-            <w:tcW w:w="3120" w:type="dxa"/>
+            <w:tcW w:w="1385" w:type="dxa"/>
           </w:tcPr>
           <w:p>
             <w:pPr/>
@@ -4718,7 +4718,7 @@
         </w:tc>
         <w:tc>
           <w:tcPr>
-            <w:tcW w:w="3120" w:type="dxa"/>
+            <w:tcW w:w="4859" w:type="dxa"/>
           </w:tcPr>
           <w:p>
             <w:pPr/>
@@ -4731,7 +4731,7 @@
       <w:tr>
         <w:tc>
           <w:tcPr>
-            <w:tcW w:w="3120" w:type="dxa"/>
+            <w:tcW w:w="3116" w:type="dxa"/>
           </w:tcPr>
           <w:p>
             <w:pPr/>
@@ -4745,7 +4745,7 @@
         </w:tc>
         <w:tc>
           <w:tcPr>
-            <w:tcW w:w="3120" w:type="dxa"/>
+            <w:tcW w:w="1385" w:type="dxa"/>
           </w:tcPr>
           <w:p>
             <w:pPr/>
@@ -4756,7 +4756,7 @@
         </w:tc>
         <w:tc>
           <w:tcPr>
-            <w:tcW w:w="3120" w:type="dxa"/>
+            <w:tcW w:w="4859" w:type="dxa"/>
           </w:tcPr>
           <w:p>
             <w:pPr/>
@@ -4769,7 +4769,7 @@
       <w:tr>
         <w:tc>
           <w:tcPr>
-            <w:tcW w:w="3120" w:type="dxa"/>
+            <w:tcW w:w="3116" w:type="dxa"/>
           </w:tcPr>
           <w:p>
             <w:pPr/>
@@ -4783,7 +4783,7 @@
         </w:tc>
         <w:tc>
           <w:tcPr>
-            <w:tcW w:w="3120" w:type="dxa"/>
+            <w:tcW w:w="1385" w:type="dxa"/>
           </w:tcPr>
           <w:p>
             <w:pPr/>
@@ -4794,7 +4794,7 @@
         </w:tc>
         <w:tc>
           <w:tcPr>
-            <w:tcW w:w="3120" w:type="dxa"/>
+            <w:tcW w:w="4859" w:type="dxa"/>
           </w:tcPr>
           <w:p>
             <w:pPr/>
@@ -4807,7 +4807,7 @@
       <w:tr>
         <w:tc>
           <w:tcPr>
-            <w:tcW w:w="3120" w:type="dxa"/>
+            <w:tcW w:w="3116" w:type="dxa"/>
           </w:tcPr>
           <w:p>
             <w:pPr/>
@@ -4821,7 +4821,7 @@
         </w:tc>
         <w:tc>
           <w:tcPr>
-            <w:tcW w:w="3120" w:type="dxa"/>
+            <w:tcW w:w="1385" w:type="dxa"/>
           </w:tcPr>
           <w:p>
             <w:pPr/>
@@ -4832,7 +4832,7 @@
         </w:tc>
         <w:tc>
           <w:tcPr>
-            <w:tcW w:w="3120" w:type="dxa"/>
+            <w:tcW w:w="4859" w:type="dxa"/>
           </w:tcPr>
           <w:p>
             <w:pPr/>
@@ -4874,8 +4874,8 @@
         <w:tblLook w:val="04A0" w:firstRow="1" w:lastRow="0" w:firstColumn="0" w:lastColumn="0" w:noHBand="0" w:noVBand="1"/>
       </w:tblPr>
       <w:tblGrid>
-        <w:gridCol w:w="4680"/>
-        <w:gridCol w:w="4680"/>
+        <w:gridCol w:w="4440"/>
+        <w:gridCol w:w="4920"/>
       </w:tblGrid>
       <w:tr>
         <w:trPr>
@@ -4883,7 +4883,7 @@
         </w:trPr>
         <w:tc>
           <w:tcPr>
-            <w:tcW w:w="4680" w:type="dxa"/>
+            <w:tcW w:w="4440" w:type="dxa"/>
             <w:shd w:val="clear" w:color="auto" w:fill="F2F2F2"/>
           </w:tcPr>
           <w:p>
@@ -4895,7 +4895,7 @@
         </w:tc>
         <w:tc>
           <w:tcPr>
-            <w:tcW w:w="4680" w:type="dxa"/>
+            <w:tcW w:w="4920" w:type="dxa"/>
             <w:shd w:val="clear" w:color="auto" w:fill="F2F2F2"/>
           </w:tcPr>
           <w:p>
@@ -4909,7 +4909,7 @@
       <w:tr>
         <w:tc>
           <w:tcPr>
-            <w:tcW w:w="4680" w:type="dxa"/>
+            <w:tcW w:w="4440" w:type="dxa"/>
           </w:tcPr>
           <w:p>
             <w:pPr/>
@@ -4920,7 +4920,7 @@
         </w:tc>
         <w:tc>
           <w:tcPr>
-            <w:tcW w:w="4680" w:type="dxa"/>
+            <w:tcW w:w="4920" w:type="dxa"/>
           </w:tcPr>
           <w:p>
             <w:pPr/>
@@ -4954,7 +4954,7 @@
       <w:tr>
         <w:tc>
           <w:tcPr>
-            <w:tcW w:w="4680" w:type="dxa"/>
+            <w:tcW w:w="4440" w:type="dxa"/>
           </w:tcPr>
           <w:p>
             <w:pPr/>
@@ -4965,7 +4965,7 @@
         </w:tc>
         <w:tc>
           <w:tcPr>
-            <w:tcW w:w="4680" w:type="dxa"/>
+            <w:tcW w:w="4920" w:type="dxa"/>
           </w:tcPr>
           <w:p>
             <w:pPr/>
@@ -4981,7 +4981,7 @@
       <w:tr>
         <w:tc>
           <w:tcPr>
-            <w:tcW w:w="4680" w:type="dxa"/>
+            <w:tcW w:w="4440" w:type="dxa"/>
           </w:tcPr>
           <w:p>
             <w:pPr/>
@@ -4992,7 +4992,7 @@
         </w:tc>
         <w:tc>
           <w:tcPr>
-            <w:tcW w:w="4680" w:type="dxa"/>
+            <w:tcW w:w="4920" w:type="dxa"/>
           </w:tcPr>
           <w:p>
             <w:pPr/>
@@ -5029,7 +5029,7 @@
       <w:tr>
         <w:tc>
           <w:tcPr>
-            <w:tcW w:w="4680" w:type="dxa"/>
+            <w:tcW w:w="4440" w:type="dxa"/>
           </w:tcPr>
           <w:p>
             <w:pPr/>
@@ -5040,7 +5040,7 @@
         </w:tc>
         <w:tc>
           <w:tcPr>
-            <w:tcW w:w="4680" w:type="dxa"/>
+            <w:tcW w:w="4920" w:type="dxa"/>
           </w:tcPr>
           <w:p>
             <w:pPr/>
@@ -5056,7 +5056,7 @@
       <w:tr>
         <w:tc>
           <w:tcPr>
-            <w:tcW w:w="4680" w:type="dxa"/>
+            <w:tcW w:w="4440" w:type="dxa"/>
           </w:tcPr>
           <w:p>
             <w:pPr/>
@@ -5067,7 +5067,7 @@
         </w:tc>
         <w:tc>
           <w:tcPr>
-            <w:tcW w:w="4680" w:type="dxa"/>
+            <w:tcW w:w="4920" w:type="dxa"/>
           </w:tcPr>
           <w:p>
             <w:pPr/>
@@ -5104,7 +5104,7 @@
       <w:tr>
         <w:tc>
           <w:tcPr>
-            <w:tcW w:w="4680" w:type="dxa"/>
+            <w:tcW w:w="4440" w:type="dxa"/>
           </w:tcPr>
           <w:p>
             <w:pPr/>
@@ -5115,7 +5115,7 @@
         </w:tc>
         <w:tc>
           <w:tcPr>
-            <w:tcW w:w="4680" w:type="dxa"/>
+            <w:tcW w:w="4920" w:type="dxa"/>
           </w:tcPr>
           <w:p>
             <w:pPr/>
@@ -5333,8 +5333,8 @@
         <w:tblLook w:val="04A0" w:firstRow="1" w:lastRow="0" w:firstColumn="0" w:lastColumn="0" w:noHBand="0" w:noVBand="1"/>
       </w:tblPr>
       <w:tblGrid>
-        <w:gridCol w:w="4680"/>
-        <w:gridCol w:w="4680"/>
+        <w:gridCol w:w="4920"/>
+        <w:gridCol w:w="4440"/>
       </w:tblGrid>
       <w:tr>
         <w:trPr>
@@ -5342,7 +5342,7 @@
         </w:trPr>
         <w:tc>
           <w:tcPr>
-            <w:tcW w:w="4680" w:type="dxa"/>
+            <w:tcW w:w="4920" w:type="dxa"/>
             <w:shd w:val="clear" w:color="auto" w:fill="F2F2F2"/>
           </w:tcPr>
           <w:p>
@@ -5354,7 +5354,7 @@
         </w:tc>
         <w:tc>
           <w:tcPr>
-            <w:tcW w:w="4680" w:type="dxa"/>
+            <w:tcW w:w="4440" w:type="dxa"/>
             <w:shd w:val="clear" w:color="auto" w:fill="F2F2F2"/>
           </w:tcPr>
           <w:p>
@@ -5368,7 +5368,7 @@
       <w:tr>
         <w:tc>
           <w:tcPr>
-            <w:tcW w:w="4680" w:type="dxa"/>
+            <w:tcW w:w="4920" w:type="dxa"/>
           </w:tcPr>
           <w:p>
             <w:pPr/>
@@ -5379,7 +5379,7 @@
         </w:tc>
         <w:tc>
           <w:tcPr>
-            <w:tcW w:w="4680" w:type="dxa"/>
+            <w:tcW w:w="4440" w:type="dxa"/>
           </w:tcPr>
           <w:p>
             <w:pPr/>
@@ -5392,7 +5392,7 @@
       <w:tr>
         <w:tc>
           <w:tcPr>
-            <w:tcW w:w="4680" w:type="dxa"/>
+            <w:tcW w:w="4920" w:type="dxa"/>
           </w:tcPr>
           <w:p>
             <w:pPr/>
@@ -5403,7 +5403,7 @@
         </w:tc>
         <w:tc>
           <w:tcPr>
-            <w:tcW w:w="4680" w:type="dxa"/>
+            <w:tcW w:w="4440" w:type="dxa"/>
           </w:tcPr>
           <w:p>
             <w:pPr/>
@@ -5416,7 +5416,7 @@
       <w:tr>
         <w:tc>
           <w:tcPr>
-            <w:tcW w:w="4680" w:type="dxa"/>
+            <w:tcW w:w="4920" w:type="dxa"/>
           </w:tcPr>
           <w:p>
             <w:pPr/>
@@ -5427,7 +5427,7 @@
         </w:tc>
         <w:tc>
           <w:tcPr>
-            <w:tcW w:w="4680" w:type="dxa"/>
+            <w:tcW w:w="4440" w:type="dxa"/>
           </w:tcPr>
           <w:p>
             <w:pPr/>
@@ -5440,7 +5440,7 @@
       <w:tr>
         <w:tc>
           <w:tcPr>
-            <w:tcW w:w="4680" w:type="dxa"/>
+            <w:tcW w:w="4920" w:type="dxa"/>
           </w:tcPr>
           <w:p>
             <w:pPr/>
@@ -5451,7 +5451,7 @@
         </w:tc>
         <w:tc>
           <w:tcPr>
-            <w:tcW w:w="4680" w:type="dxa"/>
+            <w:tcW w:w="4440" w:type="dxa"/>
           </w:tcPr>
           <w:p>
             <w:pPr/>
@@ -5464,7 +5464,7 @@
       <w:tr>
         <w:tc>
           <w:tcPr>
-            <w:tcW w:w="4680" w:type="dxa"/>
+            <w:tcW w:w="4920" w:type="dxa"/>
           </w:tcPr>
           <w:p>
             <w:pPr/>
@@ -5475,7 +5475,7 @@
         </w:tc>
         <w:tc>
           <w:tcPr>
-            <w:tcW w:w="4680" w:type="dxa"/>
+            <w:tcW w:w="4440" w:type="dxa"/>
           </w:tcPr>
           <w:p>
             <w:pPr/>
@@ -5488,7 +5488,7 @@
       <w:tr>
         <w:tc>
           <w:tcPr>
-            <w:tcW w:w="4680" w:type="dxa"/>
+            <w:tcW w:w="4920" w:type="dxa"/>
           </w:tcPr>
           <w:p>
             <w:pPr/>
@@ -5499,7 +5499,7 @@
         </w:tc>
         <w:tc>
           <w:tcPr>
-            <w:tcW w:w="4680" w:type="dxa"/>
+            <w:tcW w:w="4440" w:type="dxa"/>
           </w:tcPr>
           <w:p>
             <w:pPr/>
@@ -5512,7 +5512,7 @@
       <w:tr>
         <w:tc>
           <w:tcPr>
-            <w:tcW w:w="4680" w:type="dxa"/>
+            <w:tcW w:w="4920" w:type="dxa"/>
           </w:tcPr>
           <w:p>
             <w:pPr/>
@@ -5523,7 +5523,7 @@
         </w:tc>
         <w:tc>
           <w:tcPr>
-            <w:tcW w:w="4680" w:type="dxa"/>
+            <w:tcW w:w="4440" w:type="dxa"/>
           </w:tcPr>
           <w:p>
             <w:pPr/>
@@ -6301,8 +6301,8 @@
         <w:tblLook w:val="04A0" w:firstRow="1" w:lastRow="0" w:firstColumn="0" w:lastColumn="0" w:noHBand="0" w:noVBand="1"/>
       </w:tblPr>
       <w:tblGrid>
-        <w:gridCol w:w="4680"/>
-        <w:gridCol w:w="4680"/>
+        <w:gridCol w:w="1616"/>
+        <w:gridCol w:w="7743"/>
       </w:tblGrid>
       <w:tr>
         <w:trPr>
@@ -6310,7 +6310,7 @@
         </w:trPr>
         <w:tc>
           <w:tcPr>
-            <w:tcW w:w="4680" w:type="dxa"/>
+            <w:tcW w:w="1616" w:type="dxa"/>
             <w:shd w:val="clear" w:color="auto" w:fill="F2F2F2"/>
           </w:tcPr>
           <w:p>
@@ -6322,7 +6322,7 @@
         </w:tc>
         <w:tc>
           <w:tcPr>
-            <w:tcW w:w="4680" w:type="dxa"/>
+            <w:tcW w:w="7743" w:type="dxa"/>
             <w:shd w:val="clear" w:color="auto" w:fill="F2F2F2"/>
           </w:tcPr>
           <w:p>
@@ -6336,7 +6336,31 @@
       <w:tr>
         <w:tc>
           <w:tcPr>
-            <w:tcW w:w="4680" w:type="dxa"/>
+            <w:tcW w:w="1616" w:type="dxa"/>
+          </w:tcPr>
+          <w:p>
+            <w:pPr/>
+            <w:r>
+              <w:t xml:space="preserve">68</w:t>
+            </w:r>
+          </w:p>
+        </w:tc>
+        <w:tc>
+          <w:tcPr>
+            <w:tcW w:w="7743" w:type="dxa"/>
+          </w:tcPr>
+          <w:p>
+            <w:pPr/>
+            <w:r>
+              <w:t xml:space="preserve">SoundCloud profiles whose track list comes back empty are read from their All tab instead, and the Status column says when SoundCloud lists none for a profile that has tracks. app.check shows what each SoundCloud request returned.</w:t>
+            </w:r>
+          </w:p>
+        </w:tc>
+      </w:tr>
+      <w:tr>
+        <w:tc>
+          <w:tcPr>
+            <w:tcW w:w="1616" w:type="dxa"/>
           </w:tcPr>
           <w:p>
             <w:pPr/>
@@ -6347,7 +6371,7 @@
         </w:tc>
         <w:tc>
           <w:tcPr>
-            <w:tcW w:w="4680" w:type="dxa"/>
+            <w:tcW w:w="7743" w:type="dxa"/>
           </w:tcPr>
           <w:p>
             <w:pPr/>
@@ -6360,7 +6384,7 @@
       <w:tr>
         <w:tc>
           <w:tcPr>
-            <w:tcW w:w="4680" w:type="dxa"/>
+            <w:tcW w:w="1616" w:type="dxa"/>
           </w:tcPr>
           <w:p>
             <w:pPr/>
@@ -6371,7 +6395,7 @@
         </w:tc>
         <w:tc>
           <w:tcPr>
-            <w:tcW w:w="4680" w:type="dxa"/>
+            <w:tcW w:w="7743" w:type="dxa"/>
           </w:tcPr>
           <w:p>
             <w:pPr/>
@@ -6384,7 +6408,7 @@
       <w:tr>
         <w:tc>
           <w:tcPr>
-            <w:tcW w:w="4680" w:type="dxa"/>
+            <w:tcW w:w="1616" w:type="dxa"/>
           </w:tcPr>
           <w:p>
             <w:pPr/>
@@ -6395,7 +6419,7 @@
         </w:tc>
         <w:tc>
           <w:tcPr>
-            <w:tcW w:w="4680" w:type="dxa"/>
+            <w:tcW w:w="7743" w:type="dxa"/>
           </w:tcPr>
           <w:p>
             <w:pPr/>
@@ -6408,7 +6432,7 @@
       <w:tr>
         <w:tc>
           <w:tcPr>
-            <w:tcW w:w="4680" w:type="dxa"/>
+            <w:tcW w:w="1616" w:type="dxa"/>
           </w:tcPr>
           <w:p>
             <w:pPr/>
@@ -6419,7 +6443,7 @@
         </w:tc>
         <w:tc>
           <w:tcPr>
-            <w:tcW w:w="4680" w:type="dxa"/>
+            <w:tcW w:w="7743" w:type="dxa"/>
           </w:tcPr>
           <w:p>
             <w:pPr/>
@@ -6432,7 +6456,7 @@
       <w:tr>
         <w:tc>
           <w:tcPr>
-            <w:tcW w:w="4680" w:type="dxa"/>
+            <w:tcW w:w="1616" w:type="dxa"/>
           </w:tcPr>
           <w:p>
             <w:pPr/>
@@ -6443,7 +6467,7 @@
         </w:tc>
         <w:tc>
           <w:tcPr>
-            <w:tcW w:w="4680" w:type="dxa"/>
+            <w:tcW w:w="7743" w:type="dxa"/>
           </w:tcPr>
           <w:p>
             <w:pPr/>
@@ -6456,7 +6480,7 @@
       <w:tr>
         <w:tc>
           <w:tcPr>
-            <w:tcW w:w="4680" w:type="dxa"/>
+            <w:tcW w:w="1616" w:type="dxa"/>
           </w:tcPr>
           <w:p>
             <w:pPr/>
@@ -6467,7 +6491,7 @@
         </w:tc>
         <w:tc>
           <w:tcPr>
-            <w:tcW w:w="4680" w:type="dxa"/>
+            <w:tcW w:w="7743" w:type="dxa"/>
           </w:tcPr>
           <w:p>
             <w:pPr/>
@@ -6480,7 +6504,7 @@
       <w:tr>
         <w:tc>
           <w:tcPr>
-            <w:tcW w:w="4680" w:type="dxa"/>
+            <w:tcW w:w="1616" w:type="dxa"/>
           </w:tcPr>
           <w:p>
             <w:pPr/>
@@ -6491,7 +6515,7 @@
         </w:tc>
         <w:tc>
           <w:tcPr>
-            <w:tcW w:w="4680" w:type="dxa"/>
+            <w:tcW w:w="7743" w:type="dxa"/>
           </w:tcPr>
           <w:p>
             <w:pPr/>
@@ -6504,7 +6528,7 @@
       <w:tr>
         <w:tc>
           <w:tcPr>
-            <w:tcW w:w="4680" w:type="dxa"/>
+            <w:tcW w:w="1616" w:type="dxa"/>
           </w:tcPr>
           <w:p>
             <w:pPr/>
@@ -6515,7 +6539,7 @@
         </w:tc>
         <w:tc>
           <w:tcPr>
-            <w:tcW w:w="4680" w:type="dxa"/>
+            <w:tcW w:w="7743" w:type="dxa"/>
           </w:tcPr>
           <w:p>
             <w:pPr/>
@@ -6528,7 +6552,7 @@
       <w:tr>
         <w:tc>
           <w:tcPr>
-            <w:tcW w:w="4680" w:type="dxa"/>
+            <w:tcW w:w="1616" w:type="dxa"/>
           </w:tcPr>
           <w:p>
             <w:pPr/>
@@ -6539,7 +6563,7 @@
         </w:tc>
         <w:tc>
           <w:tcPr>
-            <w:tcW w:w="4680" w:type="dxa"/>
+            <w:tcW w:w="7743" w:type="dxa"/>
           </w:tcPr>
           <w:p>
             <w:pPr/>
@@ -6552,7 +6576,7 @@
       <w:tr>
         <w:tc>
           <w:tcPr>
-            <w:tcW w:w="4680" w:type="dxa"/>
+            <w:tcW w:w="1616" w:type="dxa"/>
           </w:tcPr>
           <w:p>
             <w:pPr/>
@@ -6563,7 +6587,7 @@
         </w:tc>
         <w:tc>
           <w:tcPr>
-            <w:tcW w:w="4680" w:type="dxa"/>
+            <w:tcW w:w="7743" w:type="dxa"/>
           </w:tcPr>
           <w:p>
             <w:pPr/>
@@ -6576,7 +6600,7 @@
       <w:tr>
         <w:tc>
           <w:tcPr>
-            <w:tcW w:w="4680" w:type="dxa"/>
+            <w:tcW w:w="1616" w:type="dxa"/>
           </w:tcPr>
           <w:p>
             <w:pPr/>
@@ -6587,7 +6611,7 @@
         </w:tc>
         <w:tc>
           <w:tcPr>
-            <w:tcW w:w="4680" w:type="dxa"/>
+            <w:tcW w:w="7743" w:type="dxa"/>
           </w:tcPr>
           <w:p>
             <w:pPr/>
@@ -6600,7 +6624,7 @@
       <w:tr>
         <w:tc>
           <w:tcPr>
-            <w:tcW w:w="4680" w:type="dxa"/>
+            <w:tcW w:w="1616" w:type="dxa"/>
           </w:tcPr>
           <w:p>
             <w:pPr/>
@@ -6611,7 +6635,7 @@
         </w:tc>
         <w:tc>
           <w:tcPr>
-            <w:tcW w:w="4680" w:type="dxa"/>
+            <w:tcW w:w="7743" w:type="dxa"/>
           </w:tcPr>
           <w:p>
             <w:pPr/>
@@ -6624,7 +6648,7 @@
       <w:tr>
         <w:tc>
           <w:tcPr>
-            <w:tcW w:w="4680" w:type="dxa"/>
+            <w:tcW w:w="1616" w:type="dxa"/>
           </w:tcPr>
           <w:p>
             <w:pPr/>
@@ -6635,7 +6659,7 @@
         </w:tc>
         <w:tc>
           <w:tcPr>
-            <w:tcW w:w="4680" w:type="dxa"/>
+            <w:tcW w:w="7743" w:type="dxa"/>
           </w:tcPr>
           <w:p>
             <w:pPr/>
@@ -6648,7 +6672,7 @@
       <w:tr>
         <w:tc>
           <w:tcPr>
-            <w:tcW w:w="4680" w:type="dxa"/>
+            <w:tcW w:w="1616" w:type="dxa"/>
           </w:tcPr>
           <w:p>
             <w:pPr/>
@@ -6659,7 +6683,7 @@
         </w:tc>
         <w:tc>
           <w:tcPr>
-            <w:tcW w:w="4680" w:type="dxa"/>
+            <w:tcW w:w="7743" w:type="dxa"/>
           </w:tcPr>
           <w:p>
             <w:pPr/>
@@ -6672,7 +6696,7 @@
       <w:tr>
         <w:tc>
           <w:tcPr>
-            <w:tcW w:w="4680" w:type="dxa"/>
+            <w:tcW w:w="1616" w:type="dxa"/>
           </w:tcPr>
           <w:p>
             <w:pPr/>
@@ -6683,7 +6707,7 @@
         </w:tc>
         <w:tc>
           <w:tcPr>
-            <w:tcW w:w="4680" w:type="dxa"/>
+            <w:tcW w:w="7743" w:type="dxa"/>
           </w:tcPr>
           <w:p>
             <w:pPr/>
@@ -6696,7 +6720,7 @@
       <w:tr>
         <w:tc>
           <w:tcPr>
-            <w:tcW w:w="4680" w:type="dxa"/>
+            <w:tcW w:w="1616" w:type="dxa"/>
           </w:tcPr>
           <w:p>
             <w:pPr/>
@@ -6707,7 +6731,7 @@
         </w:tc>
         <w:tc>
           <w:tcPr>
-            <w:tcW w:w="4680" w:type="dxa"/>
+            <w:tcW w:w="7743" w:type="dxa"/>
           </w:tcPr>
           <w:p>
             <w:pPr/>
@@ -6720,7 +6744,7 @@
       <w:tr>
         <w:tc>
           <w:tcPr>
-            <w:tcW w:w="4680" w:type="dxa"/>
+            <w:tcW w:w="1616" w:type="dxa"/>
           </w:tcPr>
           <w:p>
             <w:pPr/>
@@ -6731,7 +6755,7 @@
         </w:tc>
         <w:tc>
           <w:tcPr>
-            <w:tcW w:w="4680" w:type="dxa"/>
+            <w:tcW w:w="7743" w:type="dxa"/>
           </w:tcPr>
           <w:p>
             <w:pPr/>
@@ -6744,7 +6768,7 @@
       <w:tr>
         <w:tc>
           <w:tcPr>
-            <w:tcW w:w="4680" w:type="dxa"/>
+            <w:tcW w:w="1616" w:type="dxa"/>
           </w:tcPr>
           <w:p>
             <w:pPr/>
@@ -6755,7 +6779,7 @@
         </w:tc>
         <w:tc>
           <w:tcPr>
-            <w:tcW w:w="4680" w:type="dxa"/>
+            <w:tcW w:w="7743" w:type="dxa"/>
           </w:tcPr>
           <w:p>
             <w:pPr/>
@@ -6768,7 +6792,7 @@
       <w:tr>
         <w:tc>
           <w:tcPr>
-            <w:tcW w:w="4680" w:type="dxa"/>
+            <w:tcW w:w="1616" w:type="dxa"/>
           </w:tcPr>
           <w:p>
             <w:pPr/>
@@ -6779,7 +6803,7 @@
         </w:tc>
         <w:tc>
           <w:tcPr>
-            <w:tcW w:w="4680" w:type="dxa"/>
+            <w:tcW w:w="7743" w:type="dxa"/>
           </w:tcPr>
           <w:p>
             <w:pPr/>
@@ -6792,7 +6816,7 @@
       <w:tr>
         <w:tc>
           <w:tcPr>
-            <w:tcW w:w="4680" w:type="dxa"/>
+            <w:tcW w:w="1616" w:type="dxa"/>
           </w:tcPr>
           <w:p>
             <w:pPr/>
@@ -6803,7 +6827,7 @@
         </w:tc>
         <w:tc>
           <w:tcPr>
-            <w:tcW w:w="4680" w:type="dxa"/>
+            <w:tcW w:w="7743" w:type="dxa"/>
           </w:tcPr>
           <w:p>
             <w:pPr/>
@@ -6816,7 +6840,7 @@
       <w:tr>
         <w:tc>
           <w:tcPr>
-            <w:tcW w:w="4680" w:type="dxa"/>
+            <w:tcW w:w="1616" w:type="dxa"/>
           </w:tcPr>
           <w:p>
             <w:pPr/>
@@ -6827,7 +6851,7 @@
         </w:tc>
         <w:tc>
           <w:tcPr>
-            <w:tcW w:w="4680" w:type="dxa"/>
+            <w:tcW w:w="7743" w:type="dxa"/>
           </w:tcPr>
           <w:p>
             <w:pPr/>
@@ -6840,7 +6864,7 @@
       <w:tr>
         <w:tc>
           <w:tcPr>
-            <w:tcW w:w="4680" w:type="dxa"/>
+            <w:tcW w:w="1616" w:type="dxa"/>
           </w:tcPr>
           <w:p>
             <w:pPr/>
@@ -6851,7 +6875,7 @@
         </w:tc>
         <w:tc>
           <w:tcPr>
-            <w:tcW w:w="4680" w:type="dxa"/>
+            <w:tcW w:w="7743" w:type="dxa"/>
           </w:tcPr>
           <w:p>
             <w:pPr/>
@@ -6864,7 +6888,7 @@
       <w:tr>
         <w:tc>
           <w:tcPr>
-            <w:tcW w:w="4680" w:type="dxa"/>
+            <w:tcW w:w="1616" w:type="dxa"/>
           </w:tcPr>
           <w:p>
             <w:pPr/>
@@ -6875,7 +6899,7 @@
         </w:tc>
         <w:tc>
           <w:tcPr>
-            <w:tcW w:w="4680" w:type="dxa"/>
+            <w:tcW w:w="7743" w:type="dxa"/>
           </w:tcPr>
           <w:p>
             <w:pPr/>
@@ -6888,7 +6912,7 @@
       <w:tr>
         <w:tc>
           <w:tcPr>
-            <w:tcW w:w="4680" w:type="dxa"/>
+            <w:tcW w:w="1616" w:type="dxa"/>
           </w:tcPr>
           <w:p>
             <w:pPr/>
@@ -6899,7 +6923,7 @@
         </w:tc>
         <w:tc>
           <w:tcPr>
-            <w:tcW w:w="4680" w:type="dxa"/>
+            <w:tcW w:w="7743" w:type="dxa"/>
           </w:tcPr>
           <w:p>
             <w:pPr/>
@@ -6912,7 +6936,7 @@
       <w:tr>
         <w:tc>
           <w:tcPr>
-            <w:tcW w:w="4680" w:type="dxa"/>
+            <w:tcW w:w="1616" w:type="dxa"/>
           </w:tcPr>
           <w:p>
             <w:pPr/>
@@ -6923,7 +6947,7 @@
         </w:tc>
         <w:tc>
           <w:tcPr>
-            <w:tcW w:w="4680" w:type="dxa"/>
+            <w:tcW w:w="7743" w:type="dxa"/>
           </w:tcPr>
           <w:p>
             <w:pPr/>
@@ -6936,7 +6960,7 @@
       <w:tr>
         <w:tc>
           <w:tcPr>
-            <w:tcW w:w="4680" w:type="dxa"/>
+            <w:tcW w:w="1616" w:type="dxa"/>
           </w:tcPr>
           <w:p>
             <w:pPr/>
@@ -6947,7 +6971,7 @@
         </w:tc>
         <w:tc>
           <w:tcPr>
-            <w:tcW w:w="4680" w:type="dxa"/>
+            <w:tcW w:w="7743" w:type="dxa"/>
           </w:tcPr>
           <w:p>
             <w:pPr/>
@@ -6960,7 +6984,7 @@
       <w:tr>
         <w:tc>
           <w:tcPr>
-            <w:tcW w:w="4680" w:type="dxa"/>
+            <w:tcW w:w="1616" w:type="dxa"/>
           </w:tcPr>
           <w:p>
             <w:pPr/>
@@ -6971,7 +6995,7 @@
         </w:tc>
         <w:tc>
           <w:tcPr>
-            <w:tcW w:w="4680" w:type="dxa"/>
+            <w:tcW w:w="7743" w:type="dxa"/>
           </w:tcPr>
           <w:p>
             <w:pPr/>
@@ -6984,7 +7008,7 @@
       <w:tr>
         <w:tc>
           <w:tcPr>
-            <w:tcW w:w="4680" w:type="dxa"/>
+            <w:tcW w:w="1616" w:type="dxa"/>
           </w:tcPr>
           <w:p>
             <w:pPr/>
@@ -6995,7 +7019,7 @@
         </w:tc>
         <w:tc>
           <w:tcPr>
-            <w:tcW w:w="4680" w:type="dxa"/>
+            <w:tcW w:w="7743" w:type="dxa"/>
           </w:tcPr>
           <w:p>
             <w:pPr/>
@@ -7008,7 +7032,7 @@
       <w:tr>
         <w:tc>
           <w:tcPr>
-            <w:tcW w:w="4680" w:type="dxa"/>
+            <w:tcW w:w="1616" w:type="dxa"/>
           </w:tcPr>
           <w:p>
             <w:pPr/>
@@ -7019,7 +7043,7 @@
         </w:tc>
         <w:tc>
           <w:tcPr>
-            <w:tcW w:w="4680" w:type="dxa"/>
+            <w:tcW w:w="7743" w:type="dxa"/>
           </w:tcPr>
           <w:p>
             <w:pPr/>
@@ -7032,7 +7056,7 @@
       <w:tr>
         <w:tc>
           <w:tcPr>
-            <w:tcW w:w="4680" w:type="dxa"/>
+            <w:tcW w:w="1616" w:type="dxa"/>
           </w:tcPr>
           <w:p>
             <w:pPr/>
@@ -7043,7 +7067,7 @@
         </w:tc>
         <w:tc>
           <w:tcPr>
-            <w:tcW w:w="4680" w:type="dxa"/>
+            <w:tcW w:w="7743" w:type="dxa"/>
           </w:tcPr>
           <w:p>
             <w:pPr/>
@@ -7056,7 +7080,7 @@
       <w:tr>
         <w:tc>
           <w:tcPr>
-            <w:tcW w:w="4680" w:type="dxa"/>
+            <w:tcW w:w="1616" w:type="dxa"/>
           </w:tcPr>
           <w:p>
             <w:pPr/>
@@ -7067,7 +7091,7 @@
         </w:tc>
         <w:tc>
           <w:tcPr>
-            <w:tcW w:w="4680" w:type="dxa"/>
+            <w:tcW w:w="7743" w:type="dxa"/>
           </w:tcPr>
           <w:p>
             <w:pPr/>
@@ -7080,7 +7104,7 @@
       <w:tr>
         <w:tc>
           <w:tcPr>
-            <w:tcW w:w="4680" w:type="dxa"/>
+            <w:tcW w:w="1616" w:type="dxa"/>
           </w:tcPr>
           <w:p>
             <w:pPr/>
@@ -7091,7 +7115,7 @@
         </w:tc>
         <w:tc>
           <w:tcPr>
-            <w:tcW w:w="4680" w:type="dxa"/>
+            <w:tcW w:w="7743" w:type="dxa"/>
           </w:tcPr>
           <w:p>
             <w:pPr/>
@@ -7104,7 +7128,7 @@
       <w:tr>
         <w:tc>
           <w:tcPr>
-            <w:tcW w:w="4680" w:type="dxa"/>
+            <w:tcW w:w="1616" w:type="dxa"/>
           </w:tcPr>
           <w:p>
             <w:pPr/>
@@ -7115,7 +7139,7 @@
         </w:tc>
         <w:tc>
           <w:tcPr>
-            <w:tcW w:w="4680" w:type="dxa"/>
+            <w:tcW w:w="7743" w:type="dxa"/>
           </w:tcPr>
           <w:p>
             <w:pPr/>
@@ -7128,7 +7152,7 @@
       <w:tr>
         <w:tc>
           <w:tcPr>
-            <w:tcW w:w="4680" w:type="dxa"/>
+            <w:tcW w:w="1616" w:type="dxa"/>
           </w:tcPr>
           <w:p>
             <w:pPr/>
@@ -7139,7 +7163,7 @@
         </w:tc>
         <w:tc>
           <w:tcPr>
-            <w:tcW w:w="4680" w:type="dxa"/>
+            <w:tcW w:w="7743" w:type="dxa"/>
           </w:tcPr>
           <w:p>
             <w:pPr/>
@@ -7152,7 +7176,7 @@
       <w:tr>
         <w:tc>
           <w:tcPr>
-            <w:tcW w:w="4680" w:type="dxa"/>
+            <w:tcW w:w="1616" w:type="dxa"/>
           </w:tcPr>
           <w:p>
             <w:pPr/>
@@ -7163,7 +7187,7 @@
         </w:tc>
         <w:tc>
           <w:tcPr>
-            <w:tcW w:w="4680" w:type="dxa"/>
+            <w:tcW w:w="7743" w:type="dxa"/>
           </w:tcPr>
           <w:p>
             <w:pPr/>
@@ -7176,7 +7200,7 @@
       <w:tr>
         <w:tc>
           <w:tcPr>
-            <w:tcW w:w="4680" w:type="dxa"/>
+            <w:tcW w:w="1616" w:type="dxa"/>
           </w:tcPr>
           <w:p>
             <w:pPr/>
@@ -7187,7 +7211,7 @@
         </w:tc>
         <w:tc>
           <w:tcPr>
-            <w:tcW w:w="4680" w:type="dxa"/>
+            <w:tcW w:w="7743" w:type="dxa"/>
           </w:tcPr>
           <w:p>
             <w:pPr/>
@@ -7200,7 +7224,7 @@
       <w:tr>
         <w:tc>
           <w:tcPr>
-            <w:tcW w:w="4680" w:type="dxa"/>
+            <w:tcW w:w="1616" w:type="dxa"/>
           </w:tcPr>
           <w:p>
             <w:pPr/>
@@ -7211,7 +7235,7 @@
         </w:tc>
         <w:tc>
           <w:tcPr>
-            <w:tcW w:w="4680" w:type="dxa"/>
+            <w:tcW w:w="7743" w:type="dxa"/>
           </w:tcPr>
           <w:p>
             <w:pPr/>
@@ -7224,7 +7248,7 @@
       <w:tr>
         <w:tc>
           <w:tcPr>
-            <w:tcW w:w="4680" w:type="dxa"/>
+            <w:tcW w:w="1616" w:type="dxa"/>
           </w:tcPr>
           <w:p>
             <w:pPr/>
@@ -7235,7 +7259,7 @@
         </w:tc>
         <w:tc>
           <w:tcPr>
-            <w:tcW w:w="4680" w:type="dxa"/>
+            <w:tcW w:w="7743" w:type="dxa"/>
           </w:tcPr>
           <w:p>
             <w:pPr/>
@@ -7248,7 +7272,7 @@
       <w:tr>
         <w:tc>
           <w:tcPr>
-            <w:tcW w:w="4680" w:type="dxa"/>
+            <w:tcW w:w="1616" w:type="dxa"/>
           </w:tcPr>
           <w:p>
             <w:pPr/>
@@ -7259,7 +7283,7 @@
         </w:tc>
         <w:tc>
           <w:tcPr>
-            <w:tcW w:w="4680" w:type="dxa"/>
+            <w:tcW w:w="7743" w:type="dxa"/>
           </w:tcPr>
           <w:p>
             <w:pPr/>
@@ -7272,7 +7296,7 @@
       <w:tr>
         <w:tc>
           <w:tcPr>
-            <w:tcW w:w="4680" w:type="dxa"/>
+            <w:tcW w:w="1616" w:type="dxa"/>
           </w:tcPr>
           <w:p>
             <w:pPr/>
@@ -7283,7 +7307,7 @@
         </w:tc>
         <w:tc>
           <w:tcPr>
-            <w:tcW w:w="4680" w:type="dxa"/>
+            <w:tcW w:w="7743" w:type="dxa"/>
           </w:tcPr>
           <w:p>
             <w:pPr/>
@@ -7305,7 +7329,7 @@
       <w:tr>
         <w:tc>
           <w:tcPr>
-            <w:tcW w:w="4680" w:type="dxa"/>
+            <w:tcW w:w="1616" w:type="dxa"/>
           </w:tcPr>
           <w:p>
             <w:pPr/>
@@ -7316,7 +7340,7 @@
         </w:tc>
         <w:tc>
           <w:tcPr>
-            <w:tcW w:w="4680" w:type="dxa"/>
+            <w:tcW w:w="7743" w:type="dxa"/>
           </w:tcPr>
           <w:p>
             <w:pPr/>
@@ -7329,7 +7353,7 @@
       <w:tr>
         <w:tc>
           <w:tcPr>
-            <w:tcW w:w="4680" w:type="dxa"/>
+            <w:tcW w:w="1616" w:type="dxa"/>
           </w:tcPr>
           <w:p>
             <w:pPr/>
@@ -7340,7 +7364,7 @@
         </w:tc>
         <w:tc>
           <w:tcPr>
-            <w:tcW w:w="4680" w:type="dxa"/>
+            <w:tcW w:w="7743" w:type="dxa"/>
           </w:tcPr>
           <w:p>
             <w:pPr/>
@@ -7353,7 +7377,7 @@
       <w:tr>
         <w:tc>
           <w:tcPr>
-            <w:tcW w:w="4680" w:type="dxa"/>
+            <w:tcW w:w="1616" w:type="dxa"/>
           </w:tcPr>
           <w:p>
             <w:pPr/>
@@ -7364,7 +7388,7 @@
         </w:tc>
         <w:tc>
           <w:tcPr>
-            <w:tcW w:w="4680" w:type="dxa"/>
+            <w:tcW w:w="7743" w:type="dxa"/>
           </w:tcPr>
           <w:p>
             <w:pPr/>
@@ -7377,7 +7401,7 @@
       <w:tr>
         <w:tc>
           <w:tcPr>
-            <w:tcW w:w="4680" w:type="dxa"/>
+            <w:tcW w:w="1616" w:type="dxa"/>
           </w:tcPr>
           <w:p>
             <w:pPr/>
@@ -7388,7 +7412,7 @@
         </w:tc>
         <w:tc>
           <w:tcPr>
-            <w:tcW w:w="4680" w:type="dxa"/>
+            <w:tcW w:w="7743" w:type="dxa"/>
           </w:tcPr>
           <w:p>
             <w:pPr/>
@@ -7401,7 +7425,7 @@
       <w:tr>
         <w:tc>
           <w:tcPr>
-            <w:tcW w:w="4680" w:type="dxa"/>
+            <w:tcW w:w="1616" w:type="dxa"/>
           </w:tcPr>
           <w:p>
             <w:pPr/>
@@ -7412,7 +7436,7 @@
         </w:tc>
         <w:tc>
           <w:tcPr>
-            <w:tcW w:w="4680" w:type="dxa"/>
+            <w:tcW w:w="7743" w:type="dxa"/>
           </w:tcPr>
           <w:p>
             <w:pPr/>
@@ -7425,7 +7449,7 @@
       <w:tr>
         <w:tc>
           <w:tcPr>
-            <w:tcW w:w="4680" w:type="dxa"/>
+            <w:tcW w:w="1616" w:type="dxa"/>
           </w:tcPr>
           <w:p>
             <w:pPr/>
@@ -7436,7 +7460,7 @@
         </w:tc>
         <w:tc>
           <w:tcPr>
-            <w:tcW w:w="4680" w:type="dxa"/>
+            <w:tcW w:w="7743" w:type="dxa"/>
           </w:tcPr>
           <w:p>
             <w:pPr/>
@@ -7449,7 +7473,7 @@
       <w:tr>
         <w:tc>
           <w:tcPr>
-            <w:tcW w:w="4680" w:type="dxa"/>
+            <w:tcW w:w="1616" w:type="dxa"/>
           </w:tcPr>
           <w:p>
             <w:pPr/>
@@ -7460,7 +7484,7 @@
         </w:tc>
         <w:tc>
           <w:tcPr>
-            <w:tcW w:w="4680" w:type="dxa"/>
+            <w:tcW w:w="7743" w:type="dxa"/>
           </w:tcPr>
           <w:p>
             <w:pPr/>
@@ -7473,7 +7497,7 @@
       <w:tr>
         <w:tc>
           <w:tcPr>
-            <w:tcW w:w="4680" w:type="dxa"/>
+            <w:tcW w:w="1616" w:type="dxa"/>
           </w:tcPr>
           <w:p>
             <w:pPr/>
@@ -7484,7 +7508,7 @@
         </w:tc>
         <w:tc>
           <w:tcPr>
-            <w:tcW w:w="4680" w:type="dxa"/>
+            <w:tcW w:w="7743" w:type="dxa"/>
           </w:tcPr>
           <w:p>
             <w:pPr/>
@@ -7497,7 +7521,7 @@
       <w:tr>
         <w:tc>
           <w:tcPr>
-            <w:tcW w:w="4680" w:type="dxa"/>
+            <w:tcW w:w="1616" w:type="dxa"/>
           </w:tcPr>
           <w:p>
             <w:pPr/>
@@ -7508,7 +7532,7 @@
         </w:tc>
         <w:tc>
           <w:tcPr>
-            <w:tcW w:w="4680" w:type="dxa"/>
+            <w:tcW w:w="7743" w:type="dxa"/>
           </w:tcPr>
           <w:p>
             <w:pPr/>
@@ -7521,7 +7545,7 @@
       <w:tr>
         <w:tc>
           <w:tcPr>
-            <w:tcW w:w="4680" w:type="dxa"/>
+            <w:tcW w:w="1616" w:type="dxa"/>
           </w:tcPr>
           <w:p>
             <w:pPr/>
@@ -7532,7 +7556,7 @@
         </w:tc>
         <w:tc>
           <w:tcPr>
-            <w:tcW w:w="4680" w:type="dxa"/>
+            <w:tcW w:w="7743" w:type="dxa"/>
           </w:tcPr>
           <w:p>
             <w:pPr/>
@@ -7545,7 +7569,7 @@
       <w:tr>
         <w:tc>
           <w:tcPr>
-            <w:tcW w:w="4680" w:type="dxa"/>
+            <w:tcW w:w="1616" w:type="dxa"/>
           </w:tcPr>
           <w:p>
             <w:pPr/>
@@ -7556,7 +7580,7 @@
         </w:tc>
         <w:tc>
           <w:tcPr>
-            <w:tcW w:w="4680" w:type="dxa"/>
+            <w:tcW w:w="7743" w:type="dxa"/>
           </w:tcPr>
           <w:p>
             <w:pPr/>
@@ -7569,7 +7593,7 @@
       <w:tr>
         <w:tc>
           <w:tcPr>
-            <w:tcW w:w="4680" w:type="dxa"/>
+            <w:tcW w:w="1616" w:type="dxa"/>
           </w:tcPr>
           <w:p>
             <w:pPr/>
@@ -7580,7 +7604,7 @@
         </w:tc>
         <w:tc>
           <w:tcPr>
-            <w:tcW w:w="4680" w:type="dxa"/>
+            <w:tcW w:w="7743" w:type="dxa"/>
           </w:tcPr>
           <w:p>
             <w:pPr/>
@@ -7593,7 +7617,7 @@
       <w:tr>
         <w:tc>
           <w:tcPr>
-            <w:tcW w:w="4680" w:type="dxa"/>
+            <w:tcW w:w="1616" w:type="dxa"/>
           </w:tcPr>
           <w:p>
             <w:pPr/>
@@ -7604,7 +7628,7 @@
         </w:tc>
         <w:tc>
           <w:tcPr>
-            <w:tcW w:w="4680" w:type="dxa"/>
+            <w:tcW w:w="7743" w:type="dxa"/>
           </w:tcPr>
           <w:p>
             <w:pPr/>
@@ -7617,7 +7641,7 @@
       <w:tr>
         <w:tc>
           <w:tcPr>
-            <w:tcW w:w="4680" w:type="dxa"/>
+            <w:tcW w:w="1616" w:type="dxa"/>
           </w:tcPr>
           <w:p>
             <w:pPr/>
@@ -7628,7 +7652,7 @@
         </w:tc>
         <w:tc>
           <w:tcPr>
-            <w:tcW w:w="4680" w:type="dxa"/>
+            <w:tcW w:w="7743" w:type="dxa"/>
           </w:tcPr>
           <w:p>
             <w:pPr/>
@@ -7641,7 +7665,7 @@
       <w:tr>
         <w:tc>
           <w:tcPr>
-            <w:tcW w:w="4680" w:type="dxa"/>
+            <w:tcW w:w="1616" w:type="dxa"/>
           </w:tcPr>
           <w:p>
             <w:pPr/>
@@ -7652,7 +7676,7 @@
         </w:tc>
         <w:tc>
           <w:tcPr>
-            <w:tcW w:w="4680" w:type="dxa"/>
+            <w:tcW w:w="7743" w:type="dxa"/>
           </w:tcPr>
           <w:p>
             <w:pPr/>
@@ -7665,7 +7689,7 @@
       <w:tr>
         <w:tc>
           <w:tcPr>
-            <w:tcW w:w="4680" w:type="dxa"/>
+            <w:tcW w:w="1616" w:type="dxa"/>
           </w:tcPr>
           <w:p>
             <w:pPr/>
@@ -7676,7 +7700,7 @@
         </w:tc>
         <w:tc>
           <w:tcPr>
-            <w:tcW w:w="4680" w:type="dxa"/>
+            <w:tcW w:w="7743" w:type="dxa"/>
           </w:tcPr>
           <w:p>
             <w:pPr/>
@@ -7689,7 +7713,7 @@
       <w:tr>
         <w:tc>
           <w:tcPr>
-            <w:tcW w:w="4680" w:type="dxa"/>
+            <w:tcW w:w="1616" w:type="dxa"/>
           </w:tcPr>
           <w:p>
             <w:pPr/>
@@ -7700,7 +7724,7 @@
         </w:tc>
         <w:tc>
           <w:tcPr>
-            <w:tcW w:w="4680" w:type="dxa"/>
+            <w:tcW w:w="7743" w:type="dxa"/>
           </w:tcPr>
           <w:p>
             <w:pPr/>
@@ -7713,7 +7737,7 @@
       <w:tr>
         <w:tc>
           <w:tcPr>
-            <w:tcW w:w="4680" w:type="dxa"/>
+            <w:tcW w:w="1616" w:type="dxa"/>
           </w:tcPr>
           <w:p>
             <w:pPr/>
@@ -7724,7 +7748,7 @@
         </w:tc>
         <w:tc>
           <w:tcPr>
-            <w:tcW w:w="4680" w:type="dxa"/>
+            <w:tcW w:w="7743" w:type="dxa"/>
           </w:tcPr>
           <w:p>
             <w:pPr/>
@@ -7737,7 +7761,7 @@
       <w:tr>
         <w:tc>
           <w:tcPr>
-            <w:tcW w:w="4680" w:type="dxa"/>
+            <w:tcW w:w="1616" w:type="dxa"/>
           </w:tcPr>
           <w:p>
             <w:pPr/>
@@ -7748,7 +7772,7 @@
         </w:tc>
         <w:tc>
           <w:tcPr>
-            <w:tcW w:w="4680" w:type="dxa"/>
+            <w:tcW w:w="7743" w:type="dxa"/>
           </w:tcPr>
           <w:p>
             <w:pPr/>
@@ -7761,7 +7785,7 @@
       <w:tr>
         <w:tc>
           <w:tcPr>
-            <w:tcW w:w="4680" w:type="dxa"/>
+            <w:tcW w:w="1616" w:type="dxa"/>
           </w:tcPr>
           <w:p>
             <w:pPr/>
@@ -7772,7 +7796,7 @@
         </w:tc>
         <w:tc>
           <w:tcPr>
-            <w:tcW w:w="4680" w:type="dxa"/>
+            <w:tcW w:w="7743" w:type="dxa"/>
           </w:tcPr>
           <w:p>
             <w:pPr/>
@@ -7785,7 +7809,7 @@
       <w:tr>
         <w:tc>
           <w:tcPr>
-            <w:tcW w:w="4680" w:type="dxa"/>
+            <w:tcW w:w="1616" w:type="dxa"/>
           </w:tcPr>
           <w:p>
             <w:pPr/>
@@ -7796,7 +7820,7 @@
         </w:tc>
         <w:tc>
           <w:tcPr>
-            <w:tcW w:w="4680" w:type="dxa"/>
+            <w:tcW w:w="7743" w:type="dxa"/>
           </w:tcPr>
           <w:p>
             <w:pPr/>
@@ -7809,7 +7833,7 @@
       <w:tr>
         <w:tc>
           <w:tcPr>
-            <w:tcW w:w="4680" w:type="dxa"/>
+            <w:tcW w:w="1616" w:type="dxa"/>
           </w:tcPr>
           <w:p>
             <w:pPr/>
@@ -7820,7 +7844,7 @@
         </w:tc>
         <w:tc>
           <w:tcPr>
-            <w:tcW w:w="4680" w:type="dxa"/>
+            <w:tcW w:w="7743" w:type="dxa"/>
           </w:tcPr>
           <w:p>
             <w:pPr/>
@@ -7833,7 +7857,7 @@
       <w:tr>
         <w:tc>
           <w:tcPr>
-            <w:tcW w:w="4680" w:type="dxa"/>
+            <w:tcW w:w="1616" w:type="dxa"/>
           </w:tcPr>
           <w:p>
             <w:pPr/>
@@ -7844,7 +7868,7 @@
         </w:tc>
         <w:tc>
           <w:tcPr>
-            <w:tcW w:w="4680" w:type="dxa"/>
+            <w:tcW w:w="7743" w:type="dxa"/>
           </w:tcPr>
           <w:p>
             <w:pPr/>
@@ -7857,7 +7881,7 @@
       <w:tr>
         <w:tc>
           <w:tcPr>
-            <w:tcW w:w="4680" w:type="dxa"/>
+            <w:tcW w:w="1616" w:type="dxa"/>
           </w:tcPr>
           <w:p>
             <w:pPr/>
@@ -7868,7 +7892,7 @@
         </w:tc>
         <w:tc>
           <w:tcPr>
-            <w:tcW w:w="4680" w:type="dxa"/>
+            <w:tcW w:w="7743" w:type="dxa"/>
           </w:tcPr>
           <w:p>
             <w:pPr/>
@@ -7881,7 +7905,7 @@
       <w:tr>
         <w:tc>
           <w:tcPr>
-            <w:tcW w:w="4680" w:type="dxa"/>
+            <w:tcW w:w="1616" w:type="dxa"/>
           </w:tcPr>
           <w:p>
             <w:pPr/>
@@ -7892,7 +7916,7 @@
         </w:tc>
         <w:tc>
           <w:tcPr>
-            <w:tcW w:w="4680" w:type="dxa"/>
+            <w:tcW w:w="7743" w:type="dxa"/>
           </w:tcPr>
           <w:p>
             <w:pPr/>
@@ -7905,7 +7929,7 @@
       <w:tr>
         <w:tc>
           <w:tcPr>
-            <w:tcW w:w="4680" w:type="dxa"/>
+            <w:tcW w:w="1616" w:type="dxa"/>
           </w:tcPr>
           <w:p>
             <w:pPr/>
@@ -7916,7 +7940,7 @@
         </w:tc>
         <w:tc>
           <w:tcPr>
-            <w:tcW w:w="4680" w:type="dxa"/>
+            <w:tcW w:w="7743" w:type="dxa"/>
           </w:tcPr>
           <w:p>
             <w:pPr/>
@@ -7929,7 +7953,7 @@
       <w:tr>
         <w:tc>
           <w:tcPr>
-            <w:tcW w:w="4680" w:type="dxa"/>
+            <w:tcW w:w="1616" w:type="dxa"/>
           </w:tcPr>
           <w:p>
             <w:pPr/>
@@ -7940,7 +7964,7 @@
         </w:tc>
         <w:tc>
           <w:tcPr>
-            <w:tcW w:w="4680" w:type="dxa"/>
+            <w:tcW w:w="7743" w:type="dxa"/>
           </w:tcPr>
           <w:p>
             <w:pPr/>

</xml_diff>

<commit_message>
v69: Check now in Tracked Artists reads one artist's pages straight away; checkboxes centred in their rows.
Co-Authored-By: Claude Opus 5.5 <noreply@anthropic.com>
Claude-Session: https://claude.ai/code/session_01Xj1HuHJX1zYNh76RWBnCyx
</commit_message>
<xml_diff>
--- a/docs/Artist Feed User Guide.docx
+++ b/docs/Artist Feed User Guide.docx
@@ -33,7 +33,7 @@
     <w:p>
       <w:pPr/>
       <w:r>
-        <w:t xml:space="preserve">This guide describes Artist Feed version 68. The version number is shown in small grey text beside the title at the top of the app.</w:t>
+        <w:t xml:space="preserve">This guide describes Artist Feed version 69. The version number is shown in small grey text beside the title at the top of the app.</w:t>
       </w:r>
     </w:p>
     <w:p>
@@ -2195,7 +2195,16 @@
     <w:p>
       <w:pPr/>
       <w:r>
-        <w:t xml:space="preserve">The Status column shows how many posts each artist has, and any problem reading one of their pages.</w:t>
+        <w:t xml:space="preserve">The Status column shows how many posts each artist has, and any problem reading one of their pages. Click </w:t>
+      </w:r>
+      <w:r>
+        <w:rPr>
+          <w:b/>
+        </w:rPr>
+        <w:t xml:space="preserve">Check now</w:t>
+      </w:r>
+      <w:r>
+        <w:t xml:space="preserve"> beside the count to read that artist's pages straight away, without waiting for the next refresh or refreshing everyone; the count and any problems update when it finishes.</w:t>
       </w:r>
     </w:p>
     <w:p>
@@ -6329,6 +6338,30 @@
             <w:pPr/>
             <w:r>
               <w:t xml:space="preserve">What changed</w:t>
+            </w:r>
+          </w:p>
+        </w:tc>
+      </w:tr>
+      <w:tr>
+        <w:tc>
+          <w:tcPr>
+            <w:tcW w:w="1616" w:type="dxa"/>
+          </w:tcPr>
+          <w:p>
+            <w:pPr/>
+            <w:r>
+              <w:t xml:space="preserve">69</w:t>
+            </w:r>
+          </w:p>
+        </w:tc>
+        <w:tc>
+          <w:tcPr>
+            <w:tcW w:w="7743" w:type="dxa"/>
+          </w:tcPr>
+          <w:p>
+            <w:pPr/>
+            <w:r>
+              <w:t xml:space="preserve">Check now in the Status column of Tracked Artists reads one artist's pages straight away. The Focus, YouTube search and Rescan checkboxes sit centred in their rows.</w:t>
             </w:r>
           </w:p>
         </w:tc>

</xml_diff>

<commit_message>
v70: SoundCloud profiles whose track list comes back short are filled in from further pages and the All tab.
Co-Authored-By: Claude Opus 5.5 <noreply@anthropic.com>
Claude-Session: https://claude.ai/code/session_01Xj1HuHJX1zYNh76RWBnCyx
</commit_message>
<xml_diff>
--- a/docs/Artist Feed User Guide.docx
+++ b/docs/Artist Feed User Guide.docx
@@ -33,7 +33,7 @@
     <w:p>
       <w:pPr/>
       <w:r>
-        <w:t xml:space="preserve">This guide describes Artist Feed version 69. The version number is shown in small grey text beside the title at the top of the app.</w:t>
+        <w:t xml:space="preserve">This guide describes Artist Feed version 70. The version number is shown in small grey text beside the title at the top of the app.</w:t>
       </w:r>
     </w:p>
     <w:p>
@@ -3310,7 +3310,7 @@
     <w:p>
       <w:pPr/>
       <w:r>
-        <w:t xml:space="preserve">SoundCloud's RSS feeds are empty for most musicians, so the app uses the same data endpoints the soundcloud.com website calls. They need a public key that is embedded in the site's own code. The app finds that key itself and replaces it when it expires. Only an artist's own uploads are read, not reposts. SoundCloud sometimes sends back an empty track list for a profile that has tracks. When that happens the app also reads the profile's All tab, keeping only the artist's own uploads. If that comes back empty too while SoundCloud says the profile has tracks, the row's Status says so, and the app tries again on the next refresh. To see what SoundCloud returns for one profile, run docker compose exec artist-feed python -m app.check soundcloud username: it lists the tracks found and what each request returned.</w:t>
+        <w:t xml:space="preserve">SoundCloud's RSS feeds are empty for most musicians, so the app uses the same data endpoints the soundcloud.com website calls. They need a public key that is embedded in the site's own code. The app finds that key itself and replaces it when it expires. Only an artist's own uploads are read, not reposts. SoundCloud's track list sometimes leaves tracks out, coming back short or empty for a profile that has more. When that happens the app reads further pages of the list, then the profile's All tab, keeping only the artist's own uploads, until it has the 30 most recent. If that comes back empty too while SoundCloud says the profile has tracks, the row's Status says so, and the app tries again on the next refresh. To see what SoundCloud returns for one profile, run docker compose exec artist-feed python -m app.check soundcloud username: it lists the tracks found and what each request returned.</w:t>
       </w:r>
     </w:p>
     <w:p>
@@ -6338,6 +6338,30 @@
             <w:pPr/>
             <w:r>
               <w:t xml:space="preserve">What changed</w:t>
+            </w:r>
+          </w:p>
+        </w:tc>
+      </w:tr>
+      <w:tr>
+        <w:tc>
+          <w:tcPr>
+            <w:tcW w:w="1616" w:type="dxa"/>
+          </w:tcPr>
+          <w:p>
+            <w:pPr/>
+            <w:r>
+              <w:t xml:space="preserve">70</w:t>
+            </w:r>
+          </w:p>
+        </w:tc>
+        <w:tc>
+          <w:tcPr>
+            <w:tcW w:w="7743" w:type="dxa"/>
+          </w:tcPr>
+          <w:p>
+            <w:pPr/>
+            <w:r>
+              <w:t xml:space="preserve">SoundCloud profiles whose track list comes back short (not only empty) are filled in from further pages and the All tab, up to the 30 most recent uploads.</w:t>
             </w:r>
           </w:p>
         </w:tc>

</xml_diff>

<commit_message>
v71: SoundCloud tracks listed only by number are looked up instead of dropped.
Co-Authored-By: Claude Opus 5.5 <noreply@anthropic.com>
Claude-Session: https://claude.ai/code/session_01Xj1HuHJX1zYNh76RWBnCyx
</commit_message>
<xml_diff>
--- a/docs/Artist Feed User Guide.docx
+++ b/docs/Artist Feed User Guide.docx
@@ -33,7 +33,7 @@
     <w:p>
       <w:pPr/>
       <w:r>
-        <w:t xml:space="preserve">This guide describes Artist Feed version 70. The version number is shown in small grey text beside the title at the top of the app.</w:t>
+        <w:t xml:space="preserve">This guide describes Artist Feed version 71. The version number is shown in small grey text beside the title at the top of the app.</w:t>
       </w:r>
     </w:p>
     <w:p>
@@ -3310,7 +3310,7 @@
     <w:p>
       <w:pPr/>
       <w:r>
-        <w:t xml:space="preserve">SoundCloud's RSS feeds are empty for most musicians, so the app uses the same data endpoints the soundcloud.com website calls. They need a public key that is embedded in the site's own code. The app finds that key itself and replaces it when it expires. Only an artist's own uploads are read, not reposts. SoundCloud's track list sometimes leaves tracks out, coming back short or empty for a profile that has more. When that happens the app reads further pages of the list, then the profile's All tab, keeping only the artist's own uploads, until it has the 30 most recent. If that comes back empty too while SoundCloud says the profile has tracks, the row's Status says so, and the app tries again on the next refresh. To see what SoundCloud returns for one profile, run docker compose exec artist-feed python -m app.check soundcloud username: it lists the tracks found and what each request returned.</w:t>
+        <w:t xml:space="preserve">SoundCloud's RSS feeds are empty for most musicians, so the app uses the same data endpoints the soundcloud.com website calls. They need a public key that is embedded in the site's own code. The app finds that key itself and replaces it when it expires. Only an artist's own uploads are read, not reposts. SoundCloud's track list sometimes leaves tracks out, coming back short or empty for a profile that has more. When that happens the app reads further pages of the list, then the profile's All tab, keeping only the artist's own uploads, until it has the 30 most recent. SoundCloud also sometimes lists a track as just its number, with no title or link (most often older tracks); the app looks those up so they aren't dropped. If that comes back empty too while SoundCloud says the profile has tracks, the row's Status says so, and the app tries again on the next refresh. To see what SoundCloud returns for one profile, run docker compose exec artist-feed python -m app.check soundcloud username: it lists the tracks found and what each request returned.</w:t>
       </w:r>
     </w:p>
     <w:p>
@@ -6338,6 +6338,30 @@
             <w:pPr/>
             <w:r>
               <w:t xml:space="preserve">What changed</w:t>
+            </w:r>
+          </w:p>
+        </w:tc>
+      </w:tr>
+      <w:tr>
+        <w:tc>
+          <w:tcPr>
+            <w:tcW w:w="1616" w:type="dxa"/>
+          </w:tcPr>
+          <w:p>
+            <w:pPr/>
+            <w:r>
+              <w:t xml:space="preserve">71</w:t>
+            </w:r>
+          </w:p>
+        </w:tc>
+        <w:tc>
+          <w:tcPr>
+            <w:tcW w:w="7743" w:type="dxa"/>
+          </w:tcPr>
+          <w:p>
+            <w:pPr/>
+            <w:r>
+              <w:t xml:space="preserve">SoundCloud tracks listed only by number (no title or link) are looked up instead of dropped; app.check reports how many there were.</w:t>
             </w:r>
           </w:p>
         </w:tc>

</xml_diff>

<commit_message>
v72: SoundCloud: follow empty track-list pages further, count reposts of own tracks, fall back to Popular tracks; fuller app.check trace.
Co-Authored-By: Claude Opus 5.5 <noreply@anthropic.com>
Claude-Session: https://claude.ai/code/session_01Xj1HuHJX1zYNh76RWBnCyx
</commit_message>
<xml_diff>
--- a/docs/Artist Feed User Guide.docx
+++ b/docs/Artist Feed User Guide.docx
@@ -33,7 +33,7 @@
     <w:p>
       <w:pPr/>
       <w:r>
-        <w:t xml:space="preserve">This guide describes Artist Feed version 71. The version number is shown in small grey text beside the title at the top of the app.</w:t>
+        <w:t xml:space="preserve">This guide describes Artist Feed version 72. The version number is shown in small grey text beside the title at the top of the app.</w:t>
       </w:r>
     </w:p>
     <w:p>
@@ -3310,7 +3310,7 @@
     <w:p>
       <w:pPr/>
       <w:r>
-        <w:t xml:space="preserve">SoundCloud's RSS feeds are empty for most musicians, so the app uses the same data endpoints the soundcloud.com website calls. They need a public key that is embedded in the site's own code. The app finds that key itself and replaces it when it expires. Only an artist's own uploads are read, not reposts. SoundCloud's track list sometimes leaves tracks out, coming back short or empty for a profile that has more. When that happens the app reads further pages of the list, then the profile's All tab, keeping only the artist's own uploads, until it has the 30 most recent. SoundCloud also sometimes lists a track as just its number, with no title or link (most often older tracks); the app looks those up so they aren't dropped. If that comes back empty too while SoundCloud says the profile has tracks, the row's Status says so, and the app tries again on the next refresh. To see what SoundCloud returns for one profile, run docker compose exec artist-feed python -m app.check soundcloud username: it lists the tracks found and what each request returned.</w:t>
+        <w:t xml:space="preserve">SoundCloud's RSS feeds are empty for most musicians, so the app uses the same data endpoints the soundcloud.com website calls. They need a public key that is embedded in the site's own code. The app finds that key itself and replaces it when it expires. Only an artist's own uploads are read, not reposts. SoundCloud's track list sometimes leaves tracks out, coming back short or empty for a profile that has more. When that happens the app reads further pages of the list (up to 25 when they come back empty), then the profile's All tab and its Popular tracks tab, keeping only the artist's own uploads, until it has 30. SoundCloud also sometimes lists a track as just its number, with no title or link (most often older tracks); the app looks those up so they aren't dropped. If that comes back empty too while SoundCloud says the profile has tracks, the row's Status says so, and the app tries again on the next refresh. To see what SoundCloud returns for one profile, run docker compose exec artist-feed python -m app.check soundcloud username: it lists the tracks found and what each request returned.</w:t>
       </w:r>
     </w:p>
     <w:p>
@@ -6338,6 +6338,30 @@
             <w:pPr/>
             <w:r>
               <w:t xml:space="preserve">What changed</w:t>
+            </w:r>
+          </w:p>
+        </w:tc>
+      </w:tr>
+      <w:tr>
+        <w:tc>
+          <w:tcPr>
+            <w:tcW w:w="1616" w:type="dxa"/>
+          </w:tcPr>
+          <w:p>
+            <w:pPr/>
+            <w:r>
+              <w:t xml:space="preserve">72</w:t>
+            </w:r>
+          </w:p>
+        </w:tc>
+        <w:tc>
+          <w:tcPr>
+            <w:tcW w:w="7743" w:type="dxa"/>
+          </w:tcPr>
+          <w:p>
+            <w:pPr/>
+            <w:r>
+              <w:t xml:space="preserve">SoundCloud: empty track-list pages are followed further, reposts of an artist's own tracks count, and the Popular tracks tab is read as a last resort. app.check shows where each next page starts and what the All tab held.</w:t>
             </w:r>
           </w:p>
         </w:tc>

</xml_diff>

<commit_message>
v73: SoundCloud extra reading stops at saved tracks and skips the All/Popular tabs when the list was complete.
Co-Authored-By: Claude Opus 5.5 <noreply@anthropic.com>
Claude-Session: https://claude.ai/code/session_01Xj1HuHJX1zYNh76RWBnCyx
</commit_message>
<xml_diff>
--- a/docs/Artist Feed User Guide.docx
+++ b/docs/Artist Feed User Guide.docx
@@ -33,7 +33,7 @@
     <w:p>
       <w:pPr/>
       <w:r>
-        <w:t xml:space="preserve">This guide describes Artist Feed version 72. The version number is shown in small grey text beside the title at the top of the app.</w:t>
+        <w:t xml:space="preserve">This guide describes Artist Feed version 73. The version number is shown in small grey text beside the title at the top of the app.</w:t>
       </w:r>
     </w:p>
     <w:p>
@@ -3310,7 +3310,7 @@
     <w:p>
       <w:pPr/>
       <w:r>
-        <w:t xml:space="preserve">SoundCloud's RSS feeds are empty for most musicians, so the app uses the same data endpoints the soundcloud.com website calls. They need a public key that is embedded in the site's own code. The app finds that key itself and replaces it when it expires. Only an artist's own uploads are read, not reposts. SoundCloud's track list sometimes leaves tracks out, coming back short or empty for a profile that has more. When that happens the app reads further pages of the list (up to 25 when they come back empty), then the profile's All tab and its Popular tracks tab, keeping only the artist's own uploads, until it has 30. SoundCloud also sometimes lists a track as just its number, with no title or link (most often older tracks); the app looks those up so they aren't dropped. If that comes back empty too while SoundCloud says the profile has tracks, the row's Status says so, and the app tries again on the next refresh. To see what SoundCloud returns for one profile, run docker compose exec artist-feed python -m app.check soundcloud username: it lists the tracks found and what each request returned.</w:t>
+        <w:t xml:space="preserve">SoundCloud's RSS feeds are empty for most musicians, so the app uses the same data endpoints the soundcloud.com website calls. They need a public key that is embedded in the site's own code. The app finds that key itself and replaces it when it expires. Only an artist's own uploads are read, not reposts. SoundCloud's track list sometimes leaves tracks out, coming back short or empty for a profile that has more. When that happens the app reads further pages of the list (up to 25 when they come back empty), then the profile's All tab and its Popular tracks tab, keeping only the artist's own uploads, until it has 30. This extra reading happens only for profiles whose list comes back short: it stops as soon as it reaches tracks already saved, and the All and Popular tabs are skipped when the whole list was read and holds every track the profile shows. SoundCloud also sometimes lists a track as just its number, with no title or link (most often older tracks); the app looks those up so they aren't dropped. If that comes back empty too while SoundCloud says the profile has tracks, the row's Status says so, and the app tries again on the next refresh. To see what SoundCloud returns for one profile, run docker compose exec artist-feed python -m app.check soundcloud username: it lists the tracks found and what each request returned.</w:t>
       </w:r>
     </w:p>
     <w:p>
@@ -6338,6 +6338,30 @@
             <w:pPr/>
             <w:r>
               <w:t xml:space="preserve">What changed</w:t>
+            </w:r>
+          </w:p>
+        </w:tc>
+      </w:tr>
+      <w:tr>
+        <w:tc>
+          <w:tcPr>
+            <w:tcW w:w="1616" w:type="dxa"/>
+          </w:tcPr>
+          <w:p>
+            <w:pPr/>
+            <w:r>
+              <w:t xml:space="preserve">73</w:t>
+            </w:r>
+          </w:p>
+        </w:tc>
+        <w:tc>
+          <w:tcPr>
+            <w:tcW w:w="7743" w:type="dxa"/>
+          </w:tcPr>
+          <w:p>
+            <w:pPr/>
+            <w:r>
+              <w:t xml:space="preserve">SoundCloud's extra reading stops at tracks already saved, and skips the All and Popular tabs when the track list was complete, so later refreshes of quiet profiles take a few requests instead of twenty.</w:t>
             </w:r>
           </w:p>
         </w:tc>

</xml_diff>

<commit_message>
v74: List view: + beside SoundCloud tracks opens their related tracks (3, then 5 more per click), fetched only on click.
Co-Authored-By: Claude Opus 5.5 <noreply@anthropic.com>
Claude-Session: https://claude.ai/code/session_01Xj1HuHJX1zYNh76RWBnCyx
</commit_message>
<xml_diff>
--- a/docs/Artist Feed User Guide.docx
+++ b/docs/Artist Feed User Guide.docx
@@ -33,7 +33,7 @@
     <w:p>
       <w:pPr/>
       <w:r>
-        <w:t xml:space="preserve">This guide describes Artist Feed version 73. The version number is shown in small grey text beside the title at the top of the app.</w:t>
+        <w:t xml:space="preserve">This guide describes Artist Feed version 74. The version number is shown in small grey text beside the title at the top of the app.</w:t>
       </w:r>
     </w:p>
     <w:p>
@@ -1542,6 +1542,42 @@
       </w:r>
       <w:r>
         <w:t xml:space="preserve"> (List view only, beside Refresh Feed at the start of the filter row) downloads a CSV of every row that matches the current filters, in the current sort order, not just the rows on screen.</w:t>
+      </w:r>
+    </w:p>
+    <w:p>
+      <w:pPr>
+        <w:pStyle w:val="ListParagraph"/>
+        <w:numPr>
+          <w:ilvl w:val="0"/>
+          <w:numId w:val="10"/>
+        </w:numPr>
+      </w:pPr>
+      <w:r>
+        <w:rPr>
+          <w:b/>
+        </w:rPr>
+        <w:t xml:space="preserve">Related tracks</w:t>
+      </w:r>
+      <w:r>
+        <w:t xml:space="preserve"> (SoundCloud rows only): click </w:t>
+      </w:r>
+      <w:r>
+        <w:rPr>
+          <w:b/>
+        </w:rPr>
+        <w:t xml:space="preserve">+</w:t>
+      </w:r>
+      <w:r>
+        <w:t xml:space="preserve"> beside a SoundCloud track to open, under it, the first three tracks SoundCloud lists as related to it, with their artist, track, duration and posted date. </w:t>
+      </w:r>
+      <w:r>
+        <w:rPr>
+          <w:b/>
+        </w:rPr>
+        <w:t xml:space="preserve">Show 5 more</w:t>
+      </w:r>
+      <w:r>
+        <w:t xml:space="preserve"> adds five more below them each time; − closes the list. Each track plays in the player with ▶, and its name opens it on SoundCloud. They are read from SoundCloud only when you click +, never during a refresh, and kept for a day.</w:t>
       </w:r>
     </w:p>
     <w:p>
@@ -6338,6 +6374,30 @@
             <w:pPr/>
             <w:r>
               <w:t xml:space="preserve">What changed</w:t>
+            </w:r>
+          </w:p>
+        </w:tc>
+      </w:tr>
+      <w:tr>
+        <w:tc>
+          <w:tcPr>
+            <w:tcW w:w="1616" w:type="dxa"/>
+          </w:tcPr>
+          <w:p>
+            <w:pPr/>
+            <w:r>
+              <w:t xml:space="preserve">74</w:t>
+            </w:r>
+          </w:p>
+        </w:tc>
+        <w:tc>
+          <w:tcPr>
+            <w:tcW w:w="7743" w:type="dxa"/>
+          </w:tcPr>
+          <w:p>
+            <w:pPr/>
+            <w:r>
+              <w:t xml:space="preserve">List view: a + beside each SoundCloud track opens its related tracks underneath (three at first, Show 5 more adds five at a time), read only when clicked.</w:t>
             </w:r>
           </w:p>
         </w:tc>

</xml_diff>

<commit_message>
v75: The Bandcamp Downloads button is optional (Settings); off, purchases aren't watched for downloads.
Co-Authored-By: Claude Opus 5.5 <noreply@anthropic.com>
Claude-Session: https://claude.ai/code/session_01Xj1HuHJX1zYNh76RWBnCyx
</commit_message>
<xml_diff>
--- a/docs/Artist Feed User Guide.docx
+++ b/docs/Artist Feed User Guide.docx
@@ -33,7 +33,7 @@
     <w:p>
       <w:pPr/>
       <w:r>
-        <w:t xml:space="preserve">This guide describes Artist Feed version 74. The version number is shown in small grey text beside the title at the top of the app.</w:t>
+        <w:t xml:space="preserve">This guide describes Artist Feed version 75. The version number is shown in small grey text beside the title at the top of the app.</w:t>
       </w:r>
     </w:p>
     <w:p>
@@ -2013,7 +2013,7 @@
         <w:t xml:space="preserve">Downloads</w:t>
       </w:r>
       <w:r>
-        <w:t xml:space="preserve"> button (top right, beside Tracked Artists) shows how many of your Bandcamp purchases are ready to download that you haven't been shown yet. It appears once your Bandcamp username is set in the Link Finder panel.</w:t>
+        <w:t xml:space="preserve"> button (top right, beside Tracked Artists) shows how many of your Bandcamp purchases are ready to download that you haven't been shown yet. It appears once your Bandcamp username is set in the Link Finder panel. It is optional: untick **Show the Downloads button** in Settings to remove it. While it is off, purchases aren't watched for downloads and any waiting count is dropped, so switching it back on starts fresh. Link Finder still uses your purchases either way.</w:t>
       </w:r>
     </w:p>
     <w:p>
@@ -6374,6 +6374,30 @@
             <w:pPr/>
             <w:r>
               <w:t xml:space="preserve">What changed</w:t>
+            </w:r>
+          </w:p>
+        </w:tc>
+      </w:tr>
+      <w:tr>
+        <w:tc>
+          <w:tcPr>
+            <w:tcW w:w="1616" w:type="dxa"/>
+          </w:tcPr>
+          <w:p>
+            <w:pPr/>
+            <w:r>
+              <w:t xml:space="preserve">75</w:t>
+            </w:r>
+          </w:p>
+        </w:tc>
+        <w:tc>
+          <w:tcPr>
+            <w:tcW w:w="7743" w:type="dxa"/>
+          </w:tcPr>
+          <w:p>
+            <w:pPr/>
+            <w:r>
+              <w:t xml:space="preserve">The Downloads button is optional: Settings has a Show the Downloads button switch. Off, purchases aren't watched for downloads.</w:t>
             </w:r>
           </w:p>
         </w:tc>

</xml_diff>

<commit_message>
v76: Link Finder can search Beatport and Discogs (both off by default; Discogs needs a token); Downloads button off by default, greyed out with a tooltip.
Co-Authored-By: Claude Opus 5.5 <noreply@anthropic.com>
Claude-Session: https://claude.ai/code/session_01Xj1HuHJX1zYNh76RWBnCyx
</commit_message>
<xml_diff>
--- a/docs/Artist Feed User Guide.docx
+++ b/docs/Artist Feed User Guide.docx
@@ -33,7 +33,7 @@
     <w:p>
       <w:pPr/>
       <w:r>
-        <w:t xml:space="preserve">This guide describes Artist Feed version 75. The version number is shown in small grey text beside the title at the top of the app.</w:t>
+        <w:t xml:space="preserve">This guide describes Artist Feed version 76. The version number is shown in small grey text beside the title at the top of the app.</w:t>
       </w:r>
     </w:p>
     <w:p>
@@ -2013,7 +2013,16 @@
         <w:t xml:space="preserve">Downloads</w:t>
       </w:r>
       <w:r>
-        <w:t xml:space="preserve"> button (top right, beside Tracked Artists) shows how many of your Bandcamp purchases are ready to download that you haven't been shown yet. It appears once your Bandcamp username is set in the Link Finder panel. It is optional: untick **Show the Downloads button** in Settings to remove it. While it is off, purchases aren't watched for downloads and any waiting count is dropped, so switching it back on starts fresh. Link Finder still uses your purchases either way.</w:t>
+        <w:t xml:space="preserve"> button (top right, beside Tracked Artists) shows how many of your Bandcamp purchases are ready to download that you haven't been shown yet. It needs your Bandcamp username, set in the Link Finder panel, and is off until you tick </w:t>
+      </w:r>
+      <w:r>
+        <w:rPr>
+          <w:b/>
+        </w:rPr>
+        <w:t xml:space="preserve">Show the Downloads button</w:t>
+      </w:r>
+      <w:r>
+        <w:t xml:space="preserve"> in Settings. While it is off the button stays in place, greyed out, and hovering over it says how to turn it on; purchases aren't watched for downloads and any waiting count is dropped, so switching it on starts fresh. Link Finder still uses your purchases either way.</w:t>
       </w:r>
     </w:p>
     <w:p>
@@ -2487,7 +2496,7 @@
         <w:t xml:space="preserve">Link Finder searches.</w:t>
       </w:r>
       <w:r>
-        <w:t xml:space="preserve"> Tick the sites Link Finder looks on. A track found on a site higher in the list is preferred: Bandcamp first, then SoundCloud, then YouTube. YouTube starts unticked. Saved answers stay as they were, except that a link on a site you have unticked gives way to the next best one. When you tick a site, rows saved as not found are searched again the next time they are looked up; when the newly ticked site is YouTube, only YouTube is looked at for them, and only for the artists ticked for it.</w:t>
+        <w:t xml:space="preserve"> Tick the sites Link Finder looks on. A track found on a site higher in the list is preferred: Bandcamp first, then Beatport, then SoundCloud, then YouTube, then Discogs. YouTube, Beatport and Discogs start unticked. Saved answers stay as they were, except that a link on a site you have unticked gives way to the next best one. When you tick a site, rows saved as not found are searched again the next time they are looked up; when the newly ticked sites are only YouTube, Beatport or Discogs, only those are looked at for them (YouTube only for the artists ticked for it).</w:t>
       </w:r>
     </w:p>
     <w:p>
@@ -2573,7 +2582,111 @@
         </w:numPr>
       </w:pPr>
       <w:r>
-        <w:t xml:space="preserve">YouTube comes third: it is only looked at when the track wasn't found on Bandcamp or SoundCloud.</w:t>
+        <w:t xml:space="preserve">YouTube comes after Bandcamp, Beatport and SoundCloud: it is only looked at when the track wasn't found on SoundCloud.</w:t>
+      </w:r>
+    </w:p>
+    <w:p>
+      <w:pPr>
+        <w:pStyle w:val="Heading3"/>
+      </w:pPr>
+      <w:r>
+        <w:t xml:space="preserve">Beatport and Discogs</w:t>
+      </w:r>
+    </w:p>
+    <w:p>
+      <w:pPr/>
+      <w:r>
+        <w:t xml:space="preserve">Both are optional extra places for Link Finder to look, and both start switched off: tick them under </w:t>
+      </w:r>
+      <w:r>
+        <w:rPr>
+          <w:b/>
+        </w:rPr>
+        <w:t xml:space="preserve">Link Finder searches</w:t>
+      </w:r>
+      <w:r>
+        <w:t xml:space="preserve"> in Settings. Neither has a feed or a column in Tracked Artists.</w:t>
+      </w:r>
+    </w:p>
+    <w:p>
+      <w:pPr>
+        <w:pStyle w:val="ListParagraph"/>
+        <w:numPr>
+          <w:ilvl w:val="0"/>
+          <w:numId w:val="17"/>
+        </w:numPr>
+      </w:pPr>
+      <w:r>
+        <w:rPr>
+          <w:b/>
+        </w:rPr>
+        <w:t xml:space="preserve">Beatport</w:t>
+      </w:r>
+      <w:r>
+        <w:t xml:space="preserve"> is searched for any track that wasn't found on Bandcamp, before SoundCloud, since it is a place to buy the track. An exact match there is the answer (shown as Beatport track) and beats a partial match on Bandcamp; a partial match is kept as Beatport · check match, behind a track found on SoundCloud. The link opens the track's Beatport page.</w:t>
+      </w:r>
+    </w:p>
+    <w:p>
+      <w:pPr>
+        <w:pStyle w:val="ListParagraph"/>
+        <w:numPr>
+          <w:ilvl w:val="0"/>
+          <w:numId w:val="17"/>
+        </w:numPr>
+      </w:pPr>
+      <w:r>
+        <w:rPr>
+          <w:b/>
+        </w:rPr>
+        <w:t xml:space="preserve">Discogs</w:t>
+      </w:r>
+      <w:r>
+        <w:t xml:space="preserve"> is the last resort: it is only searched when the track itself wasn't found on Bandcamp, Beatport, SoundCloud or YouTube. It can turn up releases that exist only on vinyl. Link Finder asks Discogs for releases by the artist with that track, opens the track lists of up to three of them, and links the release the track is on (the note says its formats, such as Vinyl). A release found there comes before an artist page. Discogs only answers signed-in apps, so it needs a free personal access token: on discogs.com go to Settings → Developers → </w:t>
+      </w:r>
+      <w:r>
+        <w:rPr>
+          <w:b/>
+        </w:rPr>
+        <w:t xml:space="preserve">Generate new token</w:t>
+      </w:r>
+      <w:r>
+        <w:t xml:space="preserve">, then paste it into the box that appears in Settings when Discogs is ticked (or set </w:t>
+      </w:r>
+      <w:r>
+        <w:rPr>
+          <w:rStyle w:val="CodeChar"/>
+        </w:rPr>
+        <w:t xml:space="preserve">DISCOGS_TOKEN</w:t>
+      </w:r>
+      <w:r>
+        <w:t xml:space="preserve"> in </w:t>
+      </w:r>
+      <w:r>
+        <w:rPr>
+          <w:rStyle w:val="CodeChar"/>
+        </w:rPr>
+        <w:t xml:space="preserve">docker-compose.yml</w:t>
+      </w:r>
+      <w:r>
+        <w:t xml:space="preserve">).</w:t>
+      </w:r>
+    </w:p>
+    <w:p>
+      <w:pPr/>
+      <w:r>
+        <w:rPr>
+          <w:b/>
+        </w:rPr>
+        <w:t xml:space="preserve">How long they add (estimates).</w:t>
+      </w:r>
+      <w:r>
+        <w:t xml:space="preserve"> Beatport: one search per track not found on Bandcamp, at most one request every 1.5 seconds, so roughly 1.5 to 3 seconds per track, about 3 to 5 minutes for 100 tracks that aren't on Bandcamp. Discogs: one search plus up to three track lists, at most one request a second (Discogs allows 60 a minute), so roughly 2 to 5 seconds per track, and only for tracks found nowhere else. Tracks answered from your purchases, your feed or saved results cost nothing either way, searches are kept for a week and Discogs track lists for 30 days. These are estimates, not measurements.</w:t>
+      </w:r>
+    </w:p>
+    <w:p>
+      <w:pPr/>
+      <w:r>
+        <w:t xml:space="preserve">Beatport has no public search for apps, so Link Finder reads its search page the way a browser does. If Beatport blocks that or changes the page, the step says "Beatport search unavailable" and the lookup carries on without it.</w:t>
       </w:r>
     </w:p>
     <w:p>
@@ -2612,7 +2725,7 @@
         <w:pStyle w:val="ListParagraph"/>
         <w:numPr>
           <w:ilvl w:val="0"/>
-          <w:numId w:val="17"/>
+          <w:numId w:val="18"/>
         </w:numPr>
       </w:pPr>
       <w:r>
@@ -2624,7 +2737,7 @@
         <w:pStyle w:val="ListParagraph"/>
         <w:numPr>
           <w:ilvl w:val="0"/>
-          <w:numId w:val="17"/>
+          <w:numId w:val="18"/>
         </w:numPr>
       </w:pPr>
       <w:r>
@@ -2636,7 +2749,7 @@
         <w:pStyle w:val="ListParagraph"/>
         <w:numPr>
           <w:ilvl w:val="0"/>
-          <w:numId w:val="17"/>
+          <w:numId w:val="18"/>
         </w:numPr>
       </w:pPr>
       <w:r>
@@ -2648,7 +2761,7 @@
         <w:pStyle w:val="ListParagraph"/>
         <w:numPr>
           <w:ilvl w:val="0"/>
-          <w:numId w:val="17"/>
+          <w:numId w:val="18"/>
         </w:numPr>
       </w:pPr>
       <w:r>
@@ -2807,6 +2920,78 @@
           <w:p>
             <w:pPr/>
             <w:r>
+              <w:t xml:space="preserve">Beatport track</w:t>
+            </w:r>
+          </w:p>
+        </w:tc>
+        <w:tc>
+          <w:tcPr>
+            <w:tcW w:w="5812" w:type="dxa"/>
+          </w:tcPr>
+          <w:p>
+            <w:pPr/>
+            <w:r>
+              <w:t xml:space="preserve">Not on Bandcamp, but on Beatport with the title and artist both matching. The link is the track's Beatport page. Only when Beatport is ticked for Link Finder in Settings.</w:t>
+            </w:r>
+          </w:p>
+        </w:tc>
+      </w:tr>
+      <w:tr>
+        <w:tc>
+          <w:tcPr>
+            <w:tcW w:w="3547" w:type="dxa"/>
+          </w:tcPr>
+          <w:p>
+            <w:pPr/>
+            <w:r>
+              <w:t xml:space="preserve">Beatport · check match</w:t>
+            </w:r>
+          </w:p>
+        </w:tc>
+        <w:tc>
+          <w:tcPr>
+            <w:tcW w:w="5812" w:type="dxa"/>
+          </w:tcPr>
+          <w:p>
+            <w:pPr/>
+            <w:r>
+              <w:t xml:space="preserve">A partial match on Beatport. Worth a click before you trust it.</w:t>
+            </w:r>
+          </w:p>
+        </w:tc>
+      </w:tr>
+      <w:tr>
+        <w:tc>
+          <w:tcPr>
+            <w:tcW w:w="3547" w:type="dxa"/>
+          </w:tcPr>
+          <w:p>
+            <w:pPr/>
+            <w:r>
+              <w:t xml:space="preserve">Discogs release</w:t>
+            </w:r>
+          </w:p>
+        </w:tc>
+        <w:tc>
+          <w:tcPr>
+            <w:tcW w:w="5812" w:type="dxa"/>
+          </w:tcPr>
+          <w:p>
+            <w:pPr/>
+            <w:r>
+              <w:t xml:space="preserve">Not found on any other site, but on a release listed on Discogs (often vinyl-only). The link is that release; the note gives its formats. Only when Discogs is ticked and a token is set.</w:t>
+            </w:r>
+          </w:p>
+        </w:tc>
+      </w:tr>
+      <w:tr>
+        <w:tc>
+          <w:tcPr>
+            <w:tcW w:w="3547" w:type="dxa"/>
+          </w:tcPr>
+          <w:p>
+            <w:pPr/>
+            <w:r>
               <w:t xml:space="preserve">SoundCloud artist page</w:t>
             </w:r>
           </w:p>
@@ -2956,7 +3141,25 @@
         <w:t xml:space="preserve">What was tried</w:t>
       </w:r>
       <w:r>
-        <w:t xml:space="preserve"> lists every step and what it found. While a lookup runs, rows not yet answered have a soft blue tint, and the row being searched pulses and reads "Searching now…". Each of those rows has **Skip** and **Add link**. Skip stops the search for that track at once (or before it starts) and moves on; it is marked Skipped and nothing is saved for it, so it is searched for next time unless you add a link. Add link sets the link you already know, and that track is not searched. A row whose link is a guess (a SoundCloud profile picked by name alone, or a partial Bandcamp match) is marked Needs review and tinted red. It stays that way after the lookup finishes, until you press Looks right, which keeps the link as one you set, or correct it with Edit.</w:t>
+        <w:t xml:space="preserve"> lists every step and what it found. While a lookup runs, rows not yet answered have a soft blue tint, and the row being searched pulses and reads "Searching now…". Each of those rows has </w:t>
+      </w:r>
+      <w:r>
+        <w:rPr>
+          <w:b/>
+        </w:rPr>
+        <w:t xml:space="preserve">Skip</w:t>
+      </w:r>
+      <w:r>
+        <w:t xml:space="preserve"> and </w:t>
+      </w:r>
+      <w:r>
+        <w:rPr>
+          <w:b/>
+        </w:rPr>
+        <w:t xml:space="preserve">Add link</w:t>
+      </w:r>
+      <w:r>
+        <w:t xml:space="preserve">. Skip stops the search for that track at once (or before it starts) and moves on; it is marked Skipped and nothing is saved for it, so it is searched for next time unless you add a link. Add link sets the link you already know, and that track is not searched. A row whose link is a guess (a SoundCloud profile picked by name alone, or a partial Bandcamp, Beatport or Discogs match) is marked Needs review and tinted red. It stays that way after the lookup finishes, until you press Looks right, which keeps the link as one you set, or correct it with Edit.</w:t>
       </w:r>
     </w:p>
     <w:p>
@@ -2972,7 +3175,7 @@
         <w:pStyle w:val="ListParagraph"/>
         <w:numPr>
           <w:ilvl w:val="0"/>
-          <w:numId w:val="18"/>
+          <w:numId w:val="19"/>
         </w:numPr>
       </w:pPr>
       <w:r>
@@ -2990,7 +3193,7 @@
         <w:pStyle w:val="ListParagraph"/>
         <w:numPr>
           <w:ilvl w:val="0"/>
-          <w:numId w:val="18"/>
+          <w:numId w:val="19"/>
         </w:numPr>
       </w:pPr>
       <w:r>
@@ -3008,7 +3211,7 @@
         <w:pStyle w:val="ListParagraph"/>
         <w:numPr>
           <w:ilvl w:val="0"/>
-          <w:numId w:val="18"/>
+          <w:numId w:val="19"/>
         </w:numPr>
       </w:pPr>
       <w:r>
@@ -3069,7 +3272,7 @@
         <w:pStyle w:val="ListParagraph"/>
         <w:numPr>
           <w:ilvl w:val="0"/>
-          <w:numId w:val="19"/>
+          <w:numId w:val="20"/>
         </w:numPr>
       </w:pPr>
       <w:r>
@@ -3081,7 +3284,7 @@
         <w:pStyle w:val="ListParagraph"/>
         <w:numPr>
           <w:ilvl w:val="0"/>
-          <w:numId w:val="19"/>
+          <w:numId w:val="20"/>
         </w:numPr>
       </w:pPr>
       <w:r>
@@ -3093,7 +3296,7 @@
         <w:pStyle w:val="ListParagraph"/>
         <w:numPr>
           <w:ilvl w:val="0"/>
-          <w:numId w:val="19"/>
+          <w:numId w:val="20"/>
         </w:numPr>
       </w:pPr>
       <w:r>
@@ -3161,7 +3364,16 @@
     <w:p>
       <w:pPr/>
       <w:r>
-        <w:t xml:space="preserve">Each track is listed under the tidied form of its name: lower case, no accents or punctuation (ø is read as o; letters of other alphabets, such as Cyrillic or Chinese, are kept as they are, and so is a symbol written into a word, as in "∑1", "Myca$h" or "Mor£"), and no describing tags or status notes such as "(WIP)" or "(forth. Label)". That is the form tracks are matched by. A version keeps its own entry, shown in square brackets, so "Temperature" and "Temperature (River Dub Edit)" are saved separately. What you typed is shown beneath when it differs; tracks saved before version 40 only have the tidied form. Your spelling of the artist and of the title each have their own column. A track saved under a name that doesn't match your list exactly (saved before versions had entries of their own, or typed without brackets) shows the closest entry, marked "closest in your list": the one with the same words, or the only version of that title. **Edit spelling** (or Add spelling) under the title lets you type how the artist and title should be written; it is saved to your list for that track, and Remove takes the track out of your list.</w:t>
+        <w:t xml:space="preserve">Each track is listed under the tidied form of its name: lower case, no accents or punctuation (ø is read as o; letters of other alphabets, such as Cyrillic or Chinese, are kept as they are, and so is a symbol written into a word, as in "∑1", "Myca$h" or "Mor£"), and no describing tags or status notes such as "(WIP)" or "(forth. Label)". That is the form tracks are matched by. A version keeps its own entry, shown in square brackets, so "Temperature" and "Temperature (River Dub Edit)" are saved separately. What you typed is shown beneath when it differs; tracks saved before version 40 only have the tidied form. Your spelling of the artist and of the title each have their own column. A track saved under a name that doesn't match your list exactly (saved before versions had entries of their own, or typed without brackets) shows the closest entry, marked "closest in your list": the one with the same words, or the only version of that title. </w:t>
+      </w:r>
+      <w:r>
+        <w:rPr>
+          <w:b/>
+        </w:rPr>
+        <w:t xml:space="preserve">Edit spelling</w:t>
+      </w:r>
+      <w:r>
+        <w:t xml:space="preserve"> (or Add spelling) under the title lets you type how the artist and title should be written; it is saved to your list for that track, and Remove takes the track out of your list.</w:t>
       </w:r>
     </w:p>
     <w:p>
@@ -3195,7 +3407,7 @@
         <w:pStyle w:val="ListParagraph"/>
         <w:numPr>
           <w:ilvl w:val="0"/>
-          <w:numId w:val="20"/>
+          <w:numId w:val="21"/>
         </w:numPr>
       </w:pPr>
       <w:r>
@@ -3207,7 +3419,7 @@
         <w:pStyle w:val="ListParagraph"/>
         <w:numPr>
           <w:ilvl w:val="0"/>
-          <w:numId w:val="20"/>
+          <w:numId w:val="21"/>
         </w:numPr>
       </w:pPr>
       <w:r>
@@ -3219,7 +3431,7 @@
         <w:pStyle w:val="ListParagraph"/>
         <w:numPr>
           <w:ilvl w:val="0"/>
-          <w:numId w:val="20"/>
+          <w:numId w:val="21"/>
         </w:numPr>
       </w:pPr>
       <w:r>
@@ -3231,7 +3443,7 @@
         <w:pStyle w:val="ListParagraph"/>
         <w:numPr>
           <w:ilvl w:val="0"/>
-          <w:numId w:val="20"/>
+          <w:numId w:val="21"/>
         </w:numPr>
       </w:pPr>
       <w:r>
@@ -3249,7 +3461,7 @@
         <w:pStyle w:val="ListParagraph"/>
         <w:numPr>
           <w:ilvl w:val="0"/>
-          <w:numId w:val="21"/>
+          <w:numId w:val="22"/>
         </w:numPr>
       </w:pPr>
       <w:r>
@@ -3261,7 +3473,7 @@
         <w:pStyle w:val="ListParagraph"/>
         <w:numPr>
           <w:ilvl w:val="0"/>
-          <w:numId w:val="21"/>
+          <w:numId w:val="22"/>
         </w:numPr>
       </w:pPr>
       <w:r>
@@ -3273,7 +3485,7 @@
         <w:pStyle w:val="ListParagraph"/>
         <w:numPr>
           <w:ilvl w:val="0"/>
-          <w:numId w:val="21"/>
+          <w:numId w:val="22"/>
         </w:numPr>
       </w:pPr>
       <w:r>
@@ -3285,7 +3497,7 @@
         <w:pStyle w:val="ListParagraph"/>
         <w:numPr>
           <w:ilvl w:val="0"/>
-          <w:numId w:val="21"/>
+          <w:numId w:val="22"/>
         </w:numPr>
       </w:pPr>
       <w:r>
@@ -3382,7 +3594,7 @@
         <w:pStyle w:val="ListParagraph"/>
         <w:numPr>
           <w:ilvl w:val="0"/>
-          <w:numId w:val="22"/>
+          <w:numId w:val="23"/>
         </w:numPr>
       </w:pPr>
       <w:r>
@@ -3394,7 +3606,7 @@
         <w:pStyle w:val="ListParagraph"/>
         <w:numPr>
           <w:ilvl w:val="0"/>
-          <w:numId w:val="22"/>
+          <w:numId w:val="23"/>
         </w:numPr>
       </w:pPr>
       <w:r>
@@ -3426,7 +3638,7 @@
         <w:pStyle w:val="ListParagraph"/>
         <w:numPr>
           <w:ilvl w:val="0"/>
-          <w:numId w:val="23"/>
+          <w:numId w:val="24"/>
         </w:numPr>
       </w:pPr>
       <w:r>
@@ -3444,7 +3656,7 @@
         <w:pStyle w:val="ListParagraph"/>
         <w:numPr>
           <w:ilvl w:val="0"/>
-          <w:numId w:val="23"/>
+          <w:numId w:val="24"/>
         </w:numPr>
       </w:pPr>
       <w:r>
@@ -3482,7 +3694,7 @@
         <w:pStyle w:val="ListParagraph"/>
         <w:numPr>
           <w:ilvl w:val="0"/>
-          <w:numId w:val="24"/>
+          <w:numId w:val="25"/>
         </w:numPr>
       </w:pPr>
       <w:r>
@@ -3500,7 +3712,7 @@
         <w:pStyle w:val="ListParagraph"/>
         <w:numPr>
           <w:ilvl w:val="0"/>
-          <w:numId w:val="24"/>
+          <w:numId w:val="25"/>
         </w:numPr>
       </w:pPr>
       <w:r>
@@ -3518,7 +3730,7 @@
         <w:pStyle w:val="ListParagraph"/>
         <w:numPr>
           <w:ilvl w:val="0"/>
-          <w:numId w:val="24"/>
+          <w:numId w:val="25"/>
         </w:numPr>
       </w:pPr>
       <w:r>
@@ -3542,7 +3754,7 @@
         <w:pStyle w:val="ListParagraph"/>
         <w:numPr>
           <w:ilvl w:val="0"/>
-          <w:numId w:val="25"/>
+          <w:numId w:val="26"/>
         </w:numPr>
       </w:pPr>
       <w:r>
@@ -3554,7 +3766,7 @@
         <w:pStyle w:val="ListParagraph"/>
         <w:numPr>
           <w:ilvl w:val="0"/>
-          <w:numId w:val="25"/>
+          <w:numId w:val="26"/>
         </w:numPr>
       </w:pPr>
       <w:r>
@@ -3566,7 +3778,7 @@
         <w:pStyle w:val="ListParagraph"/>
         <w:numPr>
           <w:ilvl w:val="0"/>
-          <w:numId w:val="25"/>
+          <w:numId w:val="26"/>
         </w:numPr>
       </w:pPr>
       <w:r>
@@ -3578,7 +3790,7 @@
         <w:pStyle w:val="ListParagraph"/>
         <w:numPr>
           <w:ilvl w:val="0"/>
-          <w:numId w:val="25"/>
+          <w:numId w:val="26"/>
         </w:numPr>
       </w:pPr>
       <w:r>
@@ -3590,7 +3802,7 @@
         <w:pStyle w:val="ListParagraph"/>
         <w:numPr>
           <w:ilvl w:val="0"/>
-          <w:numId w:val="25"/>
+          <w:numId w:val="26"/>
         </w:numPr>
       </w:pPr>
       <w:r>
@@ -3602,7 +3814,7 @@
         <w:pStyle w:val="ListParagraph"/>
         <w:numPr>
           <w:ilvl w:val="0"/>
-          <w:numId w:val="25"/>
+          <w:numId w:val="26"/>
         </w:numPr>
       </w:pPr>
       <w:r>
@@ -3614,7 +3826,7 @@
         <w:pStyle w:val="ListParagraph"/>
         <w:numPr>
           <w:ilvl w:val="0"/>
-          <w:numId w:val="25"/>
+          <w:numId w:val="26"/>
         </w:numPr>
       </w:pPr>
       <w:r>
@@ -3634,7 +3846,7 @@
         <w:pStyle w:val="ListParagraph"/>
         <w:numPr>
           <w:ilvl w:val="0"/>
-          <w:numId w:val="26"/>
+          <w:numId w:val="27"/>
         </w:numPr>
       </w:pPr>
       <w:r>
@@ -3646,7 +3858,7 @@
         <w:pStyle w:val="ListParagraph"/>
         <w:numPr>
           <w:ilvl w:val="0"/>
-          <w:numId w:val="26"/>
+          <w:numId w:val="27"/>
         </w:numPr>
       </w:pPr>
       <w:r>
@@ -3658,7 +3870,7 @@
         <w:pStyle w:val="ListParagraph"/>
         <w:numPr>
           <w:ilvl w:val="0"/>
-          <w:numId w:val="26"/>
+          <w:numId w:val="27"/>
         </w:numPr>
       </w:pPr>
       <w:r>
@@ -3670,7 +3882,7 @@
         <w:pStyle w:val="ListParagraph"/>
         <w:numPr>
           <w:ilvl w:val="0"/>
-          <w:numId w:val="26"/>
+          <w:numId w:val="27"/>
         </w:numPr>
       </w:pPr>
       <w:r>
@@ -3682,7 +3894,7 @@
         <w:pStyle w:val="ListParagraph"/>
         <w:numPr>
           <w:ilvl w:val="0"/>
-          <w:numId w:val="26"/>
+          <w:numId w:val="27"/>
         </w:numPr>
       </w:pPr>
       <w:r>
@@ -4887,6 +5099,120 @@
           </w:p>
         </w:tc>
       </w:tr>
+      <w:tr>
+        <w:tc>
+          <w:tcPr>
+            <w:tcW w:w="3116" w:type="dxa"/>
+          </w:tcPr>
+          <w:p>
+            <w:pPr/>
+            <w:r>
+              <w:rPr>
+                <w:rStyle w:val="CodeChar"/>
+              </w:rPr>
+              <w:t xml:space="preserve">DISCOGS_TOKEN</w:t>
+            </w:r>
+          </w:p>
+        </w:tc>
+        <w:tc>
+          <w:tcPr>
+            <w:tcW w:w="1385" w:type="dxa"/>
+          </w:tcPr>
+          <w:p>
+            <w:pPr/>
+            <w:r>
+              <w:t xml:space="preserve">unset</w:t>
+            </w:r>
+          </w:p>
+        </w:tc>
+        <w:tc>
+          <w:tcPr>
+            <w:tcW w:w="4859" w:type="dxa"/>
+          </w:tcPr>
+          <w:p>
+            <w:pPr/>
+            <w:r>
+              <w:t xml:space="preserve">Discogs personal access token for Link Finder (also set in Settings, which wins)</w:t>
+            </w:r>
+          </w:p>
+        </w:tc>
+      </w:tr>
+      <w:tr>
+        <w:tc>
+          <w:tcPr>
+            <w:tcW w:w="3116" w:type="dxa"/>
+          </w:tcPr>
+          <w:p>
+            <w:pPr/>
+            <w:r>
+              <w:rPr>
+                <w:rStyle w:val="CodeChar"/>
+              </w:rPr>
+              <w:t xml:space="preserve">BEATPORT_GAP_SECONDS</w:t>
+            </w:r>
+          </w:p>
+        </w:tc>
+        <w:tc>
+          <w:tcPr>
+            <w:tcW w:w="1385" w:type="dxa"/>
+          </w:tcPr>
+          <w:p>
+            <w:pPr/>
+            <w:r>
+              <w:t xml:space="preserve">1.5</w:t>
+            </w:r>
+          </w:p>
+        </w:tc>
+        <w:tc>
+          <w:tcPr>
+            <w:tcW w:w="4859" w:type="dxa"/>
+          </w:tcPr>
+          <w:p>
+            <w:pPr/>
+            <w:r>
+              <w:t xml:space="preserve">Gap between Link Finder's requests to Beatport</w:t>
+            </w:r>
+          </w:p>
+        </w:tc>
+      </w:tr>
+      <w:tr>
+        <w:tc>
+          <w:tcPr>
+            <w:tcW w:w="3116" w:type="dxa"/>
+          </w:tcPr>
+          <w:p>
+            <w:pPr/>
+            <w:r>
+              <w:rPr>
+                <w:rStyle w:val="CodeChar"/>
+              </w:rPr>
+              <w:t xml:space="preserve">DISCOGS_GAP_SECONDS</w:t>
+            </w:r>
+          </w:p>
+        </w:tc>
+        <w:tc>
+          <w:tcPr>
+            <w:tcW w:w="1385" w:type="dxa"/>
+          </w:tcPr>
+          <w:p>
+            <w:pPr/>
+            <w:r>
+              <w:t xml:space="preserve">1.1</w:t>
+            </w:r>
+          </w:p>
+        </w:tc>
+        <w:tc>
+          <w:tcPr>
+            <w:tcW w:w="4859" w:type="dxa"/>
+          </w:tcPr>
+          <w:p>
+            <w:pPr/>
+            <w:r>
+              <w:t xml:space="preserve">Gap between Link Finder's requests to Discogs (Discogs allows 60 a minute)</w:t>
+            </w:r>
+          </w:p>
+        </w:tc>
+      </w:tr>
     </w:tbl>
     <w:p>
       <w:pPr>
@@ -5590,7 +5916,7 @@
         <w:pStyle w:val="ListParagraph"/>
         <w:numPr>
           <w:ilvl w:val="0"/>
-          <w:numId w:val="27"/>
+          <w:numId w:val="28"/>
         </w:numPr>
       </w:pPr>
       <w:r>
@@ -5611,7 +5937,7 @@
         <w:pStyle w:val="ListParagraph"/>
         <w:numPr>
           <w:ilvl w:val="0"/>
-          <w:numId w:val="27"/>
+          <w:numId w:val="28"/>
         </w:numPr>
       </w:pPr>
       <w:r>
@@ -5623,7 +5949,7 @@
         <w:pStyle w:val="ListParagraph"/>
         <w:numPr>
           <w:ilvl w:val="0"/>
-          <w:numId w:val="27"/>
+          <w:numId w:val="28"/>
         </w:numPr>
       </w:pPr>
       <w:r>
@@ -5644,7 +5970,7 @@
         <w:pStyle w:val="ListParagraph"/>
         <w:numPr>
           <w:ilvl w:val="0"/>
-          <w:numId w:val="27"/>
+          <w:numId w:val="28"/>
         </w:numPr>
       </w:pPr>
       <w:r>
@@ -5679,7 +6005,7 @@
         <w:pStyle w:val="ListParagraph"/>
         <w:numPr>
           <w:ilvl w:val="0"/>
-          <w:numId w:val="28"/>
+          <w:numId w:val="29"/>
         </w:numPr>
       </w:pPr>
       <w:r>
@@ -5697,7 +6023,7 @@
         <w:pStyle w:val="ListParagraph"/>
         <w:numPr>
           <w:ilvl w:val="0"/>
-          <w:numId w:val="28"/>
+          <w:numId w:val="29"/>
         </w:numPr>
       </w:pPr>
       <w:r>
@@ -5715,7 +6041,7 @@
         <w:pStyle w:val="ListParagraph"/>
         <w:numPr>
           <w:ilvl w:val="0"/>
-          <w:numId w:val="28"/>
+          <w:numId w:val="29"/>
         </w:numPr>
       </w:pPr>
       <w:r>
@@ -5733,7 +6059,7 @@
         <w:pStyle w:val="ListParagraph"/>
         <w:numPr>
           <w:ilvl w:val="0"/>
-          <w:numId w:val="28"/>
+          <w:numId w:val="29"/>
         </w:numPr>
       </w:pPr>
       <w:r>
@@ -5751,7 +6077,7 @@
         <w:pStyle w:val="ListParagraph"/>
         <w:numPr>
           <w:ilvl w:val="0"/>
-          <w:numId w:val="28"/>
+          <w:numId w:val="29"/>
         </w:numPr>
       </w:pPr>
       <w:r>
@@ -5769,7 +6095,7 @@
         <w:pStyle w:val="ListParagraph"/>
         <w:numPr>
           <w:ilvl w:val="0"/>
-          <w:numId w:val="28"/>
+          <w:numId w:val="29"/>
         </w:numPr>
       </w:pPr>
       <w:r>
@@ -5787,7 +6113,7 @@
         <w:pStyle w:val="ListParagraph"/>
         <w:numPr>
           <w:ilvl w:val="0"/>
-          <w:numId w:val="28"/>
+          <w:numId w:val="29"/>
         </w:numPr>
       </w:pPr>
       <w:r>
@@ -5805,7 +6131,7 @@
         <w:pStyle w:val="ListParagraph"/>
         <w:numPr>
           <w:ilvl w:val="0"/>
-          <w:numId w:val="28"/>
+          <w:numId w:val="29"/>
         </w:numPr>
       </w:pPr>
       <w:r>
@@ -5823,7 +6149,7 @@
         <w:pStyle w:val="ListParagraph"/>
         <w:numPr>
           <w:ilvl w:val="0"/>
-          <w:numId w:val="28"/>
+          <w:numId w:val="29"/>
         </w:numPr>
       </w:pPr>
       <w:r>
@@ -5841,7 +6167,7 @@
         <w:pStyle w:val="ListParagraph"/>
         <w:numPr>
           <w:ilvl w:val="0"/>
-          <w:numId w:val="28"/>
+          <w:numId w:val="29"/>
         </w:numPr>
       </w:pPr>
       <w:r>
@@ -5859,7 +6185,7 @@
         <w:pStyle w:val="ListParagraph"/>
         <w:numPr>
           <w:ilvl w:val="0"/>
-          <w:numId w:val="28"/>
+          <w:numId w:val="29"/>
         </w:numPr>
       </w:pPr>
       <w:r>
@@ -5874,7 +6200,7 @@
         <w:pStyle w:val="ListParagraph"/>
         <w:numPr>
           <w:ilvl w:val="0"/>
-          <w:numId w:val="28"/>
+          <w:numId w:val="29"/>
         </w:numPr>
       </w:pPr>
       <w:r>
@@ -6374,6 +6700,30 @@
             <w:pPr/>
             <w:r>
               <w:t xml:space="preserve">What changed</w:t>
+            </w:r>
+          </w:p>
+        </w:tc>
+      </w:tr>
+      <w:tr>
+        <w:tc>
+          <w:tcPr>
+            <w:tcW w:w="1616" w:type="dxa"/>
+          </w:tcPr>
+          <w:p>
+            <w:pPr/>
+            <w:r>
+              <w:t xml:space="preserve">76</w:t>
+            </w:r>
+          </w:p>
+        </w:tc>
+        <w:tc>
+          <w:tcPr>
+            <w:tcW w:w="7743" w:type="dxa"/>
+          </w:tcPr>
+          <w:p>
+            <w:pPr/>
+            <w:r>
+              <w:t xml:space="preserve">Link Finder can also search Beatport (after Bandcamp) and Discogs (last resort, finds vinyl-only releases; needs a token), both off until ticked in Settings. The Downloads button is off by default and shows greyed out, with a tooltip, until switched on.</w:t>
             </w:r>
           </w:p>
         </w:tc>
@@ -8440,19 +8790,16 @@
     <w:abstractNumId w:val="0"/>
   </w:num>
   <w:num w:numId="21">
+    <w:abstractNumId w:val="0"/>
+  </w:num>
+  <w:num w:numId="22">
     <w:abstractNumId w:val="1"/>
     <w:lvlOverride w:ilvl="0">
       <w:startOverride w:val="1"/>
     </w:lvlOverride>
   </w:num>
-  <w:num w:numId="22">
+  <w:num w:numId="23">
     <w:abstractNumId w:val="0"/>
-  </w:num>
-  <w:num w:numId="23">
-    <w:abstractNumId w:val="1"/>
-    <w:lvlOverride w:ilvl="0">
-      <w:startOverride w:val="1"/>
-    </w:lvlOverride>
   </w:num>
   <w:num w:numId="24">
     <w:abstractNumId w:val="1"/>
@@ -8467,12 +8814,18 @@
     </w:lvlOverride>
   </w:num>
   <w:num w:numId="26">
-    <w:abstractNumId w:val="0"/>
+    <w:abstractNumId w:val="1"/>
+    <w:lvlOverride w:ilvl="0">
+      <w:startOverride w:val="1"/>
+    </w:lvlOverride>
   </w:num>
   <w:num w:numId="27">
     <w:abstractNumId w:val="0"/>
   </w:num>
   <w:num w:numId="28">
+    <w:abstractNumId w:val="0"/>
+  </w:num>
+  <w:num w:numId="29">
     <w:abstractNumId w:val="0"/>
   </w:num>
 </w:numbering>

</xml_diff>

<commit_message>
Guide: running Artist Feed on a Mac
Co-Authored-By: Claude Opus 5.5 <noreply@anthropic.com>
Claude-Session: https://claude.ai/code/session_01Xj1HuHJX1zYNh76RWBnCyx
</commit_message>
<xml_diff>
--- a/docs/Artist Feed User Guide.docx
+++ b/docs/Artist Feed User Guide.docx
@@ -199,7 +199,16 @@
         <w:t xml:space="preserve">Running without Docker</w:t>
       </w:r>
       <w:r>
-        <w:t xml:space="preserve"> further down.</w:t>
+        <w:t xml:space="preserve"> further down. The app runs on Windows and on a Mac; the steps below are written for Windows, and </w:t>
+      </w:r>
+      <w:r>
+        <w:rPr>
+          <w:b/>
+        </w:rPr>
+        <w:t xml:space="preserve">On a Mac</w:t>
+      </w:r>
+      <w:r>
+        <w:t xml:space="preserve"> lists what differs.</w:t>
       </w:r>
     </w:p>
     <w:p>
@@ -362,16 +371,16 @@
         <w:t xml:space="preserve">powershell</w:t>
       </w:r>
       <w:r>
-        <w:t xml:space="preserve"> and press Enter. On a Mac, open Terminal and type </w:t>
+        <w:t xml:space="preserve"> and press Enter. On a Mac, open Terminal, type </w:t>
       </w:r>
       <w:r>
         <w:rPr>
           <w:rStyle w:val="CodeChar"/>
         </w:rPr>
-        <w:t xml:space="preserve">cd </w:t>
-      </w:r>
-      <w:r>
-        <w:t xml:space="preserve"> followed by the folder's path.</w:t>
+        <w:t xml:space="preserve">cd</w:t>
+      </w:r>
+      <w:r>
+        <w:t xml:space="preserve"> and a space, drag the folder onto the Terminal window and press Enter.</w:t>
       </w:r>
     </w:p>
     <w:p>
@@ -1208,34 +1217,16 @@
     <w:p>
       <w:pPr/>
       <w:r>
-        <w:t xml:space="preserve">On a Mac the same steps are </w:t>
-      </w:r>
-      <w:r>
-        <w:rPr>
-          <w:rStyle w:val="CodeChar"/>
-        </w:rPr>
-        <w:t xml:space="preserve">python3 -m venv .venv</w:t>
-      </w:r>
-      <w:r>
-        <w:t xml:space="preserve">, </w:t>
-      </w:r>
-      <w:r>
-        <w:rPr>
-          <w:rStyle w:val="CodeChar"/>
-        </w:rPr>
-        <w:t xml:space="preserve">source .venv/bin/activate</w:t>
-      </w:r>
-      <w:r>
-        <w:t xml:space="preserve"> and </w:t>
-      </w:r>
-      <w:r>
-        <w:rPr>
-          <w:rStyle w:val="CodeChar"/>
-        </w:rPr>
-        <w:t xml:space="preserve">pip install -r requirements.txt</w:t>
-      </w:r>
-      <w:r>
-        <w:t xml:space="preserve">.</w:t>
+        <w:t xml:space="preserve">On a Mac the steps differ slightly; see </w:t>
+      </w:r>
+      <w:r>
+        <w:rPr>
+          <w:b/>
+        </w:rPr>
+        <w:t xml:space="preserve">On a Mac</w:t>
+      </w:r>
+      <w:r>
+        <w:t xml:space="preserve"> below.</w:t>
       </w:r>
     </w:p>
     <w:p>
@@ -1360,6 +1351,309 @@
       </w:r>
       <w:r>
         <w:t xml:space="preserve"> again in case the libraries changed, and start the app as above.</w:t>
+      </w:r>
+    </w:p>
+    <w:p>
+      <w:pPr>
+        <w:pStyle w:val="Heading3"/>
+      </w:pPr>
+      <w:r>
+        <w:t xml:space="preserve">On a Mac</w:t>
+      </w:r>
+    </w:p>
+    <w:p>
+      <w:pPr/>
+      <w:r>
+        <w:t xml:space="preserve">Artist Feed runs on a Mac the same way it runs on Windows, on both Apple silicon (M1 and later) and Intel Macs. Everything above applies, with these differences.</w:t>
+      </w:r>
+    </w:p>
+    <w:p>
+      <w:pPr/>
+      <w:r>
+        <w:rPr>
+          <w:b/>
+        </w:rPr>
+        <w:t xml:space="preserve">Docker Desktop.</w:t>
+      </w:r>
+      <w:r>
+        <w:t xml:space="preserve"> On docker.com, pick the download that matches your Mac: </w:t>
+      </w:r>
+      <w:r>
+        <w:rPr>
+          <w:b/>
+        </w:rPr>
+        <w:t xml:space="preserve">Apple silicon</w:t>
+      </w:r>
+      <w:r>
+        <w:t xml:space="preserve"> or </w:t>
+      </w:r>
+      <w:r>
+        <w:rPr>
+          <w:b/>
+        </w:rPr>
+        <w:t xml:space="preserve">Intel chip</w:t>
+      </w:r>
+      <w:r>
+        <w:t xml:space="preserve">. Apple menu → </w:t>
+      </w:r>
+      <w:r>
+        <w:rPr>
+          <w:b/>
+        </w:rPr>
+        <w:t xml:space="preserve">About This Mac</w:t>
+      </w:r>
+      <w:r>
+        <w:t xml:space="preserve"> shows which, next to Chip or Processor. Open the downloaded </w:t>
+      </w:r>
+      <w:r>
+        <w:rPr>
+          <w:rStyle w:val="CodeChar"/>
+        </w:rPr>
+        <w:t xml:space="preserve">.dmg</w:t>
+      </w:r>
+      <w:r>
+        <w:t xml:space="preserve">, drag Docker into Applications, open it from there and allow the permissions it asks for. There is no WSL step; that is Windows only. Docker Desktop supports the current version of macOS and the two before it.</w:t>
+      </w:r>
+    </w:p>
+    <w:p>
+      <w:pPr/>
+      <w:r>
+        <w:rPr>
+          <w:b/>
+        </w:rPr>
+        <w:t xml:space="preserve">Getting the files.</w:t>
+      </w:r>
+      <w:r>
+        <w:t xml:space="preserve"> Either download the zip from the GitHub page (</w:t>
+      </w:r>
+      <w:r>
+        <w:rPr>
+          <w:b/>
+        </w:rPr>
+        <w:t xml:space="preserve">Code</w:t>
+      </w:r>
+      <w:r>
+        <w:t xml:space="preserve"> → </w:t>
+      </w:r>
+      <w:r>
+        <w:rPr>
+          <w:b/>
+        </w:rPr>
+        <w:t xml:space="preserve">Download ZIP</w:t>
+      </w:r>
+      <w:r>
+        <w:t xml:space="preserve">; Safari unzips it into Downloads by itself) and move the folder somewhere permanent such as </w:t>
+      </w:r>
+      <w:r>
+        <w:rPr>
+          <w:rStyle w:val="CodeChar"/>
+        </w:rPr>
+        <w:t xml:space="preserve">Documents/artist-feed</w:t>
+      </w:r>
+      <w:r>
+        <w:t xml:space="preserve">, or use Git: the first time you type </w:t>
+      </w:r>
+      <w:r>
+        <w:rPr>
+          <w:rStyle w:val="CodeChar"/>
+        </w:rPr>
+        <w:t xml:space="preserve">git</w:t>
+      </w:r>
+      <w:r>
+        <w:t xml:space="preserve"> in Terminal, macOS offers to install Apple's command line tools, which include it. Then run </w:t>
+      </w:r>
+      <w:r>
+        <w:rPr>
+          <w:rStyle w:val="CodeChar"/>
+        </w:rPr>
+        <w:t xml:space="preserve">git clone https://github.com/divided-eye/artist-feed.git</w:t>
+      </w:r>
+      <w:r>
+        <w:t xml:space="preserve"> in the folder you want it in.</w:t>
+      </w:r>
+    </w:p>
+    <w:p>
+      <w:pPr/>
+      <w:r>
+        <w:rPr>
+          <w:b/>
+        </w:rPr>
+        <w:t xml:space="preserve">Opening a terminal in the app's folder.</w:t>
+      </w:r>
+      <w:r>
+        <w:t xml:space="preserve"> Open Terminal (in Applications → Utilities, or press Cmd+Space and type Terminal). Type </w:t>
+      </w:r>
+      <w:r>
+        <w:rPr>
+          <w:rStyle w:val="CodeChar"/>
+        </w:rPr>
+        <w:t xml:space="preserve">cd</w:t>
+      </w:r>
+      <w:r>
+        <w:t xml:space="preserve"> and a space, drag the app's folder from Finder onto the Terminal window to fill in its path, and press Enter. Every command in this guide, </w:t>
+      </w:r>
+      <w:r>
+        <w:rPr>
+          <w:rStyle w:val="CodeChar"/>
+        </w:rPr>
+        <w:t xml:space="preserve">docker compose …</w:t>
+      </w:r>
+      <w:r>
+        <w:t xml:space="preserve"> and </w:t>
+      </w:r>
+      <w:r>
+        <w:rPr>
+          <w:rStyle w:val="CodeChar"/>
+        </w:rPr>
+        <w:t xml:space="preserve">git …</w:t>
+      </w:r>
+      <w:r>
+        <w:t xml:space="preserve">, is typed there exactly as written. Where the guide says PowerShell, read Terminal.</w:t>
+      </w:r>
+    </w:p>
+    <w:p>
+      <w:pPr/>
+      <w:r>
+        <w:rPr>
+          <w:b/>
+        </w:rPr>
+        <w:t xml:space="preserve">Starting with the computer.</w:t>
+      </w:r>
+      <w:r>
+        <w:t xml:space="preserve"> In Docker Desktop's Settings, under General, tick </w:t>
+      </w:r>
+      <w:r>
+        <w:rPr>
+          <w:b/>
+        </w:rPr>
+        <w:t xml:space="preserve">Start Docker Desktop when you sign in to your computer</w:t>
+      </w:r>
+      <w:r>
+        <w:t xml:space="preserve">.</w:t>
+      </w:r>
+    </w:p>
+    <w:p>
+      <w:pPr/>
+      <w:r>
+        <w:rPr>
+          <w:b/>
+        </w:rPr>
+        <w:t xml:space="preserve">Other devices on your network.</w:t>
+      </w:r>
+      <w:r>
+        <w:t xml:space="preserve"> The first time, macOS may ask whether Docker may accept incoming network connections. Allow it if you want to open the app from a phone or another computer. Your Mac's address is in System Settings → Wi-Fi → </w:t>
+      </w:r>
+      <w:r>
+        <w:rPr>
+          <w:b/>
+        </w:rPr>
+        <w:t xml:space="preserve">Details</w:t>
+      </w:r>
+      <w:r>
+        <w:t xml:space="preserve"> beside the connected network (or System Settings → Network for a cable).</w:t>
+      </w:r>
+    </w:p>
+    <w:p>
+      <w:pPr/>
+      <w:r>
+        <w:rPr>
+          <w:b/>
+        </w:rPr>
+        <w:t xml:space="preserve">Sleep.</w:t>
+      </w:r>
+      <w:r>
+        <w:t xml:space="preserve"> The app only checks for new posts while the Mac is awake. When it wakes, the app catches up, as after any time switched off.</w:t>
+      </w:r>
+    </w:p>
+    <w:p>
+      <w:pPr/>
+      <w:r>
+        <w:rPr>
+          <w:b/>
+        </w:rPr>
+        <w:t xml:space="preserve">Keys.</w:t>
+      </w:r>
+      <w:r>
+        <w:t xml:space="preserve"> For a hard refresh, use Cmd+Shift+R in Chrome or Firefox, or Cmd+Option+R in Safari, instead of Ctrl+Shift+R. To stop the app in a Terminal window, press Control+C (Control, not Command).</w:t>
+      </w:r>
+    </w:p>
+    <w:p>
+      <w:pPr/>
+      <w:r>
+        <w:rPr>
+          <w:b/>
+        </w:rPr>
+        <w:t xml:space="preserve">Running without Docker.</w:t>
+      </w:r>
+      <w:r>
+        <w:t xml:space="preserve"> Install Python 3.12 from python.org/downloads (the macOS installer); the Python that comes with Apple's command line tools is too old to rely on. Then, in Terminal in the app's folder, run once:</w:t>
+      </w:r>
+    </w:p>
+    <w:p>
+      <w:pPr>
+        <w:pStyle w:val="Code"/>
+      </w:pPr>
+      <w:r>
+        <w:t xml:space="preserve">python3.12 -m venv .venv</w:t>
+        <w:br/>
+        <w:t xml:space="preserve">source .venv/bin/activate</w:t>
+        <w:br/>
+        <w:t xml:space="preserve">pip install -r requirements.txt</w:t>
+      </w:r>
+    </w:p>
+    <w:p>
+      <w:pPr/>
+      <w:r>
+        <w:t xml:space="preserve">and to start it each time:</w:t>
+      </w:r>
+    </w:p>
+    <w:p>
+      <w:pPr>
+        <w:pStyle w:val="Code"/>
+      </w:pPr>
+      <w:r>
+        <w:t xml:space="preserve">source .venv/bin/activate</w:t>
+        <w:br/>
+        <w:t xml:space="preserve">python -m uvicorn app.main:app --host 0.0.0.0 --port 8080</w:t>
+      </w:r>
+    </w:p>
+    <w:p>
+      <w:pPr/>
+      <w:r>
+        <w:t xml:space="preserve">Settings are set with </w:t>
+      </w:r>
+      <w:r>
+        <w:rPr>
+          <w:rStyle w:val="CodeChar"/>
+        </w:rPr>
+        <w:t xml:space="preserve">export</w:t>
+      </w:r>
+      <w:r>
+        <w:t xml:space="preserve"> before starting, instead of </w:t>
+      </w:r>
+      <w:r>
+        <w:rPr>
+          <w:rStyle w:val="CodeChar"/>
+        </w:rPr>
+        <w:t xml:space="preserve">$env:</w:t>
+      </w:r>
+      <w:r>
+        <w:t xml:space="preserve">, for example </w:t>
+      </w:r>
+      <w:r>
+        <w:rPr>
+          <w:rStyle w:val="CodeChar"/>
+        </w:rPr>
+        <w:t xml:space="preserve">export REFRESH_MINUTES=30</w:t>
+      </w:r>
+      <w:r>
+        <w:t xml:space="preserve">.</w:t>
+      </w:r>
+    </w:p>
+    <w:p>
+      <w:pPr/>
+      <w:r>
+        <w:t xml:space="preserve">These are the standard Docker and Python steps for macOS, and everything the app uses is available for both kinds of Mac, but the app itself hasn't been tried on a Mac yet.</w:t>
       </w:r>
     </w:p>
     <w:p>

</xml_diff>

<commit_message>
v77: Settings has a Save button; changes are kept until saved, and Close asks before dropping unsaved ones.
Co-Authored-By: Claude Opus 5.5 <noreply@anthropic.com>
Claude-Session: https://claude.ai/code/session_01Xj1HuHJX1zYNh76RWBnCyx
</commit_message>
<xml_diff>
--- a/docs/Artist Feed User Guide.docx
+++ b/docs/Artist Feed User Guide.docx
@@ -33,7 +33,7 @@
     <w:p>
       <w:pPr/>
       <w:r>
-        <w:t xml:space="preserve">This guide describes Artist Feed version 76. The version number is shown in small grey text beside the title at the top of the app.</w:t>
+        <w:t xml:space="preserve">This guide describes Artist Feed version 77. The version number is shown in small grey text beside the title at the top of the app.</w:t>
       </w:r>
     </w:p>
     <w:p>
@@ -2766,7 +2766,43 @@
         <w:t xml:space="preserve">Settings</w:t>
       </w:r>
       <w:r>
-        <w:t xml:space="preserve"> button (top right, beside Tracked Artists and Link Finder) opens two lists of checkboxes and a box for your SoundCloud username.</w:t>
+        <w:t xml:space="preserve"> button (top right, beside Tracked Artists and Link Finder) opens two lists of checkboxes, the Downloads switch and a box for your SoundCloud username. Nothing changes until you press </w:t>
+      </w:r>
+      <w:r>
+        <w:rPr>
+          <w:b/>
+        </w:rPr>
+        <w:t xml:space="preserve">Save</w:t>
+      </w:r>
+      <w:r>
+        <w:t xml:space="preserve"> at the top of the panel. The button lights up when there is something to save, and the words beside it say </w:t>
+      </w:r>
+      <w:r>
+        <w:rPr>
+          <w:b/>
+        </w:rPr>
+        <w:t xml:space="preserve">Unsaved changes</w:t>
+      </w:r>
+      <w:r>
+        <w:t xml:space="preserve">, then </w:t>
+      </w:r>
+      <w:r>
+        <w:rPr>
+          <w:b/>
+        </w:rPr>
+        <w:t xml:space="preserve">Saved</w:t>
+      </w:r>
+      <w:r>
+        <w:t xml:space="preserve"> once it is done. Pressing </w:t>
+      </w:r>
+      <w:r>
+        <w:rPr>
+          <w:b/>
+        </w:rPr>
+        <w:t xml:space="preserve">Close</w:t>
+      </w:r>
+      <w:r>
+        <w:t xml:space="preserve"> (or Escape) with changes not yet saved asks before dropping them.</w:t>
       </w:r>
     </w:p>
     <w:p>
@@ -2808,10 +2844,19 @@
         <w:rPr>
           <w:b/>
         </w:rPr>
-        <w:t xml:space="preserve">Save and read follows</w:t>
-      </w:r>
-      <w:r>
-        <w:t xml:space="preserve">: the profiles your account follows are then preferred whenever a profile has to be picked by its name, by Find missing links in Tracked Artists and by Link Finder when a track isn't on SoundCloud. A followed profile is found even when SoundCloud's search doesn't list it. The line beside the button says how many profiles were read and when. The list is read again every 12 hours, so a profile you follow later is picked up within half a day (press the button to read it now). Your follows must be public. Clear the box and press the button to stop using it.</w:t>
+        <w:t xml:space="preserve">Save</w:t>
+      </w:r>
+      <w:r>
+        <w:t xml:space="preserve">: the profiles your account follows are read straight away and are then preferred whenever a profile has to be picked by its name, by Find missing links in Tracked Artists and by Link Finder when a track isn't on SoundCloud. A followed profile is found even when SoundCloud's search doesn't list it. The line beside the box says how many profiles were read and when. The list is read again every 12 hours, so a profile you follow later is picked up within half a day (press </w:t>
+      </w:r>
+      <w:r>
+        <w:rPr>
+          <w:b/>
+        </w:rPr>
+        <w:t xml:space="preserve">Read follows now</w:t>
+      </w:r>
+      <w:r>
+        <w:t xml:space="preserve"> to read it at once). Your follows must be public. Clear the box and press Save to stop using it.</w:t>
       </w:r>
     </w:p>
     <w:p>
@@ -2944,7 +2989,7 @@
         <w:t xml:space="preserve">Generate new token</w:t>
       </w:r>
       <w:r>
-        <w:t xml:space="preserve">, then paste it into the box that appears in Settings when Discogs is ticked (or set </w:t>
+        <w:t xml:space="preserve">, then paste it into the box that appears in Settings when Discogs is ticked and press Save (or set </w:t>
       </w:r>
       <w:r>
         <w:rPr>
@@ -2962,7 +3007,7 @@
         <w:t xml:space="preserve">docker-compose.yml</w:t>
       </w:r>
       <w:r>
-        <w:t xml:space="preserve">).</w:t>
+        <w:t xml:space="preserve">). Remove token, beside the box, takes a saved token out.</w:t>
       </w:r>
     </w:p>
     <w:p>
@@ -6994,6 +7039,30 @@
             <w:pPr/>
             <w:r>
               <w:t xml:space="preserve">What changed</w:t>
+            </w:r>
+          </w:p>
+        </w:tc>
+      </w:tr>
+      <w:tr>
+        <w:tc>
+          <w:tcPr>
+            <w:tcW w:w="1616" w:type="dxa"/>
+          </w:tcPr>
+          <w:p>
+            <w:pPr/>
+            <w:r>
+              <w:t xml:space="preserve">77</w:t>
+            </w:r>
+          </w:p>
+        </w:tc>
+        <w:tc>
+          <w:tcPr>
+            <w:tcW w:w="7743" w:type="dxa"/>
+          </w:tcPr>
+          <w:p>
+            <w:pPr/>
+            <w:r>
+              <w:t xml:space="preserve">Settings has a Save button: changes take effect when you press it, the words beside it say Unsaved changes or Saved, and Close asks before dropping unsaved changes. The SoundCloud username and Discogs token are saved with it too; Read follows now and Remove token replace their own save buttons.</w:t>
             </w:r>
           </w:p>
         </w:tc>

</xml_diff>

<commit_message>
v78: Beatport and Discogs are switchable sites (Link Finder only, experimental, off by default); Discogs links the release's main page.
Co-Authored-By: Claude Opus 5.5 <noreply@anthropic.com>
Claude-Session: https://claude.ai/code/session_01Xj1HuHJX1zYNh76RWBnCyx
</commit_message>
<xml_diff>
--- a/docs/Artist Feed User Guide.docx
+++ b/docs/Artist Feed User Guide.docx
@@ -33,7 +33,7 @@
     <w:p>
       <w:pPr/>
       <w:r>
-        <w:t xml:space="preserve">This guide describes Artist Feed version 77. The version number is shown in small grey text beside the title at the top of the app.</w:t>
+        <w:t xml:space="preserve">This guide describes Artist Feed version 78. The version number is shown in small grey text beside the title at the top of the app.</w:t>
       </w:r>
     </w:p>
     <w:p>
@@ -2814,7 +2814,25 @@
         <w:t xml:space="preserve">Sites.</w:t>
       </w:r>
       <w:r>
-        <w:t xml:space="preserve"> Switch a site off and it is gone from the app: no button for it at the top, no column in Tracked Artists, no checks for new posts, its posts left out of the feed, and Link Finder doesn't use it. This goes further than the site buttons at the top, which only narrow what the feed shows. The pages you track there are kept (saving Tracked Artists leaves them alone), so switching the site back on brings everything back. At least one site has to stay on.</w:t>
+        <w:t xml:space="preserve"> Switch a site off and it is gone from the app: no button for it at the top, no column in Tracked Artists, no checks for new posts, its posts left out of the feed, and Link Finder doesn't use it. This goes further than the site buttons at the top, which only narrow what the feed shows. The pages you track there are kept (saving Tracked Artists leaves them alone), so switching the site back on brings everything back. At least one of Bandcamp, SoundCloud and YouTube has to stay on. </w:t>
+      </w:r>
+      <w:r>
+        <w:rPr>
+          <w:b/>
+        </w:rPr>
+        <w:t xml:space="preserve">Beatport</w:t>
+      </w:r>
+      <w:r>
+        <w:t xml:space="preserve"> and </w:t>
+      </w:r>
+      <w:r>
+        <w:rPr>
+          <w:b/>
+        </w:rPr>
+        <w:t xml:space="preserve">Discogs</w:t>
+      </w:r>
+      <w:r>
+        <w:t xml:space="preserve"> are listed here too, marked Link Finder only and experimental: they have no feed, start switched off, and switching one on also ticks it for Link Finder (see Beatport and Discogs below).</w:t>
       </w:r>
     </w:p>
     <w:p>
@@ -2935,7 +2953,16 @@
     <w:p>
       <w:pPr/>
       <w:r>
-        <w:t xml:space="preserve">Both are optional extra places for Link Finder to look, and both start switched off: tick them under </w:t>
+        <w:t xml:space="preserve">Both are optional extra places for Link Finder to look, and both start switched off: switch them on under </w:t>
+      </w:r>
+      <w:r>
+        <w:rPr>
+          <w:b/>
+        </w:rPr>
+        <w:t xml:space="preserve">Sites</w:t>
+      </w:r>
+      <w:r>
+        <w:t xml:space="preserve"> in Settings, which also ticks them under </w:t>
       </w:r>
       <w:r>
         <w:rPr>
@@ -2944,7 +2971,19 @@
         <w:t xml:space="preserve">Link Finder searches</w:t>
       </w:r>
       <w:r>
-        <w:t xml:space="preserve"> in Settings. Neither has a feed or a column in Tracked Artists.</w:t>
+        <w:t xml:space="preserve"> (untick them there to keep the site on but stop searching it), then press Save. Neither has a feed or a column in Tracked Artists.</w:t>
+      </w:r>
+    </w:p>
+    <w:p>
+      <w:pPr/>
+      <w:r>
+        <w:rPr>
+          <w:b/>
+        </w:rPr>
+        <w:t xml:space="preserve">Both are experimental.</w:t>
+      </w:r>
+      <w:r>
+        <w:t xml:space="preserve"> They were built without access to the real Beatport and Discogs sites and tested only against stand-in copies, so their results may be unreliable: a track that is there may not be found, a match may be the wrong track or release, and either site can stop answering if it changes how it works. Check their links before relying on them, and treat a Beatport · check match or Discogs result as a lead rather than an answer.</w:t>
       </w:r>
     </w:p>
     <w:p>
@@ -2980,7 +3019,7 @@
         <w:t xml:space="preserve">Discogs</w:t>
       </w:r>
       <w:r>
-        <w:t xml:space="preserve"> is the last resort: it is only searched when the track itself wasn't found on Bandcamp, Beatport, SoundCloud or YouTube. It can turn up releases that exist only on vinyl. Link Finder asks Discogs for releases by the artist with that track, opens the track lists of up to three of them, and links the release the track is on (the note says its formats, such as Vinyl). A release found there comes before an artist page. Discogs only answers signed-in apps, so it needs a free personal access token: on discogs.com go to Settings → Developers → </w:t>
+        <w:t xml:space="preserve"> is the last resort: it is only searched when the track itself wasn't found on Bandcamp, Beatport, SoundCloud or YouTube. It can turn up releases that exist only on vinyl. Link Finder asks Discogs for releases by the artist with that track, opens the track lists of up to three of them, and links that release's main page on Discogs, the one that gathers all its pressings and versions (a release with no main page is linked directly; the note says its formats, such as Vinyl). A release found there comes before an artist page. Discogs only answers signed-in apps, so it needs a free personal access token: on discogs.com go to Settings → Developers → </w:t>
       </w:r>
       <w:r>
         <w:rPr>
@@ -2989,7 +3028,7 @@
         <w:t xml:space="preserve">Generate new token</w:t>
       </w:r>
       <w:r>
-        <w:t xml:space="preserve">, then paste it into the box that appears in Settings when Discogs is ticked and press Save (or set </w:t>
+        <w:t xml:space="preserve">, then paste it into the box that appears in Settings when Discogs is switched on and press Save (or set </w:t>
       </w:r>
       <w:r>
         <w:rPr>
@@ -3318,7 +3357,7 @@
           <w:p>
             <w:pPr/>
             <w:r>
-              <w:t xml:space="preserve">Not found on any other site, but on a release listed on Discogs (often vinyl-only). The link is that release; the note gives its formats. Only when Discogs is ticked and a token is set.</w:t>
+              <w:t xml:space="preserve">Not found on any other site, but on a release listed on Discogs (often vinyl-only). The link is the release's main page; the note gives its formats. Only when Discogs is switched on and a token is set. Experimental: may be wrong.</w:t>
             </w:r>
           </w:p>
         </w:tc>
@@ -6387,6 +6426,24 @@
         <w:rPr>
           <w:b/>
         </w:rPr>
+        <w:t xml:space="preserve">Beatport and Discogs lookups are experimental.</w:t>
+      </w:r>
+      <w:r>
+        <w:t xml:space="preserve"> Neither has been tried against the real site. Beatport is read the way a browser reads its search page and may be blocked; Discogs answers through its API but which release is picked is untested. Results from either may be missing or wrong.</w:t>
+      </w:r>
+    </w:p>
+    <w:p>
+      <w:pPr>
+        <w:pStyle w:val="ListParagraph"/>
+        <w:numPr>
+          <w:ilvl w:val="0"/>
+          <w:numId w:val="29"/>
+        </w:numPr>
+      </w:pPr>
+      <w:r>
+        <w:rPr>
+          <w:b/>
+        </w:rPr>
         <w:t xml:space="preserve">Bandcamp limits how fast it can be read.</w:t>
       </w:r>
       <w:r>
@@ -7039,6 +7096,30 @@
             <w:pPr/>
             <w:r>
               <w:t xml:space="preserve">What changed</w:t>
+            </w:r>
+          </w:p>
+        </w:tc>
+      </w:tr>
+      <w:tr>
+        <w:tc>
+          <w:tcPr>
+            <w:tcW w:w="1616" w:type="dxa"/>
+          </w:tcPr>
+          <w:p>
+            <w:pPr/>
+            <w:r>
+              <w:t xml:space="preserve">78</w:t>
+            </w:r>
+          </w:p>
+        </w:tc>
+        <w:tc>
+          <w:tcPr>
+            <w:tcW w:w="7743" w:type="dxa"/>
+          </w:tcPr>
+          <w:p>
+            <w:pPr/>
+            <w:r>
+              <w:t xml:space="preserve">Beatport and Discogs are listed under Sites in Settings (Link Finder only, experimental), both off by default; switching one on also ticks it for Link Finder. Discogs results link the release's main page. Notes that both lookups may be unreliable.</w:t>
             </w:r>
           </w:p>
         </w:tc>

</xml_diff>

<commit_message>
v79: Show the Downloads button moved to Link Finder, beside the Bandcamp username.
Co-Authored-By: Claude Opus 5.5 <noreply@anthropic.com>
Claude-Session: https://claude.ai/code/session_01Xj1HuHJX1zYNh76RWBnCyx
</commit_message>
<xml_diff>
--- a/docs/Artist Feed User Guide.docx
+++ b/docs/Artist Feed User Guide.docx
@@ -13,13 +13,13 @@
     <w:p>
       <w:pPr/>
       <w:r>
-        <w:t xml:space="preserve">Oct 16, 2026</w:t>
-      </w:r>
-      <w:r>
-        <w:t xml:space="preserve"/>
-      </w:r>
-      <w:r>
-        <w:t xml:space="preserve"/>
+        <w:t xml:space="preserve">Oct 10, 2026</w:t>
+      </w:r>
+      <w:r>
+        <w:t xml:space="preserve"> · </w:t>
+      </w:r>
+      <w:r>
+        <w:t xml:space="preserve">@Its</w:t>
       </w:r>
     </w:p>
     <w:p>
@@ -33,7 +33,7 @@
     <w:p>
       <w:pPr/>
       <w:r>
-        <w:t xml:space="preserve">This guide describes Artist Feed version 78. The version number is shown in small grey text beside the title at the top of the app.</w:t>
+        <w:t xml:space="preserve">This guide describes Artist Feed version 79. The version number is shown in small grey text beside the title at the top of the app.</w:t>
       </w:r>
     </w:p>
     <w:p>
@@ -2316,7 +2316,7 @@
         <w:t xml:space="preserve">Show the Downloads button</w:t>
       </w:r>
       <w:r>
-        <w:t xml:space="preserve"> in Settings. While it is off the button stays in place, greyed out, and hovering over it says how to turn it on; purchases aren't watched for downloads and any waiting count is dropped, so switching it on starts fresh. Link Finder still uses your purchases either way.</w:t>
+        <w:t xml:space="preserve">, right beside the username box in Link Finder. While it is off the button stays in place, greyed out, and hovering over it says how to turn it on; purchases aren't watched for downloads and any waiting count is dropped, so switching it on starts fresh. Link Finder still uses your purchases either way.</w:t>
       </w:r>
     </w:p>
     <w:p>
@@ -2766,7 +2766,7 @@
         <w:t xml:space="preserve">Settings</w:t>
       </w:r>
       <w:r>
-        <w:t xml:space="preserve"> button (top right, beside Tracked Artists and Link Finder) opens two lists of checkboxes, the Downloads switch and a box for your SoundCloud username. Nothing changes until you press </w:t>
+        <w:t xml:space="preserve"> button (top right, beside Tracked Artists and Link Finder) opens two lists of checkboxes and a box for your SoundCloud username. Nothing changes until you press </w:t>
       </w:r>
       <w:r>
         <w:rPr>
@@ -3563,7 +3563,16 @@
         <w:t xml:space="preserve">Your Bandcamp username.</w:t>
       </w:r>
       <w:r>
-        <w:t xml:space="preserve"> Lets the app read your public collection page. Your purchases are checked before anything is searched.</w:t>
+        <w:t xml:space="preserve"> Lets the app read your public collection page. Your purchases are checked before anything is searched. Beside it, </w:t>
+      </w:r>
+      <w:r>
+        <w:rPr>
+          <w:b/>
+        </w:rPr>
+        <w:t xml:space="preserve">Show the Downloads button</w:t>
+      </w:r>
+      <w:r>
+        <w:t xml:space="preserve"> switches the Downloads button (top right) on or off; it takes effect straight away and starts off.</w:t>
       </w:r>
     </w:p>
     <w:p>
@@ -7096,6 +7105,30 @@
             <w:pPr/>
             <w:r>
               <w:t xml:space="preserve">What changed</w:t>
+            </w:r>
+          </w:p>
+        </w:tc>
+      </w:tr>
+      <w:tr>
+        <w:tc>
+          <w:tcPr>
+            <w:tcW w:w="1616" w:type="dxa"/>
+          </w:tcPr>
+          <w:p>
+            <w:pPr/>
+            <w:r>
+              <w:t xml:space="preserve">79</w:t>
+            </w:r>
+          </w:p>
+        </w:tc>
+        <w:tc>
+          <w:tcPr>
+            <w:tcW w:w="7743" w:type="dxa"/>
+          </w:tcPr>
+          <w:p>
+            <w:pPr/>
+            <w:r>
+              <w:t xml:space="preserve">Show the Downloads button moved from Settings to Link Finder, beside your Bandcamp username, and takes effect straight away.</w:t>
             </w:r>
           </w:p>
         </w:tc>

</xml_diff>

<commit_message>
v80: Display settings: text size and colour scheme (Dark, Light, High contrast, Match this device)
Co-Authored-By: Claude Opus 5.5 <noreply@anthropic.com>
Claude-Session: https://claude.ai/code/session_01Xj1HuHJX1zYNh76RWBnCyx
</commit_message>
<xml_diff>
--- a/docs/Artist Feed User Guide.docx
+++ b/docs/Artist Feed User Guide.docx
@@ -33,7 +33,7 @@
     <w:p>
       <w:pPr/>
       <w:r>
-        <w:t xml:space="preserve">This guide describes Artist Feed version 79. The version number is shown in small grey text beside the title at the top of the app.</w:t>
+        <w:t xml:space="preserve">This guide describes Artist Feed version 80. The version number is shown in small grey text beside the title at the top of the app.</w:t>
       </w:r>
     </w:p>
     <w:p>
@@ -2766,7 +2766,7 @@
         <w:t xml:space="preserve">Settings</w:t>
       </w:r>
       <w:r>
-        <w:t xml:space="preserve"> button (top right, beside Tracked Artists and Link Finder) opens two lists of checkboxes and a box for your SoundCloud username. Nothing changes until you press </w:t>
+        <w:t xml:space="preserve"> button (top right, beside Tracked Artists and Link Finder) opens the display choices, two lists of checkboxes and a box for your SoundCloud username. Nothing changes until you press </w:t>
       </w:r>
       <w:r>
         <w:rPr>
@@ -2803,6 +2803,72 @@
       </w:r>
       <w:r>
         <w:t xml:space="preserve"> (or Escape) with changes not yet saved asks before dropping them.</w:t>
+      </w:r>
+    </w:p>
+    <w:p>
+      <w:pPr/>
+      <w:r>
+        <w:rPr>
+          <w:b/>
+        </w:rPr>
+        <w:t xml:space="preserve">Display.</w:t>
+      </w:r>
+      <w:r>
+        <w:t xml:space="preserve"> How the app looks: </w:t>
+      </w:r>
+      <w:r>
+        <w:rPr>
+          <w:b/>
+        </w:rPr>
+        <w:t xml:space="preserve">Text size</w:t>
+      </w:r>
+      <w:r>
+        <w:t xml:space="preserve"> makes everything larger or smaller (90% to 150%), and </w:t>
+      </w:r>
+      <w:r>
+        <w:rPr>
+          <w:b/>
+        </w:rPr>
+        <w:t xml:space="preserve">Colour scheme</w:t>
+      </w:r>
+      <w:r>
+        <w:t xml:space="preserve"> picks </w:t>
+      </w:r>
+      <w:r>
+        <w:rPr>
+          <w:b/>
+        </w:rPr>
+        <w:t xml:space="preserve">Dark</w:t>
+      </w:r>
+      <w:r>
+        <w:t xml:space="preserve"> (the default), </w:t>
+      </w:r>
+      <w:r>
+        <w:rPr>
+          <w:b/>
+        </w:rPr>
+        <w:t xml:space="preserve">Light</w:t>
+      </w:r>
+      <w:r>
+        <w:t xml:space="preserve">, </w:t>
+      </w:r>
+      <w:r>
+        <w:rPr>
+          <w:b/>
+        </w:rPr>
+        <w:t xml:space="preserve">High contrast</w:t>
+      </w:r>
+      <w:r>
+        <w:t xml:space="preserve"> (black and white with yellow highlights and thicker outlines) or </w:t>
+      </w:r>
+      <w:r>
+        <w:rPr>
+          <w:b/>
+        </w:rPr>
+        <w:t xml:space="preserve">Match this device</w:t>
+      </w:r>
+      <w:r>
+        <w:t xml:space="preserve">, which follows the light or dark setting of the computer or phone. They take effect when you press Save. Each browser or device keeps its own choice, so a phone can be set differently from a computer, and they are not part of the saved data.</w:t>
       </w:r>
     </w:p>
     <w:p>
@@ -7105,6 +7171,30 @@
             <w:pPr/>
             <w:r>
               <w:t xml:space="preserve">What changed</w:t>
+            </w:r>
+          </w:p>
+        </w:tc>
+      </w:tr>
+      <w:tr>
+        <w:tc>
+          <w:tcPr>
+            <w:tcW w:w="1616" w:type="dxa"/>
+          </w:tcPr>
+          <w:p>
+            <w:pPr/>
+            <w:r>
+              <w:t xml:space="preserve">80</w:t>
+            </w:r>
+          </w:p>
+        </w:tc>
+        <w:tc>
+          <w:tcPr>
+            <w:tcW w:w="7743" w:type="dxa"/>
+          </w:tcPr>
+          <w:p>
+            <w:pPr/>
+            <w:r>
+              <w:t xml:space="preserve">Display settings: text size (90% to 150%) and colour scheme (Dark, Light, High contrast or Match this device), kept per browser or device.</w:t>
             </w:r>
           </w:p>
         </w:tc>

</xml_diff>

<commit_message>
v81: a release shown on an artist's Bandcamp page but sold from another page links to the page that sells it
Co-Authored-By: Claude Opus 5.5 <noreply@anthropic.com>
Claude-Session: https://claude.ai/code/session_01Xj1HuHJX1zYNh76RWBnCyx
</commit_message>
<xml_diff>
--- a/docs/Artist Feed User Guide.docx
+++ b/docs/Artist Feed User Guide.docx
@@ -33,7 +33,7 @@
     <w:p>
       <w:pPr/>
       <w:r>
-        <w:t xml:space="preserve">This guide describes Artist Feed version 80. The version number is shown in small grey text beside the title at the top of the app.</w:t>
+        <w:t xml:space="preserve">This guide describes Artist Feed version 81. The version number is shown in small grey text beside the title at the top of the app.</w:t>
       </w:r>
     </w:p>
     <w:p>
@@ -2597,7 +2597,7 @@
     <w:p>
       <w:pPr/>
       <w:r>
-        <w:t xml:space="preserve">Labels work the same way as artists: add the label's Bandcamp page as a row. A release that reaches the feed through both an artist's page and a label's page is shown once.</w:t>
+        <w:t xml:space="preserve">Labels work the same way as artists: add the label's Bandcamp page as a row. A release that reaches the feed through both an artist's page and a label's page is shown once. Some artists' pages show a release that is sold from another page, usually the label's: that copy has no tracks and nothing to buy. The app links and plays the page that sells it instead, whether or not you track that page, and Link Finder gives that page too.</w:t>
       </w:r>
     </w:p>
     <w:p>
@@ -7171,6 +7171,30 @@
             <w:pPr/>
             <w:r>
               <w:t xml:space="preserve">What changed</w:t>
+            </w:r>
+          </w:p>
+        </w:tc>
+      </w:tr>
+      <w:tr>
+        <w:tc>
+          <w:tcPr>
+            <w:tcW w:w="1616" w:type="dxa"/>
+          </w:tcPr>
+          <w:p>
+            <w:pPr/>
+            <w:r>
+              <w:t xml:space="preserve">81</w:t>
+            </w:r>
+          </w:p>
+        </w:tc>
+        <w:tc>
+          <w:tcPr>
+            <w:tcW w:w="7743" w:type="dxa"/>
+          </w:tcPr>
+          <w:p>
+            <w:pPr/>
+            <w:r>
+              <w:t xml:space="preserve">A release shown on an artist's Bandcamp page but sold from another page (a label's), with no tracks and nothing to buy, now links and plays the page that sells it, in the feed and in Link Finder. Releases already saved without tracks are read again once.</w:t>
             </w:r>
           </w:p>
         </w:tc>

</xml_diff>

<commit_message>
v82: a Bandcamp release with nothing to buy and no link is searched for once, else marked Not for sale on this page; Link Finder only falls back to such pages
Co-Authored-By: Claude Opus 5.5 <noreply@anthropic.com>
Claude-Session: https://claude.ai/code/session_01Xj1HuHJX1zYNh76RWBnCyx
</commit_message>
<xml_diff>
--- a/docs/Artist Feed User Guide.docx
+++ b/docs/Artist Feed User Guide.docx
@@ -33,7 +33,7 @@
     <w:p>
       <w:pPr/>
       <w:r>
-        <w:t xml:space="preserve">This guide describes Artist Feed version 81. The version number is shown in small grey text beside the title at the top of the app.</w:t>
+        <w:t xml:space="preserve">This guide describes Artist Feed version 82. The version number is shown in small grey text beside the title at the top of the app.</w:t>
       </w:r>
     </w:p>
     <w:p>
@@ -2597,7 +2597,7 @@
     <w:p>
       <w:pPr/>
       <w:r>
-        <w:t xml:space="preserve">Labels work the same way as artists: add the label's Bandcamp page as a row. A release that reaches the feed through both an artist's page and a label's page is shown once. Some artists' pages show a release that is sold from another page, usually the label's: that copy has no tracks and nothing to buy. The app links and plays the page that sells it instead, whether or not you track that page, and Link Finder gives that page too.</w:t>
+        <w:t xml:space="preserve">Labels work the same way as artists: add the label's Bandcamp page as a row. A release that reaches the feed through both an artist's page and a label's page is shown once. Some artists' pages show a release that is sold from another page, usually the label's: that copy has no tracks and nothing to buy. The app links and plays the page that sells it instead, whether or not you track that page, and Link Finder gives that page too. When such a page doesn't say where the release is sold, the app searches Bandcamp once for the same title and artist on another page and uses what it finds; if nothing turns up, the card says Not for sale on this page (in the list, beside the release name).</w:t>
       </w:r>
     </w:p>
     <w:p>
@@ -3603,7 +3603,7 @@
         <w:t xml:space="preserve">Add link</w:t>
       </w:r>
       <w:r>
-        <w:t xml:space="preserve">. Skip stops the search for that track at once (or before it starts) and moves on; it is marked Skipped and nothing is saved for it, so it is searched for next time unless you add a link. Add link sets the link you already know, and that track is not searched. A row whose link is a guess (a SoundCloud profile picked by name alone, or a partial Bandcamp, Beatport or Discogs match) is marked Needs review and tinted red. It stays that way after the lookup finishes, until you press Looks right, which keeps the link as one you set, or correct it with Edit.</w:t>
+        <w:t xml:space="preserve">. Skip stops the search for that track at once (or before it starts) and moves on; it is marked Skipped and nothing is saved for it, so it is searched for next time unless you add a link. Add link sets the link you already know, and that track is not searched. A row whose link is a guess (a SoundCloud profile picked by name alone, a partial Bandcamp, Beatport or Discogs match, or a Bandcamp page with nothing to buy on it, given only when nothing better turned up) is marked Needs review and tinted red. It stays that way after the lookup finishes, until you press Looks right, which keeps the link as one you set, or correct it with Edit.</w:t>
       </w:r>
     </w:p>
     <w:p>
@@ -7171,6 +7171,30 @@
             <w:pPr/>
             <w:r>
               <w:t xml:space="preserve">What changed</w:t>
+            </w:r>
+          </w:p>
+        </w:tc>
+      </w:tr>
+      <w:tr>
+        <w:tc>
+          <w:tcPr>
+            <w:tcW w:w="1616" w:type="dxa"/>
+          </w:tcPr>
+          <w:p>
+            <w:pPr/>
+            <w:r>
+              <w:t xml:space="preserve">82</w:t>
+            </w:r>
+          </w:p>
+        </w:tc>
+        <w:tc>
+          <w:tcPr>
+            <w:tcW w:w="7743" w:type="dxa"/>
+          </w:tcPr>
+          <w:p>
+            <w:pPr/>
+            <w:r>
+              <w:t xml:space="preserve">A Bandcamp release with no tracks and nothing to buy that doesn't say where it is sold: the feed searches Bandcamp once for the page that sells it, else marks the card Not for sale on this page. Link Finder keeps looking past such a page and gives it only as a last resort, marked Needs review.</w:t>
             </w:r>
           </w:p>
         </w:tc>

</xml_diff>

<commit_message>
v83: workspaces (named groups of artists, Focus the first), Import follows from SoundCloud or Bandcamp, Find missing links on the rows shown or one row
Co-Authored-By: Claude Opus 5.5 <noreply@anthropic.com>
Claude-Session: https://claude.ai/code/session_01Xj1HuHJX1zYNh76RWBnCyx
</commit_message>
<xml_diff>
--- a/docs/Artist Feed User Guide.docx
+++ b/docs/Artist Feed User Guide.docx
@@ -33,7 +33,7 @@
     <w:p>
       <w:pPr/>
       <w:r>
-        <w:t xml:space="preserve">This guide describes Artist Feed version 82. The version number is shown in small grey text beside the title at the top of the app.</w:t>
+        <w:t xml:space="preserve">This guide describes Artist Feed version 83. The version number is shown in small grey text beside the title at the top of the app.</w:t>
       </w:r>
     </w:p>
     <w:p>
@@ -1740,22 +1740,46 @@
         <w:pStyle w:val="Heading3"/>
       </w:pPr>
       <w:r>
-        <w:t xml:space="preserve">Focus Feed</w:t>
-      </w:r>
-    </w:p>
-    <w:p>
-      <w:pPr/>
-      <w:r>
-        <w:t xml:space="preserve">The </w:t>
-      </w:r>
-      <w:r>
-        <w:rPr>
-          <w:b/>
-        </w:rPr>
-        <w:t xml:space="preserve">Focus Feed</w:t>
-      </w:r>
-      <w:r>
-        <w:t xml:space="preserve"> button, beside Grid | List, shows only the artists ticked in the </w:t>
+        <w:t xml:space="preserve">Workspaces</w:t>
+      </w:r>
+    </w:p>
+    <w:p>
+      <w:pPr/>
+      <w:r>
+        <w:t xml:space="preserve">A workspace is a group of artists with its own name, such as Focus, Labels or Deep dubstep. The </w:t>
+      </w:r>
+      <w:r>
+        <w:rPr>
+          <w:b/>
+        </w:rPr>
+        <w:t xml:space="preserve">workspace menu</w:t>
+      </w:r>
+      <w:r>
+        <w:t xml:space="preserve"> at the top, beside Search, shows only the artists in the one you pick, with how many each holds; </w:t>
+      </w:r>
+      <w:r>
+        <w:rPr>
+          <w:b/>
+        </w:rPr>
+        <w:t xml:space="preserve">Every artist</w:t>
+      </w:r>
+      <w:r>
+        <w:t xml:space="preserve"> (or Clear filters) shows everyone again. The other filters still apply on top of it, and Export Feed exports what is shown.</w:t>
+      </w:r>
+    </w:p>
+    <w:p>
+      <w:pPr/>
+      <w:r>
+        <w:t xml:space="preserve">Workspaces are set up in Tracked Artists. Press </w:t>
+      </w:r>
+      <w:r>
+        <w:rPr>
+          <w:b/>
+        </w:rPr>
+        <w:t xml:space="preserve">Workspaces</w:t>
+      </w:r>
+      <w:r>
+        <w:t xml:space="preserve"> to add one, rename it, move it up or down, or remove it (its artists stay tracked). Each workspace gets a column of checkboxes left of the artist's name: tick the artists in it. An artist can be in several. Changes are kept when you press Save changes. </w:t>
       </w:r>
       <w:r>
         <w:rPr>
@@ -1764,7 +1788,7 @@
         <w:t xml:space="preserve">Focus</w:t>
       </w:r>
       <w:r>
-        <w:t xml:space="preserve"> column of Tracked Artists: a short list of the ones you want to follow most closely, out of everyone you track. Click it again (or Clear filters) to show everyone. The other filters still apply on top of it. Tick or untick Focus in Tracked Artists, then Save changes.</w:t>
+        <w:t xml:space="preserve"> is there from the start and holds the artists you ticked for the Focus Feed in earlier versions.</w:t>
       </w:r>
     </w:p>
     <w:p>
@@ -2489,7 +2513,7 @@
         </w:numPr>
       </w:pPr>
       <w:r>
-        <w:t xml:space="preserve">The ✕ at the end of a row marks it for removal: the row turns a dark red-grey, its text is struck through, and an Undo button takes the ✕'s place. Nothing is removed until you Save, which stops tracking those artists and removes their posts after asking you to confirm. A new row that was never saved goes at once. The Focus column, left of the artist's name, picks the artists shown by the Focus Feed button.</w:t>
+        <w:t xml:space="preserve">The ✕ at the end of a row marks it for removal: the row turns a dark red-grey, its text is struck through, and an Undo button takes the ✕'s place. Nothing is removed until you Save, which stops tracking those artists and removes their posts after asking you to confirm. A new row that was never saved goes at once. Each workspace has a column of checkboxes left of the artist's name (see Workspaces).</w:t>
       </w:r>
     </w:p>
     <w:p>
@@ -2567,7 +2591,7 @@
         <w:t xml:space="preserve">Needs attention</w:t>
       </w:r>
       <w:r>
-        <w:t xml:space="preserve"> shows rows with a problem (a page that couldn't be read, or a save error), and there are also Still being checked, No posts yet, New, not saved yet, Ticked for YouTube search, Ticked for Focus, and Marked for removal. Each option shows how many rows it holds. Click a column heading to sort by it, again to reverse, and a third time to go back to the usual order; sorting by Status puts rows with problems first, then those with the fewest posts. Filtering and sorting only change what is shown: saving still saves every row, and pasting a block of cells fills the rows on screen, leaving filtered-out rows alone.</w:t>
+        <w:t xml:space="preserve"> shows rows with a problem (a page that couldn't be read, or a save error), and there are also Still being checked, No posts yet, New, not saved yet, Ticked for YouTube search, one for each workspace (In Focus, say), and Marked for removal. Each option shows how many rows it holds. Click a column heading to sort by it, again to reverse, and a third time to go back to the usual order; sorting by Status puts rows with problems first, then those with the fewest posts. Filtering and sorting only change what is shown: saving still saves every row, and pasting a block of cells fills the rows on screen, leaving filtered-out rows alone.</w:t>
       </w:r>
     </w:p>
     <w:p>
@@ -2640,7 +2664,7 @@
         <w:t xml:space="preserve">Find missing links</w:t>
       </w:r>
       <w:r>
-        <w:t xml:space="preserve"> goes through every row that has an empty cell and looks for what is missing: the Bandcamp page, the SoundCloud profile, or the name when only a link was given. It works one row at a time at Bandcamp's pace, and the button reads Stop while it runs. As in a Link Finder lookup, the panel glows while it works, rows still to be searched have a blue tint, and the row being searched pulses.</w:t>
+        <w:t xml:space="preserve"> goes through every row that has an empty cell (or, while the table is filtered, only the rows shown: the button then reads Find missing links (shown rows)) and looks for what is missing: the Bandcamp page, the SoundCloud profile, or the name when only a link was given. It works one row at a time at Bandcamp's pace, and the button reads Stop while it runs. As in a Link Finder lookup, the panel glows while it works, rows still to be searched have a blue tint, and the row being searched pulses.</w:t>
       </w:r>
     </w:p>
     <w:p>
@@ -2724,6 +2748,65 @@
       </w:r>
       <w:r>
         <w:t xml:space="preserve"> checkbox. Tick it and press Find missing links to search that row's empty cells again, including ones you cleared. A guess you removed is not offered again for that cell, so a rescan returns the next best match or nothing. The box unticks itself after the run. Typing a link into a cleared cell also ends its "left empty" state.</w:t>
+      </w:r>
+    </w:p>
+    <w:p>
+      <w:pPr/>
+      <w:r>
+        <w:t xml:space="preserve">To search one row only, press </w:t>
+      </w:r>
+      <w:r>
+        <w:rPr>
+          <w:b/>
+        </w:rPr>
+        <w:t xml:space="preserve">Find links</w:t>
+      </w:r>
+      <w:r>
+        <w:t xml:space="preserve"> in its Status column. It appears on rows with something to look for.</w:t>
+      </w:r>
+    </w:p>
+    <w:p>
+      <w:pPr>
+        <w:pStyle w:val="Heading3"/>
+      </w:pPr>
+      <w:r>
+        <w:t xml:space="preserve">Import follows</w:t>
+      </w:r>
+    </w:p>
+    <w:p>
+      <w:pPr/>
+      <w:r>
+        <w:rPr>
+          <w:b/>
+        </w:rPr>
+        <w:t xml:space="preserve">Import follows</w:t>
+      </w:r>
+      <w:r>
+        <w:t xml:space="preserve"> adds the artists and labels an account follows. Pick SoundCloud or Bandcamp, enter the username (the one in Settings or Link Finder is filled in for you) and press </w:t>
+      </w:r>
+      <w:r>
+        <w:rPr>
+          <w:b/>
+        </w:rPr>
+        <w:t xml:space="preserve">Read follows</w:t>
+      </w:r>
+      <w:r>
+        <w:t xml:space="preserve">. SoundCloud lists the profiles any account follows; Bandcamp lists the artists and labels a fan follows when the fan page is public. YouTube keeps subscriptions private, so it can't be read.</w:t>
+      </w:r>
+    </w:p>
+    <w:p>
+      <w:pPr/>
+      <w:r>
+        <w:t xml:space="preserve">The list shows everyone followed, with the ones already tracked or already in the table greyed out. Untick any you don't want (Select all ticks or unticks the rest), optionally choose a workspace to put them in, and press </w:t>
+      </w:r>
+      <w:r>
+        <w:rPr>
+          <w:b/>
+        </w:rPr>
+        <w:t xml:space="preserve">Add to table</w:t>
+      </w:r>
+      <w:r>
+        <w:t xml:space="preserve">. Each becomes a new row, highlighted for review, or joins the row that already has that name. Nothing is tracked until you Save changes. Find missing links can then fill in their other sites.</w:t>
       </w:r>
     </w:p>
     <w:p>
@@ -7171,6 +7254,30 @@
             <w:pPr/>
             <w:r>
               <w:t xml:space="preserve">What changed</w:t>
+            </w:r>
+          </w:p>
+        </w:tc>
+      </w:tr>
+      <w:tr>
+        <w:tc>
+          <w:tcPr>
+            <w:tcW w:w="1616" w:type="dxa"/>
+          </w:tcPr>
+          <w:p>
+            <w:pPr/>
+            <w:r>
+              <w:t xml:space="preserve">83</w:t>
+            </w:r>
+          </w:p>
+        </w:tc>
+        <w:tc>
+          <w:tcPr>
+            <w:tcW w:w="7743" w:type="dxa"/>
+          </w:tcPr>
+          <w:p>
+            <w:pPr/>
+            <w:r>
+              <w:t xml:space="preserve">Workspaces: named groups of artists, each with a checkbox column in Tracked Artists and a choice in the new workspace menu at the top (Focus becomes the first). Import follows adds the artists and labels a SoundCloud account or Bandcamp fan follows. Find missing links searches only the rows shown while the table is filtered, and each row has its own Find links.</w:t>
             </w:r>
           </w:p>
         </w:tc>

</xml_diff>

<commit_message>
v84: Not for sale on this page only when the Bandcamp page itself says the release has no tracks
Co-Authored-By: Claude Opus 5.5 <noreply@anthropic.com>
Claude-Session: https://claude.ai/code/session_01Xj1HuHJX1zYNh76RWBnCyx
</commit_message>
<xml_diff>
--- a/docs/Artist Feed User Guide.docx
+++ b/docs/Artist Feed User Guide.docx
@@ -33,7 +33,7 @@
     <w:p>
       <w:pPr/>
       <w:r>
-        <w:t xml:space="preserve">This guide describes Artist Feed version 83. The version number is shown in small grey text beside the title at the top of the app.</w:t>
+        <w:t xml:space="preserve">This guide describes Artist Feed version 84. The version number is shown in small grey text beside the title at the top of the app.</w:t>
       </w:r>
     </w:p>
     <w:p>
@@ -7254,6 +7254,30 @@
             <w:pPr/>
             <w:r>
               <w:t xml:space="preserve">What changed</w:t>
+            </w:r>
+          </w:p>
+        </w:tc>
+      </w:tr>
+      <w:tr>
+        <w:tc>
+          <w:tcPr>
+            <w:tcW w:w="1616" w:type="dxa"/>
+          </w:tcPr>
+          <w:p>
+            <w:pPr/>
+            <w:r>
+              <w:t xml:space="preserve">84</w:t>
+            </w:r>
+          </w:p>
+        </w:tc>
+        <w:tc>
+          <w:tcPr>
+            <w:tcW w:w="7743" w:type="dxa"/>
+          </w:tcPr>
+          <w:p>
+            <w:pPr/>
+            <w:r>
+              <w:t xml:space="preserve">Not for sale on this page is only shown when the Bandcamp page itself says the release has no tracks, so a page the app couldn't fully read is no longer marked.</w:t>
             </w:r>
           </w:p>
         </w:tc>

</xml_diff>

<commit_message>
Guide: drop the notes about Instagram not being included
Co-Authored-By: Claude Opus 5.5 <noreply@anthropic.com>
Claude-Session: https://claude.ai/code/session_01Xj1HuHJX1zYNh76RWBnCyx
</commit_message>
<xml_diff>
--- a/docs/Artist Feed User Guide.docx
+++ b/docs/Artist Feed User Guide.docx
@@ -132,18 +132,6 @@
       <w:pPr/>
       <w:r>
         <w:t xml:space="preserve">What it does not do:</w:t>
-      </w:r>
-    </w:p>
-    <w:p>
-      <w:pPr>
-        <w:pStyle w:val="ListParagraph"/>
-        <w:numPr>
-          <w:ilvl w:val="0"/>
-          <w:numId w:val="3"/>
-        </w:numPr>
-      </w:pPr>
-      <w:r>
-        <w:t xml:space="preserve">Instagram is not included. The app is built so that another site can be added as one file, but none has been.</w:t>
       </w:r>
     </w:p>
     <w:p>
@@ -6746,7 +6734,7 @@
         <w:rPr>
           <w:b/>
         </w:rPr>
-        <w:t xml:space="preserve">No Instagram, no login, no "mark as unheard".</w:t>
+        <w:t xml:space="preserve">No login, no "mark as unheard".</w:t>
       </w:r>
     </w:p>
     <w:p>

</xml_diff>

<commit_message>
Guide: choosing between Docker, the desktop app and Python; quick update steps; getting and updating the desktop .exe
Co-Authored-By: Claude Opus 5.5 <noreply@anthropic.com>
Claude-Session: https://claude.ai/code/session_01Xj1HuHJX1zYNh76RWBnCyx
</commit_message>
<xml_diff>
--- a/docs/Artist Feed User Guide.docx
+++ b/docs/Artist Feed User Guide.docx
@@ -169,7 +169,7 @@
     <w:p>
       <w:pPr/>
       <w:r>
-        <w:t xml:space="preserve">There are two ways to run the app. </w:t>
+        <w:t xml:space="preserve">There are three ways to run the app, compared under Which way to choose. </w:t>
       </w:r>
       <w:r>
         <w:rPr>
@@ -178,7 +178,7 @@
         <w:t xml:space="preserve">Docker</w:t>
       </w:r>
       <w:r>
-        <w:t xml:space="preserve"> is the recommended one: Docker Desktop is a free program that runs the app in its own sealed-off space, with everything it needs included, and starts it again whenever the computer starts. You don't need to learn Docker to use it; the few commands below are all there is. If you would rather not install Docker, see </w:t>
+        <w:t xml:space="preserve"> is the recommended one: Docker Desktop is a free program that runs the app in its own sealed-off space, with everything it needs included, and starts it again whenever the computer starts. You don't need to learn Docker to use it; the few commands below are all there is. If you would rather not install Docker, see The desktop app or </w:t>
       </w:r>
       <w:r>
         <w:rPr>
@@ -219,6 +219,116 @@
         <w:pStyle w:val="Heading3"/>
       </w:pPr>
       <w:r>
+        <w:t xml:space="preserve">Which way to choose</w:t>
+      </w:r>
+    </w:p>
+    <w:p>
+      <w:pPr/>
+      <w:r>
+        <w:t xml:space="preserve">There are three ways to run Artist Feed. All three keep the same kind of data, so you can move between them later.</w:t>
+      </w:r>
+    </w:p>
+    <w:p>
+      <w:pPr>
+        <w:pStyle w:val="ListParagraph"/>
+        <w:numPr>
+          <w:ilvl w:val="0"/>
+          <w:numId w:val="4"/>
+        </w:numPr>
+      </w:pPr>
+      <w:r>
+        <w:rPr>
+          <w:b/>
+        </w:rPr>
+        <w:t xml:space="preserve">Docker (recommended, and the easiest to keep up to date).</w:t>
+      </w:r>
+      <w:r>
+        <w:t xml:space="preserve"> Updating is two commands (see </w:t>
+      </w:r>
+      <w:r>
+        <w:rPr>
+          <w:i/>
+        </w:rPr>
+        <w:t xml:space="preserve">Updating to a new version</w:t>
+      </w:r>
+      <w:r>
+        <w:t xml:space="preserve">), your data stays where it is, the app starts by itself with the computer, and every new feature arrives here first. The price is installing Docker Desktop once and typing a few commands.</w:t>
+      </w:r>
+    </w:p>
+    <w:p>
+      <w:pPr>
+        <w:pStyle w:val="ListParagraph"/>
+        <w:numPr>
+          <w:ilvl w:val="0"/>
+          <w:numId w:val="4"/>
+        </w:numPr>
+      </w:pPr>
+      <w:r>
+        <w:rPr>
+          <w:b/>
+        </w:rPr>
+        <w:t xml:space="preserve">The desktop app (an .exe).</w:t>
+      </w:r>
+      <w:r>
+        <w:t xml:space="preserve"> No Docker, no browser and, once you have the .exe, no commands: double-click </w:t>
+      </w:r>
+      <w:r>
+        <w:rPr>
+          <w:b/>
+        </w:rPr>
+        <w:t xml:space="preserve">ArtistFeed.exe</w:t>
+      </w:r>
+      <w:r>
+        <w:t xml:space="preserve"> and it opens in its own window. It is a separate version of the app written for desktops, with the same features. Each feature reaches it after the Docker version, and updating means swapping in a newly built .exe. See </w:t>
+      </w:r>
+      <w:r>
+        <w:rPr>
+          <w:i/>
+        </w:rPr>
+        <w:t xml:space="preserve">The desktop app</w:t>
+      </w:r>
+      <w:r>
+        <w:t xml:space="preserve"> below.</w:t>
+      </w:r>
+    </w:p>
+    <w:p>
+      <w:pPr>
+        <w:pStyle w:val="ListParagraph"/>
+        <w:numPr>
+          <w:ilvl w:val="0"/>
+          <w:numId w:val="4"/>
+        </w:numPr>
+      </w:pPr>
+      <w:r>
+        <w:rPr>
+          <w:b/>
+        </w:rPr>
+        <w:t xml:space="preserve">Running without Docker (Python).</w:t>
+      </w:r>
+      <w:r>
+        <w:t xml:space="preserve"> The Docker version's own code, run with Python instead. For people who don't want Docker but don't mind leaving a terminal window open. See </w:t>
+      </w:r>
+      <w:r>
+        <w:rPr>
+          <w:i/>
+        </w:rPr>
+        <w:t xml:space="preserve">Running without Docker</w:t>
+      </w:r>
+      <w:r>
+        <w:t xml:space="preserve">.</w:t>
+      </w:r>
+    </w:p>
+    <w:p>
+      <w:pPr/>
+      <w:r>
+        <w:t xml:space="preserve">If you are not sure, choose Docker. Choose the desktop app if typing commands is the bigger obstacle and you are happy to fetch a new .exe now and then.</w:t>
+      </w:r>
+    </w:p>
+    <w:p>
+      <w:pPr>
+        <w:pStyle w:val="Heading3"/>
+      </w:pPr>
+      <w:r>
         <w:t xml:space="preserve">Installing Docker Desktop (once)</w:t>
       </w:r>
     </w:p>
@@ -227,7 +337,7 @@
         <w:pStyle w:val="ListParagraph"/>
         <w:numPr>
           <w:ilvl w:val="0"/>
-          <w:numId w:val="4"/>
+          <w:numId w:val="5"/>
         </w:numPr>
       </w:pPr>
       <w:r>
@@ -257,7 +367,7 @@
         <w:pStyle w:val="ListParagraph"/>
         <w:numPr>
           <w:ilvl w:val="0"/>
-          <w:numId w:val="4"/>
+          <w:numId w:val="5"/>
         </w:numPr>
       </w:pPr>
       <w:r>
@@ -269,7 +379,7 @@
         <w:pStyle w:val="ListParagraph"/>
         <w:numPr>
           <w:ilvl w:val="0"/>
-          <w:numId w:val="4"/>
+          <w:numId w:val="5"/>
         </w:numPr>
       </w:pPr>
       <w:r>
@@ -295,7 +405,7 @@
         <w:pStyle w:val="ListParagraph"/>
         <w:numPr>
           <w:ilvl w:val="0"/>
-          <w:numId w:val="5"/>
+          <w:numId w:val="6"/>
         </w:numPr>
       </w:pPr>
       <w:r>
@@ -325,7 +435,7 @@
         <w:pStyle w:val="ListParagraph"/>
         <w:numPr>
           <w:ilvl w:val="0"/>
-          <w:numId w:val="5"/>
+          <w:numId w:val="6"/>
         </w:numPr>
       </w:pPr>
       <w:r>
@@ -346,7 +456,7 @@
         <w:pStyle w:val="ListParagraph"/>
         <w:numPr>
           <w:ilvl w:val="0"/>
-          <w:numId w:val="5"/>
+          <w:numId w:val="6"/>
         </w:numPr>
       </w:pPr>
       <w:r>
@@ -376,7 +486,7 @@
         <w:pStyle w:val="ListParagraph"/>
         <w:numPr>
           <w:ilvl w:val="0"/>
-          <w:numId w:val="5"/>
+          <w:numId w:val="6"/>
         </w:numPr>
       </w:pPr>
       <w:r>
@@ -397,7 +507,7 @@
         <w:pStyle w:val="ListParagraph"/>
         <w:numPr>
           <w:ilvl w:val="0"/>
-          <w:numId w:val="5"/>
+          <w:numId w:val="6"/>
         </w:numPr>
       </w:pPr>
       <w:r>
@@ -506,11 +616,136 @@
       </w:r>
     </w:p>
     <w:p>
-      <w:pPr>
-        <w:pStyle w:val="ListParagraph"/>
-        <w:numPr>
-          <w:ilvl w:val="0"/>
-          <w:numId w:val="6"/>
+      <w:pPr/>
+      <w:r>
+        <w:rPr>
+          <w:b/>
+        </w:rPr>
+        <w:t xml:space="preserve">The quick way (with Git).</w:t>
+      </w:r>
+      <w:r>
+        <w:t xml:space="preserve"> If the app's folder came from </w:t>
+      </w:r>
+      <w:r>
+        <w:rPr>
+          <w:rStyle w:val="CodeChar"/>
+        </w:rPr>
+        <w:t xml:space="preserve">git clone</w:t>
+      </w:r>
+      <w:r>
+        <w:t xml:space="preserve"> (see </w:t>
+      </w:r>
+      <w:r>
+        <w:rPr>
+          <w:i/>
+        </w:rPr>
+        <w:t xml:space="preserve">Keeping it in Git</w:t>
+      </w:r>
+      <w:r>
+        <w:t xml:space="preserve">), updating is two commands. Open PowerShell, go to the app's folder, then fetch the new version and rebuild:</w:t>
+      </w:r>
+    </w:p>
+    <w:p>
+      <w:pPr>
+        <w:pStyle w:val="Code"/>
+      </w:pPr>
+      <w:bookmarkStart w:id="1" w:name="bongo_lang_powershell_1"/>
+      <w:bookmarkEnd w:id="1"/>
+      <w:r>
+        <w:t xml:space="preserve">cd "C:\Users\you\Documents\artist-feed"</w:t>
+        <w:br/>
+        <w:t xml:space="preserve">git pull</w:t>
+        <w:br/>
+        <w:t xml:space="preserve">docker compose up -d --build</w:t>
+      </w:r>
+    </w:p>
+    <w:p>
+      <w:pPr/>
+      <w:r>
+        <w:rPr>
+          <w:rStyle w:val="CodeChar"/>
+        </w:rPr>
+        <w:t xml:space="preserve">cd</w:t>
+      </w:r>
+      <w:r>
+        <w:t xml:space="preserve"> (change directory) moves PowerShell into a folder, so the next commands act on that folder. Replace the path with your own app folder, the one that contains </w:t>
+      </w:r>
+      <w:r>
+        <w:rPr>
+          <w:rStyle w:val="CodeChar"/>
+        </w:rPr>
+        <w:t xml:space="preserve">docker-compose.yml</w:t>
+      </w:r>
+      <w:r>
+        <w:t xml:space="preserve">. Keep the double quotes; they matter when the path has spaces in it. To find the path, open the folder in File Explorer and click the address bar: the path it shows is what goes after </w:t>
+      </w:r>
+      <w:r>
+        <w:rPr>
+          <w:rStyle w:val="CodeChar"/>
+        </w:rPr>
+        <w:t xml:space="preserve">cd</w:t>
+      </w:r>
+      <w:r>
+        <w:t xml:space="preserve">. Or type </w:t>
+      </w:r>
+      <w:r>
+        <w:rPr>
+          <w:rStyle w:val="CodeChar"/>
+        </w:rPr>
+        <w:t xml:space="preserve">cd</w:t>
+      </w:r>
+      <w:r>
+        <w:t xml:space="preserve"> and a space in PowerShell, drag the folder from File Explorer onto the PowerShell window, and press Enter. If PowerShell is already open in the app's folder, as when you open it from that folder's address bar, skip the </w:t>
+      </w:r>
+      <w:r>
+        <w:rPr>
+          <w:rStyle w:val="CodeChar"/>
+        </w:rPr>
+        <w:t xml:space="preserve">cd</w:t>
+      </w:r>
+      <w:r>
+        <w:t xml:space="preserve"> line.</w:t>
+      </w:r>
+    </w:p>
+    <w:p>
+      <w:pPr/>
+      <w:r>
+        <w:rPr>
+          <w:rStyle w:val="CodeChar"/>
+        </w:rPr>
+        <w:t xml:space="preserve">git pull</w:t>
+      </w:r>
+      <w:r>
+        <w:t xml:space="preserve"> downloads the new version's files, and </w:t>
+      </w:r>
+      <w:r>
+        <w:rPr>
+          <w:rStyle w:val="CodeChar"/>
+        </w:rPr>
+        <w:t xml:space="preserve">docker compose up -d --build</w:t>
+      </w:r>
+      <w:r>
+        <w:t xml:space="preserve"> rebuilds and restarts the app with them. Your data folder is never touched. When it finishes, reload the page and check the version number beside the title.</w:t>
+      </w:r>
+    </w:p>
+    <w:p>
+      <w:pPr/>
+      <w:r>
+        <w:rPr>
+          <w:b/>
+        </w:rPr>
+        <w:t xml:space="preserve">Without Git</w:t>
+      </w:r>
+      <w:r>
+        <w:t xml:space="preserve">, follow these steps:</w:t>
+      </w:r>
+    </w:p>
+    <w:p>
+      <w:pPr>
+        <w:pStyle w:val="ListParagraph"/>
+        <w:numPr>
+          <w:ilvl w:val="0"/>
+          <w:numId w:val="7"/>
         </w:numPr>
       </w:pPr>
       <w:r>
@@ -531,7 +766,7 @@
         <w:pStyle w:val="ListParagraph"/>
         <w:numPr>
           <w:ilvl w:val="0"/>
-          <w:numId w:val="6"/>
+          <w:numId w:val="7"/>
         </w:numPr>
       </w:pPr>
       <w:r>
@@ -552,7 +787,7 @@
         <w:pStyle w:val="ListParagraph"/>
         <w:numPr>
           <w:ilvl w:val="0"/>
-          <w:numId w:val="6"/>
+          <w:numId w:val="7"/>
         </w:numPr>
       </w:pPr>
       <w:r>
@@ -573,7 +808,7 @@
         <w:pStyle w:val="ListParagraph"/>
         <w:numPr>
           <w:ilvl w:val="0"/>
-          <w:numId w:val="6"/>
+          <w:numId w:val="7"/>
         </w:numPr>
       </w:pPr>
       <w:r>
@@ -594,7 +829,7 @@
         <w:pStyle w:val="ListParagraph"/>
         <w:numPr>
           <w:ilvl w:val="0"/>
-          <w:numId w:val="6"/>
+          <w:numId w:val="7"/>
         </w:numPr>
       </w:pPr>
       <w:r>
@@ -1032,7 +1267,7 @@
         <w:pStyle w:val="ListParagraph"/>
         <w:numPr>
           <w:ilvl w:val="0"/>
-          <w:numId w:val="7"/>
+          <w:numId w:val="8"/>
         </w:numPr>
       </w:pPr>
       <w:r>
@@ -1059,7 +1294,7 @@
         <w:pStyle w:val="ListParagraph"/>
         <w:numPr>
           <w:ilvl w:val="0"/>
-          <w:numId w:val="7"/>
+          <w:numId w:val="8"/>
         </w:numPr>
       </w:pPr>
       <w:r>
@@ -1071,7 +1306,7 @@
         <w:pStyle w:val="ListParagraph"/>
         <w:numPr>
           <w:ilvl w:val="0"/>
-          <w:numId w:val="7"/>
+          <w:numId w:val="8"/>
         </w:numPr>
       </w:pPr>
       <w:r>
@@ -1129,7 +1364,7 @@
         <w:pStyle w:val="ListParagraph"/>
         <w:numPr>
           <w:ilvl w:val="0"/>
-          <w:numId w:val="8"/>
+          <w:numId w:val="9"/>
         </w:numPr>
       </w:pPr>
       <w:r>
@@ -1150,7 +1385,7 @@
         <w:pStyle w:val="ListParagraph"/>
         <w:numPr>
           <w:ilvl w:val="0"/>
-          <w:numId w:val="8"/>
+          <w:numId w:val="9"/>
         </w:numPr>
       </w:pPr>
       <w:r>
@@ -1346,6 +1581,445 @@
         <w:pStyle w:val="Heading3"/>
       </w:pPr>
       <w:r>
+        <w:t xml:space="preserve">The desktop app (no Docker)</w:t>
+      </w:r>
+    </w:p>
+    <w:p>
+      <w:pPr/>
+      <w:r>
+        <w:t xml:space="preserve">Artist Feed also comes as a desktop program: </w:t>
+      </w:r>
+      <w:r>
+        <w:rPr>
+          <w:b/>
+        </w:rPr>
+        <w:t xml:space="preserve">ArtistFeed.exe</w:t>
+      </w:r>
+      <w:r>
+        <w:t xml:space="preserve"> on Windows (and versions for Mac and Linux). It does what the Docker version does, with the feed, Tracked Artists, Link Finder and Settings, in a window of its own instead of a browser tab. Its code is in its own repository, </w:t>
+      </w:r>
+      <w:r>
+        <w:rPr>
+          <w:b/>
+        </w:rPr>
+        <w:t xml:space="preserve">divided-eye/artist-feed-desktop</w:t>
+      </w:r>
+      <w:r>
+        <w:t xml:space="preserve"> on GitHub. It is the same app rebuilt for desktops, so each new feature comes to it after the Docker version.</w:t>
+      </w:r>
+    </w:p>
+    <w:p>
+      <w:pPr/>
+      <w:r>
+        <w:rPr>
+          <w:b/>
+        </w:rPr>
+        <w:t xml:space="preserve">Getting the .exe without any commands.</w:t>
+      </w:r>
+      <w:r>
+        <w:t xml:space="preserve"> GitHub can build it for you:</w:t>
+      </w:r>
+    </w:p>
+    <w:p>
+      <w:pPr>
+        <w:pStyle w:val="ListParagraph"/>
+        <w:numPr>
+          <w:ilvl w:val="0"/>
+          <w:numId w:val="10"/>
+        </w:numPr>
+      </w:pPr>
+      <w:r>
+        <w:t xml:space="preserve">Sign in to GitHub and open the </w:t>
+      </w:r>
+      <w:r>
+        <w:rPr>
+          <w:b/>
+        </w:rPr>
+        <w:t xml:space="preserve">artist-feed-desktop</w:t>
+      </w:r>
+      <w:r>
+        <w:t xml:space="preserve"> repository.</w:t>
+      </w:r>
+    </w:p>
+    <w:p>
+      <w:pPr>
+        <w:pStyle w:val="ListParagraph"/>
+        <w:numPr>
+          <w:ilvl w:val="0"/>
+          <w:numId w:val="10"/>
+        </w:numPr>
+      </w:pPr>
+      <w:r>
+        <w:t xml:space="preserve">Click </w:t>
+      </w:r>
+      <w:r>
+        <w:rPr>
+          <w:b/>
+        </w:rPr>
+        <w:t xml:space="preserve">Actions</w:t>
+      </w:r>
+      <w:r>
+        <w:t xml:space="preserve">, then </w:t>
+      </w:r>
+      <w:r>
+        <w:rPr>
+          <w:b/>
+        </w:rPr>
+        <w:t xml:space="preserve">Build</w:t>
+      </w:r>
+      <w:r>
+        <w:t xml:space="preserve"> in the list on the left, then </w:t>
+      </w:r>
+      <w:r>
+        <w:rPr>
+          <w:b/>
+        </w:rPr>
+        <w:t xml:space="preserve">Run workflow</w:t>
+      </w:r>
+      <w:r>
+        <w:t xml:space="preserve"> → </w:t>
+      </w:r>
+      <w:r>
+        <w:rPr>
+          <w:b/>
+        </w:rPr>
+        <w:t xml:space="preserve">Run workflow</w:t>
+      </w:r>
+      <w:r>
+        <w:t xml:space="preserve">.</w:t>
+      </w:r>
+    </w:p>
+    <w:p>
+      <w:pPr>
+        <w:pStyle w:val="ListParagraph"/>
+        <w:numPr>
+          <w:ilvl w:val="0"/>
+          <w:numId w:val="10"/>
+        </w:numPr>
+      </w:pPr>
+      <w:r>
+        <w:t xml:space="preserve">Wait for the run to finish with a green tick; this takes a few minutes. Click the run.</w:t>
+      </w:r>
+    </w:p>
+    <w:p>
+      <w:pPr>
+        <w:pStyle w:val="ListParagraph"/>
+        <w:numPr>
+          <w:ilvl w:val="0"/>
+          <w:numId w:val="10"/>
+        </w:numPr>
+      </w:pPr>
+      <w:r>
+        <w:t xml:space="preserve">Under </w:t>
+      </w:r>
+      <w:r>
+        <w:rPr>
+          <w:b/>
+        </w:rPr>
+        <w:t xml:space="preserve">Artifacts</w:t>
+      </w:r>
+      <w:r>
+        <w:t xml:space="preserve"> at the bottom, download </w:t>
+      </w:r>
+      <w:r>
+        <w:rPr>
+          <w:b/>
+        </w:rPr>
+        <w:t xml:space="preserve">ArtistFeed-windows</w:t>
+      </w:r>
+      <w:r>
+        <w:t xml:space="preserve"> (or </w:t>
+      </w:r>
+      <w:r>
+        <w:rPr>
+          <w:b/>
+        </w:rPr>
+        <w:t xml:space="preserve">ArtistFeed-mac-apple-silicon</w:t>
+      </w:r>
+      <w:r>
+        <w:t xml:space="preserve">, </w:t>
+      </w:r>
+      <w:r>
+        <w:rPr>
+          <w:b/>
+        </w:rPr>
+        <w:t xml:space="preserve">ArtistFeed-mac-intel</w:t>
+      </w:r>
+      <w:r>
+        <w:t xml:space="preserve"> or </w:t>
+      </w:r>
+      <w:r>
+        <w:rPr>
+          <w:b/>
+        </w:rPr>
+        <w:t xml:space="preserve">ArtistFeed-linux</w:t>
+      </w:r>
+      <w:r>
+        <w:t xml:space="preserve">) and unzip it.</w:t>
+      </w:r>
+    </w:p>
+    <w:p>
+      <w:pPr>
+        <w:pStyle w:val="ListParagraph"/>
+        <w:numPr>
+          <w:ilvl w:val="0"/>
+          <w:numId w:val="10"/>
+        </w:numPr>
+      </w:pPr>
+      <w:r>
+        <w:t xml:space="preserve">Put </w:t>
+      </w:r>
+      <w:r>
+        <w:rPr>
+          <w:b/>
+        </w:rPr>
+        <w:t xml:space="preserve">ArtistFeed.exe</w:t>
+      </w:r>
+      <w:r>
+        <w:t xml:space="preserve"> in a folder of its own that you will keep, such as </w:t>
+      </w:r>
+      <w:r>
+        <w:rPr>
+          <w:rStyle w:val="CodeChar"/>
+        </w:rPr>
+        <w:t xml:space="preserve">C:\Users\you\Apps\ArtistFeed</w:t>
+      </w:r>
+      <w:r>
+        <w:t xml:space="preserve">, and double-click it. You can pin it to the taskbar or make a shortcut to it like any program.</w:t>
+      </w:r>
+    </w:p>
+    <w:p>
+      <w:pPr/>
+      <w:r>
+        <w:t xml:space="preserve">The .exe isn't signed, so the first time Windows SmartScreen asks whether to run it: click </w:t>
+      </w:r>
+      <w:r>
+        <w:rPr>
+          <w:b/>
+        </w:rPr>
+        <w:t xml:space="preserve">More info</w:t>
+      </w:r>
+      <w:r>
+        <w:t xml:space="preserve">, then </w:t>
+      </w:r>
+      <w:r>
+        <w:rPr>
+          <w:b/>
+        </w:rPr>
+        <w:t xml:space="preserve">Run anyway</w:t>
+      </w:r>
+      <w:r>
+        <w:t xml:space="preserve">. On a Mac, right-click the app and choose </w:t>
+      </w:r>
+      <w:r>
+        <w:rPr>
+          <w:b/>
+        </w:rPr>
+        <w:t xml:space="preserve">Open</w:t>
+      </w:r>
+      <w:r>
+        <w:t xml:space="preserve"> the first time. GitHub keeps each run's downloads for 90 days.</w:t>
+      </w:r>
+    </w:p>
+    <w:p>
+      <w:pPr/>
+      <w:r>
+        <w:rPr>
+          <w:b/>
+        </w:rPr>
+        <w:t xml:space="preserve">Building it yourself instead (once you have Git).</w:t>
+      </w:r>
+      <w:r>
+        <w:t xml:space="preserve"> Install the .NET 10 SDK (</w:t>
+      </w:r>
+      <w:r>
+        <w:rPr>
+          <w:rStyle w:val="CodeChar"/>
+        </w:rPr>
+        <w:t xml:space="preserve">winget install Microsoft.DotNet.SDK.10</w:t>
+      </w:r>
+      <w:r>
+        <w:t xml:space="preserve"> in PowerShell, or from dotnet.microsoft.com), then in PowerShell:</w:t>
+      </w:r>
+    </w:p>
+    <w:p>
+      <w:pPr>
+        <w:pStyle w:val="Code"/>
+      </w:pPr>
+      <w:bookmarkStart w:id="2" w:name="bongo_lang_powershell_2"/>
+      <w:bookmarkEnd w:id="2"/>
+      <w:r>
+        <w:t xml:space="preserve">git clone https://github.com/divided-eye/artist-feed-desktop.git</w:t>
+        <w:br/>
+        <w:t xml:space="preserve">cd artist-feed-desktop</w:t>
+        <w:br/>
+        <w:t xml:space="preserve">dotnet publish src/ArtistFeed.App -c Release -r win-x64 --self-contained true -p:PublishSingleFile=true -p:IncludeNativeLibrariesForSelfExtract=true -o publish</w:t>
+      </w:r>
+    </w:p>
+    <w:p>
+      <w:pPr/>
+      <w:r>
+        <w:t xml:space="preserve">The finished </w:t>
+      </w:r>
+      <w:r>
+        <w:rPr>
+          <w:b/>
+        </w:rPr>
+        <w:t xml:space="preserve">ArtistFeed.exe</w:t>
+      </w:r>
+      <w:r>
+        <w:t xml:space="preserve"> is in the </w:t>
+      </w:r>
+      <w:r>
+        <w:rPr>
+          <w:rStyle w:val="CodeChar"/>
+        </w:rPr>
+        <w:t xml:space="preserve">publish</w:t>
+      </w:r>
+      <w:r>
+        <w:t xml:space="preserve"> folder. Copy it to your own folder as in step 5. It runs on computers without .NET installed.</w:t>
+      </w:r>
+    </w:p>
+    <w:p>
+      <w:pPr/>
+      <w:r>
+        <w:rPr>
+          <w:b/>
+        </w:rPr>
+        <w:t xml:space="preserve">Your data.</w:t>
+      </w:r>
+      <w:r>
+        <w:t xml:space="preserve"> The desktop app keeps its data in its own place, not in the app's folder: </w:t>
+      </w:r>
+      <w:r>
+        <w:rPr>
+          <w:rStyle w:val="CodeChar"/>
+        </w:rPr>
+        <w:t xml:space="preserve">%APPDATA%\ArtistFeed</w:t>
+      </w:r>
+      <w:r>
+        <w:t xml:space="preserve"> on Windows (paste that into File Explorer's address bar to open it). </w:t>
+      </w:r>
+      <w:r>
+        <w:rPr>
+          <w:b/>
+        </w:rPr>
+        <w:t xml:space="preserve">Settings → Your data</w:t>
+      </w:r>
+      <w:r>
+        <w:t xml:space="preserve"> shows the exact path. To bring over your artists, feed and saved lookups from the Docker version, stop it first (</w:t>
+      </w:r>
+      <w:r>
+        <w:rPr>
+          <w:rStyle w:val="CodeChar"/>
+        </w:rPr>
+        <w:t xml:space="preserve">docker compose stop</w:t>
+      </w:r>
+      <w:r>
+        <w:t xml:space="preserve">), then choose </w:t>
+      </w:r>
+      <w:r>
+        <w:rPr>
+          <w:b/>
+        </w:rPr>
+        <w:t xml:space="preserve">Settings → Your data → Import from the web version…</w:t>
+      </w:r>
+      <w:r>
+        <w:t xml:space="preserve"> and pick the Docker version's </w:t>
+      </w:r>
+      <w:r>
+        <w:rPr>
+          <w:rStyle w:val="CodeChar"/>
+        </w:rPr>
+        <w:t xml:space="preserve">data\feed.db</w:t>
+      </w:r>
+      <w:r>
+        <w:t xml:space="preserve">. It takes over the next time you open the desktop app. Don't run both versions on one data file at the same time.</w:t>
+      </w:r>
+    </w:p>
+    <w:p>
+      <w:pPr/>
+      <w:r>
+        <w:rPr>
+          <w:b/>
+        </w:rPr>
+        <w:t xml:space="preserve">Updating the desktop app.</w:t>
+      </w:r>
+      <w:r>
+        <w:t xml:space="preserve"> Get a new .exe (run the </w:t>
+      </w:r>
+      <w:r>
+        <w:rPr>
+          <w:b/>
+        </w:rPr>
+        <w:t xml:space="preserve">Build</w:t>
+      </w:r>
+      <w:r>
+        <w:t xml:space="preserve"> workflow again, or run </w:t>
+      </w:r>
+      <w:r>
+        <w:rPr>
+          <w:rStyle w:val="CodeChar"/>
+        </w:rPr>
+        <w:t xml:space="preserve">git pull</w:t>
+      </w:r>
+      <w:r>
+        <w:t xml:space="preserve"> and the same </w:t>
+      </w:r>
+      <w:r>
+        <w:rPr>
+          <w:rStyle w:val="CodeChar"/>
+        </w:rPr>
+        <w:t xml:space="preserve">dotnet publish</w:t>
+      </w:r>
+      <w:r>
+        <w:t xml:space="preserve"> line in the </w:t>
+      </w:r>
+      <w:r>
+        <w:rPr>
+          <w:rStyle w:val="CodeChar"/>
+        </w:rPr>
+        <w:t xml:space="preserve">artist-feed-desktop</w:t>
+      </w:r>
+      <w:r>
+        <w:t xml:space="preserve"> folder). Close the app, copy the new </w:t>
+      </w:r>
+      <w:r>
+        <w:rPr>
+          <w:b/>
+        </w:rPr>
+        <w:t xml:space="preserve">ArtistFeed.exe</w:t>
+      </w:r>
+      <w:r>
+        <w:t xml:space="preserve"> over the old one in your folder, and open it again. Your data isn't in that folder, so nothing is lost.</w:t>
+      </w:r>
+    </w:p>
+    <w:p>
+      <w:pPr/>
+      <w:r>
+        <w:rPr>
+          <w:b/>
+        </w:rPr>
+        <w:t xml:space="preserve">Which is easier to maintain?</w:t>
+      </w:r>
+      <w:r>
+        <w:t xml:space="preserve"> Docker. Its update is </w:t>
+      </w:r>
+      <w:r>
+        <w:rPr>
+          <w:rStyle w:val="CodeChar"/>
+        </w:rPr>
+        <w:t xml:space="preserve">git pull</w:t>
+      </w:r>
+      <w:r>
+        <w:t xml:space="preserve"> plus one rebuild command, it restarts by itself, and it gets new features first. The desktop app saves you Docker and the terminal day to day, but each update means fetching and swapping a new .exe yourself.</w:t>
+      </w:r>
+    </w:p>
+    <w:p>
+      <w:pPr>
+        <w:pStyle w:val="Heading3"/>
+      </w:pPr>
+      <w:r>
         <w:t xml:space="preserve">On a Mac</w:t>
       </w:r>
     </w:p>
@@ -1680,7 +2354,7 @@
         <w:pStyle w:val="ListParagraph"/>
         <w:numPr>
           <w:ilvl w:val="0"/>
-          <w:numId w:val="9"/>
+          <w:numId w:val="11"/>
         </w:numPr>
       </w:pPr>
       <w:r>
@@ -1698,7 +2372,7 @@
         <w:pStyle w:val="ListParagraph"/>
         <w:numPr>
           <w:ilvl w:val="0"/>
-          <w:numId w:val="9"/>
+          <w:numId w:val="11"/>
         </w:numPr>
       </w:pPr>
       <w:r>
@@ -1716,7 +2390,7 @@
         <w:pStyle w:val="ListParagraph"/>
         <w:numPr>
           <w:ilvl w:val="0"/>
-          <w:numId w:val="9"/>
+          <w:numId w:val="11"/>
         </w:numPr>
       </w:pPr>
       <w:r>
@@ -1792,7 +2466,7 @@
         <w:pStyle w:val="ListParagraph"/>
         <w:numPr>
           <w:ilvl w:val="0"/>
-          <w:numId w:val="10"/>
+          <w:numId w:val="12"/>
         </w:numPr>
       </w:pPr>
       <w:r>
@@ -1804,7 +2478,7 @@
         <w:pStyle w:val="ListParagraph"/>
         <w:numPr>
           <w:ilvl w:val="0"/>
-          <w:numId w:val="10"/>
+          <w:numId w:val="12"/>
         </w:numPr>
       </w:pPr>
       <w:r>
@@ -1825,7 +2499,7 @@
         <w:pStyle w:val="ListParagraph"/>
         <w:numPr>
           <w:ilvl w:val="0"/>
-          <w:numId w:val="10"/>
+          <w:numId w:val="12"/>
         </w:numPr>
       </w:pPr>
       <w:r>
@@ -1837,7 +2511,7 @@
         <w:pStyle w:val="ListParagraph"/>
         <w:numPr>
           <w:ilvl w:val="0"/>
-          <w:numId w:val="10"/>
+          <w:numId w:val="12"/>
         </w:numPr>
       </w:pPr>
       <w:r>
@@ -1855,7 +2529,7 @@
         <w:pStyle w:val="ListParagraph"/>
         <w:numPr>
           <w:ilvl w:val="0"/>
-          <w:numId w:val="10"/>
+          <w:numId w:val="12"/>
         </w:numPr>
       </w:pPr>
       <w:r>
@@ -1891,7 +2565,7 @@
         <w:pStyle w:val="ListParagraph"/>
         <w:numPr>
           <w:ilvl w:val="0"/>
-          <w:numId w:val="10"/>
+          <w:numId w:val="12"/>
         </w:numPr>
       </w:pPr>
       <w:r>
@@ -2179,7 +2853,7 @@
         <w:pStyle w:val="ListParagraph"/>
         <w:numPr>
           <w:ilvl w:val="0"/>
-          <w:numId w:val="11"/>
+          <w:numId w:val="13"/>
         </w:numPr>
       </w:pPr>
       <w:r>
@@ -2191,7 +2865,7 @@
         <w:pStyle w:val="ListParagraph"/>
         <w:numPr>
           <w:ilvl w:val="0"/>
-          <w:numId w:val="11"/>
+          <w:numId w:val="13"/>
         </w:numPr>
       </w:pPr>
       <w:r>
@@ -2203,7 +2877,7 @@
         <w:pStyle w:val="ListParagraph"/>
         <w:numPr>
           <w:ilvl w:val="0"/>
-          <w:numId w:val="11"/>
+          <w:numId w:val="13"/>
         </w:numPr>
       </w:pPr>
       <w:r>
@@ -2215,7 +2889,7 @@
         <w:pStyle w:val="ListParagraph"/>
         <w:numPr>
           <w:ilvl w:val="0"/>
-          <w:numId w:val="11"/>
+          <w:numId w:val="13"/>
         </w:numPr>
       </w:pPr>
       <w:r>
@@ -2227,7 +2901,7 @@
         <w:pStyle w:val="ListParagraph"/>
         <w:numPr>
           <w:ilvl w:val="0"/>
-          <w:numId w:val="11"/>
+          <w:numId w:val="13"/>
         </w:numPr>
       </w:pPr>
       <w:r>
@@ -2247,7 +2921,7 @@
         <w:pStyle w:val="ListParagraph"/>
         <w:numPr>
           <w:ilvl w:val="0"/>
-          <w:numId w:val="12"/>
+          <w:numId w:val="14"/>
         </w:numPr>
       </w:pPr>
       <w:r>
@@ -2259,7 +2933,7 @@
         <w:pStyle w:val="ListParagraph"/>
         <w:numPr>
           <w:ilvl w:val="0"/>
-          <w:numId w:val="12"/>
+          <w:numId w:val="14"/>
         </w:numPr>
       </w:pPr>
       <w:r>
@@ -2280,7 +2954,7 @@
         <w:pStyle w:val="ListParagraph"/>
         <w:numPr>
           <w:ilvl w:val="0"/>
-          <w:numId w:val="12"/>
+          <w:numId w:val="14"/>
         </w:numPr>
       </w:pPr>
       <w:r>
@@ -2292,7 +2966,7 @@
         <w:pStyle w:val="ListParagraph"/>
         <w:numPr>
           <w:ilvl w:val="0"/>
-          <w:numId w:val="12"/>
+          <w:numId w:val="14"/>
         </w:numPr>
       </w:pPr>
       <w:r>
@@ -2336,7 +3010,7 @@
         <w:pStyle w:val="ListParagraph"/>
         <w:numPr>
           <w:ilvl w:val="0"/>
-          <w:numId w:val="13"/>
+          <w:numId w:val="15"/>
         </w:numPr>
       </w:pPr>
       <w:r>
@@ -2348,7 +3022,7 @@
         <w:pStyle w:val="ListParagraph"/>
         <w:numPr>
           <w:ilvl w:val="0"/>
-          <w:numId w:val="13"/>
+          <w:numId w:val="15"/>
         </w:numPr>
       </w:pPr>
       <w:r>
@@ -2360,7 +3034,7 @@
         <w:pStyle w:val="ListParagraph"/>
         <w:numPr>
           <w:ilvl w:val="0"/>
-          <w:numId w:val="13"/>
+          <w:numId w:val="15"/>
         </w:numPr>
       </w:pPr>
       <w:r>
@@ -2372,7 +3046,7 @@
         <w:pStyle w:val="ListParagraph"/>
         <w:numPr>
           <w:ilvl w:val="0"/>
-          <w:numId w:val="13"/>
+          <w:numId w:val="15"/>
         </w:numPr>
       </w:pPr>
       <w:r>
@@ -2384,7 +3058,7 @@
         <w:pStyle w:val="ListParagraph"/>
         <w:numPr>
           <w:ilvl w:val="0"/>
-          <w:numId w:val="13"/>
+          <w:numId w:val="15"/>
         </w:numPr>
       </w:pPr>
       <w:r>
@@ -2419,7 +3093,7 @@
         <w:pStyle w:val="ListParagraph"/>
         <w:numPr>
           <w:ilvl w:val="0"/>
-          <w:numId w:val="14"/>
+          <w:numId w:val="16"/>
         </w:numPr>
       </w:pPr>
       <w:r>
@@ -2440,7 +3114,7 @@
         <w:pStyle w:val="ListParagraph"/>
         <w:numPr>
           <w:ilvl w:val="0"/>
-          <w:numId w:val="14"/>
+          <w:numId w:val="16"/>
         </w:numPr>
       </w:pPr>
       <w:r>
@@ -2452,7 +3126,7 @@
         <w:pStyle w:val="ListParagraph"/>
         <w:numPr>
           <w:ilvl w:val="0"/>
-          <w:numId w:val="14"/>
+          <w:numId w:val="16"/>
         </w:numPr>
       </w:pPr>
       <w:r>
@@ -2464,7 +3138,7 @@
         <w:pStyle w:val="ListParagraph"/>
         <w:numPr>
           <w:ilvl w:val="0"/>
-          <w:numId w:val="14"/>
+          <w:numId w:val="16"/>
         </w:numPr>
       </w:pPr>
       <w:r>
@@ -2476,7 +3150,7 @@
         <w:pStyle w:val="ListParagraph"/>
         <w:numPr>
           <w:ilvl w:val="0"/>
-          <w:numId w:val="14"/>
+          <w:numId w:val="16"/>
         </w:numPr>
       </w:pPr>
       <w:r>
@@ -2497,7 +3171,7 @@
         <w:pStyle w:val="ListParagraph"/>
         <w:numPr>
           <w:ilvl w:val="0"/>
-          <w:numId w:val="14"/>
+          <w:numId w:val="16"/>
         </w:numPr>
       </w:pPr>
       <w:r>
@@ -2509,7 +3183,7 @@
         <w:pStyle w:val="ListParagraph"/>
         <w:numPr>
           <w:ilvl w:val="0"/>
-          <w:numId w:val="14"/>
+          <w:numId w:val="16"/>
         </w:numPr>
       </w:pPr>
       <w:r>
@@ -2536,7 +3210,7 @@
         <w:pStyle w:val="ListParagraph"/>
         <w:numPr>
           <w:ilvl w:val="0"/>
-          <w:numId w:val="14"/>
+          <w:numId w:val="16"/>
         </w:numPr>
       </w:pPr>
       <w:r>
@@ -2660,7 +3334,7 @@
         <w:pStyle w:val="ListParagraph"/>
         <w:numPr>
           <w:ilvl w:val="0"/>
-          <w:numId w:val="15"/>
+          <w:numId w:val="17"/>
         </w:numPr>
       </w:pPr>
       <w:r>
@@ -2672,7 +3346,7 @@
         <w:pStyle w:val="ListParagraph"/>
         <w:numPr>
           <w:ilvl w:val="0"/>
-          <w:numId w:val="15"/>
+          <w:numId w:val="17"/>
         </w:numPr>
       </w:pPr>
       <w:r>
@@ -2684,7 +3358,7 @@
         <w:pStyle w:val="ListParagraph"/>
         <w:numPr>
           <w:ilvl w:val="0"/>
-          <w:numId w:val="15"/>
+          <w:numId w:val="17"/>
         </w:numPr>
       </w:pPr>
       <w:r>
@@ -2696,7 +3370,7 @@
         <w:pStyle w:val="ListParagraph"/>
         <w:numPr>
           <w:ilvl w:val="0"/>
-          <w:numId w:val="15"/>
+          <w:numId w:val="17"/>
         </w:numPr>
       </w:pPr>
       <w:r>
@@ -2708,7 +3382,7 @@
         <w:pStyle w:val="ListParagraph"/>
         <w:numPr>
           <w:ilvl w:val="0"/>
-          <w:numId w:val="15"/>
+          <w:numId w:val="17"/>
         </w:numPr>
       </w:pPr>
       <w:r>
@@ -3048,7 +3722,7 @@
         <w:pStyle w:val="ListParagraph"/>
         <w:numPr>
           <w:ilvl w:val="0"/>
-          <w:numId w:val="16"/>
+          <w:numId w:val="18"/>
         </w:numPr>
       </w:pPr>
       <w:r>
@@ -3060,7 +3734,7 @@
         <w:pStyle w:val="ListParagraph"/>
         <w:numPr>
           <w:ilvl w:val="0"/>
-          <w:numId w:val="16"/>
+          <w:numId w:val="18"/>
         </w:numPr>
       </w:pPr>
       <w:r>
@@ -3072,7 +3746,7 @@
         <w:pStyle w:val="ListParagraph"/>
         <w:numPr>
           <w:ilvl w:val="0"/>
-          <w:numId w:val="16"/>
+          <w:numId w:val="18"/>
         </w:numPr>
       </w:pPr>
       <w:r>
@@ -3128,7 +3802,7 @@
         <w:pStyle w:val="ListParagraph"/>
         <w:numPr>
           <w:ilvl w:val="0"/>
-          <w:numId w:val="17"/>
+          <w:numId w:val="19"/>
         </w:numPr>
       </w:pPr>
       <w:r>
@@ -3146,7 +3820,7 @@
         <w:pStyle w:val="ListParagraph"/>
         <w:numPr>
           <w:ilvl w:val="0"/>
-          <w:numId w:val="17"/>
+          <w:numId w:val="19"/>
         </w:numPr>
       </w:pPr>
       <w:r>
@@ -3240,7 +3914,7 @@
         <w:pStyle w:val="ListParagraph"/>
         <w:numPr>
           <w:ilvl w:val="0"/>
-          <w:numId w:val="18"/>
+          <w:numId w:val="20"/>
         </w:numPr>
       </w:pPr>
       <w:r>
@@ -3252,7 +3926,7 @@
         <w:pStyle w:val="ListParagraph"/>
         <w:numPr>
           <w:ilvl w:val="0"/>
-          <w:numId w:val="18"/>
+          <w:numId w:val="20"/>
         </w:numPr>
       </w:pPr>
       <w:r>
@@ -3264,7 +3938,7 @@
         <w:pStyle w:val="ListParagraph"/>
         <w:numPr>
           <w:ilvl w:val="0"/>
-          <w:numId w:val="18"/>
+          <w:numId w:val="20"/>
         </w:numPr>
       </w:pPr>
       <w:r>
@@ -3276,7 +3950,7 @@
         <w:pStyle w:val="ListParagraph"/>
         <w:numPr>
           <w:ilvl w:val="0"/>
-          <w:numId w:val="18"/>
+          <w:numId w:val="20"/>
         </w:numPr>
       </w:pPr>
       <w:r>
@@ -3690,7 +4364,7 @@
         <w:pStyle w:val="ListParagraph"/>
         <w:numPr>
           <w:ilvl w:val="0"/>
-          <w:numId w:val="19"/>
+          <w:numId w:val="21"/>
         </w:numPr>
       </w:pPr>
       <w:r>
@@ -3717,7 +4391,7 @@
         <w:pStyle w:val="ListParagraph"/>
         <w:numPr>
           <w:ilvl w:val="0"/>
-          <w:numId w:val="19"/>
+          <w:numId w:val="21"/>
         </w:numPr>
       </w:pPr>
       <w:r>
@@ -3735,7 +4409,7 @@
         <w:pStyle w:val="ListParagraph"/>
         <w:numPr>
           <w:ilvl w:val="0"/>
-          <w:numId w:val="19"/>
+          <w:numId w:val="21"/>
         </w:numPr>
       </w:pPr>
       <w:r>
@@ -3796,7 +4470,7 @@
         <w:pStyle w:val="ListParagraph"/>
         <w:numPr>
           <w:ilvl w:val="0"/>
-          <w:numId w:val="20"/>
+          <w:numId w:val="22"/>
         </w:numPr>
       </w:pPr>
       <w:r>
@@ -3808,7 +4482,7 @@
         <w:pStyle w:val="ListParagraph"/>
         <w:numPr>
           <w:ilvl w:val="0"/>
-          <w:numId w:val="20"/>
+          <w:numId w:val="22"/>
         </w:numPr>
       </w:pPr>
       <w:r>
@@ -3820,7 +4494,7 @@
         <w:pStyle w:val="ListParagraph"/>
         <w:numPr>
           <w:ilvl w:val="0"/>
-          <w:numId w:val="20"/>
+          <w:numId w:val="22"/>
         </w:numPr>
       </w:pPr>
       <w:r>
@@ -3931,7 +4605,7 @@
         <w:pStyle w:val="ListParagraph"/>
         <w:numPr>
           <w:ilvl w:val="0"/>
-          <w:numId w:val="21"/>
+          <w:numId w:val="23"/>
         </w:numPr>
       </w:pPr>
       <w:r>
@@ -3943,7 +4617,7 @@
         <w:pStyle w:val="ListParagraph"/>
         <w:numPr>
           <w:ilvl w:val="0"/>
-          <w:numId w:val="21"/>
+          <w:numId w:val="23"/>
         </w:numPr>
       </w:pPr>
       <w:r>
@@ -3955,7 +4629,7 @@
         <w:pStyle w:val="ListParagraph"/>
         <w:numPr>
           <w:ilvl w:val="0"/>
-          <w:numId w:val="21"/>
+          <w:numId w:val="23"/>
         </w:numPr>
       </w:pPr>
       <w:r>
@@ -3967,7 +4641,7 @@
         <w:pStyle w:val="ListParagraph"/>
         <w:numPr>
           <w:ilvl w:val="0"/>
-          <w:numId w:val="21"/>
+          <w:numId w:val="23"/>
         </w:numPr>
       </w:pPr>
       <w:r>
@@ -3985,7 +4659,7 @@
         <w:pStyle w:val="ListParagraph"/>
         <w:numPr>
           <w:ilvl w:val="0"/>
-          <w:numId w:val="22"/>
+          <w:numId w:val="24"/>
         </w:numPr>
       </w:pPr>
       <w:r>
@@ -3997,7 +4671,7 @@
         <w:pStyle w:val="ListParagraph"/>
         <w:numPr>
           <w:ilvl w:val="0"/>
-          <w:numId w:val="22"/>
+          <w:numId w:val="24"/>
         </w:numPr>
       </w:pPr>
       <w:r>
@@ -4009,7 +4683,7 @@
         <w:pStyle w:val="ListParagraph"/>
         <w:numPr>
           <w:ilvl w:val="0"/>
-          <w:numId w:val="22"/>
+          <w:numId w:val="24"/>
         </w:numPr>
       </w:pPr>
       <w:r>
@@ -4021,7 +4695,7 @@
         <w:pStyle w:val="ListParagraph"/>
         <w:numPr>
           <w:ilvl w:val="0"/>
-          <w:numId w:val="22"/>
+          <w:numId w:val="24"/>
         </w:numPr>
       </w:pPr>
       <w:r>
@@ -4118,7 +4792,7 @@
         <w:pStyle w:val="ListParagraph"/>
         <w:numPr>
           <w:ilvl w:val="0"/>
-          <w:numId w:val="23"/>
+          <w:numId w:val="25"/>
         </w:numPr>
       </w:pPr>
       <w:r>
@@ -4130,7 +4804,7 @@
         <w:pStyle w:val="ListParagraph"/>
         <w:numPr>
           <w:ilvl w:val="0"/>
-          <w:numId w:val="23"/>
+          <w:numId w:val="25"/>
         </w:numPr>
       </w:pPr>
       <w:r>
@@ -4162,7 +4836,7 @@
         <w:pStyle w:val="ListParagraph"/>
         <w:numPr>
           <w:ilvl w:val="0"/>
-          <w:numId w:val="24"/>
+          <w:numId w:val="26"/>
         </w:numPr>
       </w:pPr>
       <w:r>
@@ -4180,7 +4854,7 @@
         <w:pStyle w:val="ListParagraph"/>
         <w:numPr>
           <w:ilvl w:val="0"/>
-          <w:numId w:val="24"/>
+          <w:numId w:val="26"/>
         </w:numPr>
       </w:pPr>
       <w:r>
@@ -4218,7 +4892,7 @@
         <w:pStyle w:val="ListParagraph"/>
         <w:numPr>
           <w:ilvl w:val="0"/>
-          <w:numId w:val="25"/>
+          <w:numId w:val="27"/>
         </w:numPr>
       </w:pPr>
       <w:r>
@@ -4236,7 +4910,7 @@
         <w:pStyle w:val="ListParagraph"/>
         <w:numPr>
           <w:ilvl w:val="0"/>
-          <w:numId w:val="25"/>
+          <w:numId w:val="27"/>
         </w:numPr>
       </w:pPr>
       <w:r>
@@ -4254,7 +4928,7 @@
         <w:pStyle w:val="ListParagraph"/>
         <w:numPr>
           <w:ilvl w:val="0"/>
-          <w:numId w:val="25"/>
+          <w:numId w:val="27"/>
         </w:numPr>
       </w:pPr>
       <w:r>
@@ -4278,7 +4952,7 @@
         <w:pStyle w:val="ListParagraph"/>
         <w:numPr>
           <w:ilvl w:val="0"/>
-          <w:numId w:val="26"/>
+          <w:numId w:val="28"/>
         </w:numPr>
       </w:pPr>
       <w:r>
@@ -4290,7 +4964,7 @@
         <w:pStyle w:val="ListParagraph"/>
         <w:numPr>
           <w:ilvl w:val="0"/>
-          <w:numId w:val="26"/>
+          <w:numId w:val="28"/>
         </w:numPr>
       </w:pPr>
       <w:r>
@@ -4302,7 +4976,7 @@
         <w:pStyle w:val="ListParagraph"/>
         <w:numPr>
           <w:ilvl w:val="0"/>
-          <w:numId w:val="26"/>
+          <w:numId w:val="28"/>
         </w:numPr>
       </w:pPr>
       <w:r>
@@ -4314,7 +4988,7 @@
         <w:pStyle w:val="ListParagraph"/>
         <w:numPr>
           <w:ilvl w:val="0"/>
-          <w:numId w:val="26"/>
+          <w:numId w:val="28"/>
         </w:numPr>
       </w:pPr>
       <w:r>
@@ -4326,7 +5000,7 @@
         <w:pStyle w:val="ListParagraph"/>
         <w:numPr>
           <w:ilvl w:val="0"/>
-          <w:numId w:val="26"/>
+          <w:numId w:val="28"/>
         </w:numPr>
       </w:pPr>
       <w:r>
@@ -4338,7 +5012,7 @@
         <w:pStyle w:val="ListParagraph"/>
         <w:numPr>
           <w:ilvl w:val="0"/>
-          <w:numId w:val="26"/>
+          <w:numId w:val="28"/>
         </w:numPr>
       </w:pPr>
       <w:r>
@@ -4350,7 +5024,7 @@
         <w:pStyle w:val="ListParagraph"/>
         <w:numPr>
           <w:ilvl w:val="0"/>
-          <w:numId w:val="26"/>
+          <w:numId w:val="28"/>
         </w:numPr>
       </w:pPr>
       <w:r>
@@ -4370,7 +5044,7 @@
         <w:pStyle w:val="ListParagraph"/>
         <w:numPr>
           <w:ilvl w:val="0"/>
-          <w:numId w:val="27"/>
+          <w:numId w:val="29"/>
         </w:numPr>
       </w:pPr>
       <w:r>
@@ -4382,7 +5056,7 @@
         <w:pStyle w:val="ListParagraph"/>
         <w:numPr>
           <w:ilvl w:val="0"/>
-          <w:numId w:val="27"/>
+          <w:numId w:val="29"/>
         </w:numPr>
       </w:pPr>
       <w:r>
@@ -4394,7 +5068,7 @@
         <w:pStyle w:val="ListParagraph"/>
         <w:numPr>
           <w:ilvl w:val="0"/>
-          <w:numId w:val="27"/>
+          <w:numId w:val="29"/>
         </w:numPr>
       </w:pPr>
       <w:r>
@@ -4406,7 +5080,7 @@
         <w:pStyle w:val="ListParagraph"/>
         <w:numPr>
           <w:ilvl w:val="0"/>
-          <w:numId w:val="27"/>
+          <w:numId w:val="29"/>
         </w:numPr>
       </w:pPr>
       <w:r>
@@ -4418,7 +5092,7 @@
         <w:pStyle w:val="ListParagraph"/>
         <w:numPr>
           <w:ilvl w:val="0"/>
-          <w:numId w:val="27"/>
+          <w:numId w:val="29"/>
         </w:numPr>
       </w:pPr>
       <w:r>
@@ -6440,7 +7114,7 @@
         <w:pStyle w:val="ListParagraph"/>
         <w:numPr>
           <w:ilvl w:val="0"/>
-          <w:numId w:val="28"/>
+          <w:numId w:val="30"/>
         </w:numPr>
       </w:pPr>
       <w:r>
@@ -6461,7 +7135,7 @@
         <w:pStyle w:val="ListParagraph"/>
         <w:numPr>
           <w:ilvl w:val="0"/>
-          <w:numId w:val="28"/>
+          <w:numId w:val="30"/>
         </w:numPr>
       </w:pPr>
       <w:r>
@@ -6473,7 +7147,7 @@
         <w:pStyle w:val="ListParagraph"/>
         <w:numPr>
           <w:ilvl w:val="0"/>
-          <w:numId w:val="28"/>
+          <w:numId w:val="30"/>
         </w:numPr>
       </w:pPr>
       <w:r>
@@ -6494,7 +7168,7 @@
         <w:pStyle w:val="ListParagraph"/>
         <w:numPr>
           <w:ilvl w:val="0"/>
-          <w:numId w:val="28"/>
+          <w:numId w:val="30"/>
         </w:numPr>
       </w:pPr>
       <w:r>
@@ -6529,7 +7203,7 @@
         <w:pStyle w:val="ListParagraph"/>
         <w:numPr>
           <w:ilvl w:val="0"/>
-          <w:numId w:val="29"/>
+          <w:numId w:val="31"/>
         </w:numPr>
       </w:pPr>
       <w:r>
@@ -6547,7 +7221,7 @@
         <w:pStyle w:val="ListParagraph"/>
         <w:numPr>
           <w:ilvl w:val="0"/>
-          <w:numId w:val="29"/>
+          <w:numId w:val="31"/>
         </w:numPr>
       </w:pPr>
       <w:r>
@@ -6565,7 +7239,7 @@
         <w:pStyle w:val="ListParagraph"/>
         <w:numPr>
           <w:ilvl w:val="0"/>
-          <w:numId w:val="29"/>
+          <w:numId w:val="31"/>
         </w:numPr>
       </w:pPr>
       <w:r>
@@ -6583,7 +7257,7 @@
         <w:pStyle w:val="ListParagraph"/>
         <w:numPr>
           <w:ilvl w:val="0"/>
-          <w:numId w:val="29"/>
+          <w:numId w:val="31"/>
         </w:numPr>
       </w:pPr>
       <w:r>
@@ -6601,7 +7275,7 @@
         <w:pStyle w:val="ListParagraph"/>
         <w:numPr>
           <w:ilvl w:val="0"/>
-          <w:numId w:val="29"/>
+          <w:numId w:val="31"/>
         </w:numPr>
       </w:pPr>
       <w:r>
@@ -6619,7 +7293,7 @@
         <w:pStyle w:val="ListParagraph"/>
         <w:numPr>
           <w:ilvl w:val="0"/>
-          <w:numId w:val="29"/>
+          <w:numId w:val="31"/>
         </w:numPr>
       </w:pPr>
       <w:r>
@@ -6637,7 +7311,7 @@
         <w:pStyle w:val="ListParagraph"/>
         <w:numPr>
           <w:ilvl w:val="0"/>
-          <w:numId w:val="29"/>
+          <w:numId w:val="31"/>
         </w:numPr>
       </w:pPr>
       <w:r>
@@ -6655,7 +7329,7 @@
         <w:pStyle w:val="ListParagraph"/>
         <w:numPr>
           <w:ilvl w:val="0"/>
-          <w:numId w:val="29"/>
+          <w:numId w:val="31"/>
         </w:numPr>
       </w:pPr>
       <w:r>
@@ -6673,7 +7347,7 @@
         <w:pStyle w:val="ListParagraph"/>
         <w:numPr>
           <w:ilvl w:val="0"/>
-          <w:numId w:val="29"/>
+          <w:numId w:val="31"/>
         </w:numPr>
       </w:pPr>
       <w:r>
@@ -6691,7 +7365,7 @@
         <w:pStyle w:val="ListParagraph"/>
         <w:numPr>
           <w:ilvl w:val="0"/>
-          <w:numId w:val="29"/>
+          <w:numId w:val="31"/>
         </w:numPr>
       </w:pPr>
       <w:r>
@@ -6709,7 +7383,7 @@
         <w:pStyle w:val="ListParagraph"/>
         <w:numPr>
           <w:ilvl w:val="0"/>
-          <w:numId w:val="29"/>
+          <w:numId w:val="31"/>
         </w:numPr>
       </w:pPr>
       <w:r>
@@ -6727,7 +7401,7 @@
         <w:pStyle w:val="ListParagraph"/>
         <w:numPr>
           <w:ilvl w:val="0"/>
-          <w:numId w:val="29"/>
+          <w:numId w:val="31"/>
         </w:numPr>
       </w:pPr>
       <w:r>
@@ -6742,7 +7416,7 @@
         <w:pStyle w:val="ListParagraph"/>
         <w:numPr>
           <w:ilvl w:val="0"/>
-          <w:numId w:val="29"/>
+          <w:numId w:val="31"/>
         </w:numPr>
       </w:pPr>
       <w:r>
@@ -9461,10 +10135,7 @@
     <w:abstractNumId w:val="0"/>
   </w:num>
   <w:num w:numId="4">
-    <w:abstractNumId w:val="1"/>
-    <w:lvlOverride w:ilvl="0">
-      <w:startOverride w:val="1"/>
-    </w:lvlOverride>
+    <w:abstractNumId w:val="0"/>
   </w:num>
   <w:num w:numId="5">
     <w:abstractNumId w:val="1"/>
@@ -9479,19 +10150,25 @@
     </w:lvlOverride>
   </w:num>
   <w:num w:numId="7">
-    <w:abstractNumId w:val="0"/>
-  </w:num>
-  <w:num w:numId="8">
     <w:abstractNumId w:val="1"/>
     <w:lvlOverride w:ilvl="0">
       <w:startOverride w:val="1"/>
     </w:lvlOverride>
   </w:num>
-  <w:num w:numId="9">
+  <w:num w:numId="8">
     <w:abstractNumId w:val="0"/>
   </w:num>
+  <w:num w:numId="9">
+    <w:abstractNumId w:val="1"/>
+    <w:lvlOverride w:ilvl="0">
+      <w:startOverride w:val="1"/>
+    </w:lvlOverride>
+  </w:num>
   <w:num w:numId="10">
-    <w:abstractNumId w:val="0"/>
+    <w:abstractNumId w:val="1"/>
+    <w:lvlOverride w:ilvl="0">
+      <w:startOverride w:val="1"/>
+    </w:lvlOverride>
   </w:num>
   <w:num w:numId="11">
     <w:abstractNumId w:val="0"/>
@@ -9527,10 +10204,7 @@
     <w:abstractNumId w:val="0"/>
   </w:num>
   <w:num w:numId="22">
-    <w:abstractNumId w:val="1"/>
-    <w:lvlOverride w:ilvl="0">
-      <w:startOverride w:val="1"/>
-    </w:lvlOverride>
+    <w:abstractNumId w:val="0"/>
   </w:num>
   <w:num w:numId="23">
     <w:abstractNumId w:val="0"/>
@@ -9542,10 +10216,7 @@
     </w:lvlOverride>
   </w:num>
   <w:num w:numId="25">
-    <w:abstractNumId w:val="1"/>
-    <w:lvlOverride w:ilvl="0">
-      <w:startOverride w:val="1"/>
-    </w:lvlOverride>
+    <w:abstractNumId w:val="0"/>
   </w:num>
   <w:num w:numId="26">
     <w:abstractNumId w:val="1"/>
@@ -9554,12 +10225,24 @@
     </w:lvlOverride>
   </w:num>
   <w:num w:numId="27">
+    <w:abstractNumId w:val="1"/>
+    <w:lvlOverride w:ilvl="0">
+      <w:startOverride w:val="1"/>
+    </w:lvlOverride>
+  </w:num>
+  <w:num w:numId="28">
+    <w:abstractNumId w:val="1"/>
+    <w:lvlOverride w:ilvl="0">
+      <w:startOverride w:val="1"/>
+    </w:lvlOverride>
+  </w:num>
+  <w:num w:numId="29">
     <w:abstractNumId w:val="0"/>
   </w:num>
-  <w:num w:numId="28">
+  <w:num w:numId="30">
     <w:abstractNumId w:val="0"/>
   </w:num>
-  <w:num w:numId="29">
+  <w:num w:numId="31">
     <w:abstractNumId w:val="0"/>
   </w:num>
 </w:numbering>

</xml_diff>

<commit_message>
v85: faster refresh: a queue per site, a Bandcamp page's first read opens its newest releases, Show new posts during a refresh
Co-Authored-By: Claude Opus 5.5 <noreply@anthropic.com>
Claude-Session: https://claude.ai/code/session_01Xj1HuHJX1zYNh76RWBnCyx
</commit_message>
<xml_diff>
--- a/docs/Artist Feed User Guide.docx
+++ b/docs/Artist Feed User Guide.docx
@@ -33,7 +33,7 @@
     <w:p>
       <w:pPr/>
       <w:r>
-        <w:t xml:space="preserve">This guide describes Artist Feed version 84. The version number is shown in small grey text beside the title at the top of the app.</w:t>
+        <w:t xml:space="preserve">This guide describes Artist Feed version 85. The version number is shown in small grey text beside the title at the top of the app.</w:t>
       </w:r>
     </w:p>
     <w:p>
@@ -2342,6 +2342,30 @@
       </w:r>
     </w:p>
     <w:p>
+      <w:pPr/>
+      <w:r>
+        <w:t xml:space="preserve">You don't have to wait for a long refresh to end. While one runs, a </w:t>
+      </w:r>
+      <w:r>
+        <w:rPr>
+          <w:b/>
+        </w:rPr>
+        <w:t xml:space="preserve">Show new posts</w:t>
+      </w:r>
+      <w:r>
+        <w:t xml:space="preserve"> button beside the status line (for example </w:t>
+      </w:r>
+      <w:r>
+        <w:rPr>
+          <w:b/>
+        </w:rPr>
+        <w:t xml:space="preserve">Show 24 new posts</w:t>
+      </w:r>
+      <w:r>
+        <w:t xml:space="preserve">) adds what it has found so far, and the refresh carries on.</w:t>
+      </w:r>
+    </w:p>
+    <w:p>
       <w:pPr>
         <w:pStyle w:val="Heading3"/>
       </w:pPr>
@@ -4815,6 +4839,12 @@
       <w:pPr/>
       <w:r>
         <w:t xml:space="preserve">While the feed refreshes, the status line counts the pages checked and estimates the time left, for example "Checking for new posts… 118 of 452 pages · about 49 min left". Each site is timed separately, since the refresh ends when its slowest site does: a site's pace comes from the last full refresh at first, then from this refresh once five of its pages are done. Bandcamp's two-second gap and any pauses it asks for make it a rough guide: SoundCloud and YouTube pages are quick, Bandcamp pages slow.</w:t>
+      </w:r>
+    </w:p>
+    <w:p>
+      <w:pPr/>
+      <w:r>
+        <w:t xml:space="preserve">Each site has its own queue, three pages at a time, so SoundCloud and YouTube pages are read straight away instead of waiting behind Bandcamp's spaced-out requests. A Bandcamp page read for the first time opens only its two newest releases, so every newly added artist appears in the first pass; its older releases load on the catch-up visits every 10 minutes. Together this matters most just after adding many artists at once, such as with Import follows: their latest posts arrive within minutes rather than at the end of a long first refresh.</w:t>
       </w:r>
     </w:p>
     <w:p>
@@ -5729,7 +5759,7 @@
         <w:t xml:space="preserve">docker compose up -d --build</w:t>
       </w:r>
       <w:r>
-        <w:t xml:space="preserve">. Only the first two are set in the file by default; the third is there as a commented-out line.</w:t>
+        <w:t xml:space="preserve">. Only the first two are set in the file by default; several others are there as commented-out lines (remove the # to use one).</w:t>
       </w:r>
     </w:p>
     <w:tbl>
@@ -5740,9 +5770,9 @@
         <w:tblLook w:val="04A0" w:firstRow="1" w:lastRow="0" w:firstColumn="0" w:lastColumn="0" w:noHBand="0" w:noVBand="1"/>
       </w:tblPr>
       <w:tblGrid>
-        <w:gridCol w:w="3116"/>
+        <w:gridCol w:w="3120"/>
         <w:gridCol w:w="1385"/>
-        <w:gridCol w:w="4859"/>
+        <w:gridCol w:w="4855"/>
       </w:tblGrid>
       <w:tr>
         <w:trPr>
@@ -5750,7 +5780,7 @@
         </w:trPr>
         <w:tc>
           <w:tcPr>
-            <w:tcW w:w="3116" w:type="dxa"/>
+            <w:tcW w:w="3120" w:type="dxa"/>
             <w:shd w:val="clear" w:color="auto" w:fill="F2F2F2"/>
           </w:tcPr>
           <w:p>
@@ -5774,7 +5804,7 @@
         </w:tc>
         <w:tc>
           <w:tcPr>
-            <w:tcW w:w="4859" w:type="dxa"/>
+            <w:tcW w:w="4855" w:type="dxa"/>
             <w:shd w:val="clear" w:color="auto" w:fill="F2F2F2"/>
           </w:tcPr>
           <w:p>
@@ -5788,7 +5818,7 @@
       <w:tr>
         <w:tc>
           <w:tcPr>
-            <w:tcW w:w="3116" w:type="dxa"/>
+            <w:tcW w:w="3120" w:type="dxa"/>
           </w:tcPr>
           <w:p>
             <w:pPr/>
@@ -5813,7 +5843,7 @@
         </w:tc>
         <w:tc>
           <w:tcPr>
-            <w:tcW w:w="4859" w:type="dxa"/>
+            <w:tcW w:w="4855" w:type="dxa"/>
           </w:tcPr>
           <w:p>
             <w:pPr/>
@@ -5826,7 +5856,7 @@
       <w:tr>
         <w:tc>
           <w:tcPr>
-            <w:tcW w:w="3116" w:type="dxa"/>
+            <w:tcW w:w="3120" w:type="dxa"/>
           </w:tcPr>
           <w:p>
             <w:pPr/>
@@ -5851,7 +5881,7 @@
         </w:tc>
         <w:tc>
           <w:tcPr>
-            <w:tcW w:w="4859" w:type="dxa"/>
+            <w:tcW w:w="4855" w:type="dxa"/>
           </w:tcPr>
           <w:p>
             <w:pPr/>
@@ -5864,7 +5894,7 @@
       <w:tr>
         <w:tc>
           <w:tcPr>
-            <w:tcW w:w="3116" w:type="dxa"/>
+            <w:tcW w:w="3120" w:type="dxa"/>
           </w:tcPr>
           <w:p>
             <w:pPr/>
@@ -5889,7 +5919,7 @@
         </w:tc>
         <w:tc>
           <w:tcPr>
-            <w:tcW w:w="4859" w:type="dxa"/>
+            <w:tcW w:w="4855" w:type="dxa"/>
           </w:tcPr>
           <w:p>
             <w:pPr/>
@@ -5920,7 +5950,7 @@
       <w:tr>
         <w:tc>
           <w:tcPr>
-            <w:tcW w:w="3116" w:type="dxa"/>
+            <w:tcW w:w="3120" w:type="dxa"/>
           </w:tcPr>
           <w:p>
             <w:pPr/>
@@ -5945,7 +5975,7 @@
         </w:tc>
         <w:tc>
           <w:tcPr>
-            <w:tcW w:w="4859" w:type="dxa"/>
+            <w:tcW w:w="4855" w:type="dxa"/>
           </w:tcPr>
           <w:p>
             <w:pPr/>
@@ -5958,7 +5988,7 @@
       <w:tr>
         <w:tc>
           <w:tcPr>
-            <w:tcW w:w="3116" w:type="dxa"/>
+            <w:tcW w:w="3120" w:type="dxa"/>
           </w:tcPr>
           <w:p>
             <w:pPr/>
@@ -5983,7 +6013,7 @@
         </w:tc>
         <w:tc>
           <w:tcPr>
-            <w:tcW w:w="4859" w:type="dxa"/>
+            <w:tcW w:w="4855" w:type="dxa"/>
           </w:tcPr>
           <w:p>
             <w:pPr/>
@@ -5996,7 +6026,7 @@
       <w:tr>
         <w:tc>
           <w:tcPr>
-            <w:tcW w:w="3116" w:type="dxa"/>
+            <w:tcW w:w="3120" w:type="dxa"/>
           </w:tcPr>
           <w:p>
             <w:pPr/>
@@ -6021,7 +6051,7 @@
         </w:tc>
         <w:tc>
           <w:tcPr>
-            <w:tcW w:w="4859" w:type="dxa"/>
+            <w:tcW w:w="4855" w:type="dxa"/>
           </w:tcPr>
           <w:p>
             <w:pPr/>
@@ -6034,7 +6064,77 @@
       <w:tr>
         <w:tc>
           <w:tcPr>
-            <w:tcW w:w="3116" w:type="dxa"/>
+            <w:tcW w:w="3120" w:type="dxa"/>
+          </w:tcPr>
+          <w:p>
+            <w:pPr/>
+            <w:r>
+              <w:t xml:space="preserve">BANDCAMP_FIRST_READ</w:t>
+            </w:r>
+          </w:p>
+        </w:tc>
+        <w:tc>
+          <w:tcPr>
+            <w:tcW w:w="1385" w:type="dxa"/>
+          </w:tcPr>
+          <w:p>
+            <w:pPr/>
+            <w:r>
+              <w:t xml:space="preserve">2</w:t>
+            </w:r>
+          </w:p>
+        </w:tc>
+        <w:tc>
+          <w:tcPr>
+            <w:tcW w:w="4855" w:type="dxa"/>
+          </w:tcPr>
+          <w:p>
+            <w:pPr/>
+            <w:r>
+              <w:t xml:space="preserve">Releases opened on a Bandcamp page's first read, newest first; the rest load on catch-up visits</w:t>
+            </w:r>
+          </w:p>
+        </w:tc>
+      </w:tr>
+      <w:tr>
+        <w:tc>
+          <w:tcPr>
+            <w:tcW w:w="3120" w:type="dxa"/>
+          </w:tcPr>
+          <w:p>
+            <w:pPr/>
+            <w:r>
+              <w:t xml:space="preserve">REFRESH_CONCURRENCY</w:t>
+            </w:r>
+          </w:p>
+        </w:tc>
+        <w:tc>
+          <w:tcPr>
+            <w:tcW w:w="1385" w:type="dxa"/>
+          </w:tcPr>
+          <w:p>
+            <w:pPr/>
+            <w:r>
+              <w:t xml:space="preserve">3</w:t>
+            </w:r>
+          </w:p>
+        </w:tc>
+        <w:tc>
+          <w:tcPr>
+            <w:tcW w:w="4855" w:type="dxa"/>
+          </w:tcPr>
+          <w:p>
+            <w:pPr/>
+            <w:r>
+              <w:t xml:space="preserve">Pages read at the same time, per site</w:t>
+            </w:r>
+          </w:p>
+        </w:tc>
+      </w:tr>
+      <w:tr>
+        <w:tc>
+          <w:tcPr>
+            <w:tcW w:w="3120" w:type="dxa"/>
           </w:tcPr>
           <w:p>
             <w:pPr/>
@@ -6059,7 +6159,7 @@
         </w:tc>
         <w:tc>
           <w:tcPr>
-            <w:tcW w:w="4859" w:type="dxa"/>
+            <w:tcW w:w="4855" w:type="dxa"/>
           </w:tcPr>
           <w:p>
             <w:pPr/>
@@ -6072,7 +6172,7 @@
       <w:tr>
         <w:tc>
           <w:tcPr>
-            <w:tcW w:w="3116" w:type="dxa"/>
+            <w:tcW w:w="3120" w:type="dxa"/>
           </w:tcPr>
           <w:p>
             <w:pPr/>
@@ -6097,7 +6197,7 @@
         </w:tc>
         <w:tc>
           <w:tcPr>
-            <w:tcW w:w="4859" w:type="dxa"/>
+            <w:tcW w:w="4855" w:type="dxa"/>
           </w:tcPr>
           <w:p>
             <w:pPr/>
@@ -6110,7 +6210,7 @@
       <w:tr>
         <w:tc>
           <w:tcPr>
-            <w:tcW w:w="3116" w:type="dxa"/>
+            <w:tcW w:w="3120" w:type="dxa"/>
           </w:tcPr>
           <w:p>
             <w:pPr/>
@@ -6135,7 +6235,7 @@
         </w:tc>
         <w:tc>
           <w:tcPr>
-            <w:tcW w:w="4859" w:type="dxa"/>
+            <w:tcW w:w="4855" w:type="dxa"/>
           </w:tcPr>
           <w:p>
             <w:pPr/>
@@ -6148,7 +6248,7 @@
       <w:tr>
         <w:tc>
           <w:tcPr>
-            <w:tcW w:w="3116" w:type="dxa"/>
+            <w:tcW w:w="3120" w:type="dxa"/>
           </w:tcPr>
           <w:p>
             <w:pPr/>
@@ -6173,7 +6273,7 @@
         </w:tc>
         <w:tc>
           <w:tcPr>
-            <w:tcW w:w="4859" w:type="dxa"/>
+            <w:tcW w:w="4855" w:type="dxa"/>
           </w:tcPr>
           <w:p>
             <w:pPr/>
@@ -6186,7 +6286,7 @@
       <w:tr>
         <w:tc>
           <w:tcPr>
-            <w:tcW w:w="3116" w:type="dxa"/>
+            <w:tcW w:w="3120" w:type="dxa"/>
           </w:tcPr>
           <w:p>
             <w:pPr/>
@@ -6211,7 +6311,7 @@
         </w:tc>
         <w:tc>
           <w:tcPr>
-            <w:tcW w:w="4859" w:type="dxa"/>
+            <w:tcW w:w="4855" w:type="dxa"/>
           </w:tcPr>
           <w:p>
             <w:pPr/>
@@ -6224,7 +6324,7 @@
       <w:tr>
         <w:tc>
           <w:tcPr>
-            <w:tcW w:w="3116" w:type="dxa"/>
+            <w:tcW w:w="3120" w:type="dxa"/>
           </w:tcPr>
           <w:p>
             <w:pPr/>
@@ -6249,7 +6349,7 @@
         </w:tc>
         <w:tc>
           <w:tcPr>
-            <w:tcW w:w="4859" w:type="dxa"/>
+            <w:tcW w:w="4855" w:type="dxa"/>
           </w:tcPr>
           <w:p>
             <w:pPr/>
@@ -6262,7 +6362,7 @@
       <w:tr>
         <w:tc>
           <w:tcPr>
-            <w:tcW w:w="3116" w:type="dxa"/>
+            <w:tcW w:w="3120" w:type="dxa"/>
           </w:tcPr>
           <w:p>
             <w:pPr/>
@@ -6287,7 +6387,7 @@
         </w:tc>
         <w:tc>
           <w:tcPr>
-            <w:tcW w:w="4859" w:type="dxa"/>
+            <w:tcW w:w="4855" w:type="dxa"/>
           </w:tcPr>
           <w:p>
             <w:pPr/>
@@ -6300,7 +6400,7 @@
       <w:tr>
         <w:tc>
           <w:tcPr>
-            <w:tcW w:w="3116" w:type="dxa"/>
+            <w:tcW w:w="3120" w:type="dxa"/>
           </w:tcPr>
           <w:p>
             <w:pPr/>
@@ -6325,7 +6425,7 @@
         </w:tc>
         <w:tc>
           <w:tcPr>
-            <w:tcW w:w="4859" w:type="dxa"/>
+            <w:tcW w:w="4855" w:type="dxa"/>
           </w:tcPr>
           <w:p>
             <w:pPr/>
@@ -6338,7 +6438,7 @@
       <w:tr>
         <w:tc>
           <w:tcPr>
-            <w:tcW w:w="3116" w:type="dxa"/>
+            <w:tcW w:w="3120" w:type="dxa"/>
           </w:tcPr>
           <w:p>
             <w:pPr/>
@@ -6363,7 +6463,7 @@
         </w:tc>
         <w:tc>
           <w:tcPr>
-            <w:tcW w:w="4859" w:type="dxa"/>
+            <w:tcW w:w="4855" w:type="dxa"/>
           </w:tcPr>
           <w:p>
             <w:pPr/>
@@ -6376,7 +6476,7 @@
       <w:tr>
         <w:tc>
           <w:tcPr>
-            <w:tcW w:w="3116" w:type="dxa"/>
+            <w:tcW w:w="3120" w:type="dxa"/>
           </w:tcPr>
           <w:p>
             <w:pPr/>
@@ -6401,7 +6501,7 @@
         </w:tc>
         <w:tc>
           <w:tcPr>
-            <w:tcW w:w="4859" w:type="dxa"/>
+            <w:tcW w:w="4855" w:type="dxa"/>
           </w:tcPr>
           <w:p>
             <w:pPr/>
@@ -7916,6 +8016,30 @@
             <w:pPr/>
             <w:r>
               <w:t xml:space="preserve">What changed</w:t>
+            </w:r>
+          </w:p>
+        </w:tc>
+      </w:tr>
+      <w:tr>
+        <w:tc>
+          <w:tcPr>
+            <w:tcW w:w="1616" w:type="dxa"/>
+          </w:tcPr>
+          <w:p>
+            <w:pPr/>
+            <w:r>
+              <w:t xml:space="preserve">85</w:t>
+            </w:r>
+          </w:p>
+        </w:tc>
+        <w:tc>
+          <w:tcPr>
+            <w:tcW w:w="7743" w:type="dxa"/>
+          </w:tcPr>
+          <w:p>
+            <w:pPr/>
+            <w:r>
+              <w:t xml:space="preserve">Faster refresh after adding many artists: each site has its own queue, so SoundCloud and YouTube no longer wait behind Bandcamp; a Bandcamp page's first read opens only its two newest releases (the rest load on catch-up visits); and Show new posts adds what a running refresh has found so far.</w:t>
             </w:r>
           </w:p>
         </w:tc>

</xml_diff>

<commit_message>
Guide: setting names in code style
Co-Authored-By: Claude Opus 5.5 <noreply@anthropic.com>
Claude-Session: https://claude.ai/code/session_01Xj1HuHJX1zYNh76RWBnCyx
</commit_message>
<xml_diff>
--- a/docs/Artist Feed User Guide.docx
+++ b/docs/Artist Feed User Guide.docx
@@ -5770,9 +5770,9 @@
         <w:tblLook w:val="04A0" w:firstRow="1" w:lastRow="0" w:firstColumn="0" w:lastColumn="0" w:noHBand="0" w:noVBand="1"/>
       </w:tblPr>
       <w:tblGrid>
-        <w:gridCol w:w="3120"/>
+        <w:gridCol w:w="3116"/>
         <w:gridCol w:w="1385"/>
-        <w:gridCol w:w="4855"/>
+        <w:gridCol w:w="4859"/>
       </w:tblGrid>
       <w:tr>
         <w:trPr>
@@ -5780,7 +5780,7 @@
         </w:trPr>
         <w:tc>
           <w:tcPr>
-            <w:tcW w:w="3120" w:type="dxa"/>
+            <w:tcW w:w="3116" w:type="dxa"/>
             <w:shd w:val="clear" w:color="auto" w:fill="F2F2F2"/>
           </w:tcPr>
           <w:p>
@@ -5804,7 +5804,7 @@
         </w:tc>
         <w:tc>
           <w:tcPr>
-            <w:tcW w:w="4855" w:type="dxa"/>
+            <w:tcW w:w="4859" w:type="dxa"/>
             <w:shd w:val="clear" w:color="auto" w:fill="F2F2F2"/>
           </w:tcPr>
           <w:p>
@@ -5818,7 +5818,7 @@
       <w:tr>
         <w:tc>
           <w:tcPr>
-            <w:tcW w:w="3120" w:type="dxa"/>
+            <w:tcW w:w="3116" w:type="dxa"/>
           </w:tcPr>
           <w:p>
             <w:pPr/>
@@ -5843,7 +5843,7 @@
         </w:tc>
         <w:tc>
           <w:tcPr>
-            <w:tcW w:w="4855" w:type="dxa"/>
+            <w:tcW w:w="4859" w:type="dxa"/>
           </w:tcPr>
           <w:p>
             <w:pPr/>
@@ -5856,7 +5856,7 @@
       <w:tr>
         <w:tc>
           <w:tcPr>
-            <w:tcW w:w="3120" w:type="dxa"/>
+            <w:tcW w:w="3116" w:type="dxa"/>
           </w:tcPr>
           <w:p>
             <w:pPr/>
@@ -5881,7 +5881,7 @@
         </w:tc>
         <w:tc>
           <w:tcPr>
-            <w:tcW w:w="4855" w:type="dxa"/>
+            <w:tcW w:w="4859" w:type="dxa"/>
           </w:tcPr>
           <w:p>
             <w:pPr/>
@@ -5894,7 +5894,7 @@
       <w:tr>
         <w:tc>
           <w:tcPr>
-            <w:tcW w:w="3120" w:type="dxa"/>
+            <w:tcW w:w="3116" w:type="dxa"/>
           </w:tcPr>
           <w:p>
             <w:pPr/>
@@ -5919,7 +5919,7 @@
         </w:tc>
         <w:tc>
           <w:tcPr>
-            <w:tcW w:w="4855" w:type="dxa"/>
+            <w:tcW w:w="4859" w:type="dxa"/>
           </w:tcPr>
           <w:p>
             <w:pPr/>
@@ -5950,7 +5950,7 @@
       <w:tr>
         <w:tc>
           <w:tcPr>
-            <w:tcW w:w="3120" w:type="dxa"/>
+            <w:tcW w:w="3116" w:type="dxa"/>
           </w:tcPr>
           <w:p>
             <w:pPr/>
@@ -5975,7 +5975,7 @@
         </w:tc>
         <w:tc>
           <w:tcPr>
-            <w:tcW w:w="4855" w:type="dxa"/>
+            <w:tcW w:w="4859" w:type="dxa"/>
           </w:tcPr>
           <w:p>
             <w:pPr/>
@@ -5988,7 +5988,7 @@
       <w:tr>
         <w:tc>
           <w:tcPr>
-            <w:tcW w:w="3120" w:type="dxa"/>
+            <w:tcW w:w="3116" w:type="dxa"/>
           </w:tcPr>
           <w:p>
             <w:pPr/>
@@ -6013,7 +6013,7 @@
         </w:tc>
         <w:tc>
           <w:tcPr>
-            <w:tcW w:w="4855" w:type="dxa"/>
+            <w:tcW w:w="4859" w:type="dxa"/>
           </w:tcPr>
           <w:p>
             <w:pPr/>
@@ -6026,7 +6026,7 @@
       <w:tr>
         <w:tc>
           <w:tcPr>
-            <w:tcW w:w="3120" w:type="dxa"/>
+            <w:tcW w:w="3116" w:type="dxa"/>
           </w:tcPr>
           <w:p>
             <w:pPr/>
@@ -6051,7 +6051,7 @@
         </w:tc>
         <w:tc>
           <w:tcPr>
-            <w:tcW w:w="4855" w:type="dxa"/>
+            <w:tcW w:w="4859" w:type="dxa"/>
           </w:tcPr>
           <w:p>
             <w:pPr/>
@@ -6064,11 +6064,14 @@
       <w:tr>
         <w:tc>
           <w:tcPr>
-            <w:tcW w:w="3120" w:type="dxa"/>
-          </w:tcPr>
-          <w:p>
-            <w:pPr/>
-            <w:r>
+            <w:tcW w:w="3116" w:type="dxa"/>
+          </w:tcPr>
+          <w:p>
+            <w:pPr/>
+            <w:r>
+              <w:rPr>
+                <w:rStyle w:val="CodeChar"/>
+              </w:rPr>
               <w:t xml:space="preserve">BANDCAMP_FIRST_READ</w:t>
             </w:r>
           </w:p>
@@ -6086,7 +6089,7 @@
         </w:tc>
         <w:tc>
           <w:tcPr>
-            <w:tcW w:w="4855" w:type="dxa"/>
+            <w:tcW w:w="4859" w:type="dxa"/>
           </w:tcPr>
           <w:p>
             <w:pPr/>
@@ -6099,11 +6102,14 @@
       <w:tr>
         <w:tc>
           <w:tcPr>
-            <w:tcW w:w="3120" w:type="dxa"/>
-          </w:tcPr>
-          <w:p>
-            <w:pPr/>
-            <w:r>
+            <w:tcW w:w="3116" w:type="dxa"/>
+          </w:tcPr>
+          <w:p>
+            <w:pPr/>
+            <w:r>
+              <w:rPr>
+                <w:rStyle w:val="CodeChar"/>
+              </w:rPr>
               <w:t xml:space="preserve">REFRESH_CONCURRENCY</w:t>
             </w:r>
           </w:p>
@@ -6121,7 +6127,7 @@
         </w:tc>
         <w:tc>
           <w:tcPr>
-            <w:tcW w:w="4855" w:type="dxa"/>
+            <w:tcW w:w="4859" w:type="dxa"/>
           </w:tcPr>
           <w:p>
             <w:pPr/>
@@ -6134,7 +6140,7 @@
       <w:tr>
         <w:tc>
           <w:tcPr>
-            <w:tcW w:w="3120" w:type="dxa"/>
+            <w:tcW w:w="3116" w:type="dxa"/>
           </w:tcPr>
           <w:p>
             <w:pPr/>
@@ -6159,7 +6165,7 @@
         </w:tc>
         <w:tc>
           <w:tcPr>
-            <w:tcW w:w="4855" w:type="dxa"/>
+            <w:tcW w:w="4859" w:type="dxa"/>
           </w:tcPr>
           <w:p>
             <w:pPr/>
@@ -6172,7 +6178,7 @@
       <w:tr>
         <w:tc>
           <w:tcPr>
-            <w:tcW w:w="3120" w:type="dxa"/>
+            <w:tcW w:w="3116" w:type="dxa"/>
           </w:tcPr>
           <w:p>
             <w:pPr/>
@@ -6197,7 +6203,7 @@
         </w:tc>
         <w:tc>
           <w:tcPr>
-            <w:tcW w:w="4855" w:type="dxa"/>
+            <w:tcW w:w="4859" w:type="dxa"/>
           </w:tcPr>
           <w:p>
             <w:pPr/>
@@ -6210,7 +6216,7 @@
       <w:tr>
         <w:tc>
           <w:tcPr>
-            <w:tcW w:w="3120" w:type="dxa"/>
+            <w:tcW w:w="3116" w:type="dxa"/>
           </w:tcPr>
           <w:p>
             <w:pPr/>
@@ -6235,7 +6241,7 @@
         </w:tc>
         <w:tc>
           <w:tcPr>
-            <w:tcW w:w="4855" w:type="dxa"/>
+            <w:tcW w:w="4859" w:type="dxa"/>
           </w:tcPr>
           <w:p>
             <w:pPr/>
@@ -6248,7 +6254,7 @@
       <w:tr>
         <w:tc>
           <w:tcPr>
-            <w:tcW w:w="3120" w:type="dxa"/>
+            <w:tcW w:w="3116" w:type="dxa"/>
           </w:tcPr>
           <w:p>
             <w:pPr/>
@@ -6273,7 +6279,7 @@
         </w:tc>
         <w:tc>
           <w:tcPr>
-            <w:tcW w:w="4855" w:type="dxa"/>
+            <w:tcW w:w="4859" w:type="dxa"/>
           </w:tcPr>
           <w:p>
             <w:pPr/>
@@ -6286,7 +6292,7 @@
       <w:tr>
         <w:tc>
           <w:tcPr>
-            <w:tcW w:w="3120" w:type="dxa"/>
+            <w:tcW w:w="3116" w:type="dxa"/>
           </w:tcPr>
           <w:p>
             <w:pPr/>
@@ -6311,7 +6317,7 @@
         </w:tc>
         <w:tc>
           <w:tcPr>
-            <w:tcW w:w="4855" w:type="dxa"/>
+            <w:tcW w:w="4859" w:type="dxa"/>
           </w:tcPr>
           <w:p>
             <w:pPr/>
@@ -6324,7 +6330,7 @@
       <w:tr>
         <w:tc>
           <w:tcPr>
-            <w:tcW w:w="3120" w:type="dxa"/>
+            <w:tcW w:w="3116" w:type="dxa"/>
           </w:tcPr>
           <w:p>
             <w:pPr/>
@@ -6349,7 +6355,7 @@
         </w:tc>
         <w:tc>
           <w:tcPr>
-            <w:tcW w:w="4855" w:type="dxa"/>
+            <w:tcW w:w="4859" w:type="dxa"/>
           </w:tcPr>
           <w:p>
             <w:pPr/>
@@ -6362,7 +6368,7 @@
       <w:tr>
         <w:tc>
           <w:tcPr>
-            <w:tcW w:w="3120" w:type="dxa"/>
+            <w:tcW w:w="3116" w:type="dxa"/>
           </w:tcPr>
           <w:p>
             <w:pPr/>
@@ -6387,7 +6393,7 @@
         </w:tc>
         <w:tc>
           <w:tcPr>
-            <w:tcW w:w="4855" w:type="dxa"/>
+            <w:tcW w:w="4859" w:type="dxa"/>
           </w:tcPr>
           <w:p>
             <w:pPr/>
@@ -6400,7 +6406,7 @@
       <w:tr>
         <w:tc>
           <w:tcPr>
-            <w:tcW w:w="3120" w:type="dxa"/>
+            <w:tcW w:w="3116" w:type="dxa"/>
           </w:tcPr>
           <w:p>
             <w:pPr/>
@@ -6425,7 +6431,7 @@
         </w:tc>
         <w:tc>
           <w:tcPr>
-            <w:tcW w:w="4855" w:type="dxa"/>
+            <w:tcW w:w="4859" w:type="dxa"/>
           </w:tcPr>
           <w:p>
             <w:pPr/>
@@ -6438,7 +6444,7 @@
       <w:tr>
         <w:tc>
           <w:tcPr>
-            <w:tcW w:w="3120" w:type="dxa"/>
+            <w:tcW w:w="3116" w:type="dxa"/>
           </w:tcPr>
           <w:p>
             <w:pPr/>
@@ -6463,7 +6469,7 @@
         </w:tc>
         <w:tc>
           <w:tcPr>
-            <w:tcW w:w="4855" w:type="dxa"/>
+            <w:tcW w:w="4859" w:type="dxa"/>
           </w:tcPr>
           <w:p>
             <w:pPr/>
@@ -6476,7 +6482,7 @@
       <w:tr>
         <w:tc>
           <w:tcPr>
-            <w:tcW w:w="3120" w:type="dxa"/>
+            <w:tcW w:w="3116" w:type="dxa"/>
           </w:tcPr>
           <w:p>
             <w:pPr/>
@@ -6501,7 +6507,7 @@
         </w:tc>
         <w:tc>
           <w:tcPr>
-            <w:tcW w:w="4855" w:type="dxa"/>
+            <w:tcW w:w="4859" w:type="dxa"/>
           </w:tcPr>
           <w:p>
             <w:pPr/>

</xml_diff>

<commit_message>
Guide: download the desktop app from the Releases page; publishing a version with a tag
Co-Authored-By: Claude Opus 5.5 <noreply@anthropic.com>
Claude-Session: https://claude.ai/code/session_01Xj1HuHJX1zYNh76RWBnCyx
</commit_message>
<xml_diff>
--- a/docs/Artist Feed User Guide.docx
+++ b/docs/Artist Feed User Guide.docx
@@ -1614,10 +1614,99 @@
         <w:rPr>
           <w:b/>
         </w:rPr>
-        <w:t xml:space="preserve">Getting the .exe without any commands.</w:t>
-      </w:r>
-      <w:r>
-        <w:t xml:space="preserve"> GitHub can build it for you:</w:t>
+        <w:t xml:space="preserve">Downloading it (the easiest way).</w:t>
+      </w:r>
+      <w:r>
+        <w:t xml:space="preserve"> Open </w:t>
+      </w:r>
+      <w:hyperlink r:id="rId3" w:history="1">
+        <w:r>
+          <w:rPr>
+            <w:rStyle w:val="Hyperlink"/>
+          </w:rPr>
+          <w:t xml:space="preserve">github.com/divided-eye/artist-feed-desktop/releases/latest</w:t>
+        </w:r>
+      </w:hyperlink>
+      <w:r>
+        <w:t xml:space="preserve">. Under </w:t>
+      </w:r>
+      <w:r>
+        <w:rPr>
+          <w:b/>
+        </w:rPr>
+        <w:t xml:space="preserve">Assets</w:t>
+      </w:r>
+      <w:r>
+        <w:t xml:space="preserve">, download </w:t>
+      </w:r>
+      <w:r>
+        <w:rPr>
+          <w:b/>
+        </w:rPr>
+        <w:t xml:space="preserve">ArtistFeed-windows.zip</w:t>
+      </w:r>
+      <w:r>
+        <w:t xml:space="preserve"> (or the Mac or Linux zip), unzip it, and put </w:t>
+      </w:r>
+      <w:r>
+        <w:rPr>
+          <w:b/>
+        </w:rPr>
+        <w:t xml:space="preserve">ArtistFeed.exe</w:t>
+      </w:r>
+      <w:r>
+        <w:t xml:space="preserve"> in a folder of its own that you will keep. No GitHub account is needed, and the link always points to the newest version.</w:t>
+      </w:r>
+    </w:p>
+    <w:p>
+      <w:pPr/>
+      <w:r>
+        <w:rPr>
+          <w:b/>
+        </w:rPr>
+        <w:t xml:space="preserve">Publishing a new version (for whoever looks after the app).</w:t>
+      </w:r>
+      <w:r>
+        <w:t xml:space="preserve"> In PowerShell, in the </w:t>
+      </w:r>
+      <w:r>
+        <w:rPr>
+          <w:rStyle w:val="CodeChar"/>
+        </w:rPr>
+        <w:t xml:space="preserve">artist-feed-desktop</w:t>
+      </w:r>
+      <w:r>
+        <w:t xml:space="preserve"> folder, run </w:t>
+      </w:r>
+      <w:r>
+        <w:rPr>
+          <w:rStyle w:val="CodeChar"/>
+        </w:rPr>
+        <w:t xml:space="preserve">git tag -a v0.5.0 -m "What changed"</w:t>
+      </w:r>
+      <w:r>
+        <w:t xml:space="preserve"> and then </w:t>
+      </w:r>
+      <w:r>
+        <w:rPr>
+          <w:rStyle w:val="CodeChar"/>
+        </w:rPr>
+        <w:t xml:space="preserve">git push origin v0.5.0</w:t>
+      </w:r>
+      <w:r>
+        <w:t xml:space="preserve">, with the next version number. GitHub tests and builds the app, then publishes a release of that name on the Releases page with all four zips attached, using your message as its description. The app shows that number beside its title.</w:t>
+      </w:r>
+    </w:p>
+    <w:p>
+      <w:pPr/>
+      <w:r>
+        <w:rPr>
+          <w:b/>
+        </w:rPr>
+        <w:t xml:space="preserve">Building a copy without a release.</w:t>
+      </w:r>
+      <w:r>
+        <w:t xml:space="preserve"> To try the latest changes before publishing a version, GitHub can build them for you; the download is only for signed-in GitHub users and is deleted after 90 days:</w:t>
       </w:r>
     </w:p>
     <w:p>
@@ -1946,7 +2035,7 @@
         <w:t xml:space="preserve">Updating the desktop app.</w:t>
       </w:r>
       <w:r>
-        <w:t xml:space="preserve"> Get a new .exe (run the </w:t>
+        <w:t xml:space="preserve"> Get a new .exe (download it from the Releases page, run the </w:t>
       </w:r>
       <w:r>
         <w:rPr>

</xml_diff>

<commit_message>
v86: quiet Bandcamp pages (no release in 90 days) are checked every 6 hours; one-second gap between Bandcamp requests
Co-Authored-By: Claude Opus 5.5 <noreply@anthropic.com>
Claude-Session: https://claude.ai/code/session_01Xj1HuHJX1zYNh76RWBnCyx
</commit_message>
<xml_diff>
--- a/docs/Artist Feed User Guide.docx
+++ b/docs/Artist Feed User Guide.docx
@@ -33,7 +33,7 @@
     <w:p>
       <w:pPr/>
       <w:r>
-        <w:t xml:space="preserve">This guide describes Artist Feed version 85. The version number is shown in small grey text beside the title at the top of the app.</w:t>
+        <w:t xml:space="preserve">This guide describes Artist Feed version 86. The version number is shown in small grey text beside the title at the top of the app.</w:t>
       </w:r>
     </w:p>
     <w:p>
@@ -4897,7 +4897,16 @@
     <w:p>
       <w:pPr/>
       <w:r>
-        <w:t xml:space="preserve">Every request to Bandcamp goes through one queue, two seconds apart, whether it comes from the feed, the purchases reader or the Link Finder.</w:t>
+        <w:t xml:space="preserve">Every request to Bandcamp goes through one queue, one second apart (</w:t>
+      </w:r>
+      <w:r>
+        <w:rPr>
+          <w:rStyle w:val="CodeChar"/>
+        </w:rPr>
+        <w:t xml:space="preserve">BANDCAMP_GAP_SECONDS</w:t>
+      </w:r>
+      <w:r>
+        <w:t xml:space="preserve">), whether it comes from the feed, the purchases reader or the Link Finder.</w:t>
       </w:r>
     </w:p>
     <w:p>
@@ -4927,13 +4936,64 @@
     <w:p>
       <w:pPr/>
       <w:r>
-        <w:t xml:space="preserve">While the feed refreshes, the status line counts the pages checked and estimates the time left, for example "Checking for new posts… 118 of 452 pages · about 49 min left". Each site is timed separately, since the refresh ends when its slowest site does: a site's pace comes from the last full refresh at first, then from this refresh once five of its pages are done. Bandcamp's two-second gap and any pauses it asks for make it a rough guide: SoundCloud and YouTube pages are quick, Bandcamp pages slow.</w:t>
+        <w:t xml:space="preserve">While the feed refreshes, the status line counts the pages checked and estimates the time left, for example "Checking for new posts… 118 of 452 pages · about 49 min left". Each site is timed separately, since the refresh ends when its slowest site does: a site's pace comes from the last full refresh at first, then from this refresh once five of its pages are done. Bandcamp's one-second gap and any pauses it asks for make it a rough guide: SoundCloud and YouTube pages are quick, Bandcamp pages slow.</w:t>
       </w:r>
     </w:p>
     <w:p>
       <w:pPr/>
       <w:r>
         <w:t xml:space="preserve">Each site has its own queue, three pages at a time, so SoundCloud and YouTube pages are read straight away instead of waiting behind Bandcamp's spaced-out requests. A Bandcamp page read for the first time opens only its two newest releases, so every newly added artist appears in the first pass; its older releases load on the catch-up visits every 10 minutes. Together this matters most just after adding many artists at once, such as with Import follows: their latest posts arrive within minutes rather than at the end of a long first refresh.</w:t>
+      </w:r>
+    </w:p>
+    <w:p>
+      <w:pPr/>
+      <w:r>
+        <w:t xml:space="preserve">Quiet Bandcamp pages rest between checks. A page whose newest release is more than 90 days old is checked at most every 6 hours, instead of on every hourly refresh, so a typical refresh reads only the pages that have been active lately. Pages with a recent release, pages never read before, and pages whose older releases are still loading are checked every time; so are SoundCloud and YouTube pages, which are quick. </w:t>
+      </w:r>
+      <w:r>
+        <w:rPr>
+          <w:b/>
+        </w:rPr>
+        <w:t xml:space="preserve">Refresh Feed</w:t>
+      </w:r>
+      <w:r>
+        <w:t xml:space="preserve"> follows the same rule, while </w:t>
+      </w:r>
+      <w:r>
+        <w:rPr>
+          <w:b/>
+        </w:rPr>
+        <w:t xml:space="preserve">Check now</w:t>
+      </w:r>
+      <w:r>
+        <w:t xml:space="preserve"> in Tracked Artists always reads that artist's pages. After a refresh, the status line says how many quiet pages were left for a later check. A long-silent artist's surprise release can therefore show up a few hours late; set </w:t>
+      </w:r>
+      <w:r>
+        <w:rPr>
+          <w:rStyle w:val="CodeChar"/>
+        </w:rPr>
+        <w:t xml:space="preserve">BANDCAMP_QUIET_HOURS</w:t>
+      </w:r>
+      <w:r>
+        <w:t xml:space="preserve"> to </w:t>
+      </w:r>
+      <w:r>
+        <w:rPr>
+          <w:rStyle w:val="CodeChar"/>
+        </w:rPr>
+        <w:t xml:space="preserve">0</w:t>
+      </w:r>
+      <w:r>
+        <w:t xml:space="preserve"> in </w:t>
+      </w:r>
+      <w:r>
+        <w:rPr>
+          <w:rStyle w:val="CodeChar"/>
+        </w:rPr>
+        <w:t xml:space="preserve">docker-compose.yml</w:t>
+      </w:r>
+      <w:r>
+        <w:t xml:space="preserve"> to check every page on every refresh.</w:t>
       </w:r>
     </w:p>
     <w:p>
@@ -6058,7 +6118,7 @@
           <w:p>
             <w:pPr/>
             <w:r>
-              <w:t xml:space="preserve">2</w:t>
+              <w:t xml:space="preserve">1</w:t>
             </w:r>
           </w:p>
         </w:tc>
@@ -6222,6 +6282,82 @@
             <w:pPr/>
             <w:r>
               <w:t xml:space="preserve">Pages read at the same time, per site</w:t>
+            </w:r>
+          </w:p>
+        </w:tc>
+      </w:tr>
+      <w:tr>
+        <w:tc>
+          <w:tcPr>
+            <w:tcW w:w="3116" w:type="dxa"/>
+          </w:tcPr>
+          <w:p>
+            <w:pPr/>
+            <w:r>
+              <w:rPr>
+                <w:rStyle w:val="CodeChar"/>
+              </w:rPr>
+              <w:t xml:space="preserve">BANDCAMP_QUIET_DAYS</w:t>
+            </w:r>
+          </w:p>
+        </w:tc>
+        <w:tc>
+          <w:tcPr>
+            <w:tcW w:w="1385" w:type="dxa"/>
+          </w:tcPr>
+          <w:p>
+            <w:pPr/>
+            <w:r>
+              <w:t xml:space="preserve">90</w:t>
+            </w:r>
+          </w:p>
+        </w:tc>
+        <w:tc>
+          <w:tcPr>
+            <w:tcW w:w="4859" w:type="dxa"/>
+          </w:tcPr>
+          <w:p>
+            <w:pPr/>
+            <w:r>
+              <w:t xml:space="preserve">A Bandcamp page with no release in this many days counts as quiet</w:t>
+            </w:r>
+          </w:p>
+        </w:tc>
+      </w:tr>
+      <w:tr>
+        <w:tc>
+          <w:tcPr>
+            <w:tcW w:w="3116" w:type="dxa"/>
+          </w:tcPr>
+          <w:p>
+            <w:pPr/>
+            <w:r>
+              <w:rPr>
+                <w:rStyle w:val="CodeChar"/>
+              </w:rPr>
+              <w:t xml:space="preserve">BANDCAMP_QUIET_HOURS</w:t>
+            </w:r>
+          </w:p>
+        </w:tc>
+        <w:tc>
+          <w:tcPr>
+            <w:tcW w:w="1385" w:type="dxa"/>
+          </w:tcPr>
+          <w:p>
+            <w:pPr/>
+            <w:r>
+              <w:t xml:space="preserve">6</w:t>
+            </w:r>
+          </w:p>
+        </w:tc>
+        <w:tc>
+          <w:tcPr>
+            <w:tcW w:w="4859" w:type="dxa"/>
+          </w:tcPr>
+          <w:p>
+            <w:pPr/>
+            <w:r>
+              <w:t xml:space="preserve">A quiet page is checked at most this often; 0 checks every page on every refresh</w:t>
             </w:r>
           </w:p>
         </w:tc>
@@ -7950,7 +8086,7 @@
         <w:t xml:space="preserve">Why does a lookup take so long, or seem stuck?</w:t>
       </w:r>
       <w:r>
-        <w:t xml:space="preserve"> Bandcamp limits how fast it can be read, so requests go two seconds apart and pause when Bandcamp asks. A track that is not in your purchases can need several searches and dozens of page reads. The status line names the track being searched and shows any pause. Tracks already known are filled in first. If you know a track can't be found (an unreleased tune, say) or already have its link, press Skip or Add link on its row.</w:t>
+        <w:t xml:space="preserve"> Bandcamp limits how fast it can be read, so requests go a second apart and pause when Bandcamp asks. A track that is not in your purchases can need several searches and dozens of page reads. The status line names the track being searched and shows any pause. Tracks already known are filled in first. If you know a track can't be found (an unreleased tune, say) or already have its link, press Skip or Add link on its row.</w:t>
       </w:r>
     </w:p>
     <w:p>
@@ -8111,6 +8247,30 @@
             <w:pPr/>
             <w:r>
               <w:t xml:space="preserve">What changed</w:t>
+            </w:r>
+          </w:p>
+        </w:tc>
+      </w:tr>
+      <w:tr>
+        <w:tc>
+          <w:tcPr>
+            <w:tcW w:w="1616" w:type="dxa"/>
+          </w:tcPr>
+          <w:p>
+            <w:pPr/>
+            <w:r>
+              <w:t xml:space="preserve">86</w:t>
+            </w:r>
+          </w:p>
+        </w:tc>
+        <w:tc>
+          <w:tcPr>
+            <w:tcW w:w="7743" w:type="dxa"/>
+          </w:tcPr>
+          <w:p>
+            <w:pPr/>
+            <w:r>
+              <w:t xml:space="preserve">Quiet Bandcamp pages (no release in 90 days) are checked every 6 hours instead of every refresh, and the gap between Bandcamp requests is one second instead of two (BANDCAMP_GAP_SECONDS raises it again).</w:t>
             </w:r>
           </w:p>
         </w:tc>

</xml_diff>

<commit_message>
v87: Check them now refreshes the quiet Bandcamp pages too; pages counted per site in the status line
Co-Authored-By: Claude Opus 5.5 <noreply@anthropic.com>
Claude-Session: https://claude.ai/code/session_01Xj1HuHJX1zYNh76RWBnCyx
</commit_message>
<xml_diff>
--- a/docs/Artist Feed User Guide.docx
+++ b/docs/Artist Feed User Guide.docx
@@ -33,7 +33,7 @@
     <w:p>
       <w:pPr/>
       <w:r>
-        <w:t xml:space="preserve">This guide describes Artist Feed version 86. The version number is shown in small grey text beside the title at the top of the app.</w:t>
+        <w:t xml:space="preserve">This guide describes Artist Feed version 87. The version number is shown in small grey text beside the title at the top of the app.</w:t>
       </w:r>
     </w:p>
     <w:p>
@@ -4942,6 +4942,12 @@
     <w:p>
       <w:pPr/>
       <w:r>
+        <w:t xml:space="preserve">The status line also counts pages per site, both while a refresh runs ("120 of 300 pages (Bandcamp 40 of 110, SoundCloud 80 of 190)") and in the summary afterwards ("pages checked: Bandcamp 110, SoundCloud 190").</w:t>
+      </w:r>
+    </w:p>
+    <w:p>
+      <w:pPr/>
+      <w:r>
         <w:t xml:space="preserve">Each site has its own queue, three pages at a time, so SoundCloud and YouTube pages are read straight away instead of waiting behind Bandcamp's spaced-out requests. A Bandcamp page read for the first time opens only its two newest releases, so every newly added artist appears in the first pass; its older releases load on the catch-up visits every 10 minutes. Together this matters most just after adding many artists at once, such as with Import follows: their latest posts arrive within minutes rather than at the end of a long first refresh.</w:t>
       </w:r>
     </w:p>
@@ -4966,7 +4972,16 @@
         <w:t xml:space="preserve">Check now</w:t>
       </w:r>
       <w:r>
-        <w:t xml:space="preserve"> in Tracked Artists always reads that artist's pages. After a refresh, the status line says how many quiet pages were left for a later check. A long-silent artist's surprise release can therefore show up a few hours late; set </w:t>
+        <w:t xml:space="preserve"> in Tracked Artists always reads that artist's pages. After a refresh, the status line says how many quiet pages were left for a later check, with a </w:t>
+      </w:r>
+      <w:r>
+        <w:rPr>
+          <w:b/>
+        </w:rPr>
+        <w:t xml:space="preserve">Check them now</w:t>
+      </w:r>
+      <w:r>
+        <w:t xml:space="preserve"> button beside it that runs a full refresh of every page, quiet ones included. A long-silent artist's surprise release can therefore show up a few hours late; set </w:t>
       </w:r>
       <w:r>
         <w:rPr>
@@ -8247,6 +8262,30 @@
             <w:pPr/>
             <w:r>
               <w:t xml:space="preserve">What changed</w:t>
+            </w:r>
+          </w:p>
+        </w:tc>
+      </w:tr>
+      <w:tr>
+        <w:tc>
+          <w:tcPr>
+            <w:tcW w:w="1616" w:type="dxa"/>
+          </w:tcPr>
+          <w:p>
+            <w:pPr/>
+            <w:r>
+              <w:t xml:space="preserve">87</w:t>
+            </w:r>
+          </w:p>
+        </w:tc>
+        <w:tc>
+          <w:tcPr>
+            <w:tcW w:w="7743" w:type="dxa"/>
+          </w:tcPr>
+          <w:p>
+            <w:pPr/>
+            <w:r>
+              <w:t xml:space="preserve">Check them now, beside the note about quiet Bandcamp pages left for later, refreshes every page at once. The status line counts pages per site, during a refresh and in the summary after it.</w:t>
             </w:r>
           </w:p>
         </w:tc>

</xml_diff>

<commit_message>
v88: short status line; refresh details behind an info icon shown on hover or tap
Co-Authored-By: Claude Opus 5.5 <noreply@anthropic.com>
Claude-Session: https://claude.ai/code/session_01Xj1HuHJX1zYNh76RWBnCyx
</commit_message>
<xml_diff>
--- a/docs/Artist Feed User Guide.docx
+++ b/docs/Artist Feed User Guide.docx
@@ -33,7 +33,7 @@
     <w:p>
       <w:pPr/>
       <w:r>
-        <w:t xml:space="preserve">This guide describes Artist Feed version 87. The version number is shown in small grey text beside the title at the top of the app.</w:t>
+        <w:t xml:space="preserve">This guide describes Artist Feed version 88. The version number is shown in small grey text beside the title at the top of the app.</w:t>
       </w:r>
     </w:p>
     <w:p>
@@ -2427,7 +2427,7 @@
         <w:t xml:space="preserve">Refresh Feed</w:t>
       </w:r>
       <w:r>
-        <w:t xml:space="preserve"> checks immediately. If a refresh is already under way (for example for pages just added), a full one follows as soon as it ends. When it finishes, the line beside the buttons says what it found: how many new posts, how many Bandcamp pages were skipped because a Link Finder lookup was running (they are checked on the next refresh), and how many pages couldn't be read. The reasons for those are in the Status column of Tracked Artists and in the app's log (docker compose logs).</w:t>
+        <w:t xml:space="preserve"> checks immediately. If a refresh is already under way (for example for pages just added), a full one follows as soon as it ends. When it finishes, the line beside the buttons says when it ran and how many new posts it found. The rest sits behind the small ⓘ after it: hover over it (or tap it) for the pages checked on each site, Bandcamp pages skipped because a Link Finder lookup was running (they are checked on the next refresh), quiet Bandcamp pages left for later, and pages that couldn't be read. The ⓘ turns yellow when some pages couldn't be read. The reasons for those are in the Status column of Tracked Artists and in the app's log (docker compose logs).</w:t>
       </w:r>
     </w:p>
     <w:p>
@@ -4942,7 +4942,7 @@
     <w:p>
       <w:pPr/>
       <w:r>
-        <w:t xml:space="preserve">The status line also counts pages per site, both while a refresh runs ("120 of 300 pages (Bandcamp 40 of 110, SoundCloud 80 of 190)") and in the summary afterwards ("pages checked: Bandcamp 110, SoundCloud 190").</w:t>
+        <w:t xml:space="preserve">The ⓘ beside the status line counts pages per site, both while a refresh runs ("Pages checked so far: Bandcamp 40 of 110, SoundCloud 80 of 190") and afterwards ("Pages checked: Bandcamp 110, SoundCloud 190").</w:t>
       </w:r>
     </w:p>
     <w:p>
@@ -4972,7 +4972,7 @@
         <w:t xml:space="preserve">Check now</w:t>
       </w:r>
       <w:r>
-        <w:t xml:space="preserve"> in Tracked Artists always reads that artist's pages. After a refresh, the status line says how many quiet pages were left for a later check, with a </w:t>
+        <w:t xml:space="preserve"> in Tracked Artists always reads that artist's pages. After a refresh, the ⓘ beside the status line says how many quiet pages were left for a later check, with a </w:t>
       </w:r>
       <w:r>
         <w:rPr>
@@ -4981,7 +4981,7 @@
         <w:t xml:space="preserve">Check them now</w:t>
       </w:r>
       <w:r>
-        <w:t xml:space="preserve"> button beside it that runs a full refresh of every page, quiet ones included. A long-silent artist's surprise release can therefore show up a few hours late; set </w:t>
+        <w:t xml:space="preserve"> button in it that runs a full refresh of every page, quiet ones included. A long-silent artist's surprise release can therefore show up a few hours late; set </w:t>
       </w:r>
       <w:r>
         <w:rPr>
@@ -8262,6 +8262,30 @@
             <w:pPr/>
             <w:r>
               <w:t xml:space="preserve">What changed</w:t>
+            </w:r>
+          </w:p>
+        </w:tc>
+      </w:tr>
+      <w:tr>
+        <w:tc>
+          <w:tcPr>
+            <w:tcW w:w="1616" w:type="dxa"/>
+          </w:tcPr>
+          <w:p>
+            <w:pPr/>
+            <w:r>
+              <w:t xml:space="preserve">88</w:t>
+            </w:r>
+          </w:p>
+        </w:tc>
+        <w:tc>
+          <w:tcPr>
+            <w:tcW w:w="7743" w:type="dxa"/>
+          </w:tcPr>
+          <w:p>
+            <w:pPr/>
+            <w:r>
+              <w:t xml:space="preserve">Shorter status line: it says when the feed was updated and how many new posts came in, and the rest (pages per site, skipped and quiet pages, problems, Check them now) is behind a small ⓘ beside it, shown on hover or tap. The line no longer wraps and shifts the page.</w:t>
             </w:r>
           </w:p>
         </w:tc>

</xml_diff>

<commit_message>
v89: Find missing links can look for one site only, and skips rows already searched
Co-Authored-By: Claude Opus 5.5 <noreply@anthropic.com>
Claude-Session: https://claude.ai/code/session_01Xj1HuHJX1zYNh76RWBnCyx
</commit_message>
<xml_diff>
--- a/docs/Artist Feed User Guide.docx
+++ b/docs/Artist Feed User Guide.docx
@@ -33,7 +33,7 @@
     <w:p>
       <w:pPr/>
       <w:r>
-        <w:t xml:space="preserve">This guide describes Artist Feed version 88. The version number is shown in small grey text beside the title at the top of the app.</w:t>
+        <w:t xml:space="preserve">This guide describes Artist Feed version 89. The version number is shown in small grey text beside the title at the top of the app.</w:t>
       </w:r>
     </w:p>
     <w:p>
@@ -3443,6 +3443,48 @@
       </w:r>
     </w:p>
     <w:p>
+      <w:pPr/>
+      <w:r>
+        <w:t xml:space="preserve">The menu beside the button picks what to look for: </w:t>
+      </w:r>
+      <w:r>
+        <w:rPr>
+          <w:b/>
+        </w:rPr>
+        <w:t xml:space="preserve">Bandcamp and SoundCloud</w:t>
+      </w:r>
+      <w:r>
+        <w:t xml:space="preserve">, </w:t>
+      </w:r>
+      <w:r>
+        <w:rPr>
+          <w:b/>
+        </w:rPr>
+        <w:t xml:space="preserve">Bandcamp only</w:t>
+      </w:r>
+      <w:r>
+        <w:t xml:space="preserve"> or </w:t>
+      </w:r>
+      <w:r>
+        <w:rPr>
+          <w:b/>
+        </w:rPr>
+        <w:t xml:space="preserve">SoundCloud only</w:t>
+      </w:r>
+      <w:r>
+        <w:t xml:space="preserve">. A missing name is still filled in either way. With </w:t>
+      </w:r>
+      <w:r>
+        <w:rPr>
+          <w:b/>
+        </w:rPr>
+        <w:t xml:space="preserve">Skip rows already searched</w:t>
+      </w:r>
+      <w:r>
+        <w:t xml:space="preserve"> ticked (the default), a row is only searched for a site it hasn't been searched for before, so pressing the button again after adding new rows searches just the new ones. Untick it to search every row with an empty cell again, or tick Rescan on a single row. Both choices are remembered in this browser.</w:t>
+      </w:r>
+    </w:p>
+    <w:p>
       <w:pPr>
         <w:pStyle w:val="ListParagraph"/>
         <w:numPr>
@@ -3522,7 +3564,7 @@
         <w:t xml:space="preserve">Rescan</w:t>
       </w:r>
       <w:r>
-        <w:t xml:space="preserve"> checkbox. Tick it and press Find missing links to search that row's empty cells again, including ones you cleared. A guess you removed is not offered again for that cell, so a rescan returns the next best match or nothing. The box unticks itself after the run. Typing a link into a cleared cell also ends its "left empty" state.</w:t>
+        <w:t xml:space="preserve"> checkbox. Tick it and press Find missing links to search that row's empty cells again, including ones you cleared. A guess you removed is not offered again for that cell, so a rescan returns the next best match or nothing. A ticked Rescan also searches the row when Skip rows already searched is on. The box unticks itself after the run. Typing a link into a cleared cell also ends its "left empty" state.</w:t>
       </w:r>
     </w:p>
     <w:p>
@@ -8262,6 +8304,30 @@
             <w:pPr/>
             <w:r>
               <w:t xml:space="preserve">What changed</w:t>
+            </w:r>
+          </w:p>
+        </w:tc>
+      </w:tr>
+      <w:tr>
+        <w:tc>
+          <w:tcPr>
+            <w:tcW w:w="1616" w:type="dxa"/>
+          </w:tcPr>
+          <w:p>
+            <w:pPr/>
+            <w:r>
+              <w:t xml:space="preserve">89</w:t>
+            </w:r>
+          </w:p>
+        </w:tc>
+        <w:tc>
+          <w:tcPr>
+            <w:tcW w:w="7743" w:type="dxa"/>
+          </w:tcPr>
+          <w:p>
+            <w:pPr/>
+            <w:r>
+              <w:t xml:space="preserve">Tracked Artists: a menu beside Find missing links picks Bandcamp and SoundCloud, Bandcamp only or SoundCloud only, and Skip rows already searched (ticked by default) leaves out rows already searched for that site, so a second run only searches new rows.</w:t>
             </w:r>
           </w:p>
         </w:tc>

</xml_diff>

<commit_message>
v90: grouped Tracked Artists toolbar, Clear all follows the filter, last warning before saving an empty list
Co-Authored-By: Claude Opus 5.5 <noreply@anthropic.com>
Claude-Session: https://claude.ai/code/session_01Xj1HuHJX1zYNh76RWBnCyx
</commit_message>
<xml_diff>
--- a/docs/Artist Feed User Guide.docx
+++ b/docs/Artist Feed User Guide.docx
@@ -33,7 +33,7 @@
     <w:p>
       <w:pPr/>
       <w:r>
-        <w:t xml:space="preserve">This guide describes Artist Feed version 89. The version number is shown in small grey text beside the title at the top of the app.</w:t>
+        <w:t xml:space="preserve">This guide describes Artist Feed version 90. The version number is shown in small grey text beside the title at the top of the app.</w:t>
       </w:r>
     </w:p>
     <w:p>
@@ -3445,13 +3445,22 @@
     <w:p>
       <w:pPr/>
       <w:r>
-        <w:t xml:space="preserve">The menu beside the button picks what to look for: </w:t>
-      </w:r>
-      <w:r>
-        <w:rPr>
-          <w:b/>
-        </w:rPr>
-        <w:t xml:space="preserve">Bandcamp and SoundCloud</w:t>
+        <w:t xml:space="preserve">Find missing links has its own box. </w:t>
+      </w:r>
+      <w:r>
+        <w:rPr>
+          <w:b/>
+        </w:rPr>
+        <w:t xml:space="preserve">Look on</w:t>
+      </w:r>
+      <w:r>
+        <w:t xml:space="preserve"> picks what to look for: </w:t>
+      </w:r>
+      <w:r>
+        <w:rPr>
+          <w:b/>
+        </w:rPr>
+        <w:t xml:space="preserve">Both</w:t>
       </w:r>
       <w:r>
         <w:t xml:space="preserve">, </w:t>
@@ -3460,7 +3469,7 @@
         <w:rPr>
           <w:b/>
         </w:rPr>
-        <w:t xml:space="preserve">Bandcamp only</w:t>
+        <w:t xml:space="preserve">Bandcamp</w:t>
       </w:r>
       <w:r>
         <w:t xml:space="preserve"> or </w:t>
@@ -3469,7 +3478,7 @@
         <w:rPr>
           <w:b/>
         </w:rPr>
-        <w:t xml:space="preserve">SoundCloud only</w:t>
+        <w:t xml:space="preserve">SoundCloud</w:t>
       </w:r>
       <w:r>
         <w:t xml:space="preserve">. A missing name is still filled in either way. With </w:t>
@@ -3478,7 +3487,7 @@
         <w:rPr>
           <w:b/>
         </w:rPr>
-        <w:t xml:space="preserve">Skip rows already searched</w:t>
+        <w:t xml:space="preserve">Only rows not searched yet</w:t>
       </w:r>
       <w:r>
         <w:t xml:space="preserve"> ticked (the default), a row is only searched for a site it hasn't been searched for before, so pressing the button again after adding new rows searches just the new ones. Untick it to search every row with an empty cell again, or tick Rescan on a single row. Both choices are remembered in this browser.</w:t>
@@ -3564,7 +3573,7 @@
         <w:t xml:space="preserve">Rescan</w:t>
       </w:r>
       <w:r>
-        <w:t xml:space="preserve"> checkbox. Tick it and press Find missing links to search that row's empty cells again, including ones you cleared. A guess you removed is not offered again for that cell, so a rescan returns the next best match or nothing. A ticked Rescan also searches the row when Skip rows already searched is on. The box unticks itself after the run. Typing a link into a cleared cell also ends its "left empty" state.</w:t>
+        <w:t xml:space="preserve"> checkbox. Tick it and press Find missing links to search that row's empty cells again, including ones you cleared. A guess you removed is not offered again for that cell, so a rescan returns the next best match or nothing. A ticked Rescan also searches the row when Only rows not searched yet is on. The box unticks itself after the run. Typing a link into a cleared cell also ends its "left empty" state.</w:t>
       </w:r>
     </w:p>
     <w:p>
@@ -3631,19 +3640,46 @@
         <w:pStyle w:val="Heading3"/>
       </w:pPr>
       <w:r>
-        <w:t xml:space="preserve">Clear All</w:t>
-      </w:r>
-    </w:p>
-    <w:p>
-      <w:pPr/>
-      <w:r>
-        <w:rPr>
-          <w:b/>
-        </w:rPr>
-        <w:t xml:space="preserve">Clear All</w:t>
-      </w:r>
-      <w:r>
-        <w:t xml:space="preserve"> empties the table after asking you to confirm. Nothing is removed from the feed until you press Save changes, which asks again; Discard brings the rows back.</w:t>
+        <w:t xml:space="preserve">Clear all</w:t>
+      </w:r>
+    </w:p>
+    <w:p>
+      <w:pPr/>
+      <w:r>
+        <w:rPr>
+          <w:b/>
+        </w:rPr>
+        <w:t xml:space="preserve">Clear all</w:t>
+      </w:r>
+      <w:r>
+        <w:t xml:space="preserve">, in the Table group, empties the table after asking you to confirm. While the table is filtered it removes only the rows shown, and the button says so (for example </w:t>
+      </w:r>
+      <w:r>
+        <w:rPr>
+          <w:b/>
+        </w:rPr>
+        <w:t xml:space="preserve">Clear 2 shown rows</w:t>
+      </w:r>
+      <w:r>
+        <w:t xml:space="preserve">); the other rows stay. Nothing is removed from the feed until you press Save changes, which asks again; Discard brings the rows back. If saving would remove every artist you track, a last warning asks you to choose between </w:t>
+      </w:r>
+      <w:r>
+        <w:rPr>
+          <w:b/>
+        </w:rPr>
+        <w:t xml:space="preserve">Keep my list</w:t>
+      </w:r>
+      <w:r>
+        <w:t xml:space="preserve"> and </w:t>
+      </w:r>
+      <w:r>
+        <w:rPr>
+          <w:b/>
+        </w:rPr>
+        <w:t xml:space="preserve">Yes, clear everything</w:t>
+      </w:r>
+      <w:r>
+        <w:t xml:space="preserve">.</w:t>
       </w:r>
     </w:p>
     <w:p>
@@ -8304,6 +8340,30 @@
             <w:pPr/>
             <w:r>
               <w:t xml:space="preserve">What changed</w:t>
+            </w:r>
+          </w:p>
+        </w:tc>
+      </w:tr>
+      <w:tr>
+        <w:tc>
+          <w:tcPr>
+            <w:tcW w:w="1616" w:type="dxa"/>
+          </w:tcPr>
+          <w:p>
+            <w:pPr/>
+            <w:r>
+              <w:t xml:space="preserve">90</w:t>
+            </w:r>
+          </w:p>
+        </w:tc>
+        <w:tc>
+          <w:tcPr>
+            <w:tcW w:w="7743" w:type="dxa"/>
+          </w:tcPr>
+          <w:p>
+            <w:pPr/>
+            <w:r>
+              <w:t xml:space="preserve">Tidier Tracked Artists toolbar: buttons grouped under Add artists, Organize and Table; Save changes moved up beside Close; Find missing links in its own box with Look on (Both, Bandcamp, SoundCloud) and Only rows not searched yet. Clear all removes only the rows shown while the table is filtered, and a last warning appears before saving an empty list.</w:t>
             </w:r>
           </w:p>
         </w:tc>

</xml_diff>

<commit_message>
v91: Tracked Artists toolbar as in the mockup: icons, blue Find missing links, blue chosen and open states
Co-Authored-By: Claude Opus 5.5 <noreply@anthropic.com>
Claude-Session: https://claude.ai/code/session_01Xj1HuHJX1zYNh76RWBnCyx
</commit_message>
<xml_diff>
--- a/docs/Artist Feed User Guide.docx
+++ b/docs/Artist Feed User Guide.docx
@@ -33,7 +33,7 @@
     <w:p>
       <w:pPr/>
       <w:r>
-        <w:t xml:space="preserve">This guide describes Artist Feed version 90. The version number is shown in small grey text beside the title at the top of the app.</w:t>
+        <w:t xml:space="preserve">This guide describes Artist Feed version 91. The version number is shown in small grey text beside the title at the top of the app.</w:t>
       </w:r>
     </w:p>
     <w:p>
@@ -8340,6 +8340,30 @@
             <w:pPr/>
             <w:r>
               <w:t xml:space="preserve">What changed</w:t>
+            </w:r>
+          </w:p>
+        </w:tc>
+      </w:tr>
+      <w:tr>
+        <w:tc>
+          <w:tcPr>
+            <w:tcW w:w="1616" w:type="dxa"/>
+          </w:tcPr>
+          <w:p>
+            <w:pPr/>
+            <w:r>
+              <w:t xml:space="preserve">91</w:t>
+            </w:r>
+          </w:p>
+        </w:tc>
+        <w:tc>
+          <w:tcPr>
+            <w:tcW w:w="7743" w:type="dxa"/>
+          </w:tcPr>
+          <w:p>
+            <w:pPr/>
+            <w:r>
+              <w:t xml:space="preserve">Tracked Artists toolbar: small icons on the buttons, a blue Find missing links button, and the Look on choice and an open Import follows or Workspaces panel shown in blue, with an arrow that points up while the panel is open.</w:t>
             </w:r>
           </w:p>
         </w:tc>

</xml_diff>

<commit_message>
v92: Link Finder matches bootlegs titled differently (bare "bootleg", original artist restated)
Co-Authored-By: Claude Opus 5.5 <noreply@anthropic.com>
Claude-Session: https://claude.ai/code/session_01Xj1HuHJX1zYNh76RWBnCyx
</commit_message>
<xml_diff>
--- a/docs/Artist Feed User Guide.docx
+++ b/docs/Artist Feed User Guide.docx
@@ -33,7 +33,7 @@
     <w:p>
       <w:pPr/>
       <w:r>
-        <w:t xml:space="preserve">This guide describes Artist Feed version 91. The version number is shown in small grey text beside the title at the top of the app.</w:t>
+        <w:t xml:space="preserve">This guide describes Artist Feed version 92. The version number is shown in small grey text beside the title at the top of the app.</w:t>
       </w:r>
     </w:p>
     <w:p>
@@ -8340,6 +8340,30 @@
             <w:pPr/>
             <w:r>
               <w:t xml:space="preserve">What changed</w:t>
+            </w:r>
+          </w:p>
+        </w:tc>
+      </w:tr>
+      <w:tr>
+        <w:tc>
+          <w:tcPr>
+            <w:tcW w:w="1616" w:type="dxa"/>
+          </w:tcPr>
+          <w:p>
+            <w:pPr/>
+            <w:r>
+              <w:t xml:space="preserve">92</w:t>
+            </w:r>
+          </w:p>
+        </w:tc>
+        <w:tc>
+          <w:tcPr>
+            <w:tcW w:w="7743" w:type="dxa"/>
+          </w:tcPr>
+          <w:p>
+            <w:pPr/>
+            <w:r>
+              <w:t xml:space="preserve">Link Finder finds bootlegs, remixes and edits whose Bandcamp title is worded differently from your row: "bootleg" outside the brackets, or the original artist repeated in them, as in "Oblivion bootleg (by Astor Piazzolla as performed by Miguel Fajardo)".</w:t>
             </w:r>
           </w:p>
         </w:tc>

</xml_diff>

<commit_message>
v93: undo the v92 bootleg matching change for now
Co-Authored-By: Claude Opus 5.5 <noreply@anthropic.com>
Claude-Session: https://claude.ai/code/session_01Xj1HuHJX1zYNh76RWBnCyx
</commit_message>
<xml_diff>
--- a/docs/Artist Feed User Guide.docx
+++ b/docs/Artist Feed User Guide.docx
@@ -33,7 +33,7 @@
     <w:p>
       <w:pPr/>
       <w:r>
-        <w:t xml:space="preserve">This guide describes Artist Feed version 92. The version number is shown in small grey text beside the title at the top of the app.</w:t>
+        <w:t xml:space="preserve">This guide describes Artist Feed version 93. The version number is shown in small grey text beside the title at the top of the app.</w:t>
       </w:r>
     </w:p>
     <w:p>
@@ -8340,6 +8340,30 @@
             <w:pPr/>
             <w:r>
               <w:t xml:space="preserve">What changed</w:t>
+            </w:r>
+          </w:p>
+        </w:tc>
+      </w:tr>
+      <w:tr>
+        <w:tc>
+          <w:tcPr>
+            <w:tcW w:w="1616" w:type="dxa"/>
+          </w:tcPr>
+          <w:p>
+            <w:pPr/>
+            <w:r>
+              <w:t xml:space="preserve">93</w:t>
+            </w:r>
+          </w:p>
+        </w:tc>
+        <w:tc>
+          <w:tcPr>
+            <w:tcW w:w="7743" w:type="dxa"/>
+          </w:tcPr>
+          <w:p>
+            <w:pPr/>
+            <w:r>
+              <w:t xml:space="preserve">The version 92 change to how Link Finder matches bootlegs is undone for now: matching works as it did in version 91.</w:t>
             </w:r>
           </w:p>
         </w:tc>

</xml_diff>

<commit_message>
v94: Link Finder's Export results button is blue
Co-Authored-By: Claude Opus 5.5 <noreply@anthropic.com>
Claude-Session: https://claude.ai/code/session_01Xj1HuHJX1zYNh76RWBnCyx
</commit_message>
<xml_diff>
--- a/docs/Artist Feed User Guide.docx
+++ b/docs/Artist Feed User Guide.docx
@@ -33,7 +33,7 @@
     <w:p>
       <w:pPr/>
       <w:r>
-        <w:t xml:space="preserve">This guide describes Artist Feed version 93. The version number is shown in small grey text beside the title at the top of the app.</w:t>
+        <w:t xml:space="preserve">This guide describes Artist Feed version 94. The version number is shown in small grey text beside the title at the top of the app.</w:t>
       </w:r>
     </w:p>
     <w:p>
@@ -8340,6 +8340,30 @@
             <w:pPr/>
             <w:r>
               <w:t xml:space="preserve">What changed</w:t>
+            </w:r>
+          </w:p>
+        </w:tc>
+      </w:tr>
+      <w:tr>
+        <w:tc>
+          <w:tcPr>
+            <w:tcW w:w="1616" w:type="dxa"/>
+          </w:tcPr>
+          <w:p>
+            <w:pPr/>
+            <w:r>
+              <w:t xml:space="preserve">94</w:t>
+            </w:r>
+          </w:p>
+        </w:tc>
+        <w:tc>
+          <w:tcPr>
+            <w:tcW w:w="7743" w:type="dxa"/>
+          </w:tcPr>
+          <w:p>
+            <w:pPr/>
+            <w:r>
+              <w:t xml:space="preserve">Link Finder: the Export results button that appears when a lookup finishes is blue, like Find missing links in Tracked Artists.</w:t>
             </w:r>
           </w:p>
         </w:tc>

</xml_diff>

<commit_message>
v95: remove the Add row and Import CSV buttons from Tracked Artists
Co-Authored-By: Claude Opus 5.5 <noreply@anthropic.com>
Claude-Session: https://claude.ai/code/session_01Xj1HuHJX1zYNh76RWBnCyx
</commit_message>
<xml_diff>
--- a/docs/Artist Feed User Guide.docx
+++ b/docs/Artist Feed User Guide.docx
@@ -33,7 +33,7 @@
     <w:p>
       <w:pPr/>
       <w:r>
-        <w:t xml:space="preserve">This guide describes Artist Feed version 94. The version number is shown in small grey text beside the title at the top of the app.</w:t>
+        <w:t xml:space="preserve">This guide describes Artist Feed version 95. The version number is shown in small grey text beside the title at the top of the app.</w:t>
       </w:r>
     </w:p>
     <w:p>
@@ -3306,16 +3306,7 @@
         <w:t xml:space="preserve">Export CSV</w:t>
       </w:r>
       <w:r>
-        <w:t xml:space="preserve"> downloads the saved list. </w:t>
-      </w:r>
-      <w:r>
-        <w:rPr>
-          <w:b/>
-        </w:rPr>
-        <w:t xml:space="preserve">Import CSV</w:t>
-      </w:r>
-      <w:r>
-        <w:t xml:space="preserve"> adds a file's rows to the table for you to review and save.</w:t>
+        <w:t xml:space="preserve"> downloads the saved list.</w:t>
       </w:r>
     </w:p>
     <w:p>
@@ -3372,16 +3363,7 @@
     <w:p>
       <w:pPr/>
       <w:r>
-        <w:t xml:space="preserve">Each artist belongs on one row. Save is refused, with a message on every row involved, when two rows have the same page, or share a name (any of the names in their Artist cells). Both usually happen after </w:t>
-      </w:r>
-      <w:r>
-        <w:rPr>
-          <w:b/>
-        </w:rPr>
-        <w:t xml:space="preserve">Import CSV</w:t>
-      </w:r>
-      <w:r>
-        <w:t xml:space="preserve">, which adds the file's rows as new rows rather than updating the ones you have: move the new pages into the existing row and delete the extra one. Two rows for one artist would leave Link Finder using whichever it finds first. If two rows really are different artists who share a name (in different genres, say), press </w:t>
+        <w:t xml:space="preserve">Each artist belongs on one row. Save is refused, with a message on every row involved, when two rows have the same page, or share a name (any of the names in their Artist cells). Both usually happen after pasting a list, which adds new rows rather than updating the ones you have: move the new pages into the existing row and delete the extra one. Two rows for one artist would leave Link Finder using whichever it finds first. If two rows really are different artists who share a name (in different genres, say), press </w:t>
       </w:r>
       <w:r>
         <w:rPr>
@@ -8340,6 +8322,30 @@
             <w:pPr/>
             <w:r>
               <w:t xml:space="preserve">What changed</w:t>
+            </w:r>
+          </w:p>
+        </w:tc>
+      </w:tr>
+      <w:tr>
+        <w:tc>
+          <w:tcPr>
+            <w:tcW w:w="1616" w:type="dxa"/>
+          </w:tcPr>
+          <w:p>
+            <w:pPr/>
+            <w:r>
+              <w:t xml:space="preserve">95</w:t>
+            </w:r>
+          </w:p>
+        </w:tc>
+        <w:tc>
+          <w:tcPr>
+            <w:tcW w:w="7743" w:type="dxa"/>
+          </w:tcPr>
+          <w:p>
+            <w:pPr/>
+            <w:r>
+              <w:t xml:space="preserve">Tracked Artists: the Add row and Import CSV buttons are gone. Type in the empty row at the bottom of the table (a new one appears as you type), or paste a list into the box under the table.</w:t>
             </w:r>
           </w:p>
         </w:tc>

</xml_diff>